<commit_message>
Add Task 2.2 correlation analysis and Task 3.1 basic probability
- Task 2.2: Pearson correlation between temperature and traffic volume (r = 0.14), with direction, strength, and correlation-vs-causation interpretation
- Task 3.1: P(Congestion), P(Clear Weather), P(Congestion AND Clear Weather) via COUNTIF/COUNTIFS on the deduplicated hourly dataset
</commit_message>
<xml_diff>
--- a/part1_data_analytics/part1_analysis_notes.docx
+++ b/part1_data_analytics/part1_analysis_notes.docx
@@ -161,15 +161,7 @@
         <w:pStyle w:val="NormalWeb"/>
       </w:pPr>
       <w:r>
-        <w:t xml:space="preserve">Loaded Metro_Interstate_Traffic_Volume.csv into a SQLite table </w:t>
-      </w:r>
-      <w:proofErr w:type="spellStart"/>
-      <w:r>
-        <w:t>traffic_volume</w:t>
-      </w:r>
-      <w:proofErr w:type="spellEnd"/>
-      <w:r>
-        <w:t xml:space="preserve"> (schema in 01_schema.sql) using DB Browser for SQLite's CSV import feature. Verified the load with the following checks, all matching the source CSV</w:t>
+        <w:t>Loaded Metro_Interstate_Traffic_Volume.csv into a SQLite table traffic_volume (schema in 01_schema.sql) using DB Browser for SQLite's CSV import feature. Verified the load with the following checks, all matching the source CSV</w:t>
       </w:r>
     </w:p>
     <w:p>
@@ -177,55 +169,15 @@
         <w:pStyle w:val="NormalWeb"/>
       </w:pPr>
       <w:r>
-        <w:t xml:space="preserve">Row count: 48,204 (via SELECT </w:t>
-      </w:r>
-      <w:proofErr w:type="gramStart"/>
-      <w:r>
-        <w:t>COUNT(</w:t>
-      </w:r>
-      <w:proofErr w:type="gramEnd"/>
-      <w:r>
-        <w:t xml:space="preserve">*) FROM </w:t>
-      </w:r>
-      <w:proofErr w:type="spellStart"/>
-      <w:r>
-        <w:t>traffic_volume</w:t>
-      </w:r>
-      <w:proofErr w:type="spellEnd"/>
-      <w:r>
-        <w:t>;)</w:t>
+        <w:t>Row count: 48,204 (via SELECT COUNT(*) FROM traffic_volume;)</w:t>
       </w:r>
       <w:r>
         <w:br/>
-        <w:t xml:space="preserve">Column count: 9, with correct data types (temp/rain_1h/snow_1h as REAL, </w:t>
-      </w:r>
-      <w:proofErr w:type="spellStart"/>
-      <w:r>
-        <w:t>clouds_all</w:t>
-      </w:r>
-      <w:proofErr w:type="spellEnd"/>
-      <w:r>
-        <w:t>/</w:t>
-      </w:r>
-      <w:proofErr w:type="spellStart"/>
-      <w:r>
-        <w:t>traffic_volume</w:t>
-      </w:r>
-      <w:proofErr w:type="spellEnd"/>
-      <w:r>
-        <w:t xml:space="preserve"> as INTEGER)</w:t>
+        <w:t>Column count: 9, with correct data types (temp/rain_1h/snow_1h as REAL, clouds_all/traffic_volume as INTEGER)</w:t>
       </w:r>
       <w:r>
         <w:br/>
-        <w:t xml:space="preserve">Min/max </w:t>
-      </w:r>
-      <w:proofErr w:type="spellStart"/>
-      <w:r>
-        <w:t>traffic_volume</w:t>
-      </w:r>
-      <w:proofErr w:type="spellEnd"/>
-      <w:r>
-        <w:t>: 0 and 7,280, matching the source data</w:t>
+        <w:t>Min/max traffic_volume: 0 and 7,280, matching the source data</w:t>
       </w:r>
     </w:p>
     <w:p>
@@ -297,31 +249,7 @@
           <w:szCs w:val="22"/>
           <w:lang w:val="en-PH"/>
         </w:rPr>
-        <w:t xml:space="preserve">1.2 </w:t>
-      </w:r>
-      <w:proofErr w:type="spellStart"/>
-      <w:r>
-        <w:rPr>
-          <w:rFonts w:ascii="Times New Roman" w:hAnsi="Times New Roman" w:cs="Times New Roman"/>
-          <w:b/>
-          <w:bCs/>
-          <w:sz w:val="22"/>
-          <w:szCs w:val="22"/>
-          <w:lang w:val="en-PH"/>
-        </w:rPr>
-        <w:t>Analyse</w:t>
-      </w:r>
-      <w:proofErr w:type="spellEnd"/>
-      <w:r>
-        <w:rPr>
-          <w:rFonts w:ascii="Times New Roman" w:hAnsi="Times New Roman" w:cs="Times New Roman"/>
-          <w:b/>
-          <w:bCs/>
-          <w:sz w:val="22"/>
-          <w:szCs w:val="22"/>
-          <w:lang w:val="en-PH"/>
-        </w:rPr>
-        <w:t xml:space="preserve"> annual traffic trends</w:t>
+        <w:t>1.2 Analyse annual traffic trends</w:t>
       </w:r>
     </w:p>
     <w:p>
@@ -552,23 +480,7 @@
         <w:t>Note:</w:t>
       </w:r>
       <w:r>
-        <w:t xml:space="preserve"> I found that 5,445 timestamps in this dataset appear 2–3 times each, because the weather feed sometimes logs more than one observation within the same hour. I confirmed </w:t>
-      </w:r>
-      <w:proofErr w:type="spellStart"/>
-      <w:r>
-        <w:t>traffic_volume</w:t>
-      </w:r>
-      <w:proofErr w:type="spellEnd"/>
-      <w:r>
-        <w:t xml:space="preserve"> is identical across these duplicate rows, so I removed duplicates (keeping one row per unique hour, via the </w:t>
-      </w:r>
-      <w:proofErr w:type="spellStart"/>
-      <w:r>
-        <w:t>hourly_traffic</w:t>
-      </w:r>
-      <w:proofErr w:type="spellEnd"/>
-      <w:r>
-        <w:t xml:space="preserve"> view in 02_annual_trends.sql) before summing. Without this step, the totals above would be inflated.</w:t>
+        <w:t xml:space="preserve"> I found that 5,445 timestamps in this dataset appear 2–3 times each, because the weather feed sometimes logs more than one observation within the same hour. I confirmed traffic_volume is identical across these duplicate rows, so I removed duplicates (keeping one row per unique hour, via the hourly_traffic view in 02_annual_trends.sql) before summing. Without this step, the totals above would be inflated.</w:t>
       </w:r>
     </w:p>
     <w:p>
@@ -820,27 +732,8 @@
           <w:sz w:val="22"/>
           <w:szCs w:val="22"/>
         </w:rPr>
-        <w:t xml:space="preserve">The totals above are heavily shaped by how much data </w:t>
-      </w:r>
-      <w:proofErr w:type="gramStart"/>
-      <w:r>
-        <w:rPr>
-          <w:rFonts w:ascii="Times New Roman" w:hAnsi="Times New Roman" w:cs="Times New Roman"/>
-          <w:sz w:val="22"/>
-          <w:szCs w:val="22"/>
-        </w:rPr>
-        <w:t>exists for</w:t>
-      </w:r>
-      <w:proofErr w:type="gramEnd"/>
-      <w:r>
-        <w:rPr>
-          <w:rFonts w:ascii="Times New Roman" w:hAnsi="Times New Roman" w:cs="Times New Roman"/>
-          <w:sz w:val="22"/>
-          <w:szCs w:val="22"/>
-        </w:rPr>
-        <w:t xml:space="preserve"> each year, not just real traffic demand. The percentage of the year </w:t>
-      </w:r>
-      <w:proofErr w:type="gramStart"/>
+        <w:t xml:space="preserve">The totals above are heavily shaped by how much data exists for each year, not just real traffic demand. The percentage of the year </w:t>
+      </w:r>
       <w:r>
         <w:rPr>
           <w:rFonts w:ascii="Times New Roman" w:hAnsi="Times New Roman" w:cs="Times New Roman"/>
@@ -857,7 +750,6 @@
         </w:rPr>
         <w:t>covered</w:t>
       </w:r>
-      <w:proofErr w:type="gramEnd"/>
       <w:r>
         <w:rPr>
           <w:rFonts w:ascii="Times New Roman" w:hAnsi="Times New Roman" w:cs="Times New Roman"/>
@@ -896,18 +788,8 @@
           <w:sz w:val="22"/>
           <w:szCs w:val="22"/>
         </w:rPr>
-        <w:t xml:space="preserve">~ 2 </w:t>
-      </w:r>
-      <w:proofErr w:type="spellStart"/>
-      <w:r>
-        <w:rPr>
-          <w:rFonts w:ascii="Times New Roman" w:hAnsi="Times New Roman" w:cs="Times New Roman"/>
-          <w:sz w:val="22"/>
-          <w:szCs w:val="22"/>
-        </w:rPr>
-        <w:t>mths</w:t>
-      </w:r>
-      <w:proofErr w:type="spellEnd"/>
+        <w:t>~ 2 mths</w:t>
+      </w:r>
       <w:r>
         <w:rPr>
           <w:rFonts w:ascii="Times New Roman" w:hAnsi="Times New Roman" w:cs="Times New Roman"/>
@@ -1038,31 +920,7 @@
           <w:szCs w:val="22"/>
           <w:lang w:val="en-PH"/>
         </w:rPr>
-        <w:t xml:space="preserve">1.3 </w:t>
-      </w:r>
-      <w:proofErr w:type="spellStart"/>
-      <w:r>
-        <w:rPr>
-          <w:rFonts w:ascii="Times New Roman" w:hAnsi="Times New Roman" w:cs="Times New Roman"/>
-          <w:b/>
-          <w:bCs/>
-          <w:sz w:val="22"/>
-          <w:szCs w:val="22"/>
-          <w:lang w:val="en-PH"/>
-        </w:rPr>
-        <w:t>Analyse</w:t>
-      </w:r>
-      <w:proofErr w:type="spellEnd"/>
-      <w:r>
-        <w:rPr>
-          <w:rFonts w:ascii="Times New Roman" w:hAnsi="Times New Roman" w:cs="Times New Roman"/>
-          <w:b/>
-          <w:bCs/>
-          <w:sz w:val="22"/>
-          <w:szCs w:val="22"/>
-          <w:lang w:val="en-PH"/>
-        </w:rPr>
-        <w:t xml:space="preserve"> temperature around holidays</w:t>
+        <w:t>1.3 Analyse temperature around holidays</w:t>
       </w:r>
     </w:p>
     <w:p>
@@ -1310,7 +1168,6 @@
                 <w14:ligatures w14:val="none"/>
               </w:rPr>
             </w:pPr>
-            <w:proofErr w:type="spellStart"/>
             <w:r>
               <w:rPr>
                 <w:rFonts w:ascii="Arial" w:eastAsia="Times New Roman" w:hAnsi="Arial" w:cs="Arial"/>
@@ -1323,22 +1180,7 @@
                 <w:lang w:val="en-SG" w:eastAsia="en-SG"/>
                 <w14:ligatures w14:val="none"/>
               </w:rPr>
-              <w:t>Avg</w:t>
-            </w:r>
-            <w:proofErr w:type="spellEnd"/>
-            <w:r>
-              <w:rPr>
-                <w:rFonts w:ascii="Arial" w:eastAsia="Times New Roman" w:hAnsi="Arial" w:cs="Arial"/>
-                <w:b/>
-                <w:bCs/>
-                <w:color w:val="FFFFFF"/>
-                <w:kern w:val="0"/>
-                <w:sz w:val="22"/>
-                <w:szCs w:val="22"/>
-                <w:lang w:val="en-SG" w:eastAsia="en-SG"/>
-                <w14:ligatures w14:val="none"/>
-              </w:rPr>
-              <w:t xml:space="preserve"> Temp (°C)</w:t>
+              <w:t>Avg Temp (°C)</w:t>
             </w:r>
           </w:p>
         </w:tc>
@@ -1372,7 +1214,6 @@
                 <w14:ligatures w14:val="none"/>
               </w:rPr>
             </w:pPr>
-            <w:proofErr w:type="spellStart"/>
             <w:r>
               <w:rPr>
                 <w:rFonts w:ascii="Arial" w:eastAsia="Times New Roman" w:hAnsi="Arial" w:cs="Arial"/>
@@ -1385,22 +1226,7 @@
                 <w:lang w:val="en-SG" w:eastAsia="en-SG"/>
                 <w14:ligatures w14:val="none"/>
               </w:rPr>
-              <w:t>Avg</w:t>
-            </w:r>
-            <w:proofErr w:type="spellEnd"/>
-            <w:r>
-              <w:rPr>
-                <w:rFonts w:ascii="Arial" w:eastAsia="Times New Roman" w:hAnsi="Arial" w:cs="Arial"/>
-                <w:b/>
-                <w:bCs/>
-                <w:color w:val="FFFFFF"/>
-                <w:kern w:val="0"/>
-                <w:sz w:val="22"/>
-                <w:szCs w:val="22"/>
-                <w:lang w:val="en-SG" w:eastAsia="en-SG"/>
-                <w14:ligatures w14:val="none"/>
-              </w:rPr>
-              <w:t xml:space="preserve"> Temp (K)</w:t>
+              <w:t>Avg Temp (K)</w:t>
             </w:r>
           </w:p>
         </w:tc>
@@ -1480,7 +1306,6 @@
                 <w14:ligatures w14:val="none"/>
               </w:rPr>
             </w:pPr>
-            <w:proofErr w:type="spellStart"/>
             <w:r>
               <w:rPr>
                 <w:rFonts w:ascii="Arial" w:eastAsia="Times New Roman" w:hAnsi="Arial" w:cs="Arial"/>
@@ -1493,22 +1318,7 @@
                 <w:lang w:val="en-SG" w:eastAsia="en-SG"/>
                 <w14:ligatures w14:val="none"/>
               </w:rPr>
-              <w:t>Avg</w:t>
-            </w:r>
-            <w:proofErr w:type="spellEnd"/>
-            <w:r>
-              <w:rPr>
-                <w:rFonts w:ascii="Arial" w:eastAsia="Times New Roman" w:hAnsi="Arial" w:cs="Arial"/>
-                <w:b/>
-                <w:bCs/>
-                <w:color w:val="FFFFFF"/>
-                <w:kern w:val="0"/>
-                <w:sz w:val="22"/>
-                <w:szCs w:val="22"/>
-                <w:lang w:val="en-SG" w:eastAsia="en-SG"/>
-                <w14:ligatures w14:val="none"/>
-              </w:rPr>
-              <w:t xml:space="preserve"> Traffic Volume</w:t>
+              <w:t>Avg Traffic Volume</w:t>
             </w:r>
           </w:p>
         </w:tc>
@@ -3074,25 +2884,7 @@
           <w:sz w:val="22"/>
           <w:szCs w:val="22"/>
         </w:rPr>
-        <w:t xml:space="preserve">(~10mths). As a result, I have marked 2015 New </w:t>
-      </w:r>
-      <w:proofErr w:type="gramStart"/>
-      <w:r>
-        <w:rPr>
-          <w:rFonts w:ascii="Times New Roman" w:hAnsi="Times New Roman" w:cs="Times New Roman"/>
-          <w:sz w:val="22"/>
-          <w:szCs w:val="22"/>
-        </w:rPr>
-        <w:t>Years day</w:t>
-      </w:r>
-      <w:proofErr w:type="gramEnd"/>
-      <w:r>
-        <w:rPr>
-          <w:rFonts w:ascii="Times New Roman" w:hAnsi="Times New Roman" w:cs="Times New Roman"/>
-          <w:sz w:val="22"/>
-          <w:szCs w:val="22"/>
-        </w:rPr>
-        <w:t xml:space="preserve"> as ‘</w:t>
+        <w:t>(~10mths). As a result, I have marked 2015 New Years day as ‘</w:t>
       </w:r>
       <w:r>
         <w:rPr>
@@ -3496,25 +3288,7 @@
           <w:sz w:val="22"/>
           <w:szCs w:val="22"/>
         </w:rPr>
-        <w:t xml:space="preserve">contributing to </w:t>
-      </w:r>
-      <w:proofErr w:type="gramStart"/>
-      <w:r>
-        <w:rPr>
-          <w:rFonts w:ascii="Times New Roman" w:hAnsi="Times New Roman" w:cs="Times New Roman"/>
-          <w:sz w:val="22"/>
-          <w:szCs w:val="22"/>
-        </w:rPr>
-        <w:t>a YoY</w:t>
-      </w:r>
-      <w:proofErr w:type="gramEnd"/>
-      <w:r>
-        <w:rPr>
-          <w:rFonts w:ascii="Times New Roman" w:hAnsi="Times New Roman" w:cs="Times New Roman"/>
-          <w:sz w:val="22"/>
-          <w:szCs w:val="22"/>
-        </w:rPr>
-        <w:t xml:space="preserve"> growth.</w:t>
+        <w:t>contributing to a YoY growth.</w:t>
       </w:r>
     </w:p>
     <w:p>
@@ -3722,12 +3496,2585 @@
       <w:pPr>
         <w:rPr>
           <w:rFonts w:ascii="Times New Roman" w:hAnsi="Times New Roman" w:cs="Times New Roman"/>
-          <w:sz w:val="22"/>
-          <w:szCs w:val="22"/>
-          <w:lang w:val="en-PH"/>
-        </w:rPr>
-      </w:pPr>
-    </w:p>
+          <w:b/>
+          <w:bCs/>
+          <w:sz w:val="22"/>
+          <w:szCs w:val="22"/>
+          <w:lang w:val="en-PH"/>
+        </w:rPr>
+      </w:pPr>
+      <w:r>
+        <w:rPr>
+          <w:rFonts w:ascii="Times New Roman" w:hAnsi="Times New Roman" w:cs="Times New Roman"/>
+          <w:b/>
+          <w:bCs/>
+          <w:sz w:val="22"/>
+          <w:szCs w:val="22"/>
+          <w:lang w:val="en-PH"/>
+        </w:rPr>
+        <w:lastRenderedPageBreak/>
+        <w:t>Task 2: Descriptive Statistics and Correlation</w:t>
+      </w:r>
+    </w:p>
+    <w:p>
+      <w:pPr>
+        <w:rPr>
+          <w:rFonts w:ascii="Times New Roman" w:hAnsi="Times New Roman" w:cs="Times New Roman"/>
+          <w:sz w:val="22"/>
+          <w:szCs w:val="22"/>
+          <w:lang w:val="en-PH"/>
+        </w:rPr>
+      </w:pPr>
+      <w:r>
+        <w:rPr>
+          <w:rFonts w:ascii="Times New Roman" w:hAnsi="Times New Roman" w:cs="Times New Roman"/>
+          <w:sz w:val="22"/>
+          <w:szCs w:val="22"/>
+          <w:lang w:val="en-PH"/>
+        </w:rPr>
+        <w:t>Using the traffic dataset, calculate:</w:t>
+      </w:r>
+    </w:p>
+    <w:p>
+      <w:pPr>
+        <w:rPr>
+          <w:rFonts w:ascii="Times New Roman" w:hAnsi="Times New Roman" w:cs="Times New Roman"/>
+          <w:b/>
+          <w:bCs/>
+          <w:sz w:val="22"/>
+          <w:szCs w:val="22"/>
+          <w:lang w:val="en-PH"/>
+        </w:rPr>
+      </w:pPr>
+      <w:r>
+        <w:rPr>
+          <w:rFonts w:ascii="Times New Roman" w:hAnsi="Times New Roman" w:cs="Times New Roman"/>
+          <w:b/>
+          <w:bCs/>
+          <w:sz w:val="22"/>
+          <w:szCs w:val="22"/>
+          <w:lang w:val="en-PH"/>
+        </w:rPr>
+        <w:t>2.1 Traffic volume statistics</w:t>
+      </w:r>
+    </w:p>
+    <w:p>
+      <w:pPr>
+        <w:pStyle w:val="ListParagraph"/>
+        <w:numPr>
+          <w:ilvl w:val="0"/>
+          <w:numId w:val="8"/>
+        </w:numPr>
+        <w:rPr>
+          <w:rFonts w:ascii="Times New Roman" w:hAnsi="Times New Roman" w:cs="Times New Roman"/>
+          <w:sz w:val="22"/>
+          <w:szCs w:val="22"/>
+          <w:lang w:val="en-PH"/>
+        </w:rPr>
+      </w:pPr>
+      <w:r>
+        <w:rPr>
+          <w:rFonts w:ascii="Times New Roman" w:hAnsi="Times New Roman" w:cs="Times New Roman"/>
+          <w:sz w:val="22"/>
+          <w:szCs w:val="22"/>
+          <w:lang w:val="en-PH"/>
+        </w:rPr>
+        <w:t xml:space="preserve">Mean </w:t>
+      </w:r>
+    </w:p>
+    <w:p>
+      <w:pPr>
+        <w:pStyle w:val="ListParagraph"/>
+        <w:numPr>
+          <w:ilvl w:val="0"/>
+          <w:numId w:val="8"/>
+        </w:numPr>
+        <w:rPr>
+          <w:rFonts w:ascii="Times New Roman" w:hAnsi="Times New Roman" w:cs="Times New Roman"/>
+          <w:sz w:val="22"/>
+          <w:szCs w:val="22"/>
+          <w:lang w:val="en-PH"/>
+        </w:rPr>
+      </w:pPr>
+      <w:r>
+        <w:rPr>
+          <w:rFonts w:ascii="Times New Roman" w:hAnsi="Times New Roman" w:cs="Times New Roman"/>
+          <w:sz w:val="22"/>
+          <w:szCs w:val="22"/>
+          <w:lang w:val="en-PH"/>
+        </w:rPr>
+        <w:t xml:space="preserve">Median </w:t>
+      </w:r>
+    </w:p>
+    <w:p>
+      <w:pPr>
+        <w:pStyle w:val="ListParagraph"/>
+        <w:numPr>
+          <w:ilvl w:val="0"/>
+          <w:numId w:val="8"/>
+        </w:numPr>
+        <w:rPr>
+          <w:rFonts w:ascii="Times New Roman" w:hAnsi="Times New Roman" w:cs="Times New Roman"/>
+          <w:sz w:val="22"/>
+          <w:szCs w:val="22"/>
+          <w:lang w:val="en-PH"/>
+        </w:rPr>
+      </w:pPr>
+      <w:r>
+        <w:rPr>
+          <w:rFonts w:ascii="Times New Roman" w:hAnsi="Times New Roman" w:cs="Times New Roman"/>
+          <w:sz w:val="22"/>
+          <w:szCs w:val="22"/>
+          <w:lang w:val="en-PH"/>
+        </w:rPr>
+        <w:t xml:space="preserve">Standard deviation </w:t>
+      </w:r>
+    </w:p>
+    <w:p>
+      <w:pPr>
+        <w:pStyle w:val="ListParagraph"/>
+        <w:numPr>
+          <w:ilvl w:val="0"/>
+          <w:numId w:val="8"/>
+        </w:numPr>
+        <w:rPr>
+          <w:rFonts w:ascii="Times New Roman" w:hAnsi="Times New Roman" w:cs="Times New Roman"/>
+          <w:sz w:val="22"/>
+          <w:szCs w:val="22"/>
+          <w:lang w:val="en-PH"/>
+        </w:rPr>
+      </w:pPr>
+      <w:r>
+        <w:rPr>
+          <w:rFonts w:ascii="Times New Roman" w:hAnsi="Times New Roman" w:cs="Times New Roman"/>
+          <w:sz w:val="22"/>
+          <w:szCs w:val="22"/>
+          <w:lang w:val="en-PH"/>
+        </w:rPr>
+        <w:t xml:space="preserve">Variance </w:t>
+      </w:r>
+    </w:p>
+    <w:p>
+      <w:pPr>
+        <w:pStyle w:val="ListParagraph"/>
+        <w:numPr>
+          <w:ilvl w:val="0"/>
+          <w:numId w:val="8"/>
+        </w:numPr>
+        <w:rPr>
+          <w:rFonts w:ascii="Times New Roman" w:hAnsi="Times New Roman" w:cs="Times New Roman"/>
+          <w:sz w:val="22"/>
+          <w:szCs w:val="22"/>
+          <w:lang w:val="en-PH"/>
+        </w:rPr>
+      </w:pPr>
+      <w:r>
+        <w:rPr>
+          <w:rFonts w:ascii="Times New Roman" w:hAnsi="Times New Roman" w:cs="Times New Roman"/>
+          <w:sz w:val="22"/>
+          <w:szCs w:val="22"/>
+          <w:lang w:val="en-PH"/>
+        </w:rPr>
+        <w:t xml:space="preserve">Range </w:t>
+      </w:r>
+    </w:p>
+    <w:tbl>
+      <w:tblPr>
+        <w:tblW w:w="4168" w:type="dxa"/>
+        <w:tblLook w:val="04A0" w:firstRow="1" w:lastRow="0" w:firstColumn="1" w:lastColumn="0" w:noHBand="0" w:noVBand="1"/>
+      </w:tblPr>
+      <w:tblGrid>
+        <w:gridCol w:w="1906"/>
+        <w:gridCol w:w="2262"/>
+      </w:tblGrid>
+      <w:tr>
+        <w:trPr>
+          <w:trHeight w:val="277"/>
+        </w:trPr>
+        <w:tc>
+          <w:tcPr>
+            <w:tcW w:w="1906" w:type="dxa"/>
+            <w:tcBorders>
+              <w:top w:val="single" w:sz="4" w:space="0" w:color="auto"/>
+              <w:left w:val="single" w:sz="4" w:space="0" w:color="auto"/>
+              <w:bottom w:val="single" w:sz="4" w:space="0" w:color="auto"/>
+              <w:right w:val="single" w:sz="4" w:space="0" w:color="auto"/>
+            </w:tcBorders>
+            <w:noWrap/>
+            <w:vAlign w:val="bottom"/>
+            <w:hideMark/>
+          </w:tcPr>
+          <w:p>
+            <w:pPr>
+              <w:spacing w:after="0" w:line="240" w:lineRule="auto"/>
+              <w:rPr>
+                <w:rFonts w:ascii="Aptos Narrow" w:eastAsia="Times New Roman" w:hAnsi="Aptos Narrow" w:cs="Times New Roman"/>
+                <w:b/>
+                <w:bCs/>
+                <w:color w:val="000000"/>
+                <w:kern w:val="0"/>
+                <w:sz w:val="22"/>
+                <w:szCs w:val="22"/>
+                <w:lang w:val="en-SG" w:eastAsia="en-SG"/>
+                <w14:ligatures w14:val="none"/>
+              </w:rPr>
+            </w:pPr>
+            <w:r>
+              <w:rPr>
+                <w:rFonts w:ascii="Aptos Narrow" w:eastAsia="Times New Roman" w:hAnsi="Aptos Narrow" w:cs="Times New Roman"/>
+                <w:b/>
+                <w:bCs/>
+                <w:color w:val="000000"/>
+                <w:kern w:val="0"/>
+                <w:sz w:val="22"/>
+                <w:szCs w:val="22"/>
+                <w:lang w:val="en-SG" w:eastAsia="en-SG"/>
+                <w14:ligatures w14:val="none"/>
+              </w:rPr>
+              <w:t xml:space="preserve">Mean </w:t>
+            </w:r>
+          </w:p>
+        </w:tc>
+        <w:tc>
+          <w:tcPr>
+            <w:tcW w:w="2262" w:type="dxa"/>
+            <w:tcBorders>
+              <w:top w:val="single" w:sz="4" w:space="0" w:color="auto"/>
+              <w:left w:val="nil"/>
+              <w:bottom w:val="single" w:sz="4" w:space="0" w:color="auto"/>
+              <w:right w:val="single" w:sz="4" w:space="0" w:color="auto"/>
+            </w:tcBorders>
+            <w:noWrap/>
+            <w:vAlign w:val="bottom"/>
+            <w:hideMark/>
+          </w:tcPr>
+          <w:p>
+            <w:pPr>
+              <w:spacing w:after="0" w:line="240" w:lineRule="auto"/>
+              <w:rPr>
+                <w:rFonts w:ascii="Aptos Narrow" w:eastAsia="Times New Roman" w:hAnsi="Aptos Narrow" w:cs="Times New Roman"/>
+                <w:color w:val="000000"/>
+                <w:kern w:val="0"/>
+                <w:sz w:val="22"/>
+                <w:szCs w:val="22"/>
+                <w:lang w:val="en-SG" w:eastAsia="en-SG"/>
+                <w14:ligatures w14:val="none"/>
+              </w:rPr>
+            </w:pPr>
+            <w:r>
+              <w:rPr>
+                <w:rFonts w:ascii="Aptos Narrow" w:eastAsia="Times New Roman" w:hAnsi="Aptos Narrow" w:cs="Times New Roman"/>
+                <w:color w:val="000000"/>
+                <w:kern w:val="0"/>
+                <w:sz w:val="22"/>
+                <w:szCs w:val="22"/>
+                <w:lang w:val="en-SG" w:eastAsia="en-SG"/>
+                <w14:ligatures w14:val="none"/>
+              </w:rPr>
+              <w:t xml:space="preserve">            3,290.65 </w:t>
+            </w:r>
+          </w:p>
+        </w:tc>
+      </w:tr>
+      <w:tr>
+        <w:trPr>
+          <w:trHeight w:val="277"/>
+        </w:trPr>
+        <w:tc>
+          <w:tcPr>
+            <w:tcW w:w="1906" w:type="dxa"/>
+            <w:tcBorders>
+              <w:top w:val="nil"/>
+              <w:left w:val="single" w:sz="4" w:space="0" w:color="auto"/>
+              <w:bottom w:val="single" w:sz="4" w:space="0" w:color="auto"/>
+              <w:right w:val="single" w:sz="4" w:space="0" w:color="auto"/>
+            </w:tcBorders>
+            <w:noWrap/>
+            <w:vAlign w:val="bottom"/>
+            <w:hideMark/>
+          </w:tcPr>
+          <w:p>
+            <w:pPr>
+              <w:spacing w:after="0" w:line="240" w:lineRule="auto"/>
+              <w:rPr>
+                <w:rFonts w:ascii="Aptos Narrow" w:eastAsia="Times New Roman" w:hAnsi="Aptos Narrow" w:cs="Times New Roman"/>
+                <w:b/>
+                <w:bCs/>
+                <w:color w:val="000000"/>
+                <w:kern w:val="0"/>
+                <w:sz w:val="22"/>
+                <w:szCs w:val="22"/>
+                <w:lang w:val="en-SG" w:eastAsia="en-SG"/>
+                <w14:ligatures w14:val="none"/>
+              </w:rPr>
+            </w:pPr>
+            <w:r>
+              <w:rPr>
+                <w:rFonts w:ascii="Aptos Narrow" w:eastAsia="Times New Roman" w:hAnsi="Aptos Narrow" w:cs="Times New Roman"/>
+                <w:b/>
+                <w:bCs/>
+                <w:color w:val="000000"/>
+                <w:kern w:val="0"/>
+                <w:sz w:val="22"/>
+                <w:szCs w:val="22"/>
+                <w:lang w:val="en-SG" w:eastAsia="en-SG"/>
+                <w14:ligatures w14:val="none"/>
+              </w:rPr>
+              <w:t xml:space="preserve"> Median </w:t>
+            </w:r>
+          </w:p>
+        </w:tc>
+        <w:tc>
+          <w:tcPr>
+            <w:tcW w:w="2262" w:type="dxa"/>
+            <w:tcBorders>
+              <w:top w:val="nil"/>
+              <w:left w:val="nil"/>
+              <w:bottom w:val="single" w:sz="4" w:space="0" w:color="auto"/>
+              <w:right w:val="single" w:sz="4" w:space="0" w:color="auto"/>
+            </w:tcBorders>
+            <w:noWrap/>
+            <w:vAlign w:val="bottom"/>
+            <w:hideMark/>
+          </w:tcPr>
+          <w:p>
+            <w:pPr>
+              <w:spacing w:after="0" w:line="240" w:lineRule="auto"/>
+              <w:rPr>
+                <w:rFonts w:ascii="Aptos Narrow" w:eastAsia="Times New Roman" w:hAnsi="Aptos Narrow" w:cs="Times New Roman"/>
+                <w:color w:val="000000"/>
+                <w:kern w:val="0"/>
+                <w:sz w:val="22"/>
+                <w:szCs w:val="22"/>
+                <w:lang w:val="en-SG" w:eastAsia="en-SG"/>
+                <w14:ligatures w14:val="none"/>
+              </w:rPr>
+            </w:pPr>
+            <w:r>
+              <w:rPr>
+                <w:rFonts w:ascii="Aptos Narrow" w:eastAsia="Times New Roman" w:hAnsi="Aptos Narrow" w:cs="Times New Roman"/>
+                <w:color w:val="000000"/>
+                <w:kern w:val="0"/>
+                <w:sz w:val="22"/>
+                <w:szCs w:val="22"/>
+                <w:lang w:val="en-SG" w:eastAsia="en-SG"/>
+                <w14:ligatures w14:val="none"/>
+              </w:rPr>
+              <w:t xml:space="preserve">            3,427.00 </w:t>
+            </w:r>
+          </w:p>
+        </w:tc>
+      </w:tr>
+      <w:tr>
+        <w:trPr>
+          <w:trHeight w:val="277"/>
+        </w:trPr>
+        <w:tc>
+          <w:tcPr>
+            <w:tcW w:w="1906" w:type="dxa"/>
+            <w:tcBorders>
+              <w:top w:val="nil"/>
+              <w:left w:val="single" w:sz="4" w:space="0" w:color="auto"/>
+              <w:bottom w:val="single" w:sz="4" w:space="0" w:color="auto"/>
+              <w:right w:val="single" w:sz="4" w:space="0" w:color="auto"/>
+            </w:tcBorders>
+            <w:noWrap/>
+            <w:vAlign w:val="bottom"/>
+            <w:hideMark/>
+          </w:tcPr>
+          <w:p>
+            <w:pPr>
+              <w:spacing w:after="0" w:line="240" w:lineRule="auto"/>
+              <w:rPr>
+                <w:rFonts w:ascii="Aptos Narrow" w:eastAsia="Times New Roman" w:hAnsi="Aptos Narrow" w:cs="Times New Roman"/>
+                <w:b/>
+                <w:bCs/>
+                <w:color w:val="000000"/>
+                <w:kern w:val="0"/>
+                <w:sz w:val="22"/>
+                <w:szCs w:val="22"/>
+                <w:lang w:val="en-SG" w:eastAsia="en-SG"/>
+                <w14:ligatures w14:val="none"/>
+              </w:rPr>
+            </w:pPr>
+            <w:r>
+              <w:rPr>
+                <w:rFonts w:ascii="Aptos Narrow" w:eastAsia="Times New Roman" w:hAnsi="Aptos Narrow" w:cs="Times New Roman"/>
+                <w:b/>
+                <w:bCs/>
+                <w:color w:val="000000"/>
+                <w:kern w:val="0"/>
+                <w:sz w:val="22"/>
+                <w:szCs w:val="22"/>
+                <w:lang w:val="en-SG" w:eastAsia="en-SG"/>
+                <w14:ligatures w14:val="none"/>
+              </w:rPr>
+              <w:t xml:space="preserve"> Std Dev </w:t>
+            </w:r>
+          </w:p>
+        </w:tc>
+        <w:tc>
+          <w:tcPr>
+            <w:tcW w:w="2262" w:type="dxa"/>
+            <w:tcBorders>
+              <w:top w:val="nil"/>
+              <w:left w:val="nil"/>
+              <w:bottom w:val="single" w:sz="4" w:space="0" w:color="auto"/>
+              <w:right w:val="single" w:sz="4" w:space="0" w:color="auto"/>
+            </w:tcBorders>
+            <w:noWrap/>
+            <w:vAlign w:val="bottom"/>
+            <w:hideMark/>
+          </w:tcPr>
+          <w:p>
+            <w:pPr>
+              <w:spacing w:after="0" w:line="240" w:lineRule="auto"/>
+              <w:rPr>
+                <w:rFonts w:ascii="Aptos Narrow" w:eastAsia="Times New Roman" w:hAnsi="Aptos Narrow" w:cs="Times New Roman"/>
+                <w:color w:val="000000"/>
+                <w:kern w:val="0"/>
+                <w:sz w:val="22"/>
+                <w:szCs w:val="22"/>
+                <w:lang w:val="en-SG" w:eastAsia="en-SG"/>
+                <w14:ligatures w14:val="none"/>
+              </w:rPr>
+            </w:pPr>
+            <w:r>
+              <w:rPr>
+                <w:rFonts w:ascii="Aptos Narrow" w:eastAsia="Times New Roman" w:hAnsi="Aptos Narrow" w:cs="Times New Roman"/>
+                <w:color w:val="000000"/>
+                <w:kern w:val="0"/>
+                <w:sz w:val="22"/>
+                <w:szCs w:val="22"/>
+                <w:lang w:val="en-SG" w:eastAsia="en-SG"/>
+                <w14:ligatures w14:val="none"/>
+              </w:rPr>
+              <w:t xml:space="preserve">            1,984.77 </w:t>
+            </w:r>
+          </w:p>
+        </w:tc>
+      </w:tr>
+      <w:tr>
+        <w:trPr>
+          <w:trHeight w:val="277"/>
+        </w:trPr>
+        <w:tc>
+          <w:tcPr>
+            <w:tcW w:w="1906" w:type="dxa"/>
+            <w:tcBorders>
+              <w:top w:val="nil"/>
+              <w:left w:val="single" w:sz="4" w:space="0" w:color="auto"/>
+              <w:bottom w:val="single" w:sz="4" w:space="0" w:color="auto"/>
+              <w:right w:val="single" w:sz="4" w:space="0" w:color="auto"/>
+            </w:tcBorders>
+            <w:noWrap/>
+            <w:vAlign w:val="bottom"/>
+            <w:hideMark/>
+          </w:tcPr>
+          <w:p>
+            <w:pPr>
+              <w:spacing w:after="0" w:line="240" w:lineRule="auto"/>
+              <w:rPr>
+                <w:rFonts w:ascii="Aptos Narrow" w:eastAsia="Times New Roman" w:hAnsi="Aptos Narrow" w:cs="Times New Roman"/>
+                <w:b/>
+                <w:bCs/>
+                <w:color w:val="000000"/>
+                <w:kern w:val="0"/>
+                <w:sz w:val="22"/>
+                <w:szCs w:val="22"/>
+                <w:lang w:val="en-SG" w:eastAsia="en-SG"/>
+                <w14:ligatures w14:val="none"/>
+              </w:rPr>
+            </w:pPr>
+            <w:r>
+              <w:rPr>
+                <w:rFonts w:ascii="Aptos Narrow" w:eastAsia="Times New Roman" w:hAnsi="Aptos Narrow" w:cs="Times New Roman"/>
+                <w:b/>
+                <w:bCs/>
+                <w:color w:val="000000"/>
+                <w:kern w:val="0"/>
+                <w:sz w:val="22"/>
+                <w:szCs w:val="22"/>
+                <w:lang w:val="en-SG" w:eastAsia="en-SG"/>
+                <w14:ligatures w14:val="none"/>
+              </w:rPr>
+              <w:t xml:space="preserve"> Variance </w:t>
+            </w:r>
+          </w:p>
+        </w:tc>
+        <w:tc>
+          <w:tcPr>
+            <w:tcW w:w="2262" w:type="dxa"/>
+            <w:tcBorders>
+              <w:top w:val="nil"/>
+              <w:left w:val="nil"/>
+              <w:bottom w:val="single" w:sz="4" w:space="0" w:color="auto"/>
+              <w:right w:val="single" w:sz="4" w:space="0" w:color="auto"/>
+            </w:tcBorders>
+            <w:noWrap/>
+            <w:vAlign w:val="bottom"/>
+            <w:hideMark/>
+          </w:tcPr>
+          <w:p>
+            <w:pPr>
+              <w:spacing w:after="0" w:line="240" w:lineRule="auto"/>
+              <w:rPr>
+                <w:rFonts w:ascii="Aptos Narrow" w:eastAsia="Times New Roman" w:hAnsi="Aptos Narrow" w:cs="Times New Roman"/>
+                <w:color w:val="000000"/>
+                <w:kern w:val="0"/>
+                <w:sz w:val="22"/>
+                <w:szCs w:val="22"/>
+                <w:lang w:val="en-SG" w:eastAsia="en-SG"/>
+                <w14:ligatures w14:val="none"/>
+              </w:rPr>
+            </w:pPr>
+            <w:r>
+              <w:rPr>
+                <w:rFonts w:ascii="Aptos Narrow" w:eastAsia="Times New Roman" w:hAnsi="Aptos Narrow" w:cs="Times New Roman"/>
+                <w:color w:val="000000"/>
+                <w:kern w:val="0"/>
+                <w:sz w:val="22"/>
+                <w:szCs w:val="22"/>
+                <w:lang w:val="en-SG" w:eastAsia="en-SG"/>
+                <w14:ligatures w14:val="none"/>
+              </w:rPr>
+              <w:t xml:space="preserve">   3,939,323.50 </w:t>
+            </w:r>
+          </w:p>
+        </w:tc>
+      </w:tr>
+      <w:tr>
+        <w:trPr>
+          <w:trHeight w:val="277"/>
+        </w:trPr>
+        <w:tc>
+          <w:tcPr>
+            <w:tcW w:w="1906" w:type="dxa"/>
+            <w:tcBorders>
+              <w:top w:val="nil"/>
+              <w:left w:val="single" w:sz="4" w:space="0" w:color="auto"/>
+              <w:bottom w:val="single" w:sz="4" w:space="0" w:color="auto"/>
+              <w:right w:val="single" w:sz="4" w:space="0" w:color="auto"/>
+            </w:tcBorders>
+            <w:noWrap/>
+            <w:vAlign w:val="bottom"/>
+            <w:hideMark/>
+          </w:tcPr>
+          <w:p>
+            <w:pPr>
+              <w:spacing w:after="0" w:line="240" w:lineRule="auto"/>
+              <w:rPr>
+                <w:rFonts w:ascii="Aptos Narrow" w:eastAsia="Times New Roman" w:hAnsi="Aptos Narrow" w:cs="Times New Roman"/>
+                <w:b/>
+                <w:bCs/>
+                <w:color w:val="000000"/>
+                <w:kern w:val="0"/>
+                <w:sz w:val="22"/>
+                <w:szCs w:val="22"/>
+                <w:lang w:val="en-SG" w:eastAsia="en-SG"/>
+                <w14:ligatures w14:val="none"/>
+              </w:rPr>
+            </w:pPr>
+            <w:r>
+              <w:rPr>
+                <w:rFonts w:ascii="Aptos Narrow" w:eastAsia="Times New Roman" w:hAnsi="Aptos Narrow" w:cs="Times New Roman"/>
+                <w:b/>
+                <w:bCs/>
+                <w:color w:val="000000"/>
+                <w:kern w:val="0"/>
+                <w:sz w:val="22"/>
+                <w:szCs w:val="22"/>
+                <w:lang w:val="en-SG" w:eastAsia="en-SG"/>
+                <w14:ligatures w14:val="none"/>
+              </w:rPr>
+              <w:t xml:space="preserve"> Minimum </w:t>
+            </w:r>
+          </w:p>
+        </w:tc>
+        <w:tc>
+          <w:tcPr>
+            <w:tcW w:w="2262" w:type="dxa"/>
+            <w:tcBorders>
+              <w:top w:val="nil"/>
+              <w:left w:val="nil"/>
+              <w:bottom w:val="single" w:sz="4" w:space="0" w:color="auto"/>
+              <w:right w:val="single" w:sz="4" w:space="0" w:color="auto"/>
+            </w:tcBorders>
+            <w:noWrap/>
+            <w:vAlign w:val="bottom"/>
+            <w:hideMark/>
+          </w:tcPr>
+          <w:p>
+            <w:pPr>
+              <w:spacing w:after="0" w:line="240" w:lineRule="auto"/>
+              <w:rPr>
+                <w:rFonts w:ascii="Aptos Narrow" w:eastAsia="Times New Roman" w:hAnsi="Aptos Narrow" w:cs="Times New Roman"/>
+                <w:color w:val="000000"/>
+                <w:kern w:val="0"/>
+                <w:sz w:val="22"/>
+                <w:szCs w:val="22"/>
+                <w:lang w:val="en-SG" w:eastAsia="en-SG"/>
+                <w14:ligatures w14:val="none"/>
+              </w:rPr>
+            </w:pPr>
+            <w:r>
+              <w:rPr>
+                <w:rFonts w:ascii="Aptos Narrow" w:eastAsia="Times New Roman" w:hAnsi="Aptos Narrow" w:cs="Times New Roman"/>
+                <w:color w:val="000000"/>
+                <w:kern w:val="0"/>
+                <w:sz w:val="22"/>
+                <w:szCs w:val="22"/>
+                <w:lang w:val="en-SG" w:eastAsia="en-SG"/>
+                <w14:ligatures w14:val="none"/>
+              </w:rPr>
+              <w:t xml:space="preserve">                            -   </w:t>
+            </w:r>
+          </w:p>
+        </w:tc>
+      </w:tr>
+      <w:tr>
+        <w:trPr>
+          <w:trHeight w:val="277"/>
+        </w:trPr>
+        <w:tc>
+          <w:tcPr>
+            <w:tcW w:w="1906" w:type="dxa"/>
+            <w:tcBorders>
+              <w:top w:val="nil"/>
+              <w:left w:val="single" w:sz="4" w:space="0" w:color="auto"/>
+              <w:bottom w:val="single" w:sz="4" w:space="0" w:color="auto"/>
+              <w:right w:val="single" w:sz="4" w:space="0" w:color="auto"/>
+            </w:tcBorders>
+            <w:noWrap/>
+            <w:vAlign w:val="bottom"/>
+            <w:hideMark/>
+          </w:tcPr>
+          <w:p>
+            <w:pPr>
+              <w:spacing w:after="0" w:line="240" w:lineRule="auto"/>
+              <w:rPr>
+                <w:rFonts w:ascii="Aptos Narrow" w:eastAsia="Times New Roman" w:hAnsi="Aptos Narrow" w:cs="Times New Roman"/>
+                <w:b/>
+                <w:bCs/>
+                <w:color w:val="000000"/>
+                <w:kern w:val="0"/>
+                <w:sz w:val="22"/>
+                <w:szCs w:val="22"/>
+                <w:lang w:val="en-SG" w:eastAsia="en-SG"/>
+                <w14:ligatures w14:val="none"/>
+              </w:rPr>
+            </w:pPr>
+            <w:r>
+              <w:rPr>
+                <w:rFonts w:ascii="Aptos Narrow" w:eastAsia="Times New Roman" w:hAnsi="Aptos Narrow" w:cs="Times New Roman"/>
+                <w:b/>
+                <w:bCs/>
+                <w:color w:val="000000"/>
+                <w:kern w:val="0"/>
+                <w:sz w:val="22"/>
+                <w:szCs w:val="22"/>
+                <w:lang w:val="en-SG" w:eastAsia="en-SG"/>
+                <w14:ligatures w14:val="none"/>
+              </w:rPr>
+              <w:t xml:space="preserve"> Maximum </w:t>
+            </w:r>
+          </w:p>
+        </w:tc>
+        <w:tc>
+          <w:tcPr>
+            <w:tcW w:w="2262" w:type="dxa"/>
+            <w:tcBorders>
+              <w:top w:val="nil"/>
+              <w:left w:val="nil"/>
+              <w:bottom w:val="single" w:sz="4" w:space="0" w:color="auto"/>
+              <w:right w:val="single" w:sz="4" w:space="0" w:color="auto"/>
+            </w:tcBorders>
+            <w:noWrap/>
+            <w:vAlign w:val="bottom"/>
+            <w:hideMark/>
+          </w:tcPr>
+          <w:p>
+            <w:pPr>
+              <w:spacing w:after="0" w:line="240" w:lineRule="auto"/>
+              <w:rPr>
+                <w:rFonts w:ascii="Aptos Narrow" w:eastAsia="Times New Roman" w:hAnsi="Aptos Narrow" w:cs="Times New Roman"/>
+                <w:color w:val="000000"/>
+                <w:kern w:val="0"/>
+                <w:sz w:val="22"/>
+                <w:szCs w:val="22"/>
+                <w:lang w:val="en-SG" w:eastAsia="en-SG"/>
+                <w14:ligatures w14:val="none"/>
+              </w:rPr>
+            </w:pPr>
+            <w:r>
+              <w:rPr>
+                <w:rFonts w:ascii="Aptos Narrow" w:eastAsia="Times New Roman" w:hAnsi="Aptos Narrow" w:cs="Times New Roman"/>
+                <w:color w:val="000000"/>
+                <w:kern w:val="0"/>
+                <w:sz w:val="22"/>
+                <w:szCs w:val="22"/>
+                <w:lang w:val="en-SG" w:eastAsia="en-SG"/>
+                <w14:ligatures w14:val="none"/>
+              </w:rPr>
+              <w:t xml:space="preserve">            7,280.00 </w:t>
+            </w:r>
+          </w:p>
+        </w:tc>
+      </w:tr>
+      <w:tr>
+        <w:trPr>
+          <w:trHeight w:val="277"/>
+        </w:trPr>
+        <w:tc>
+          <w:tcPr>
+            <w:tcW w:w="1906" w:type="dxa"/>
+            <w:tcBorders>
+              <w:top w:val="nil"/>
+              <w:left w:val="single" w:sz="4" w:space="0" w:color="auto"/>
+              <w:bottom w:val="single" w:sz="4" w:space="0" w:color="auto"/>
+              <w:right w:val="single" w:sz="4" w:space="0" w:color="auto"/>
+            </w:tcBorders>
+            <w:noWrap/>
+            <w:vAlign w:val="bottom"/>
+            <w:hideMark/>
+          </w:tcPr>
+          <w:p>
+            <w:pPr>
+              <w:spacing w:after="0" w:line="240" w:lineRule="auto"/>
+              <w:rPr>
+                <w:rFonts w:ascii="Aptos Narrow" w:eastAsia="Times New Roman" w:hAnsi="Aptos Narrow" w:cs="Times New Roman"/>
+                <w:b/>
+                <w:bCs/>
+                <w:color w:val="000000"/>
+                <w:kern w:val="0"/>
+                <w:sz w:val="22"/>
+                <w:szCs w:val="22"/>
+                <w:lang w:val="en-SG" w:eastAsia="en-SG"/>
+                <w14:ligatures w14:val="none"/>
+              </w:rPr>
+            </w:pPr>
+            <w:r>
+              <w:rPr>
+                <w:rFonts w:ascii="Aptos Narrow" w:eastAsia="Times New Roman" w:hAnsi="Aptos Narrow" w:cs="Times New Roman"/>
+                <w:b/>
+                <w:bCs/>
+                <w:color w:val="000000"/>
+                <w:kern w:val="0"/>
+                <w:sz w:val="22"/>
+                <w:szCs w:val="22"/>
+                <w:lang w:val="en-SG" w:eastAsia="en-SG"/>
+                <w14:ligatures w14:val="none"/>
+              </w:rPr>
+              <w:t xml:space="preserve"> Range </w:t>
+            </w:r>
+          </w:p>
+        </w:tc>
+        <w:tc>
+          <w:tcPr>
+            <w:tcW w:w="2262" w:type="dxa"/>
+            <w:tcBorders>
+              <w:top w:val="nil"/>
+              <w:left w:val="nil"/>
+              <w:bottom w:val="single" w:sz="4" w:space="0" w:color="auto"/>
+              <w:right w:val="single" w:sz="4" w:space="0" w:color="auto"/>
+            </w:tcBorders>
+            <w:noWrap/>
+            <w:vAlign w:val="bottom"/>
+            <w:hideMark/>
+          </w:tcPr>
+          <w:p>
+            <w:pPr>
+              <w:spacing w:after="0" w:line="240" w:lineRule="auto"/>
+              <w:rPr>
+                <w:rFonts w:ascii="Aptos Narrow" w:eastAsia="Times New Roman" w:hAnsi="Aptos Narrow" w:cs="Times New Roman"/>
+                <w:color w:val="000000"/>
+                <w:kern w:val="0"/>
+                <w:sz w:val="22"/>
+                <w:szCs w:val="22"/>
+                <w:lang w:val="en-SG" w:eastAsia="en-SG"/>
+                <w14:ligatures w14:val="none"/>
+              </w:rPr>
+            </w:pPr>
+            <w:r>
+              <w:rPr>
+                <w:rFonts w:ascii="Aptos Narrow" w:eastAsia="Times New Roman" w:hAnsi="Aptos Narrow" w:cs="Times New Roman"/>
+                <w:color w:val="000000"/>
+                <w:kern w:val="0"/>
+                <w:sz w:val="22"/>
+                <w:szCs w:val="22"/>
+                <w:lang w:val="en-SG" w:eastAsia="en-SG"/>
+                <w14:ligatures w14:val="none"/>
+              </w:rPr>
+              <w:t xml:space="preserve">            7,280.00 </w:t>
+            </w:r>
+          </w:p>
+        </w:tc>
+      </w:tr>
+    </w:tbl>
+    <w:p>
+      <w:pPr>
+        <w:rPr>
+          <w:rFonts w:ascii="Times New Roman" w:hAnsi="Times New Roman" w:cs="Times New Roman"/>
+          <w:sz w:val="22"/>
+          <w:szCs w:val="22"/>
+          <w:lang w:val="en-PH"/>
+        </w:rPr>
+      </w:pPr>
+    </w:p>
+    <w:p>
+      <w:pPr>
+        <w:rPr>
+          <w:rFonts w:ascii="Times New Roman" w:hAnsi="Times New Roman" w:cs="Times New Roman"/>
+          <w:b/>
+          <w:bCs/>
+          <w:sz w:val="22"/>
+          <w:szCs w:val="22"/>
+          <w:lang w:val="en-PH"/>
+        </w:rPr>
+      </w:pPr>
+      <w:r>
+        <w:rPr>
+          <w:rFonts w:ascii="Times New Roman" w:hAnsi="Times New Roman" w:cs="Times New Roman"/>
+          <w:b/>
+          <w:bCs/>
+          <w:sz w:val="22"/>
+          <w:szCs w:val="22"/>
+          <w:lang w:val="en-PH"/>
+        </w:rPr>
+        <w:t>Interpret what these statistics tell you about traffic volume and its variability.</w:t>
+      </w:r>
+    </w:p>
+    <w:p>
+      <w:pPr>
+        <w:rPr>
+          <w:rFonts w:ascii="Times New Roman" w:hAnsi="Times New Roman" w:cs="Times New Roman"/>
+          <w:sz w:val="22"/>
+          <w:szCs w:val="22"/>
+        </w:rPr>
+      </w:pPr>
+      <w:r>
+        <w:rPr>
+          <w:rFonts w:ascii="Times New Roman" w:hAnsi="Times New Roman" w:cs="Times New Roman"/>
+          <w:b/>
+          <w:bCs/>
+          <w:sz w:val="22"/>
+          <w:szCs w:val="22"/>
+        </w:rPr>
+        <w:t>Mean vs Median:</w:t>
+      </w:r>
+      <w:r>
+        <w:rPr>
+          <w:rFonts w:ascii="Times New Roman" w:hAnsi="Times New Roman" w:cs="Times New Roman"/>
+          <w:sz w:val="22"/>
+          <w:szCs w:val="22"/>
+        </w:rPr>
+        <w:t xml:space="preserve"> </w:t>
+      </w:r>
+      <w:r>
+        <w:rPr>
+          <w:rFonts w:ascii="Times New Roman" w:hAnsi="Times New Roman" w:cs="Times New Roman"/>
+          <w:sz w:val="22"/>
+          <w:szCs w:val="22"/>
+        </w:rPr>
+        <w:t xml:space="preserve">The mean (3,290.65) is noticeably lower than the median (3,427.00), a gap of about 136 vehicles. Since the mean </w:t>
+      </w:r>
+      <w:r>
+        <w:rPr>
+          <w:rFonts w:ascii="Times New Roman" w:hAnsi="Times New Roman" w:cs="Times New Roman"/>
+          <w:sz w:val="22"/>
+          <w:szCs w:val="22"/>
+        </w:rPr>
+        <w:t>is</w:t>
+      </w:r>
+      <w:r>
+        <w:rPr>
+          <w:rFonts w:ascii="Times New Roman" w:hAnsi="Times New Roman" w:cs="Times New Roman"/>
+          <w:sz w:val="22"/>
+          <w:szCs w:val="22"/>
+        </w:rPr>
+        <w:t xml:space="preserve"> below the median, the distribution of traffic volume leans toward lower values. There is a cluster of low traffic hours, mainly overnight and early morning when volume drops close to zero, pulling the average down, while most hours sit at moderate to high volumes clustered nearer the median.</w:t>
+      </w:r>
+    </w:p>
+    <w:p>
+      <w:pPr>
+        <w:rPr>
+          <w:rFonts w:ascii="Times New Roman" w:hAnsi="Times New Roman" w:cs="Times New Roman"/>
+          <w:sz w:val="22"/>
+          <w:szCs w:val="22"/>
+        </w:rPr>
+      </w:pPr>
+      <w:r>
+        <w:rPr>
+          <w:rFonts w:ascii="Times New Roman" w:hAnsi="Times New Roman" w:cs="Times New Roman"/>
+          <w:b/>
+          <w:bCs/>
+          <w:sz w:val="22"/>
+          <w:szCs w:val="22"/>
+        </w:rPr>
+        <w:t>Std Deviation &amp; Variance:</w:t>
+      </w:r>
+      <w:r>
+        <w:rPr>
+          <w:rFonts w:ascii="Times New Roman" w:hAnsi="Times New Roman" w:cs="Times New Roman"/>
+          <w:b/>
+          <w:bCs/>
+          <w:sz w:val="22"/>
+          <w:szCs w:val="22"/>
+        </w:rPr>
+        <w:t xml:space="preserve"> </w:t>
+      </w:r>
+      <w:r>
+        <w:rPr>
+          <w:rFonts w:ascii="Times New Roman" w:hAnsi="Times New Roman" w:cs="Times New Roman"/>
+          <w:sz w:val="22"/>
+          <w:szCs w:val="22"/>
+        </w:rPr>
+        <w:t xml:space="preserve">The standard deviation (1,984.77) is large relative to the mean, </w:t>
+      </w:r>
+      <w:r>
+        <w:rPr>
+          <w:rFonts w:ascii="Times New Roman" w:hAnsi="Times New Roman" w:cs="Times New Roman"/>
+          <w:sz w:val="22"/>
+          <w:szCs w:val="22"/>
+        </w:rPr>
+        <w:t>and looking at the coefficient of variation at ~</w:t>
+      </w:r>
+      <w:r>
+        <w:rPr>
+          <w:rFonts w:ascii="Times New Roman" w:hAnsi="Times New Roman" w:cs="Times New Roman"/>
+          <w:sz w:val="22"/>
+          <w:szCs w:val="22"/>
+        </w:rPr>
+        <w:t>60.3</w:t>
+      </w:r>
+      <w:r>
+        <w:rPr>
+          <w:rFonts w:ascii="Times New Roman" w:hAnsi="Times New Roman" w:cs="Times New Roman"/>
+          <w:sz w:val="22"/>
+          <w:szCs w:val="22"/>
+        </w:rPr>
+        <w:t xml:space="preserve">% of the mean value (1,984.77 </w:t>
+      </w:r>
+      <w:r>
+        <w:rPr>
+          <w:rFonts w:ascii="Times New Roman" w:hAnsi="Times New Roman" w:cs="Times New Roman"/>
+          <w:sz w:val="22"/>
+          <w:szCs w:val="22"/>
+        </w:rPr>
+        <w:t xml:space="preserve">/ </w:t>
+      </w:r>
+      <w:r>
+        <w:rPr>
+          <w:rFonts w:ascii="Times New Roman" w:hAnsi="Times New Roman" w:cs="Times New Roman"/>
+          <w:sz w:val="22"/>
+          <w:szCs w:val="22"/>
+        </w:rPr>
+        <w:t xml:space="preserve">3,290.65 is </w:t>
+      </w:r>
+      <w:r>
+        <w:rPr>
+          <w:rFonts w:ascii="Times New Roman" w:hAnsi="Times New Roman" w:cs="Times New Roman"/>
+          <w:sz w:val="22"/>
+          <w:szCs w:val="22"/>
+        </w:rPr>
+        <w:t>~</w:t>
+      </w:r>
+      <w:r>
+        <w:rPr>
+          <w:rFonts w:ascii="Times New Roman" w:hAnsi="Times New Roman" w:cs="Times New Roman"/>
+          <w:sz w:val="22"/>
+          <w:szCs w:val="22"/>
+        </w:rPr>
+        <w:t xml:space="preserve"> 60.3%</w:t>
+      </w:r>
+      <w:r>
+        <w:rPr>
+          <w:rFonts w:ascii="Times New Roman" w:hAnsi="Times New Roman" w:cs="Times New Roman"/>
+          <w:sz w:val="22"/>
+          <w:szCs w:val="22"/>
+        </w:rPr>
+        <w:t>)</w:t>
+      </w:r>
+      <w:r>
+        <w:rPr>
+          <w:rFonts w:ascii="Times New Roman" w:hAnsi="Times New Roman" w:cs="Times New Roman"/>
+          <w:sz w:val="22"/>
+          <w:szCs w:val="22"/>
+        </w:rPr>
+        <w:t xml:space="preserve"> indicates substantial </w:t>
+      </w:r>
+      <w:r>
+        <w:rPr>
+          <w:rFonts w:ascii="Times New Roman" w:hAnsi="Times New Roman" w:cs="Times New Roman"/>
+          <w:sz w:val="22"/>
+          <w:szCs w:val="22"/>
+        </w:rPr>
+        <w:t>variability i.e. t</w:t>
+      </w:r>
+      <w:r>
+        <w:rPr>
+          <w:rFonts w:ascii="Times New Roman" w:hAnsi="Times New Roman" w:cs="Times New Roman"/>
+          <w:sz w:val="22"/>
+          <w:szCs w:val="22"/>
+        </w:rPr>
+        <w:t>raffic volume swings widely rather than staying close to its average. The variance (3,939,323.50) conveys the same spread in squared units, so it is mainly useful as an input to other calculations rather than something to interpret directly on its own.</w:t>
+      </w:r>
+    </w:p>
+    <w:p>
+      <w:pPr>
+        <w:rPr>
+          <w:rFonts w:ascii="Times New Roman" w:hAnsi="Times New Roman" w:cs="Times New Roman"/>
+          <w:sz w:val="22"/>
+          <w:szCs w:val="22"/>
+        </w:rPr>
+      </w:pPr>
+      <w:r>
+        <w:rPr>
+          <w:rFonts w:ascii="Times New Roman" w:hAnsi="Times New Roman" w:cs="Times New Roman"/>
+          <w:b/>
+          <w:bCs/>
+          <w:sz w:val="22"/>
+          <w:szCs w:val="22"/>
+        </w:rPr>
+        <w:t>Range:</w:t>
+      </w:r>
+      <w:r>
+        <w:rPr>
+          <w:rFonts w:ascii="Times New Roman" w:hAnsi="Times New Roman" w:cs="Times New Roman"/>
+          <w:b/>
+          <w:bCs/>
+          <w:sz w:val="22"/>
+          <w:szCs w:val="22"/>
+        </w:rPr>
+        <w:t xml:space="preserve"> </w:t>
+      </w:r>
+      <w:r>
+        <w:rPr>
+          <w:rFonts w:ascii="Times New Roman" w:hAnsi="Times New Roman" w:cs="Times New Roman"/>
+          <w:sz w:val="22"/>
+          <w:szCs w:val="22"/>
+        </w:rPr>
+        <w:t>The range (7,280, from a minimum of 0 to a maximum of 7,280 vehicles per hour) confirms this. The corridor goes from essentially empty at its quietest to fully saturated at its busiest within the same dataset.</w:t>
+      </w:r>
+    </w:p>
+    <w:p>
+      <w:pPr>
+        <w:rPr>
+          <w:rFonts w:ascii="Times New Roman" w:hAnsi="Times New Roman" w:cs="Times New Roman"/>
+          <w:sz w:val="22"/>
+          <w:szCs w:val="22"/>
+          <w:lang w:val="en-PH"/>
+        </w:rPr>
+      </w:pPr>
+      <w:r>
+        <w:rPr>
+          <w:rFonts w:ascii="Times New Roman" w:hAnsi="Times New Roman" w:cs="Times New Roman"/>
+          <w:sz w:val="22"/>
+          <w:szCs w:val="22"/>
+        </w:rPr>
+        <w:t xml:space="preserve">Looking at the above statistics as a </w:t>
+      </w:r>
+      <w:r>
+        <w:rPr>
+          <w:rFonts w:ascii="Times New Roman" w:hAnsi="Times New Roman" w:cs="Times New Roman"/>
+          <w:sz w:val="22"/>
+          <w:szCs w:val="22"/>
+        </w:rPr>
+        <w:t>cohort</w:t>
+      </w:r>
+      <w:r>
+        <w:rPr>
+          <w:rFonts w:ascii="Times New Roman" w:hAnsi="Times New Roman" w:cs="Times New Roman"/>
+          <w:sz w:val="22"/>
+          <w:szCs w:val="22"/>
+        </w:rPr>
+        <w:t xml:space="preserve"> the trend seems consistent</w:t>
+      </w:r>
+      <w:r>
+        <w:rPr>
+          <w:rFonts w:ascii="Times New Roman" w:hAnsi="Times New Roman" w:cs="Times New Roman"/>
+          <w:sz w:val="22"/>
+          <w:szCs w:val="22"/>
+        </w:rPr>
+        <w:t>.</w:t>
+      </w:r>
+      <w:r>
+        <w:rPr>
+          <w:rFonts w:ascii="Times New Roman" w:hAnsi="Times New Roman" w:cs="Times New Roman"/>
+          <w:sz w:val="22"/>
+          <w:szCs w:val="22"/>
+        </w:rPr>
+        <w:t xml:space="preserve"> Traffic volume is not stable throughout the day. It depends heavily on the time of day, with a wide range between quiet overnight hours and peak commuting hours.</w:t>
+      </w:r>
+      <w:r>
+        <w:rPr>
+          <w:rFonts w:ascii="Times New Roman" w:hAnsi="Times New Roman" w:cs="Times New Roman"/>
+          <w:sz w:val="22"/>
+          <w:szCs w:val="22"/>
+        </w:rPr>
+        <w:t xml:space="preserve"> </w:t>
+      </w:r>
+      <w:r>
+        <w:rPr>
+          <w:rFonts w:ascii="Times New Roman" w:hAnsi="Times New Roman" w:cs="Times New Roman"/>
+          <w:sz w:val="22"/>
+          <w:szCs w:val="22"/>
+        </w:rPr>
+        <w:t>A single average figure hides most of what is actually happening, and any predictive model needs to account for this time driven swing rather than treating traffic volume as roughly constant.</w:t>
+      </w:r>
+    </w:p>
+    <w:p/>
+    <w:p>
+      <w:r>
+        <w:rPr>
+          <w:rFonts w:ascii="Times New Roman" w:hAnsi="Times New Roman" w:cs="Times New Roman"/>
+          <w:b/>
+          <w:sz w:val="22"/>
+        </w:rPr>
+        <w:t>2.2 Correlation analysis</w:t>
+      </w:r>
+    </w:p>
+    <w:p>
+      <w:r>
+        <w:rPr>
+          <w:rFonts w:ascii="Times New Roman" w:hAnsi="Times New Roman" w:cs="Times New Roman"/>
+          <w:sz w:val="22"/>
+        </w:rPr>
+        <w:t>Calculate the correlation coefficient between:</w:t>
+      </w:r>
+    </w:p>
+    <w:p>
+      <w:pPr>
+        <w:pStyle w:val="ListParagraph"/>
+        <w:numPr>
+          <w:ilvl w:val="0"/>
+          <w:numId w:val="8"/>
+        </w:numPr>
+      </w:pPr>
+      <w:r>
+        <w:rPr>
+          <w:rFonts w:ascii="Times New Roman" w:hAnsi="Times New Roman" w:cs="Times New Roman"/>
+          <w:sz w:val="22"/>
+        </w:rPr>
+        <w:t>Temperature</w:t>
+      </w:r>
+    </w:p>
+    <w:p>
+      <w:pPr>
+        <w:pStyle w:val="ListParagraph"/>
+        <w:numPr>
+          <w:ilvl w:val="0"/>
+          <w:numId w:val="8"/>
+        </w:numPr>
+      </w:pPr>
+      <w:r>
+        <w:rPr>
+          <w:rFonts w:ascii="Times New Roman" w:hAnsi="Times New Roman" w:cs="Times New Roman"/>
+          <w:sz w:val="22"/>
+        </w:rPr>
+        <w:t>Traffic volume</w:t>
+      </w:r>
+    </w:p>
+    <w:p>
+      <w:r>
+        <w:rPr>
+          <w:rFonts w:ascii="Times New Roman" w:hAnsi="Times New Roman" w:cs="Times New Roman"/>
+          <w:sz w:val="22"/>
+        </w:rPr>
+        <w:lastRenderedPageBreak/>
+        <w:t xml:space="preserve">Pearson correlation coefficient (temperature vs. traffic volume), calculated across all 40,575 unique hourly records in the dataset </w:t>
+      </w:r>
+      <w:r>
+        <w:rPr>
+          <w:rFonts w:ascii="Times New Roman" w:hAnsi="Times New Roman" w:cs="Times New Roman"/>
+          <w:b/>
+          <w:sz w:val="22"/>
+        </w:rPr>
+        <w:t>r = 0.14 (unrounded: 0.1369)</w:t>
+      </w:r>
+      <w:r>
+        <w:rPr>
+          <w:rFonts w:ascii="Times New Roman" w:hAnsi="Times New Roman" w:cs="Times New Roman"/>
+          <w:sz w:val="22"/>
+        </w:rPr>
+        <w:t>. Because a Pearson correlation is unaffected by a linear rescaling of either variable, this value is identical whether temperature is expressed in Kelvin (</w:t>
+      </w:r>
+      <w:r>
+        <w:rPr>
+          <w:rFonts w:ascii="Times New Roman" w:hAnsi="Times New Roman" w:cs="Times New Roman"/>
+          <w:sz w:val="22"/>
+        </w:rPr>
+        <w:t>as available in the file</w:t>
+      </w:r>
+      <w:r>
+        <w:rPr>
+          <w:rFonts w:ascii="Times New Roman" w:hAnsi="Times New Roman" w:cs="Times New Roman"/>
+          <w:sz w:val="22"/>
+        </w:rPr>
+        <w:t>) or converted to Celsius.</w:t>
+      </w:r>
+    </w:p>
+    <w:p>
+      <w:r>
+        <w:rPr>
+          <w:rFonts w:ascii="Times New Roman" w:hAnsi="Times New Roman" w:cs="Times New Roman"/>
+          <w:b/>
+          <w:sz w:val="22"/>
+        </w:rPr>
+        <w:t>Note:</w:t>
+      </w:r>
+      <w:r>
+        <w:rPr>
+          <w:rFonts w:ascii="Times New Roman" w:hAnsi="Times New Roman" w:cs="Times New Roman"/>
+          <w:sz w:val="22"/>
+        </w:rPr>
+        <w:t xml:space="preserve"> 10 rows record temperature as exactly 0 K (absolute zero), and a further 78 rows record exactly 276.793 K — both look like placeholder/default values rather than real sensor readings (0 K is physically </w:t>
+      </w:r>
+      <w:r>
+        <w:rPr>
+          <w:rFonts w:ascii="Times New Roman" w:hAnsi="Times New Roman" w:cs="Times New Roman"/>
+          <w:sz w:val="22"/>
+        </w:rPr>
+        <w:t>impossible</w:t>
+      </w:r>
+      <w:r>
+        <w:rPr>
+          <w:rFonts w:ascii="Times New Roman" w:hAnsi="Times New Roman" w:cs="Times New Roman"/>
+          <w:sz w:val="22"/>
+        </w:rPr>
+        <w:t xml:space="preserve"> for Minneapolis–St Paul</w:t>
+      </w:r>
+      <w:r>
+        <w:rPr>
+          <w:rFonts w:ascii="Times New Roman" w:hAnsi="Times New Roman" w:cs="Times New Roman"/>
+          <w:sz w:val="22"/>
+        </w:rPr>
+        <w:t xml:space="preserve"> (unless it is created in a lab)</w:t>
+      </w:r>
+      <w:r>
+        <w:rPr>
+          <w:rFonts w:ascii="Times New Roman" w:hAnsi="Times New Roman" w:cs="Times New Roman"/>
+          <w:sz w:val="22"/>
+        </w:rPr>
+        <w:t>, and 276.793 K recurs suspiciously often, always on the "extra" row of an hour that already has a duplicate weather entry). Recomputing the coefficient with these 88 rows (0.22% of the data) excluded gives r = 0.1391, which still rounds to 0.14, so this data-quality issue does not change the result</w:t>
+      </w:r>
+      <w:r>
+        <w:rPr>
+          <w:rFonts w:ascii="Times New Roman" w:hAnsi="Times New Roman" w:cs="Times New Roman"/>
+          <w:sz w:val="22"/>
+        </w:rPr>
+        <w:t>.</w:t>
+      </w:r>
+      <w:r>
+        <w:rPr>
+          <w:rFonts w:ascii="Times New Roman" w:hAnsi="Times New Roman" w:cs="Times New Roman"/>
+          <w:sz w:val="22"/>
+        </w:rPr>
+        <w:t xml:space="preserve"> </w:t>
+      </w:r>
+    </w:p>
+    <w:p>
+      <w:pPr>
+        <w:rPr>
+          <w:b/>
+          <w:bCs/>
+        </w:rPr>
+      </w:pPr>
+      <w:r>
+        <w:rPr>
+          <w:rFonts w:ascii="Times New Roman" w:hAnsi="Times New Roman" w:cs="Times New Roman"/>
+          <w:b/>
+          <w:bCs/>
+          <w:sz w:val="22"/>
+        </w:rPr>
+        <w:t>Interpret the direction of the relationship.</w:t>
+      </w:r>
+    </w:p>
+    <w:p>
+      <w:r>
+        <w:rPr>
+          <w:rFonts w:ascii="Times New Roman" w:hAnsi="Times New Roman" w:cs="Times New Roman"/>
+          <w:b/>
+          <w:sz w:val="22"/>
+        </w:rPr>
+        <w:t>Direction:</w:t>
+      </w:r>
+      <w:r>
+        <w:rPr>
+          <w:rFonts w:ascii="Times New Roman" w:hAnsi="Times New Roman" w:cs="Times New Roman"/>
+          <w:sz w:val="22"/>
+        </w:rPr>
+        <w:t xml:space="preserve"> The coefficient is positive (r = 0.14 &gt; 0), so temperature and traffic volume move in the same direction on average: hours with higher temperatures tend to have slightly higher traffic volume, and hours with lower temperatures tend to have slightly lower traffic volume. The relationship is not negative, </w:t>
+      </w:r>
+      <w:r>
+        <w:rPr>
+          <w:rFonts w:ascii="Times New Roman" w:hAnsi="Times New Roman" w:cs="Times New Roman"/>
+          <w:b/>
+          <w:bCs/>
+          <w:sz w:val="22"/>
+        </w:rPr>
+        <w:t>so there is no evidence here that heat suppresses driving</w:t>
+      </w:r>
+      <w:r>
+        <w:rPr>
+          <w:rFonts w:ascii="Times New Roman" w:hAnsi="Times New Roman" w:cs="Times New Roman"/>
+          <w:sz w:val="22"/>
+        </w:rPr>
+        <w:t>.</w:t>
+      </w:r>
+    </w:p>
+    <w:p>
+      <w:pPr>
+        <w:rPr>
+          <w:b/>
+          <w:bCs/>
+        </w:rPr>
+      </w:pPr>
+      <w:r>
+        <w:rPr>
+          <w:rFonts w:ascii="Times New Roman" w:hAnsi="Times New Roman" w:cs="Times New Roman"/>
+          <w:b/>
+          <w:bCs/>
+          <w:sz w:val="22"/>
+        </w:rPr>
+        <w:t>Interpret the strength of the relationship.</w:t>
+      </w:r>
+    </w:p>
+    <w:p>
+      <w:r>
+        <w:rPr>
+          <w:rFonts w:ascii="Times New Roman" w:hAnsi="Times New Roman" w:cs="Times New Roman"/>
+          <w:b/>
+          <w:sz w:val="22"/>
+        </w:rPr>
+        <w:t>Strength:</w:t>
+      </w:r>
+      <w:r>
+        <w:rPr>
+          <w:rFonts w:ascii="Times New Roman" w:hAnsi="Times New Roman" w:cs="Times New Roman"/>
+          <w:sz w:val="22"/>
+        </w:rPr>
+        <w:t xml:space="preserve"> By conventional benchmarks for correlation strength (roughly: &lt;0.20 very weak, 0.20–0.39 weak, 0.40–0.59 moderate, 0.60–0.79 strong, ≥0.80 very strong), r = 0.14 falls in the very weak range</w:t>
+      </w:r>
+      <w:r>
+        <w:rPr>
+          <w:rFonts w:ascii="Times New Roman" w:hAnsi="Times New Roman" w:cs="Times New Roman"/>
+          <w:sz w:val="22"/>
+        </w:rPr>
+        <w:t xml:space="preserve"> that indicates</w:t>
+      </w:r>
+      <w:r>
+        <w:rPr>
+          <w:rFonts w:ascii="Times New Roman" w:hAnsi="Times New Roman" w:cs="Times New Roman"/>
+          <w:sz w:val="22"/>
+        </w:rPr>
+        <w:t xml:space="preserve"> close to no linear relationship at all. Squaring the coefficient gives R</w:t>
+      </w:r>
+      <w:r>
+        <w:rPr>
+          <w:rFonts w:ascii="Times New Roman" w:hAnsi="Times New Roman" w:cs="Times New Roman"/>
+          <w:sz w:val="22"/>
+        </w:rPr>
+        <w:t>^2</w:t>
+      </w:r>
+      <w:r>
+        <w:rPr>
+          <w:rFonts w:ascii="Times New Roman" w:hAnsi="Times New Roman" w:cs="Times New Roman"/>
+          <w:sz w:val="22"/>
+        </w:rPr>
+        <w:t xml:space="preserve"> ≈ 0.019, meaning temperature alone statistically accounts for under 2% of the hour-to-hour variation in traffic volume. This lines up with the </w:t>
+      </w:r>
+      <w:r>
+        <w:rPr>
+          <w:rFonts w:ascii="Times New Roman" w:hAnsi="Times New Roman" w:cs="Times New Roman"/>
+          <w:sz w:val="22"/>
+        </w:rPr>
+        <w:t>previous</w:t>
+      </w:r>
+      <w:r>
+        <w:rPr>
+          <w:rFonts w:ascii="Times New Roman" w:hAnsi="Times New Roman" w:cs="Times New Roman"/>
+          <w:sz w:val="22"/>
+        </w:rPr>
+        <w:t xml:space="preserve"> task</w:t>
+      </w:r>
+      <w:r>
+        <w:rPr>
+          <w:rFonts w:ascii="Times New Roman" w:hAnsi="Times New Roman" w:cs="Times New Roman"/>
+          <w:sz w:val="22"/>
+        </w:rPr>
+        <w:t xml:space="preserve"> finding that traffic volume is dominated by time-of-day/commuting patterns rather than a single continuous driver such as temperature.</w:t>
+      </w:r>
+    </w:p>
+    <w:p>
+      <w:pPr>
+        <w:rPr>
+          <w:b/>
+          <w:bCs/>
+        </w:rPr>
+      </w:pPr>
+      <w:r>
+        <w:rPr>
+          <w:rFonts w:ascii="Times New Roman" w:hAnsi="Times New Roman" w:cs="Times New Roman"/>
+          <w:b/>
+          <w:bCs/>
+          <w:sz w:val="22"/>
+        </w:rPr>
+        <w:t>Explain why correlation does not necessarily imply causation.</w:t>
+      </w:r>
+    </w:p>
+    <w:p>
+      <w:r>
+        <w:rPr>
+          <w:rFonts w:ascii="Times New Roman" w:hAnsi="Times New Roman" w:cs="Times New Roman"/>
+          <w:b/>
+          <w:sz w:val="22"/>
+        </w:rPr>
+        <w:t>Correlation vs. causation:</w:t>
+      </w:r>
+      <w:r>
+        <w:rPr>
+          <w:rFonts w:ascii="Times New Roman" w:hAnsi="Times New Roman" w:cs="Times New Roman"/>
+          <w:sz w:val="22"/>
+        </w:rPr>
+        <w:t xml:space="preserve"> A correlation coefficient only measures how closely two variables move together; it cannot by itself show that one causes the other. Two variables can be correlated because a third, unmeasured variable drives them both (a confounder), because the relationship actually runs in the opposite direction, or simply by chance. In this dataset, a plausible confounder is time (hour of day and season): traffic volume follows a strong commuting-driven daily cycle that has nothing to do with the outdoor temperature at</w:t>
+      </w:r>
+      <w:r>
+        <w:rPr>
+          <w:rFonts w:ascii="Times New Roman" w:hAnsi="Times New Roman" w:cs="Times New Roman"/>
+          <w:sz w:val="22"/>
+        </w:rPr>
+        <w:t xml:space="preserve"> that moment, while temperature follows its own daily and seasonal cycle. The two series can drift together somewhat simply because both are shaped by the calendar, without temperature having any direct influence on how many vehicles are on the road</w:t>
+      </w:r>
+      <w:r>
+        <w:rPr>
+          <w:rFonts w:ascii="Times New Roman" w:hAnsi="Times New Roman" w:cs="Times New Roman"/>
+          <w:sz w:val="22"/>
+        </w:rPr>
+        <w:t>.</w:t>
+      </w:r>
+      <w:r>
+        <w:rPr>
+          <w:rFonts w:ascii="Times New Roman" w:hAnsi="Times New Roman" w:cs="Times New Roman"/>
+          <w:sz w:val="22"/>
+        </w:rPr>
+        <w:t xml:space="preserve"> </w:t>
+      </w:r>
+      <w:r>
+        <w:rPr>
+          <w:rFonts w:ascii="Times New Roman" w:hAnsi="Times New Roman" w:cs="Times New Roman"/>
+          <w:sz w:val="22"/>
+        </w:rPr>
+        <w:t>F</w:t>
+      </w:r>
+      <w:r>
+        <w:rPr>
+          <w:rFonts w:ascii="Times New Roman" w:hAnsi="Times New Roman" w:cs="Times New Roman"/>
+          <w:sz w:val="22"/>
+        </w:rPr>
+        <w:t>or example, a warm summer rush hour and a cold winter rush hour can both be "high traffic" for scheduling reasons alone. Given how weak this correlation already is (R</w:t>
+      </w:r>
+      <w:r>
+        <w:rPr>
+          <w:rFonts w:ascii="Times New Roman" w:hAnsi="Times New Roman" w:cs="Times New Roman"/>
+          <w:sz w:val="22"/>
+        </w:rPr>
+        <w:t>^2</w:t>
+      </w:r>
+      <w:r>
+        <w:rPr>
+          <w:rFonts w:ascii="Times New Roman" w:hAnsi="Times New Roman" w:cs="Times New Roman"/>
+          <w:sz w:val="22"/>
+        </w:rPr>
+        <w:t xml:space="preserve"> &lt; 2%), it would be a mistake to conclude from it that warmer weather causes more people to drive; the data only supports saying the two are weakly, positively associated.</w:t>
+      </w:r>
+    </w:p>
+    <w:p>
+      <w:pPr>
+        <w:rPr>
+          <w:rFonts w:ascii="Times New Roman" w:hAnsi="Times New Roman" w:cs="Times New Roman"/>
+          <w:sz w:val="22"/>
+        </w:rPr>
+      </w:pPr>
+      <w:r>
+        <w:rPr>
+          <w:rFonts w:ascii="Times New Roman" w:hAnsi="Times New Roman" w:cs="Times New Roman"/>
+          <w:sz w:val="22"/>
+        </w:rPr>
+        <w:t xml:space="preserve">Overall, temperature has only a marginal linear association with traffic volume in this dataset. It is directionally positive but too weak to treat as a meaningful driver of traffic on its own, reinforcing </w:t>
+      </w:r>
+      <w:r>
+        <w:rPr>
+          <w:rFonts w:ascii="Times New Roman" w:hAnsi="Times New Roman" w:cs="Times New Roman"/>
+          <w:sz w:val="22"/>
+        </w:rPr>
+        <w:t>those time-based factors</w:t>
+      </w:r>
+      <w:r>
+        <w:rPr>
+          <w:rFonts w:ascii="Times New Roman" w:hAnsi="Times New Roman" w:cs="Times New Roman"/>
+          <w:sz w:val="22"/>
+        </w:rPr>
+        <w:t xml:space="preserve"> (hour, day of week, holiday status) are far more important explanatory variables than weather.</w:t>
+      </w:r>
+    </w:p>
+    <w:p>
+      <w:pPr>
+        <w:rPr>
+          <w:rFonts w:ascii="Times New Roman" w:hAnsi="Times New Roman" w:cs="Times New Roman"/>
+          <w:sz w:val="22"/>
+        </w:rPr>
+      </w:pPr>
+    </w:p>
+    <w:p>
+      <w:pPr>
+        <w:rPr>
+          <w:rFonts w:ascii="Times New Roman" w:hAnsi="Times New Roman" w:cs="Times New Roman"/>
+          <w:sz w:val="22"/>
+        </w:rPr>
+      </w:pPr>
+    </w:p>
+    <w:p>
+      <w:pPr>
+        <w:rPr>
+          <w:rFonts w:ascii="Times New Roman" w:hAnsi="Times New Roman" w:cs="Times New Roman"/>
+          <w:b/>
+          <w:bCs/>
+          <w:sz w:val="22"/>
+          <w:szCs w:val="22"/>
+          <w:lang w:val="en-PH"/>
+        </w:rPr>
+      </w:pPr>
+      <w:r>
+        <w:rPr>
+          <w:rFonts w:ascii="Times New Roman" w:hAnsi="Times New Roman" w:cs="Times New Roman"/>
+          <w:b/>
+          <w:bCs/>
+          <w:sz w:val="22"/>
+          <w:szCs w:val="22"/>
+          <w:lang w:val="en-PH"/>
+        </w:rPr>
+        <w:lastRenderedPageBreak/>
+        <w:t>Task 3: Probability and Congestion Analysis</w:t>
+      </w:r>
+    </w:p>
+    <w:p>
+      <w:pPr>
+        <w:rPr>
+          <w:rFonts w:ascii="Times New Roman" w:hAnsi="Times New Roman" w:cs="Times New Roman"/>
+          <w:sz w:val="22"/>
+          <w:szCs w:val="22"/>
+          <w:lang w:val="en-PH"/>
+        </w:rPr>
+      </w:pPr>
+      <w:r>
+        <w:rPr>
+          <w:rFonts w:ascii="Times New Roman" w:hAnsi="Times New Roman" w:cs="Times New Roman"/>
+          <w:sz w:val="22"/>
+          <w:szCs w:val="22"/>
+          <w:lang w:val="en-PH"/>
+        </w:rPr>
+        <w:t xml:space="preserve">Define </w:t>
+      </w:r>
+      <w:r>
+        <w:rPr>
+          <w:rFonts w:ascii="Times New Roman" w:hAnsi="Times New Roman" w:cs="Times New Roman"/>
+          <w:b/>
+          <w:bCs/>
+          <w:sz w:val="22"/>
+          <w:szCs w:val="22"/>
+          <w:lang w:val="en-PH"/>
+        </w:rPr>
+        <w:t>congestion</w:t>
+      </w:r>
+      <w:r>
+        <w:rPr>
+          <w:rFonts w:ascii="Times New Roman" w:hAnsi="Times New Roman" w:cs="Times New Roman"/>
+          <w:sz w:val="22"/>
+          <w:szCs w:val="22"/>
+          <w:lang w:val="en-PH"/>
+        </w:rPr>
+        <w:t xml:space="preserve"> as:</w:t>
+      </w:r>
+      <w:r>
+        <w:rPr>
+          <w:rFonts w:ascii="Times New Roman" w:hAnsi="Times New Roman" w:cs="Times New Roman"/>
+          <w:sz w:val="22"/>
+          <w:szCs w:val="22"/>
+          <w:lang w:val="en-PH"/>
+        </w:rPr>
+        <w:t xml:space="preserve"> t</w:t>
+      </w:r>
+      <w:r>
+        <w:rPr>
+          <w:rFonts w:ascii="Times New Roman" w:hAnsi="Times New Roman" w:cs="Times New Roman"/>
+          <w:sz w:val="22"/>
+          <w:szCs w:val="22"/>
+          <w:lang w:val="en-PH"/>
+        </w:rPr>
+        <w:t>raffic volume &gt; 5,500 vehicles.</w:t>
+      </w:r>
+    </w:p>
+    <w:p>
+      <w:pPr>
+        <w:rPr>
+          <w:rFonts w:ascii="Times New Roman" w:hAnsi="Times New Roman" w:cs="Times New Roman"/>
+          <w:sz w:val="22"/>
+          <w:szCs w:val="22"/>
+          <w:lang w:val="en-PH"/>
+        </w:rPr>
+      </w:pPr>
+      <w:r>
+        <w:rPr>
+          <w:rFonts w:ascii="Times New Roman" w:hAnsi="Times New Roman" w:cs="Times New Roman"/>
+          <w:sz w:val="22"/>
+          <w:szCs w:val="22"/>
+          <w:lang w:val="en-PH"/>
+        </w:rPr>
+        <w:t>Calculate:</w:t>
+      </w:r>
+    </w:p>
+    <w:p>
+      <w:pPr>
+        <w:rPr>
+          <w:rFonts w:ascii="Times New Roman" w:hAnsi="Times New Roman" w:cs="Times New Roman"/>
+          <w:b/>
+          <w:bCs/>
+          <w:sz w:val="22"/>
+          <w:szCs w:val="22"/>
+          <w:lang w:val="en-PH"/>
+        </w:rPr>
+      </w:pPr>
+      <w:r>
+        <w:rPr>
+          <w:rFonts w:ascii="Times New Roman" w:hAnsi="Times New Roman" w:cs="Times New Roman"/>
+          <w:b/>
+          <w:bCs/>
+          <w:sz w:val="22"/>
+          <w:szCs w:val="22"/>
+          <w:lang w:val="en-PH"/>
+        </w:rPr>
+        <w:t>3.1 Basic probability</w:t>
+      </w:r>
+    </w:p>
+    <w:p>
+      <w:pPr>
+        <w:pStyle w:val="ListParagraph"/>
+        <w:numPr>
+          <w:ilvl w:val="0"/>
+          <w:numId w:val="9"/>
+        </w:numPr>
+        <w:rPr>
+          <w:rFonts w:ascii="Times New Roman" w:hAnsi="Times New Roman" w:cs="Times New Roman"/>
+          <w:sz w:val="22"/>
+          <w:szCs w:val="22"/>
+          <w:lang w:val="en-PH"/>
+        </w:rPr>
+      </w:pPr>
+      <w:r>
+        <w:rPr>
+          <w:rFonts w:ascii="Times New Roman" w:hAnsi="Times New Roman" w:cs="Times New Roman"/>
+          <w:b/>
+          <w:bCs/>
+          <w:sz w:val="22"/>
+          <w:szCs w:val="22"/>
+          <w:lang w:val="en-PH"/>
+        </w:rPr>
+        <w:t>P(Congestion)</w:t>
+      </w:r>
+      <w:r>
+        <w:rPr>
+          <w:rFonts w:ascii="Times New Roman" w:hAnsi="Times New Roman" w:cs="Times New Roman"/>
+          <w:sz w:val="22"/>
+          <w:szCs w:val="22"/>
+          <w:lang w:val="en-PH"/>
+        </w:rPr>
+        <w:t xml:space="preserve"> </w:t>
+      </w:r>
+    </w:p>
+    <w:p>
+      <w:pPr>
+        <w:pStyle w:val="ListParagraph"/>
+        <w:numPr>
+          <w:ilvl w:val="0"/>
+          <w:numId w:val="9"/>
+        </w:numPr>
+        <w:rPr>
+          <w:rFonts w:ascii="Times New Roman" w:hAnsi="Times New Roman" w:cs="Times New Roman"/>
+          <w:sz w:val="22"/>
+          <w:szCs w:val="22"/>
+          <w:lang w:val="en-PH"/>
+        </w:rPr>
+      </w:pPr>
+      <w:r>
+        <w:rPr>
+          <w:rFonts w:ascii="Times New Roman" w:hAnsi="Times New Roman" w:cs="Times New Roman"/>
+          <w:b/>
+          <w:bCs/>
+          <w:sz w:val="22"/>
+          <w:szCs w:val="22"/>
+          <w:lang w:val="en-PH"/>
+        </w:rPr>
+        <w:t>P(Clear Weather)</w:t>
+      </w:r>
+      <w:r>
+        <w:rPr>
+          <w:rFonts w:ascii="Times New Roman" w:hAnsi="Times New Roman" w:cs="Times New Roman"/>
+          <w:sz w:val="22"/>
+          <w:szCs w:val="22"/>
+          <w:lang w:val="en-PH"/>
+        </w:rPr>
+        <w:t xml:space="preserve"> </w:t>
+      </w:r>
+    </w:p>
+    <w:p>
+      <w:pPr>
+        <w:pStyle w:val="ListParagraph"/>
+        <w:numPr>
+          <w:ilvl w:val="0"/>
+          <w:numId w:val="9"/>
+        </w:numPr>
+        <w:rPr>
+          <w:rFonts w:ascii="Times New Roman" w:hAnsi="Times New Roman" w:cs="Times New Roman"/>
+          <w:sz w:val="22"/>
+          <w:szCs w:val="22"/>
+          <w:lang w:val="en-PH"/>
+        </w:rPr>
+      </w:pPr>
+      <w:r>
+        <w:rPr>
+          <w:rFonts w:ascii="Times New Roman" w:hAnsi="Times New Roman" w:cs="Times New Roman"/>
+          <w:b/>
+          <w:bCs/>
+          <w:sz w:val="22"/>
+          <w:szCs w:val="22"/>
+          <w:lang w:val="en-PH"/>
+        </w:rPr>
+        <w:t>P(Congestion AND Clear Weather)</w:t>
+      </w:r>
+      <w:r>
+        <w:rPr>
+          <w:rFonts w:ascii="Times New Roman" w:hAnsi="Times New Roman" w:cs="Times New Roman"/>
+          <w:sz w:val="22"/>
+          <w:szCs w:val="22"/>
+          <w:lang w:val="en-PH"/>
+        </w:rPr>
+        <w:t xml:space="preserve"> </w:t>
+      </w:r>
+    </w:p>
+    <w:tbl>
+      <w:tblPr>
+        <w:tblW w:w="6860" w:type="dxa"/>
+        <w:tblLook w:val="04A0" w:firstRow="1" w:lastRow="0" w:firstColumn="1" w:lastColumn="0" w:noHBand="0" w:noVBand="1"/>
+      </w:tblPr>
+      <w:tblGrid>
+        <w:gridCol w:w="5597"/>
+        <w:gridCol w:w="1263"/>
+      </w:tblGrid>
+      <w:tr>
+        <w:trPr>
+          <w:trHeight w:val="290"/>
+        </w:trPr>
+        <w:tc>
+          <w:tcPr>
+            <w:tcW w:w="6860" w:type="dxa"/>
+            <w:gridSpan w:val="2"/>
+            <w:tcBorders>
+              <w:top w:val="single" w:sz="4" w:space="0" w:color="auto"/>
+              <w:left w:val="single" w:sz="4" w:space="0" w:color="auto"/>
+              <w:bottom w:val="single" w:sz="4" w:space="0" w:color="auto"/>
+              <w:right w:val="single" w:sz="4" w:space="0" w:color="auto"/>
+            </w:tcBorders>
+            <w:noWrap/>
+            <w:vAlign w:val="bottom"/>
+            <w:hideMark/>
+          </w:tcPr>
+          <w:p>
+            <w:pPr>
+              <w:spacing w:after="0" w:line="240" w:lineRule="auto"/>
+              <w:jc w:val="center"/>
+              <w:rPr>
+                <w:rFonts w:ascii="Aptos Narrow" w:eastAsia="Times New Roman" w:hAnsi="Aptos Narrow" w:cs="Times New Roman"/>
+                <w:b/>
+                <w:bCs/>
+                <w:color w:val="000000"/>
+                <w:kern w:val="0"/>
+                <w:sz w:val="22"/>
+                <w:szCs w:val="22"/>
+                <w:lang w:val="en-SG" w:eastAsia="en-SG"/>
+                <w14:ligatures w14:val="none"/>
+              </w:rPr>
+            </w:pPr>
+            <w:r>
+              <w:rPr>
+                <w:rFonts w:ascii="Aptos Narrow" w:eastAsia="Times New Roman" w:hAnsi="Aptos Narrow" w:cs="Times New Roman"/>
+                <w:b/>
+                <w:bCs/>
+                <w:color w:val="000000"/>
+                <w:kern w:val="0"/>
+                <w:sz w:val="22"/>
+                <w:szCs w:val="22"/>
+                <w:lang w:val="en-SG" w:eastAsia="en-SG"/>
+                <w14:ligatures w14:val="none"/>
+              </w:rPr>
+              <w:t xml:space="preserve">Basic Probability (where, Congestion = Traffic volume &gt; 5,500 vehicles) </w:t>
+            </w:r>
+          </w:p>
+        </w:tc>
+      </w:tr>
+      <w:tr>
+        <w:trPr>
+          <w:trHeight w:val="290"/>
+        </w:trPr>
+        <w:tc>
+          <w:tcPr>
+            <w:tcW w:w="5597" w:type="dxa"/>
+            <w:tcBorders>
+              <w:top w:val="nil"/>
+              <w:left w:val="single" w:sz="4" w:space="0" w:color="auto"/>
+              <w:bottom w:val="single" w:sz="4" w:space="0" w:color="auto"/>
+              <w:right w:val="single" w:sz="4" w:space="0" w:color="auto"/>
+            </w:tcBorders>
+            <w:noWrap/>
+            <w:vAlign w:val="bottom"/>
+            <w:hideMark/>
+          </w:tcPr>
+          <w:p>
+            <w:pPr>
+              <w:spacing w:after="0" w:line="240" w:lineRule="auto"/>
+              <w:rPr>
+                <w:rFonts w:ascii="Aptos Narrow" w:eastAsia="Times New Roman" w:hAnsi="Aptos Narrow" w:cs="Times New Roman"/>
+                <w:b/>
+                <w:bCs/>
+                <w:color w:val="000000"/>
+                <w:kern w:val="0"/>
+                <w:sz w:val="22"/>
+                <w:szCs w:val="22"/>
+                <w:lang w:val="en-SG" w:eastAsia="en-SG"/>
+                <w14:ligatures w14:val="none"/>
+              </w:rPr>
+            </w:pPr>
+            <w:r>
+              <w:rPr>
+                <w:rFonts w:ascii="Aptos Narrow" w:eastAsia="Times New Roman" w:hAnsi="Aptos Narrow" w:cs="Times New Roman"/>
+                <w:b/>
+                <w:bCs/>
+                <w:color w:val="000000"/>
+                <w:kern w:val="0"/>
+                <w:sz w:val="22"/>
+                <w:szCs w:val="22"/>
+                <w:lang w:val="en-SG" w:eastAsia="en-SG"/>
+                <w14:ligatures w14:val="none"/>
+              </w:rPr>
+              <w:t xml:space="preserve"> N(hourly traffic volume) </w:t>
+            </w:r>
+          </w:p>
+        </w:tc>
+        <w:tc>
+          <w:tcPr>
+            <w:tcW w:w="1263" w:type="dxa"/>
+            <w:tcBorders>
+              <w:top w:val="nil"/>
+              <w:left w:val="nil"/>
+              <w:bottom w:val="single" w:sz="4" w:space="0" w:color="auto"/>
+              <w:right w:val="single" w:sz="4" w:space="0" w:color="auto"/>
+            </w:tcBorders>
+            <w:noWrap/>
+            <w:vAlign w:val="bottom"/>
+            <w:hideMark/>
+          </w:tcPr>
+          <w:p>
+            <w:pPr>
+              <w:spacing w:after="0" w:line="240" w:lineRule="auto"/>
+              <w:jc w:val="right"/>
+              <w:rPr>
+                <w:rFonts w:ascii="Aptos Narrow" w:eastAsia="Times New Roman" w:hAnsi="Aptos Narrow" w:cs="Times New Roman"/>
+                <w:color w:val="000000"/>
+                <w:kern w:val="0"/>
+                <w:sz w:val="22"/>
+                <w:szCs w:val="22"/>
+                <w:lang w:val="en-SG" w:eastAsia="en-SG"/>
+                <w14:ligatures w14:val="none"/>
+              </w:rPr>
+            </w:pPr>
+            <w:r>
+              <w:rPr>
+                <w:rFonts w:ascii="Aptos Narrow" w:eastAsia="Times New Roman" w:hAnsi="Aptos Narrow" w:cs="Times New Roman"/>
+                <w:color w:val="000000"/>
+                <w:kern w:val="0"/>
+                <w:sz w:val="22"/>
+                <w:szCs w:val="22"/>
+                <w:lang w:val="en-SG" w:eastAsia="en-SG"/>
+                <w14:ligatures w14:val="none"/>
+              </w:rPr>
+              <w:t>40575</w:t>
+            </w:r>
+          </w:p>
+        </w:tc>
+      </w:tr>
+      <w:tr>
+        <w:trPr>
+          <w:trHeight w:val="290"/>
+        </w:trPr>
+        <w:tc>
+          <w:tcPr>
+            <w:tcW w:w="5597" w:type="dxa"/>
+            <w:tcBorders>
+              <w:top w:val="nil"/>
+              <w:left w:val="single" w:sz="4" w:space="0" w:color="auto"/>
+              <w:bottom w:val="single" w:sz="4" w:space="0" w:color="auto"/>
+              <w:right w:val="single" w:sz="4" w:space="0" w:color="auto"/>
+            </w:tcBorders>
+            <w:noWrap/>
+            <w:vAlign w:val="bottom"/>
+            <w:hideMark/>
+          </w:tcPr>
+          <w:p>
+            <w:pPr>
+              <w:spacing w:after="0" w:line="240" w:lineRule="auto"/>
+              <w:rPr>
+                <w:rFonts w:ascii="Aptos Narrow" w:eastAsia="Times New Roman" w:hAnsi="Aptos Narrow" w:cs="Times New Roman"/>
+                <w:b/>
+                <w:bCs/>
+                <w:color w:val="000000"/>
+                <w:kern w:val="0"/>
+                <w:sz w:val="22"/>
+                <w:szCs w:val="22"/>
+                <w:lang w:val="en-SG" w:eastAsia="en-SG"/>
+                <w14:ligatures w14:val="none"/>
+              </w:rPr>
+            </w:pPr>
+            <w:r>
+              <w:rPr>
+                <w:rFonts w:ascii="Aptos Narrow" w:eastAsia="Times New Roman" w:hAnsi="Aptos Narrow" w:cs="Times New Roman"/>
+                <w:b/>
+                <w:bCs/>
+                <w:color w:val="000000"/>
+                <w:kern w:val="0"/>
+                <w:sz w:val="22"/>
+                <w:szCs w:val="22"/>
+                <w:lang w:val="en-SG" w:eastAsia="en-SG"/>
+                <w14:ligatures w14:val="none"/>
+              </w:rPr>
+              <w:t xml:space="preserve"> N(Congestion) </w:t>
+            </w:r>
+          </w:p>
+        </w:tc>
+        <w:tc>
+          <w:tcPr>
+            <w:tcW w:w="1263" w:type="dxa"/>
+            <w:tcBorders>
+              <w:top w:val="nil"/>
+              <w:left w:val="nil"/>
+              <w:bottom w:val="single" w:sz="4" w:space="0" w:color="auto"/>
+              <w:right w:val="single" w:sz="4" w:space="0" w:color="auto"/>
+            </w:tcBorders>
+            <w:noWrap/>
+            <w:vAlign w:val="bottom"/>
+            <w:hideMark/>
+          </w:tcPr>
+          <w:p>
+            <w:pPr>
+              <w:spacing w:after="0" w:line="240" w:lineRule="auto"/>
+              <w:jc w:val="right"/>
+              <w:rPr>
+                <w:rFonts w:ascii="Aptos Narrow" w:eastAsia="Times New Roman" w:hAnsi="Aptos Narrow" w:cs="Times New Roman"/>
+                <w:color w:val="000000"/>
+                <w:kern w:val="0"/>
+                <w:sz w:val="22"/>
+                <w:szCs w:val="22"/>
+                <w:lang w:val="en-SG" w:eastAsia="en-SG"/>
+                <w14:ligatures w14:val="none"/>
+              </w:rPr>
+            </w:pPr>
+            <w:r>
+              <w:rPr>
+                <w:rFonts w:ascii="Aptos Narrow" w:eastAsia="Times New Roman" w:hAnsi="Aptos Narrow" w:cs="Times New Roman"/>
+                <w:color w:val="000000"/>
+                <w:kern w:val="0"/>
+                <w:sz w:val="22"/>
+                <w:szCs w:val="22"/>
+                <w:lang w:val="en-SG" w:eastAsia="en-SG"/>
+                <w14:ligatures w14:val="none"/>
+              </w:rPr>
+              <w:t>6107</w:t>
+            </w:r>
+          </w:p>
+        </w:tc>
+      </w:tr>
+      <w:tr>
+        <w:trPr>
+          <w:trHeight w:val="290"/>
+        </w:trPr>
+        <w:tc>
+          <w:tcPr>
+            <w:tcW w:w="5597" w:type="dxa"/>
+            <w:tcBorders>
+              <w:top w:val="nil"/>
+              <w:left w:val="single" w:sz="4" w:space="0" w:color="auto"/>
+              <w:bottom w:val="single" w:sz="4" w:space="0" w:color="auto"/>
+              <w:right w:val="single" w:sz="4" w:space="0" w:color="auto"/>
+            </w:tcBorders>
+            <w:noWrap/>
+            <w:vAlign w:val="bottom"/>
+            <w:hideMark/>
+          </w:tcPr>
+          <w:p>
+            <w:pPr>
+              <w:spacing w:after="0" w:line="240" w:lineRule="auto"/>
+              <w:rPr>
+                <w:rFonts w:ascii="Aptos Narrow" w:eastAsia="Times New Roman" w:hAnsi="Aptos Narrow" w:cs="Times New Roman"/>
+                <w:b/>
+                <w:bCs/>
+                <w:color w:val="000000"/>
+                <w:kern w:val="0"/>
+                <w:sz w:val="22"/>
+                <w:szCs w:val="22"/>
+                <w:lang w:val="en-SG" w:eastAsia="en-SG"/>
+                <w14:ligatures w14:val="none"/>
+              </w:rPr>
+            </w:pPr>
+            <w:r>
+              <w:rPr>
+                <w:rFonts w:ascii="Aptos Narrow" w:eastAsia="Times New Roman" w:hAnsi="Aptos Narrow" w:cs="Times New Roman"/>
+                <w:b/>
+                <w:bCs/>
+                <w:color w:val="000000"/>
+                <w:kern w:val="0"/>
+                <w:sz w:val="22"/>
+                <w:szCs w:val="22"/>
+                <w:lang w:val="en-SG" w:eastAsia="en-SG"/>
+                <w14:ligatures w14:val="none"/>
+              </w:rPr>
+              <w:t xml:space="preserve"> N(Clear Weather) </w:t>
+            </w:r>
+          </w:p>
+        </w:tc>
+        <w:tc>
+          <w:tcPr>
+            <w:tcW w:w="1263" w:type="dxa"/>
+            <w:tcBorders>
+              <w:top w:val="nil"/>
+              <w:left w:val="nil"/>
+              <w:bottom w:val="single" w:sz="4" w:space="0" w:color="auto"/>
+              <w:right w:val="single" w:sz="4" w:space="0" w:color="auto"/>
+            </w:tcBorders>
+            <w:noWrap/>
+            <w:vAlign w:val="bottom"/>
+            <w:hideMark/>
+          </w:tcPr>
+          <w:p>
+            <w:pPr>
+              <w:spacing w:after="0" w:line="240" w:lineRule="auto"/>
+              <w:jc w:val="right"/>
+              <w:rPr>
+                <w:rFonts w:ascii="Aptos Narrow" w:eastAsia="Times New Roman" w:hAnsi="Aptos Narrow" w:cs="Times New Roman"/>
+                <w:color w:val="000000"/>
+                <w:kern w:val="0"/>
+                <w:sz w:val="22"/>
+                <w:szCs w:val="22"/>
+                <w:lang w:val="en-SG" w:eastAsia="en-SG"/>
+                <w14:ligatures w14:val="none"/>
+              </w:rPr>
+            </w:pPr>
+            <w:r>
+              <w:rPr>
+                <w:rFonts w:ascii="Aptos Narrow" w:eastAsia="Times New Roman" w:hAnsi="Aptos Narrow" w:cs="Times New Roman"/>
+                <w:color w:val="000000"/>
+                <w:kern w:val="0"/>
+                <w:sz w:val="22"/>
+                <w:szCs w:val="22"/>
+                <w:lang w:val="en-SG" w:eastAsia="en-SG"/>
+                <w14:ligatures w14:val="none"/>
+              </w:rPr>
+              <w:t>13366</w:t>
+            </w:r>
+          </w:p>
+        </w:tc>
+      </w:tr>
+      <w:tr>
+        <w:trPr>
+          <w:trHeight w:val="290"/>
+        </w:trPr>
+        <w:tc>
+          <w:tcPr>
+            <w:tcW w:w="5597" w:type="dxa"/>
+            <w:tcBorders>
+              <w:top w:val="nil"/>
+              <w:left w:val="single" w:sz="4" w:space="0" w:color="auto"/>
+              <w:bottom w:val="single" w:sz="4" w:space="0" w:color="auto"/>
+              <w:right w:val="single" w:sz="4" w:space="0" w:color="auto"/>
+            </w:tcBorders>
+            <w:noWrap/>
+            <w:vAlign w:val="bottom"/>
+            <w:hideMark/>
+          </w:tcPr>
+          <w:p>
+            <w:pPr>
+              <w:spacing w:after="0" w:line="240" w:lineRule="auto"/>
+              <w:rPr>
+                <w:rFonts w:ascii="Aptos Narrow" w:eastAsia="Times New Roman" w:hAnsi="Aptos Narrow" w:cs="Times New Roman"/>
+                <w:b/>
+                <w:bCs/>
+                <w:color w:val="000000"/>
+                <w:kern w:val="0"/>
+                <w:sz w:val="22"/>
+                <w:szCs w:val="22"/>
+                <w:lang w:val="en-SG" w:eastAsia="en-SG"/>
+                <w14:ligatures w14:val="none"/>
+              </w:rPr>
+            </w:pPr>
+            <w:r>
+              <w:rPr>
+                <w:rFonts w:ascii="Aptos Narrow" w:eastAsia="Times New Roman" w:hAnsi="Aptos Narrow" w:cs="Times New Roman"/>
+                <w:b/>
+                <w:bCs/>
+                <w:color w:val="000000"/>
+                <w:kern w:val="0"/>
+                <w:sz w:val="22"/>
+                <w:szCs w:val="22"/>
+                <w:lang w:val="en-SG" w:eastAsia="en-SG"/>
+                <w14:ligatures w14:val="none"/>
+              </w:rPr>
+              <w:t>N(Congestion and Clear Weather)</w:t>
+            </w:r>
+          </w:p>
+        </w:tc>
+        <w:tc>
+          <w:tcPr>
+            <w:tcW w:w="1263" w:type="dxa"/>
+            <w:tcBorders>
+              <w:top w:val="nil"/>
+              <w:left w:val="nil"/>
+              <w:bottom w:val="single" w:sz="4" w:space="0" w:color="auto"/>
+              <w:right w:val="single" w:sz="4" w:space="0" w:color="auto"/>
+            </w:tcBorders>
+            <w:noWrap/>
+            <w:vAlign w:val="bottom"/>
+            <w:hideMark/>
+          </w:tcPr>
+          <w:p>
+            <w:pPr>
+              <w:spacing w:after="0" w:line="240" w:lineRule="auto"/>
+              <w:jc w:val="right"/>
+              <w:rPr>
+                <w:rFonts w:ascii="Aptos Narrow" w:eastAsia="Times New Roman" w:hAnsi="Aptos Narrow" w:cs="Times New Roman"/>
+                <w:color w:val="000000"/>
+                <w:kern w:val="0"/>
+                <w:sz w:val="22"/>
+                <w:szCs w:val="22"/>
+                <w:lang w:val="en-SG" w:eastAsia="en-SG"/>
+                <w14:ligatures w14:val="none"/>
+              </w:rPr>
+            </w:pPr>
+            <w:r>
+              <w:rPr>
+                <w:rFonts w:ascii="Aptos Narrow" w:eastAsia="Times New Roman" w:hAnsi="Aptos Narrow" w:cs="Times New Roman"/>
+                <w:color w:val="000000"/>
+                <w:kern w:val="0"/>
+                <w:sz w:val="22"/>
+                <w:szCs w:val="22"/>
+                <w:lang w:val="en-SG" w:eastAsia="en-SG"/>
+                <w14:ligatures w14:val="none"/>
+              </w:rPr>
+              <w:t>1762</w:t>
+            </w:r>
+          </w:p>
+        </w:tc>
+      </w:tr>
+      <w:tr>
+        <w:trPr>
+          <w:trHeight w:val="290"/>
+        </w:trPr>
+        <w:tc>
+          <w:tcPr>
+            <w:tcW w:w="5597" w:type="dxa"/>
+            <w:tcBorders>
+              <w:top w:val="nil"/>
+              <w:left w:val="single" w:sz="4" w:space="0" w:color="auto"/>
+              <w:bottom w:val="single" w:sz="4" w:space="0" w:color="auto"/>
+              <w:right w:val="single" w:sz="4" w:space="0" w:color="auto"/>
+            </w:tcBorders>
+            <w:noWrap/>
+            <w:vAlign w:val="bottom"/>
+            <w:hideMark/>
+          </w:tcPr>
+          <w:p>
+            <w:pPr>
+              <w:spacing w:after="0" w:line="240" w:lineRule="auto"/>
+              <w:rPr>
+                <w:rFonts w:ascii="Aptos Narrow" w:eastAsia="Times New Roman" w:hAnsi="Aptos Narrow" w:cs="Times New Roman"/>
+                <w:b/>
+                <w:bCs/>
+                <w:color w:val="000000"/>
+                <w:kern w:val="0"/>
+                <w:sz w:val="22"/>
+                <w:szCs w:val="22"/>
+                <w:lang w:val="en-SG" w:eastAsia="en-SG"/>
+                <w14:ligatures w14:val="none"/>
+              </w:rPr>
+            </w:pPr>
+            <w:r>
+              <w:rPr>
+                <w:rFonts w:ascii="Aptos Narrow" w:eastAsia="Times New Roman" w:hAnsi="Aptos Narrow" w:cs="Times New Roman"/>
+                <w:b/>
+                <w:bCs/>
+                <w:color w:val="000000"/>
+                <w:kern w:val="0"/>
+                <w:sz w:val="22"/>
+                <w:szCs w:val="22"/>
+                <w:lang w:val="en-SG" w:eastAsia="en-SG"/>
+                <w14:ligatures w14:val="none"/>
+              </w:rPr>
+              <w:t xml:space="preserve"> P(Congestion) </w:t>
+            </w:r>
+          </w:p>
+        </w:tc>
+        <w:tc>
+          <w:tcPr>
+            <w:tcW w:w="1263" w:type="dxa"/>
+            <w:tcBorders>
+              <w:top w:val="nil"/>
+              <w:left w:val="nil"/>
+              <w:bottom w:val="single" w:sz="4" w:space="0" w:color="auto"/>
+              <w:right w:val="single" w:sz="4" w:space="0" w:color="auto"/>
+            </w:tcBorders>
+            <w:noWrap/>
+            <w:vAlign w:val="bottom"/>
+            <w:hideMark/>
+          </w:tcPr>
+          <w:p>
+            <w:pPr>
+              <w:spacing w:after="0" w:line="240" w:lineRule="auto"/>
+              <w:jc w:val="right"/>
+              <w:rPr>
+                <w:rFonts w:ascii="Aptos Narrow" w:eastAsia="Times New Roman" w:hAnsi="Aptos Narrow" w:cs="Times New Roman"/>
+                <w:color w:val="000000"/>
+                <w:kern w:val="0"/>
+                <w:sz w:val="22"/>
+                <w:szCs w:val="22"/>
+                <w:lang w:val="en-SG" w:eastAsia="en-SG"/>
+                <w14:ligatures w14:val="none"/>
+              </w:rPr>
+            </w:pPr>
+            <w:r>
+              <w:rPr>
+                <w:rFonts w:ascii="Aptos Narrow" w:eastAsia="Times New Roman" w:hAnsi="Aptos Narrow" w:cs="Times New Roman"/>
+                <w:color w:val="000000"/>
+                <w:kern w:val="0"/>
+                <w:sz w:val="22"/>
+                <w:szCs w:val="22"/>
+                <w:lang w:val="en-SG" w:eastAsia="en-SG"/>
+                <w14:ligatures w14:val="none"/>
+              </w:rPr>
+              <w:t>15.05%</w:t>
+            </w:r>
+          </w:p>
+        </w:tc>
+      </w:tr>
+      <w:tr>
+        <w:trPr>
+          <w:trHeight w:val="290"/>
+        </w:trPr>
+        <w:tc>
+          <w:tcPr>
+            <w:tcW w:w="5597" w:type="dxa"/>
+            <w:tcBorders>
+              <w:top w:val="nil"/>
+              <w:left w:val="single" w:sz="4" w:space="0" w:color="auto"/>
+              <w:bottom w:val="single" w:sz="4" w:space="0" w:color="auto"/>
+              <w:right w:val="single" w:sz="4" w:space="0" w:color="auto"/>
+            </w:tcBorders>
+            <w:noWrap/>
+            <w:vAlign w:val="bottom"/>
+            <w:hideMark/>
+          </w:tcPr>
+          <w:p>
+            <w:pPr>
+              <w:spacing w:after="0" w:line="240" w:lineRule="auto"/>
+              <w:rPr>
+                <w:rFonts w:ascii="Aptos Narrow" w:eastAsia="Times New Roman" w:hAnsi="Aptos Narrow" w:cs="Times New Roman"/>
+                <w:b/>
+                <w:bCs/>
+                <w:color w:val="000000"/>
+                <w:kern w:val="0"/>
+                <w:sz w:val="22"/>
+                <w:szCs w:val="22"/>
+                <w:lang w:val="en-SG" w:eastAsia="en-SG"/>
+                <w14:ligatures w14:val="none"/>
+              </w:rPr>
+            </w:pPr>
+            <w:r>
+              <w:rPr>
+                <w:rFonts w:ascii="Aptos Narrow" w:eastAsia="Times New Roman" w:hAnsi="Aptos Narrow" w:cs="Times New Roman"/>
+                <w:b/>
+                <w:bCs/>
+                <w:color w:val="000000"/>
+                <w:kern w:val="0"/>
+                <w:sz w:val="22"/>
+                <w:szCs w:val="22"/>
+                <w:lang w:val="en-SG" w:eastAsia="en-SG"/>
+                <w14:ligatures w14:val="none"/>
+              </w:rPr>
+              <w:t xml:space="preserve"> P(Clear Weather) </w:t>
+            </w:r>
+          </w:p>
+        </w:tc>
+        <w:tc>
+          <w:tcPr>
+            <w:tcW w:w="1263" w:type="dxa"/>
+            <w:tcBorders>
+              <w:top w:val="nil"/>
+              <w:left w:val="nil"/>
+              <w:bottom w:val="single" w:sz="4" w:space="0" w:color="auto"/>
+              <w:right w:val="single" w:sz="4" w:space="0" w:color="auto"/>
+            </w:tcBorders>
+            <w:noWrap/>
+            <w:vAlign w:val="bottom"/>
+            <w:hideMark/>
+          </w:tcPr>
+          <w:p>
+            <w:pPr>
+              <w:spacing w:after="0" w:line="240" w:lineRule="auto"/>
+              <w:jc w:val="right"/>
+              <w:rPr>
+                <w:rFonts w:ascii="Aptos Narrow" w:eastAsia="Times New Roman" w:hAnsi="Aptos Narrow" w:cs="Times New Roman"/>
+                <w:color w:val="000000"/>
+                <w:kern w:val="0"/>
+                <w:sz w:val="22"/>
+                <w:szCs w:val="22"/>
+                <w:lang w:val="en-SG" w:eastAsia="en-SG"/>
+                <w14:ligatures w14:val="none"/>
+              </w:rPr>
+            </w:pPr>
+            <w:r>
+              <w:rPr>
+                <w:rFonts w:ascii="Aptos Narrow" w:eastAsia="Times New Roman" w:hAnsi="Aptos Narrow" w:cs="Times New Roman"/>
+                <w:color w:val="000000"/>
+                <w:kern w:val="0"/>
+                <w:sz w:val="22"/>
+                <w:szCs w:val="22"/>
+                <w:lang w:val="en-SG" w:eastAsia="en-SG"/>
+                <w14:ligatures w14:val="none"/>
+              </w:rPr>
+              <w:t>32.94%</w:t>
+            </w:r>
+          </w:p>
+        </w:tc>
+      </w:tr>
+      <w:tr>
+        <w:trPr>
+          <w:trHeight w:val="290"/>
+        </w:trPr>
+        <w:tc>
+          <w:tcPr>
+            <w:tcW w:w="5597" w:type="dxa"/>
+            <w:tcBorders>
+              <w:top w:val="nil"/>
+              <w:left w:val="single" w:sz="4" w:space="0" w:color="auto"/>
+              <w:bottom w:val="single" w:sz="4" w:space="0" w:color="auto"/>
+              <w:right w:val="single" w:sz="4" w:space="0" w:color="auto"/>
+            </w:tcBorders>
+            <w:noWrap/>
+            <w:vAlign w:val="bottom"/>
+            <w:hideMark/>
+          </w:tcPr>
+          <w:p>
+            <w:pPr>
+              <w:spacing w:after="0" w:line="240" w:lineRule="auto"/>
+              <w:rPr>
+                <w:rFonts w:ascii="Aptos Narrow" w:eastAsia="Times New Roman" w:hAnsi="Aptos Narrow" w:cs="Times New Roman"/>
+                <w:b/>
+                <w:bCs/>
+                <w:color w:val="000000"/>
+                <w:kern w:val="0"/>
+                <w:sz w:val="22"/>
+                <w:szCs w:val="22"/>
+                <w:lang w:val="en-SG" w:eastAsia="en-SG"/>
+                <w14:ligatures w14:val="none"/>
+              </w:rPr>
+            </w:pPr>
+            <w:r>
+              <w:rPr>
+                <w:rFonts w:ascii="Aptos Narrow" w:eastAsia="Times New Roman" w:hAnsi="Aptos Narrow" w:cs="Times New Roman"/>
+                <w:b/>
+                <w:bCs/>
+                <w:color w:val="000000"/>
+                <w:kern w:val="0"/>
+                <w:sz w:val="22"/>
+                <w:szCs w:val="22"/>
+                <w:lang w:val="en-SG" w:eastAsia="en-SG"/>
+                <w14:ligatures w14:val="none"/>
+              </w:rPr>
+              <w:t xml:space="preserve"> P(Congestion And Clear Weather) </w:t>
+            </w:r>
+          </w:p>
+        </w:tc>
+        <w:tc>
+          <w:tcPr>
+            <w:tcW w:w="1263" w:type="dxa"/>
+            <w:tcBorders>
+              <w:top w:val="nil"/>
+              <w:left w:val="nil"/>
+              <w:bottom w:val="single" w:sz="4" w:space="0" w:color="auto"/>
+              <w:right w:val="single" w:sz="4" w:space="0" w:color="auto"/>
+            </w:tcBorders>
+            <w:noWrap/>
+            <w:vAlign w:val="bottom"/>
+            <w:hideMark/>
+          </w:tcPr>
+          <w:p>
+            <w:pPr>
+              <w:spacing w:after="0" w:line="240" w:lineRule="auto"/>
+              <w:jc w:val="right"/>
+              <w:rPr>
+                <w:rFonts w:ascii="Aptos Narrow" w:eastAsia="Times New Roman" w:hAnsi="Aptos Narrow" w:cs="Times New Roman"/>
+                <w:color w:val="000000"/>
+                <w:kern w:val="0"/>
+                <w:sz w:val="22"/>
+                <w:szCs w:val="22"/>
+                <w:lang w:val="en-SG" w:eastAsia="en-SG"/>
+                <w14:ligatures w14:val="none"/>
+              </w:rPr>
+            </w:pPr>
+            <w:r>
+              <w:rPr>
+                <w:rFonts w:ascii="Aptos Narrow" w:eastAsia="Times New Roman" w:hAnsi="Aptos Narrow" w:cs="Times New Roman"/>
+                <w:color w:val="000000"/>
+                <w:kern w:val="0"/>
+                <w:sz w:val="22"/>
+                <w:szCs w:val="22"/>
+                <w:lang w:val="en-SG" w:eastAsia="en-SG"/>
+                <w14:ligatures w14:val="none"/>
+              </w:rPr>
+              <w:t>4.34%</w:t>
+            </w:r>
+          </w:p>
+        </w:tc>
+      </w:tr>
+    </w:tbl>
+    <w:p>
+      <w:pPr>
+        <w:rPr>
+          <w:rFonts w:ascii="Times New Roman" w:hAnsi="Times New Roman" w:cs="Times New Roman"/>
+          <w:sz w:val="22"/>
+        </w:rPr>
+      </w:pPr>
+    </w:p>
+    <w:p>
+      <w:r>
+        <w:rPr>
+          <w:rFonts w:ascii="Times New Roman" w:hAnsi="Times New Roman" w:cs="Times New Roman"/>
+          <w:b/>
+          <w:bCs/>
+          <w:sz w:val="22"/>
+        </w:rPr>
+        <w:t>Method:</w:t>
+      </w:r>
+      <w:r>
+        <w:rPr>
+          <w:rFonts w:ascii="Times New Roman" w:hAnsi="Times New Roman" w:cs="Times New Roman"/>
+          <w:sz w:val="22"/>
+        </w:rPr>
+        <w:t xml:space="preserve"> All three probabilities are empirical relative frequencies computed over the same 40,575</w:t>
+      </w:r>
+      <w:r>
+        <w:rPr>
+          <w:rFonts w:ascii="Times New Roman" w:hAnsi="Times New Roman" w:cs="Times New Roman"/>
+          <w:sz w:val="22"/>
+        </w:rPr>
+        <w:t xml:space="preserve"> deduplicated rows</w:t>
+      </w:r>
+      <w:r>
+        <w:rPr>
+          <w:rFonts w:ascii="Times New Roman" w:hAnsi="Times New Roman" w:cs="Times New Roman"/>
+          <w:sz w:val="22"/>
+        </w:rPr>
+        <w:t xml:space="preserve">, one-row-per-hour dataset used throughout </w:t>
+      </w:r>
+      <w:r>
+        <w:rPr>
+          <w:rFonts w:ascii="Times New Roman" w:hAnsi="Times New Roman" w:cs="Times New Roman"/>
+          <w:sz w:val="22"/>
+        </w:rPr>
+        <w:t>the previous tasks</w:t>
+      </w:r>
+      <w:r>
+        <w:rPr>
+          <w:rFonts w:ascii="Times New Roman" w:hAnsi="Times New Roman" w:cs="Times New Roman"/>
+          <w:sz w:val="22"/>
+        </w:rPr>
+        <w:t xml:space="preserve"> (so an hour with multiple weather log entries is not double-counted). "Clear Weather" uses the weather_main column’s exact category "Clear" (one of 10 categories in the data: Clouds, Clear, Rain, Drizzle, Mist, Fog, Thunderstorm, Haze, Snow, Squall, Smoke) rather than the free-text weather_description field, since weather_main gives a single unambiguous label per hour.</w:t>
+      </w:r>
+    </w:p>
+    <w:p>
+      <w:r>
+        <w:rPr>
+          <w:rFonts w:ascii="Times New Roman" w:hAnsi="Times New Roman" w:cs="Times New Roman"/>
+          <w:b/>
+          <w:sz w:val="22"/>
+        </w:rPr>
+        <w:t xml:space="preserve">P(Congestion): </w:t>
+      </w:r>
+      <w:r>
+        <w:rPr>
+          <w:rFonts w:ascii="Times New Roman" w:hAnsi="Times New Roman" w:cs="Times New Roman"/>
+          <w:sz w:val="22"/>
+        </w:rPr>
+        <w:t>6,107 of 40,575 hours have traffic_volume &gt; 5,500, so P(Congestion) = 6,107 / 40,575 ≈ 0.1505 (15.05%).</w:t>
+      </w:r>
+    </w:p>
+    <w:p>
+      <w:r>
+        <w:rPr>
+          <w:rFonts w:ascii="Times New Roman" w:hAnsi="Times New Roman" w:cs="Times New Roman"/>
+          <w:b/>
+          <w:sz w:val="22"/>
+        </w:rPr>
+        <w:t xml:space="preserve">P(Clear Weather): </w:t>
+      </w:r>
+      <w:r>
+        <w:rPr>
+          <w:rFonts w:ascii="Times New Roman" w:hAnsi="Times New Roman" w:cs="Times New Roman"/>
+          <w:sz w:val="22"/>
+        </w:rPr>
+        <w:t>13,366 of 40,575 hours are logged with weather_main = "Clear", so P(Clear Weather) = 13,366 / 40,575 ≈ 0.3294 (32.94%).</w:t>
+      </w:r>
+    </w:p>
+    <w:p>
+      <w:r>
+        <w:rPr>
+          <w:rFonts w:ascii="Times New Roman" w:hAnsi="Times New Roman" w:cs="Times New Roman"/>
+          <w:b/>
+          <w:sz w:val="22"/>
+        </w:rPr>
+        <w:t xml:space="preserve">P(Congestion AND Clear Weather): </w:t>
+      </w:r>
+      <w:r>
+        <w:rPr>
+          <w:rFonts w:ascii="Times New Roman" w:hAnsi="Times New Roman" w:cs="Times New Roman"/>
+          <w:sz w:val="22"/>
+        </w:rPr>
+        <w:t>1,762 of 40,575 hours are both congested and clear, so P(Congestion AND Clear Weather) = 1,762 / 40,575 ≈ 0.0434 (4.34%).</w:t>
+      </w:r>
+    </w:p>
+    <w:p>
+      <w:pPr>
+        <w:rPr>
+          <w:rFonts w:ascii="Times New Roman" w:hAnsi="Times New Roman" w:cs="Times New Roman"/>
+          <w:sz w:val="22"/>
+        </w:rPr>
+      </w:pPr>
+    </w:p>
+    <w:p>
+      <w:pPr>
+        <w:rPr>
+          <w:rFonts w:ascii="Times New Roman" w:hAnsi="Times New Roman" w:cs="Times New Roman"/>
+          <w:sz w:val="22"/>
+        </w:rPr>
+      </w:pPr>
+    </w:p>
+    <w:p/>
     <w:sectPr>
       <w:pgSz w:w="11906" w:h="16838"/>
       <w:pgMar w:top="1440" w:right="1440" w:bottom="1440" w:left="1440" w:header="708" w:footer="708" w:gutter="0"/>
@@ -3741,6 +6088,119 @@
 <file path=word/numbering.xml><?xml version="1.0" encoding="utf-8"?>
 <w:numbering xmlns:wpc="http://schemas.microsoft.com/office/word/2010/wordprocessingCanvas" xmlns:cx="http://schemas.microsoft.com/office/drawing/2014/chartex" xmlns:cx1="http://schemas.microsoft.com/office/drawing/2015/9/8/chartex" xmlns:cx2="http://schemas.microsoft.com/office/drawing/2015/10/21/chartex" xmlns:cx3="http://schemas.microsoft.com/office/drawing/2016/5/9/chartex" xmlns:cx4="http://schemas.microsoft.com/office/drawing/2016/5/10/chartex" xmlns:cx5="http://schemas.microsoft.com/office/drawing/2016/5/11/chartex" xmlns:cx6="http://schemas.microsoft.com/office/drawing/2016/5/12/chartex" xmlns:cx7="http://schemas.microsoft.com/office/drawing/2016/5/13/chartex" xmlns:cx8="http://schemas.microsoft.com/office/drawing/2016/5/14/chartex" xmlns:mc="http://schemas.openxmlformats.org/markup-compatibility/2006" xmlns:aink="http://schemas.microsoft.com/office/drawing/2016/ink" xmlns:am3d="http://schemas.microsoft.com/office/drawing/2017/model3d" xmlns:o="urn:schemas-microsoft-com:office:office" xmlns:oel="http://schemas.microsoft.com/office/2019/extlst" xmlns:r="http://schemas.openxmlformats.org/officeDocument/2006/relationships" xmlns:m="http://schemas.openxmlformats.org/officeDocument/2006/math" xmlns:v="urn:schemas-microsoft-com:vml" xmlns:wp14="http://schemas.microsoft.com/office/word/2010/wordprocessingDrawing" xmlns:wp="http://schemas.openxmlformats.org/drawingml/2006/wordprocessingDrawing" xmlns:w10="urn:schemas-microsoft-com:office:word" xmlns:w="http://schemas.openxmlformats.org/wordprocessingml/2006/main" xmlns:w14="http://schemas.microsoft.com/office/word/2010/wordml" xmlns:w15="http://schemas.microsoft.com/office/word/2012/wordml" xmlns:w16cex="http://schemas.microsoft.com/office/word/2018/wordml/cex" xmlns:w16cid="http://schemas.microsoft.com/office/word/2016/wordml/cid" xmlns:w16="http://schemas.microsoft.com/office/word/2018/wordml" xmlns:w16du="http://schemas.microsoft.com/office/word/2023/wordml/word16du" xmlns:w16sdtdh="http://schemas.microsoft.com/office/word/2020/wordml/sdtdatahash" xmlns:w16sdtfl="http://schemas.microsoft.com/office/word/2024/wordml/sdtformatlock" xmlns:w16se="http://schemas.microsoft.com/office/word/2015/wordml/symex" xmlns:wpg="http://schemas.microsoft.com/office/word/2010/wordprocessingGroup" xmlns:wpi="http://schemas.microsoft.com/office/word/2010/wordprocessingInk" xmlns:wne="http://schemas.microsoft.com/office/word/2006/wordml" xmlns:wps="http://schemas.microsoft.com/office/word/2010/wordprocessingShape" mc:Ignorable="w14 w15 w16se w16cid w16 w16cex w16sdtdh w16sdtfl w16du wp14">
   <w:abstractNum w:abstractNumId="0" w15:restartNumberingAfterBreak="0">
+    <w:nsid w:val="08B35A96"/>
+    <w:multiLevelType w:val="hybridMultilevel"/>
+    <w:tmpl w:val="C7E4FB6E"/>
+    <w:lvl w:ilvl="0" w:tplc="34090001">
+      <w:start w:val="1"/>
+      <w:numFmt w:val="bullet"/>
+      <w:lvlText w:val=""/>
+      <w:lvlJc w:val="left"/>
+      <w:pPr>
+        <w:ind w:left="1080" w:hanging="360"/>
+      </w:pPr>
+      <w:rPr>
+        <w:rFonts w:ascii="Symbol" w:hAnsi="Symbol" w:hint="default"/>
+      </w:rPr>
+    </w:lvl>
+    <w:lvl w:ilvl="1" w:tplc="34090003" w:tentative="1">
+      <w:start w:val="1"/>
+      <w:numFmt w:val="bullet"/>
+      <w:lvlText w:val="o"/>
+      <w:lvlJc w:val="left"/>
+      <w:pPr>
+        <w:ind w:left="1800" w:hanging="360"/>
+      </w:pPr>
+      <w:rPr>
+        <w:rFonts w:ascii="Courier New" w:hAnsi="Courier New" w:cs="Courier New" w:hint="default"/>
+      </w:rPr>
+    </w:lvl>
+    <w:lvl w:ilvl="2" w:tplc="34090005" w:tentative="1">
+      <w:start w:val="1"/>
+      <w:numFmt w:val="bullet"/>
+      <w:lvlText w:val=""/>
+      <w:lvlJc w:val="left"/>
+      <w:pPr>
+        <w:ind w:left="2520" w:hanging="360"/>
+      </w:pPr>
+      <w:rPr>
+        <w:rFonts w:ascii="Wingdings" w:hAnsi="Wingdings" w:hint="default"/>
+      </w:rPr>
+    </w:lvl>
+    <w:lvl w:ilvl="3" w:tplc="34090001" w:tentative="1">
+      <w:start w:val="1"/>
+      <w:numFmt w:val="bullet"/>
+      <w:lvlText w:val=""/>
+      <w:lvlJc w:val="left"/>
+      <w:pPr>
+        <w:ind w:left="3240" w:hanging="360"/>
+      </w:pPr>
+      <w:rPr>
+        <w:rFonts w:ascii="Symbol" w:hAnsi="Symbol" w:hint="default"/>
+      </w:rPr>
+    </w:lvl>
+    <w:lvl w:ilvl="4" w:tplc="34090003" w:tentative="1">
+      <w:start w:val="1"/>
+      <w:numFmt w:val="bullet"/>
+      <w:lvlText w:val="o"/>
+      <w:lvlJc w:val="left"/>
+      <w:pPr>
+        <w:ind w:left="3960" w:hanging="360"/>
+      </w:pPr>
+      <w:rPr>
+        <w:rFonts w:ascii="Courier New" w:hAnsi="Courier New" w:cs="Courier New" w:hint="default"/>
+      </w:rPr>
+    </w:lvl>
+    <w:lvl w:ilvl="5" w:tplc="34090005" w:tentative="1">
+      <w:start w:val="1"/>
+      <w:numFmt w:val="bullet"/>
+      <w:lvlText w:val=""/>
+      <w:lvlJc w:val="left"/>
+      <w:pPr>
+        <w:ind w:left="4680" w:hanging="360"/>
+      </w:pPr>
+      <w:rPr>
+        <w:rFonts w:ascii="Wingdings" w:hAnsi="Wingdings" w:hint="default"/>
+      </w:rPr>
+    </w:lvl>
+    <w:lvl w:ilvl="6" w:tplc="34090001" w:tentative="1">
+      <w:start w:val="1"/>
+      <w:numFmt w:val="bullet"/>
+      <w:lvlText w:val=""/>
+      <w:lvlJc w:val="left"/>
+      <w:pPr>
+        <w:ind w:left="5400" w:hanging="360"/>
+      </w:pPr>
+      <w:rPr>
+        <w:rFonts w:ascii="Symbol" w:hAnsi="Symbol" w:hint="default"/>
+      </w:rPr>
+    </w:lvl>
+    <w:lvl w:ilvl="7" w:tplc="34090003" w:tentative="1">
+      <w:start w:val="1"/>
+      <w:numFmt w:val="bullet"/>
+      <w:lvlText w:val="o"/>
+      <w:lvlJc w:val="left"/>
+      <w:pPr>
+        <w:ind w:left="6120" w:hanging="360"/>
+      </w:pPr>
+      <w:rPr>
+        <w:rFonts w:ascii="Courier New" w:hAnsi="Courier New" w:cs="Courier New" w:hint="default"/>
+      </w:rPr>
+    </w:lvl>
+    <w:lvl w:ilvl="8" w:tplc="34090005" w:tentative="1">
+      <w:start w:val="1"/>
+      <w:numFmt w:val="bullet"/>
+      <w:lvlText w:val=""/>
+      <w:lvlJc w:val="left"/>
+      <w:pPr>
+        <w:ind w:left="6840" w:hanging="360"/>
+      </w:pPr>
+      <w:rPr>
+        <w:rFonts w:ascii="Wingdings" w:hAnsi="Wingdings" w:hint="default"/>
+      </w:rPr>
+    </w:lvl>
+  </w:abstractNum>
+  <w:abstractNum w:abstractNumId="1" w15:restartNumberingAfterBreak="0">
     <w:nsid w:val="108A38F2"/>
     <w:multiLevelType w:val="hybridMultilevel"/>
     <w:tmpl w:val="94E46B62"/>
@@ -3853,7 +6313,7 @@
       </w:rPr>
     </w:lvl>
   </w:abstractNum>
-  <w:abstractNum w:abstractNumId="1" w15:restartNumberingAfterBreak="0">
+  <w:abstractNum w:abstractNumId="2" w15:restartNumberingAfterBreak="0">
     <w:nsid w:val="1F117553"/>
     <w:multiLevelType w:val="hybridMultilevel"/>
     <w:tmpl w:val="722A14DC"/>
@@ -3966,96 +6426,10 @@
       </w:rPr>
     </w:lvl>
   </w:abstractNum>
-  <w:abstractNum w:abstractNumId="2" w15:restartNumberingAfterBreak="0">
-    <w:nsid w:val="35083D96"/>
+  <w:abstractNum w:abstractNumId="3" w15:restartNumberingAfterBreak="0">
+    <w:nsid w:val="205F1E66"/>
     <w:multiLevelType w:val="hybridMultilevel"/>
-    <w:tmpl w:val="CB6452E0"/>
-    <w:lvl w:ilvl="0" w:tplc="4809000F">
-      <w:start w:val="1"/>
-      <w:numFmt w:val="decimal"/>
-      <w:lvlText w:val="%1."/>
-      <w:lvlJc w:val="left"/>
-      <w:pPr>
-        <w:ind w:left="720" w:hanging="360"/>
-      </w:pPr>
-    </w:lvl>
-    <w:lvl w:ilvl="1" w:tplc="48090019" w:tentative="1">
-      <w:start w:val="1"/>
-      <w:numFmt w:val="lowerLetter"/>
-      <w:lvlText w:val="%2."/>
-      <w:lvlJc w:val="left"/>
-      <w:pPr>
-        <w:ind w:left="1440" w:hanging="360"/>
-      </w:pPr>
-    </w:lvl>
-    <w:lvl w:ilvl="2" w:tplc="4809001B" w:tentative="1">
-      <w:start w:val="1"/>
-      <w:numFmt w:val="lowerRoman"/>
-      <w:lvlText w:val="%3."/>
-      <w:lvlJc w:val="right"/>
-      <w:pPr>
-        <w:ind w:left="2160" w:hanging="180"/>
-      </w:pPr>
-    </w:lvl>
-    <w:lvl w:ilvl="3" w:tplc="4809000F" w:tentative="1">
-      <w:start w:val="1"/>
-      <w:numFmt w:val="decimal"/>
-      <w:lvlText w:val="%4."/>
-      <w:lvlJc w:val="left"/>
-      <w:pPr>
-        <w:ind w:left="2880" w:hanging="360"/>
-      </w:pPr>
-    </w:lvl>
-    <w:lvl w:ilvl="4" w:tplc="48090019" w:tentative="1">
-      <w:start w:val="1"/>
-      <w:numFmt w:val="lowerLetter"/>
-      <w:lvlText w:val="%5."/>
-      <w:lvlJc w:val="left"/>
-      <w:pPr>
-        <w:ind w:left="3600" w:hanging="360"/>
-      </w:pPr>
-    </w:lvl>
-    <w:lvl w:ilvl="5" w:tplc="4809001B" w:tentative="1">
-      <w:start w:val="1"/>
-      <w:numFmt w:val="lowerRoman"/>
-      <w:lvlText w:val="%6."/>
-      <w:lvlJc w:val="right"/>
-      <w:pPr>
-        <w:ind w:left="4320" w:hanging="180"/>
-      </w:pPr>
-    </w:lvl>
-    <w:lvl w:ilvl="6" w:tplc="4809000F" w:tentative="1">
-      <w:start w:val="1"/>
-      <w:numFmt w:val="decimal"/>
-      <w:lvlText w:val="%7."/>
-      <w:lvlJc w:val="left"/>
-      <w:pPr>
-        <w:ind w:left="5040" w:hanging="360"/>
-      </w:pPr>
-    </w:lvl>
-    <w:lvl w:ilvl="7" w:tplc="48090019" w:tentative="1">
-      <w:start w:val="1"/>
-      <w:numFmt w:val="lowerLetter"/>
-      <w:lvlText w:val="%8."/>
-      <w:lvlJc w:val="left"/>
-      <w:pPr>
-        <w:ind w:left="5760" w:hanging="360"/>
-      </w:pPr>
-    </w:lvl>
-    <w:lvl w:ilvl="8" w:tplc="4809001B" w:tentative="1">
-      <w:start w:val="1"/>
-      <w:numFmt w:val="lowerRoman"/>
-      <w:lvlText w:val="%9."/>
-      <w:lvlJc w:val="right"/>
-      <w:pPr>
-        <w:ind w:left="6480" w:hanging="180"/>
-      </w:pPr>
-    </w:lvl>
-  </w:abstractNum>
-  <w:abstractNum w:abstractNumId="3" w15:restartNumberingAfterBreak="0">
-    <w:nsid w:val="3FFC78F8"/>
-    <w:multiLevelType w:val="hybridMultilevel"/>
-    <w:tmpl w:val="28688F7E"/>
+    <w:tmpl w:val="C8809040"/>
     <w:lvl w:ilvl="0" w:tplc="34090001">
       <w:start w:val="1"/>
       <w:numFmt w:val="bullet"/>
@@ -4166,6 +6540,205 @@
     </w:lvl>
   </w:abstractNum>
   <w:abstractNum w:abstractNumId="4" w15:restartNumberingAfterBreak="0">
+    <w:nsid w:val="35083D96"/>
+    <w:multiLevelType w:val="hybridMultilevel"/>
+    <w:tmpl w:val="CB6452E0"/>
+    <w:lvl w:ilvl="0" w:tplc="4809000F">
+      <w:start w:val="1"/>
+      <w:numFmt w:val="decimal"/>
+      <w:lvlText w:val="%1."/>
+      <w:lvlJc w:val="left"/>
+      <w:pPr>
+        <w:ind w:left="720" w:hanging="360"/>
+      </w:pPr>
+    </w:lvl>
+    <w:lvl w:ilvl="1" w:tplc="48090019" w:tentative="1">
+      <w:start w:val="1"/>
+      <w:numFmt w:val="lowerLetter"/>
+      <w:lvlText w:val="%2."/>
+      <w:lvlJc w:val="left"/>
+      <w:pPr>
+        <w:ind w:left="1440" w:hanging="360"/>
+      </w:pPr>
+    </w:lvl>
+    <w:lvl w:ilvl="2" w:tplc="4809001B" w:tentative="1">
+      <w:start w:val="1"/>
+      <w:numFmt w:val="lowerRoman"/>
+      <w:lvlText w:val="%3."/>
+      <w:lvlJc w:val="right"/>
+      <w:pPr>
+        <w:ind w:left="2160" w:hanging="180"/>
+      </w:pPr>
+    </w:lvl>
+    <w:lvl w:ilvl="3" w:tplc="4809000F" w:tentative="1">
+      <w:start w:val="1"/>
+      <w:numFmt w:val="decimal"/>
+      <w:lvlText w:val="%4."/>
+      <w:lvlJc w:val="left"/>
+      <w:pPr>
+        <w:ind w:left="2880" w:hanging="360"/>
+      </w:pPr>
+    </w:lvl>
+    <w:lvl w:ilvl="4" w:tplc="48090019" w:tentative="1">
+      <w:start w:val="1"/>
+      <w:numFmt w:val="lowerLetter"/>
+      <w:lvlText w:val="%5."/>
+      <w:lvlJc w:val="left"/>
+      <w:pPr>
+        <w:ind w:left="3600" w:hanging="360"/>
+      </w:pPr>
+    </w:lvl>
+    <w:lvl w:ilvl="5" w:tplc="4809001B" w:tentative="1">
+      <w:start w:val="1"/>
+      <w:numFmt w:val="lowerRoman"/>
+      <w:lvlText w:val="%6."/>
+      <w:lvlJc w:val="right"/>
+      <w:pPr>
+        <w:ind w:left="4320" w:hanging="180"/>
+      </w:pPr>
+    </w:lvl>
+    <w:lvl w:ilvl="6" w:tplc="4809000F" w:tentative="1">
+      <w:start w:val="1"/>
+      <w:numFmt w:val="decimal"/>
+      <w:lvlText w:val="%7."/>
+      <w:lvlJc w:val="left"/>
+      <w:pPr>
+        <w:ind w:left="5040" w:hanging="360"/>
+      </w:pPr>
+    </w:lvl>
+    <w:lvl w:ilvl="7" w:tplc="48090019" w:tentative="1">
+      <w:start w:val="1"/>
+      <w:numFmt w:val="lowerLetter"/>
+      <w:lvlText w:val="%8."/>
+      <w:lvlJc w:val="left"/>
+      <w:pPr>
+        <w:ind w:left="5760" w:hanging="360"/>
+      </w:pPr>
+    </w:lvl>
+    <w:lvl w:ilvl="8" w:tplc="4809001B" w:tentative="1">
+      <w:start w:val="1"/>
+      <w:numFmt w:val="lowerRoman"/>
+      <w:lvlText w:val="%9."/>
+      <w:lvlJc w:val="right"/>
+      <w:pPr>
+        <w:ind w:left="6480" w:hanging="180"/>
+      </w:pPr>
+    </w:lvl>
+  </w:abstractNum>
+  <w:abstractNum w:abstractNumId="5" w15:restartNumberingAfterBreak="0">
+    <w:nsid w:val="3FFC78F8"/>
+    <w:multiLevelType w:val="hybridMultilevel"/>
+    <w:tmpl w:val="28688F7E"/>
+    <w:lvl w:ilvl="0" w:tplc="34090001">
+      <w:start w:val="1"/>
+      <w:numFmt w:val="bullet"/>
+      <w:lvlText w:val=""/>
+      <w:lvlJc w:val="left"/>
+      <w:pPr>
+        <w:ind w:left="1080" w:hanging="360"/>
+      </w:pPr>
+      <w:rPr>
+        <w:rFonts w:ascii="Symbol" w:hAnsi="Symbol" w:hint="default"/>
+      </w:rPr>
+    </w:lvl>
+    <w:lvl w:ilvl="1" w:tplc="34090003" w:tentative="1">
+      <w:start w:val="1"/>
+      <w:numFmt w:val="bullet"/>
+      <w:lvlText w:val="o"/>
+      <w:lvlJc w:val="left"/>
+      <w:pPr>
+        <w:ind w:left="1800" w:hanging="360"/>
+      </w:pPr>
+      <w:rPr>
+        <w:rFonts w:ascii="Courier New" w:hAnsi="Courier New" w:cs="Courier New" w:hint="default"/>
+      </w:rPr>
+    </w:lvl>
+    <w:lvl w:ilvl="2" w:tplc="34090005" w:tentative="1">
+      <w:start w:val="1"/>
+      <w:numFmt w:val="bullet"/>
+      <w:lvlText w:val=""/>
+      <w:lvlJc w:val="left"/>
+      <w:pPr>
+        <w:ind w:left="2520" w:hanging="360"/>
+      </w:pPr>
+      <w:rPr>
+        <w:rFonts w:ascii="Wingdings" w:hAnsi="Wingdings" w:hint="default"/>
+      </w:rPr>
+    </w:lvl>
+    <w:lvl w:ilvl="3" w:tplc="34090001" w:tentative="1">
+      <w:start w:val="1"/>
+      <w:numFmt w:val="bullet"/>
+      <w:lvlText w:val=""/>
+      <w:lvlJc w:val="left"/>
+      <w:pPr>
+        <w:ind w:left="3240" w:hanging="360"/>
+      </w:pPr>
+      <w:rPr>
+        <w:rFonts w:ascii="Symbol" w:hAnsi="Symbol" w:hint="default"/>
+      </w:rPr>
+    </w:lvl>
+    <w:lvl w:ilvl="4" w:tplc="34090003" w:tentative="1">
+      <w:start w:val="1"/>
+      <w:numFmt w:val="bullet"/>
+      <w:lvlText w:val="o"/>
+      <w:lvlJc w:val="left"/>
+      <w:pPr>
+        <w:ind w:left="3960" w:hanging="360"/>
+      </w:pPr>
+      <w:rPr>
+        <w:rFonts w:ascii="Courier New" w:hAnsi="Courier New" w:cs="Courier New" w:hint="default"/>
+      </w:rPr>
+    </w:lvl>
+    <w:lvl w:ilvl="5" w:tplc="34090005" w:tentative="1">
+      <w:start w:val="1"/>
+      <w:numFmt w:val="bullet"/>
+      <w:lvlText w:val=""/>
+      <w:lvlJc w:val="left"/>
+      <w:pPr>
+        <w:ind w:left="4680" w:hanging="360"/>
+      </w:pPr>
+      <w:rPr>
+        <w:rFonts w:ascii="Wingdings" w:hAnsi="Wingdings" w:hint="default"/>
+      </w:rPr>
+    </w:lvl>
+    <w:lvl w:ilvl="6" w:tplc="34090001" w:tentative="1">
+      <w:start w:val="1"/>
+      <w:numFmt w:val="bullet"/>
+      <w:lvlText w:val=""/>
+      <w:lvlJc w:val="left"/>
+      <w:pPr>
+        <w:ind w:left="5400" w:hanging="360"/>
+      </w:pPr>
+      <w:rPr>
+        <w:rFonts w:ascii="Symbol" w:hAnsi="Symbol" w:hint="default"/>
+      </w:rPr>
+    </w:lvl>
+    <w:lvl w:ilvl="7" w:tplc="34090003" w:tentative="1">
+      <w:start w:val="1"/>
+      <w:numFmt w:val="bullet"/>
+      <w:lvlText w:val="o"/>
+      <w:lvlJc w:val="left"/>
+      <w:pPr>
+        <w:ind w:left="6120" w:hanging="360"/>
+      </w:pPr>
+      <w:rPr>
+        <w:rFonts w:ascii="Courier New" w:hAnsi="Courier New" w:cs="Courier New" w:hint="default"/>
+      </w:rPr>
+    </w:lvl>
+    <w:lvl w:ilvl="8" w:tplc="34090005" w:tentative="1">
+      <w:start w:val="1"/>
+      <w:numFmt w:val="bullet"/>
+      <w:lvlText w:val=""/>
+      <w:lvlJc w:val="left"/>
+      <w:pPr>
+        <w:ind w:left="6840" w:hanging="360"/>
+      </w:pPr>
+      <w:rPr>
+        <w:rFonts w:ascii="Wingdings" w:hAnsi="Wingdings" w:hint="default"/>
+      </w:rPr>
+    </w:lvl>
+  </w:abstractNum>
+  <w:abstractNum w:abstractNumId="6" w15:restartNumberingAfterBreak="0">
     <w:nsid w:val="5CD93BD2"/>
     <w:multiLevelType w:val="multilevel"/>
     <w:tmpl w:val="62BAF922"/>
@@ -4314,7 +6887,7 @@
       </w:rPr>
     </w:lvl>
   </w:abstractNum>
-  <w:abstractNum w:abstractNumId="5" w15:restartNumberingAfterBreak="0">
+  <w:abstractNum w:abstractNumId="7" w15:restartNumberingAfterBreak="0">
     <w:nsid w:val="740F428C"/>
     <w:multiLevelType w:val="hybridMultilevel"/>
     <w:tmpl w:val="81E6BFDE"/>
@@ -4427,7 +7000,7 @@
       </w:rPr>
     </w:lvl>
   </w:abstractNum>
-  <w:abstractNum w:abstractNumId="6" w15:restartNumberingAfterBreak="0">
+  <w:abstractNum w:abstractNumId="8" w15:restartNumberingAfterBreak="0">
     <w:nsid w:val="7EE455F6"/>
     <w:multiLevelType w:val="hybridMultilevel"/>
     <w:tmpl w:val="17600EDA"/>
@@ -4541,24 +7114,30 @@
     </w:lvl>
   </w:abstractNum>
   <w:num w:numId="1" w16cid:durableId="1743143035">
+    <w:abstractNumId w:val="8"/>
+  </w:num>
+  <w:num w:numId="2" w16cid:durableId="1082602018">
+    <w:abstractNumId w:val="7"/>
+  </w:num>
+  <w:num w:numId="3" w16cid:durableId="1385986353">
+    <w:abstractNumId w:val="2"/>
+  </w:num>
+  <w:num w:numId="4" w16cid:durableId="411506492">
     <w:abstractNumId w:val="6"/>
   </w:num>
-  <w:num w:numId="2" w16cid:durableId="1082602018">
+  <w:num w:numId="5" w16cid:durableId="1222054480">
     <w:abstractNumId w:val="5"/>
   </w:num>
-  <w:num w:numId="3" w16cid:durableId="1385986353">
+  <w:num w:numId="6" w16cid:durableId="272519437">
+    <w:abstractNumId w:val="4"/>
+  </w:num>
+  <w:num w:numId="7" w16cid:durableId="1779643879">
     <w:abstractNumId w:val="1"/>
   </w:num>
-  <w:num w:numId="4" w16cid:durableId="411506492">
-    <w:abstractNumId w:val="4"/>
-  </w:num>
-  <w:num w:numId="5" w16cid:durableId="1222054480">
+  <w:num w:numId="8" w16cid:durableId="18043436">
     <w:abstractNumId w:val="3"/>
   </w:num>
-  <w:num w:numId="6" w16cid:durableId="272519437">
-    <w:abstractNumId w:val="2"/>
-  </w:num>
-  <w:num w:numId="7" w16cid:durableId="1779643879">
+  <w:num w:numId="9" w16cid:durableId="826092256">
     <w:abstractNumId w:val="0"/>
   </w:num>
 </w:numbering>

</xml_diff>

<commit_message>
Task 4.1 — Data quality and preparation, complete
</commit_message>
<xml_diff>
--- a/part1_data_analytics/part1_analysis_notes.docx
+++ b/part1_data_analytics/part1_analysis_notes.docx
@@ -161,7 +161,15 @@
         <w:pStyle w:val="NormalWeb"/>
       </w:pPr>
       <w:r>
-        <w:t>Loaded Metro_Interstate_Traffic_Volume.csv into a SQLite table traffic_volume (schema in 01_schema.sql) using DB Browser for SQLite's CSV import feature. Verified the load with the following checks, all matching the source CSV</w:t>
+        <w:t xml:space="preserve">Loaded Metro_Interstate_Traffic_Volume.csv into a SQLite table </w:t>
+      </w:r>
+      <w:proofErr w:type="spellStart"/>
+      <w:r>
+        <w:t>traffic_volume</w:t>
+      </w:r>
+      <w:proofErr w:type="spellEnd"/>
+      <w:r>
+        <w:t xml:space="preserve"> (schema in 01_schema.sql) using DB Browser for SQLite's CSV import feature. Verified the load with the following checks, all matching the source CSV</w:t>
       </w:r>
     </w:p>
     <w:p>
@@ -169,15 +177,55 @@
         <w:pStyle w:val="NormalWeb"/>
       </w:pPr>
       <w:r>
-        <w:t>Row count: 48,204 (via SELECT COUNT(*) FROM traffic_volume;)</w:t>
+        <w:t xml:space="preserve">Row count: 48,204 (via SELECT </w:t>
+      </w:r>
+      <w:proofErr w:type="gramStart"/>
+      <w:r>
+        <w:t>COUNT(</w:t>
+      </w:r>
+      <w:proofErr w:type="gramEnd"/>
+      <w:r>
+        <w:t xml:space="preserve">*) FROM </w:t>
+      </w:r>
+      <w:proofErr w:type="spellStart"/>
+      <w:r>
+        <w:t>traffic_volume</w:t>
+      </w:r>
+      <w:proofErr w:type="spellEnd"/>
+      <w:r>
+        <w:t>;)</w:t>
       </w:r>
       <w:r>
         <w:br/>
-        <w:t>Column count: 9, with correct data types (temp/rain_1h/snow_1h as REAL, clouds_all/traffic_volume as INTEGER)</w:t>
+        <w:t xml:space="preserve">Column count: 9, with correct data types (temp/rain_1h/snow_1h as REAL, </w:t>
+      </w:r>
+      <w:proofErr w:type="spellStart"/>
+      <w:r>
+        <w:t>clouds_all</w:t>
+      </w:r>
+      <w:proofErr w:type="spellEnd"/>
+      <w:r>
+        <w:t>/</w:t>
+      </w:r>
+      <w:proofErr w:type="spellStart"/>
+      <w:r>
+        <w:t>traffic_volume</w:t>
+      </w:r>
+      <w:proofErr w:type="spellEnd"/>
+      <w:r>
+        <w:t xml:space="preserve"> as INTEGER)</w:t>
       </w:r>
       <w:r>
         <w:br/>
-        <w:t>Min/max traffic_volume: 0 and 7,280, matching the source data</w:t>
+        <w:t xml:space="preserve">Min/max </w:t>
+      </w:r>
+      <w:proofErr w:type="spellStart"/>
+      <w:r>
+        <w:t>traffic_volume</w:t>
+      </w:r>
+      <w:proofErr w:type="spellEnd"/>
+      <w:r>
+        <w:t>: 0 and 7,280, matching the source data</w:t>
       </w:r>
     </w:p>
     <w:p>
@@ -249,7 +297,31 @@
           <w:szCs w:val="22"/>
           <w:lang w:val="en-PH"/>
         </w:rPr>
-        <w:t>1.2 Analyse annual traffic trends</w:t>
+        <w:t xml:space="preserve">1.2 </w:t>
+      </w:r>
+      <w:proofErr w:type="spellStart"/>
+      <w:r>
+        <w:rPr>
+          <w:rFonts w:ascii="Times New Roman" w:hAnsi="Times New Roman" w:cs="Times New Roman"/>
+          <w:b/>
+          <w:bCs/>
+          <w:sz w:val="22"/>
+          <w:szCs w:val="22"/>
+          <w:lang w:val="en-PH"/>
+        </w:rPr>
+        <w:t>Analyse</w:t>
+      </w:r>
+      <w:proofErr w:type="spellEnd"/>
+      <w:r>
+        <w:rPr>
+          <w:rFonts w:ascii="Times New Roman" w:hAnsi="Times New Roman" w:cs="Times New Roman"/>
+          <w:b/>
+          <w:bCs/>
+          <w:sz w:val="22"/>
+          <w:szCs w:val="22"/>
+          <w:lang w:val="en-PH"/>
+        </w:rPr>
+        <w:t xml:space="preserve"> annual traffic trends</w:t>
       </w:r>
     </w:p>
     <w:p>
@@ -480,7 +552,23 @@
         <w:t>Note:</w:t>
       </w:r>
       <w:r>
-        <w:t xml:space="preserve"> I found that 5,445 timestamps in this dataset appear 2–3 times each, because the weather feed sometimes logs more than one observation within the same hour. I confirmed traffic_volume is identical across these duplicate rows, so I removed duplicates (keeping one row per unique hour, via the hourly_traffic view in 02_annual_trends.sql) before summing. Without this step, the totals above would be inflated.</w:t>
+        <w:t xml:space="preserve"> I found that 5,445 timestamps in this dataset appear 2–3 times each, because the weather feed sometimes logs more than one observation within the same hour. I confirmed </w:t>
+      </w:r>
+      <w:proofErr w:type="spellStart"/>
+      <w:r>
+        <w:t>traffic_volume</w:t>
+      </w:r>
+      <w:proofErr w:type="spellEnd"/>
+      <w:r>
+        <w:t xml:space="preserve"> is identical across these duplicate rows, so I removed duplicates (keeping one row per unique hour, via the </w:t>
+      </w:r>
+      <w:proofErr w:type="spellStart"/>
+      <w:r>
+        <w:t>hourly_traffic</w:t>
+      </w:r>
+      <w:proofErr w:type="spellEnd"/>
+      <w:r>
+        <w:t xml:space="preserve"> view in 02_annual_trends.sql) before summing. Without this step, the totals above would be inflated.</w:t>
       </w:r>
     </w:p>
     <w:p>
@@ -732,8 +820,27 @@
           <w:sz w:val="22"/>
           <w:szCs w:val="22"/>
         </w:rPr>
-        <w:t xml:space="preserve">The totals above are heavily shaped by how much data exists for each year, not just real traffic demand. The percentage of the year </w:t>
-      </w:r>
+        <w:t xml:space="preserve">The totals above are heavily shaped by how much data </w:t>
+      </w:r>
+      <w:proofErr w:type="gramStart"/>
+      <w:r>
+        <w:rPr>
+          <w:rFonts w:ascii="Times New Roman" w:hAnsi="Times New Roman" w:cs="Times New Roman"/>
+          <w:sz w:val="22"/>
+          <w:szCs w:val="22"/>
+        </w:rPr>
+        <w:t>exists for</w:t>
+      </w:r>
+      <w:proofErr w:type="gramEnd"/>
+      <w:r>
+        <w:rPr>
+          <w:rFonts w:ascii="Times New Roman" w:hAnsi="Times New Roman" w:cs="Times New Roman"/>
+          <w:sz w:val="22"/>
+          <w:szCs w:val="22"/>
+        </w:rPr>
+        <w:t xml:space="preserve"> each year, not just real traffic demand. The percentage of the year </w:t>
+      </w:r>
+      <w:proofErr w:type="gramStart"/>
       <w:r>
         <w:rPr>
           <w:rFonts w:ascii="Times New Roman" w:hAnsi="Times New Roman" w:cs="Times New Roman"/>
@@ -750,6 +857,7 @@
         </w:rPr>
         <w:t>covered</w:t>
       </w:r>
+      <w:proofErr w:type="gramEnd"/>
       <w:r>
         <w:rPr>
           <w:rFonts w:ascii="Times New Roman" w:hAnsi="Times New Roman" w:cs="Times New Roman"/>
@@ -788,8 +896,18 @@
           <w:sz w:val="22"/>
           <w:szCs w:val="22"/>
         </w:rPr>
-        <w:t>~ 2 mths</w:t>
-      </w:r>
+        <w:t xml:space="preserve">~ 2 </w:t>
+      </w:r>
+      <w:proofErr w:type="spellStart"/>
+      <w:r>
+        <w:rPr>
+          <w:rFonts w:ascii="Times New Roman" w:hAnsi="Times New Roman" w:cs="Times New Roman"/>
+          <w:sz w:val="22"/>
+          <w:szCs w:val="22"/>
+        </w:rPr>
+        <w:t>mths</w:t>
+      </w:r>
+      <w:proofErr w:type="spellEnd"/>
       <w:r>
         <w:rPr>
           <w:rFonts w:ascii="Times New Roman" w:hAnsi="Times New Roman" w:cs="Times New Roman"/>
@@ -920,7 +1038,31 @@
           <w:szCs w:val="22"/>
           <w:lang w:val="en-PH"/>
         </w:rPr>
-        <w:t>1.3 Analyse temperature around holidays</w:t>
+        <w:t xml:space="preserve">1.3 </w:t>
+      </w:r>
+      <w:proofErr w:type="spellStart"/>
+      <w:r>
+        <w:rPr>
+          <w:rFonts w:ascii="Times New Roman" w:hAnsi="Times New Roman" w:cs="Times New Roman"/>
+          <w:b/>
+          <w:bCs/>
+          <w:sz w:val="22"/>
+          <w:szCs w:val="22"/>
+          <w:lang w:val="en-PH"/>
+        </w:rPr>
+        <w:t>Analyse</w:t>
+      </w:r>
+      <w:proofErr w:type="spellEnd"/>
+      <w:r>
+        <w:rPr>
+          <w:rFonts w:ascii="Times New Roman" w:hAnsi="Times New Roman" w:cs="Times New Roman"/>
+          <w:b/>
+          <w:bCs/>
+          <w:sz w:val="22"/>
+          <w:szCs w:val="22"/>
+          <w:lang w:val="en-PH"/>
+        </w:rPr>
+        <w:t xml:space="preserve"> temperature around holidays</w:t>
       </w:r>
     </w:p>
     <w:p>
@@ -1168,6 +1310,7 @@
                 <w14:ligatures w14:val="none"/>
               </w:rPr>
             </w:pPr>
+            <w:proofErr w:type="spellStart"/>
             <w:r>
               <w:rPr>
                 <w:rFonts w:ascii="Arial" w:eastAsia="Times New Roman" w:hAnsi="Arial" w:cs="Arial"/>
@@ -1180,7 +1323,22 @@
                 <w:lang w:val="en-SG" w:eastAsia="en-SG"/>
                 <w14:ligatures w14:val="none"/>
               </w:rPr>
-              <w:t>Avg Temp (°C)</w:t>
+              <w:t>Avg</w:t>
+            </w:r>
+            <w:proofErr w:type="spellEnd"/>
+            <w:r>
+              <w:rPr>
+                <w:rFonts w:ascii="Arial" w:eastAsia="Times New Roman" w:hAnsi="Arial" w:cs="Arial"/>
+                <w:b/>
+                <w:bCs/>
+                <w:color w:val="FFFFFF"/>
+                <w:kern w:val="0"/>
+                <w:sz w:val="22"/>
+                <w:szCs w:val="22"/>
+                <w:lang w:val="en-SG" w:eastAsia="en-SG"/>
+                <w14:ligatures w14:val="none"/>
+              </w:rPr>
+              <w:t xml:space="preserve"> Temp (°C)</w:t>
             </w:r>
           </w:p>
         </w:tc>
@@ -1214,6 +1372,7 @@
                 <w14:ligatures w14:val="none"/>
               </w:rPr>
             </w:pPr>
+            <w:proofErr w:type="spellStart"/>
             <w:r>
               <w:rPr>
                 <w:rFonts w:ascii="Arial" w:eastAsia="Times New Roman" w:hAnsi="Arial" w:cs="Arial"/>
@@ -1226,7 +1385,22 @@
                 <w:lang w:val="en-SG" w:eastAsia="en-SG"/>
                 <w14:ligatures w14:val="none"/>
               </w:rPr>
-              <w:t>Avg Temp (K)</w:t>
+              <w:t>Avg</w:t>
+            </w:r>
+            <w:proofErr w:type="spellEnd"/>
+            <w:r>
+              <w:rPr>
+                <w:rFonts w:ascii="Arial" w:eastAsia="Times New Roman" w:hAnsi="Arial" w:cs="Arial"/>
+                <w:b/>
+                <w:bCs/>
+                <w:color w:val="FFFFFF"/>
+                <w:kern w:val="0"/>
+                <w:sz w:val="22"/>
+                <w:szCs w:val="22"/>
+                <w:lang w:val="en-SG" w:eastAsia="en-SG"/>
+                <w14:ligatures w14:val="none"/>
+              </w:rPr>
+              <w:t xml:space="preserve"> Temp (K)</w:t>
             </w:r>
           </w:p>
         </w:tc>
@@ -1306,6 +1480,7 @@
                 <w14:ligatures w14:val="none"/>
               </w:rPr>
             </w:pPr>
+            <w:proofErr w:type="spellStart"/>
             <w:r>
               <w:rPr>
                 <w:rFonts w:ascii="Arial" w:eastAsia="Times New Roman" w:hAnsi="Arial" w:cs="Arial"/>
@@ -1318,7 +1493,22 @@
                 <w:lang w:val="en-SG" w:eastAsia="en-SG"/>
                 <w14:ligatures w14:val="none"/>
               </w:rPr>
-              <w:t>Avg Traffic Volume</w:t>
+              <w:t>Avg</w:t>
+            </w:r>
+            <w:proofErr w:type="spellEnd"/>
+            <w:r>
+              <w:rPr>
+                <w:rFonts w:ascii="Arial" w:eastAsia="Times New Roman" w:hAnsi="Arial" w:cs="Arial"/>
+                <w:b/>
+                <w:bCs/>
+                <w:color w:val="FFFFFF"/>
+                <w:kern w:val="0"/>
+                <w:sz w:val="22"/>
+                <w:szCs w:val="22"/>
+                <w:lang w:val="en-SG" w:eastAsia="en-SG"/>
+                <w14:ligatures w14:val="none"/>
+              </w:rPr>
+              <w:t xml:space="preserve"> Traffic Volume</w:t>
             </w:r>
           </w:p>
         </w:tc>
@@ -2884,7 +3074,25 @@
           <w:sz w:val="22"/>
           <w:szCs w:val="22"/>
         </w:rPr>
-        <w:t>(~10mths). As a result, I have marked 2015 New Years day as ‘</w:t>
+        <w:t xml:space="preserve">(~10mths). As a result, I have marked 2015 New </w:t>
+      </w:r>
+      <w:proofErr w:type="gramStart"/>
+      <w:r>
+        <w:rPr>
+          <w:rFonts w:ascii="Times New Roman" w:hAnsi="Times New Roman" w:cs="Times New Roman"/>
+          <w:sz w:val="22"/>
+          <w:szCs w:val="22"/>
+        </w:rPr>
+        <w:t>Years day</w:t>
+      </w:r>
+      <w:proofErr w:type="gramEnd"/>
+      <w:r>
+        <w:rPr>
+          <w:rFonts w:ascii="Times New Roman" w:hAnsi="Times New Roman" w:cs="Times New Roman"/>
+          <w:sz w:val="22"/>
+          <w:szCs w:val="22"/>
+        </w:rPr>
+        <w:t xml:space="preserve"> as ‘</w:t>
       </w:r>
       <w:r>
         <w:rPr>
@@ -3288,7 +3496,25 @@
           <w:sz w:val="22"/>
           <w:szCs w:val="22"/>
         </w:rPr>
-        <w:t>contributing to a YoY growth.</w:t>
+        <w:t xml:space="preserve">contributing to </w:t>
+      </w:r>
+      <w:proofErr w:type="gramStart"/>
+      <w:r>
+        <w:rPr>
+          <w:rFonts w:ascii="Times New Roman" w:hAnsi="Times New Roman" w:cs="Times New Roman"/>
+          <w:sz w:val="22"/>
+          <w:szCs w:val="22"/>
+        </w:rPr>
+        <w:t>a YoY</w:t>
+      </w:r>
+      <w:proofErr w:type="gramEnd"/>
+      <w:r>
+        <w:rPr>
+          <w:rFonts w:ascii="Times New Roman" w:hAnsi="Times New Roman" w:cs="Times New Roman"/>
+          <w:sz w:val="22"/>
+          <w:szCs w:val="22"/>
+        </w:rPr>
+        <w:t xml:space="preserve"> growth.</w:t>
       </w:r>
     </w:p>
     <w:p>
@@ -4620,7 +4846,25 @@
           <w:sz w:val="22"/>
           <w:szCs w:val="22"/>
         </w:rPr>
-        <w:t>A single average figure hides most of what is actually happening, and any predictive model needs to account for this time driven swing rather than treating traffic volume as roughly constant.</w:t>
+        <w:t xml:space="preserve">A single average figure hides most of what is </w:t>
+      </w:r>
+      <w:proofErr w:type="gramStart"/>
+      <w:r>
+        <w:rPr>
+          <w:rFonts w:ascii="Times New Roman" w:hAnsi="Times New Roman" w:cs="Times New Roman"/>
+          <w:sz w:val="22"/>
+          <w:szCs w:val="22"/>
+        </w:rPr>
+        <w:t>actually happening</w:t>
+      </w:r>
+      <w:proofErr w:type="gramEnd"/>
+      <w:r>
+        <w:rPr>
+          <w:rFonts w:ascii="Times New Roman" w:hAnsi="Times New Roman" w:cs="Times New Roman"/>
+          <w:sz w:val="22"/>
+          <w:szCs w:val="22"/>
+        </w:rPr>
+        <w:t>, and any predictive model needs to account for this time driven swing rather than treating traffic volume as roughly constant.</w:t>
       </w:r>
     </w:p>
     <w:p/>
@@ -4884,13 +5128,15 @@
         </w:rPr>
         <w:t xml:space="preserve"> ≈ 0.019, meaning temperature alone statistically accounts for under 2% of the hour-to-hour variation in traffic volume. This lines up with the </w:t>
       </w:r>
-      <w:r>
-        <w:rPr>
-          <w:rFonts w:ascii="Times New Roman" w:hAnsi="Times New Roman" w:cs="Times New Roman"/>
-          <w:sz w:val="22"/>
-        </w:rPr>
-        <w:t>previous</w:t>
-      </w:r>
+      <w:proofErr w:type="spellStart"/>
+      <w:r>
+        <w:rPr>
+          <w:rFonts w:ascii="Times New Roman" w:hAnsi="Times New Roman" w:cs="Times New Roman"/>
+          <w:sz w:val="22"/>
+        </w:rPr>
+        <w:t>sql</w:t>
+      </w:r>
+      <w:proofErr w:type="spellEnd"/>
       <w:r>
         <w:rPr>
           <w:rFonts w:ascii="Times New Roman" w:hAnsi="Times New Roman" w:cs="Times New Roman"/>
@@ -4990,41 +5236,376 @@
       </w:r>
     </w:p>
     <w:p>
-      <w:pPr>
-        <w:rPr>
-          <w:rFonts w:ascii="Times New Roman" w:hAnsi="Times New Roman" w:cs="Times New Roman"/>
-          <w:sz w:val="22"/>
-        </w:rPr>
-      </w:pPr>
-      <w:r>
-        <w:rPr>
-          <w:rFonts w:ascii="Times New Roman" w:hAnsi="Times New Roman" w:cs="Times New Roman"/>
-          <w:sz w:val="22"/>
-        </w:rPr>
-        <w:t xml:space="preserve">Overall, temperature has only a marginal linear association with traffic volume in this dataset. It is directionally positive but too weak to treat as a meaningful driver of traffic on its own, reinforcing </w:t>
-      </w:r>
-      <w:r>
-        <w:rPr>
-          <w:rFonts w:ascii="Times New Roman" w:hAnsi="Times New Roman" w:cs="Times New Roman"/>
-          <w:sz w:val="22"/>
-        </w:rPr>
-        <w:t>those time-based factors</w:t>
-      </w:r>
-      <w:r>
-        <w:rPr>
-          <w:rFonts w:ascii="Times New Roman" w:hAnsi="Times New Roman" w:cs="Times New Roman"/>
-          <w:sz w:val="22"/>
-        </w:rPr>
-        <w:t xml:space="preserve"> (hour, day of week, holiday status) are far more important explanatory variables than weather.</w:t>
-      </w:r>
-    </w:p>
-    <w:p>
-      <w:pPr>
-        <w:rPr>
-          <w:rFonts w:ascii="Times New Roman" w:hAnsi="Times New Roman" w:cs="Times New Roman"/>
-          <w:sz w:val="22"/>
-        </w:rPr>
-      </w:pPr>
+      <w:r>
+        <w:rPr>
+          <w:rFonts w:ascii="Times New Roman" w:hAnsi="Times New Roman" w:cs="Times New Roman"/>
+          <w:sz w:val="22"/>
+        </w:rPr>
+        <w:t>Overall, temperature has only a marginal linear association with traffic volume in this dataset. It is directionally positive but too weak to treat as a meaningful driver of traffic on its own, reinforcing that time-based factors (hour, day of week, holiday status) are far more important explanatory variables than weather.</w:t>
+      </w:r>
+    </w:p>
+    <w:p/>
+    <w:p>
+      <w:r>
+        <w:rPr>
+          <w:rFonts w:ascii="Times New Roman" w:hAnsi="Times New Roman" w:cs="Times New Roman"/>
+          <w:b/>
+          <w:sz w:val="22"/>
+        </w:rPr>
+        <w:t>Task 3: Probability and Congestion Analysis</w:t>
+      </w:r>
+    </w:p>
+    <w:p>
+      <w:r>
+        <w:rPr>
+          <w:rFonts w:ascii="Times New Roman" w:hAnsi="Times New Roman" w:cs="Times New Roman"/>
+          <w:sz w:val="22"/>
+        </w:rPr>
+        <w:lastRenderedPageBreak/>
+        <w:t xml:space="preserve">Congestion is defined for this task as an hour where </w:t>
+      </w:r>
+      <w:r>
+        <w:rPr>
+          <w:rFonts w:ascii="Times New Roman" w:hAnsi="Times New Roman" w:cs="Times New Roman"/>
+          <w:b/>
+          <w:sz w:val="22"/>
+        </w:rPr>
+        <w:t>traffic_volume &gt; 5,500 vehicles</w:t>
+      </w:r>
+      <w:r>
+        <w:rPr>
+          <w:rFonts w:ascii="Times New Roman" w:hAnsi="Times New Roman" w:cs="Times New Roman"/>
+          <w:sz w:val="22"/>
+        </w:rPr>
+        <w:t>.</w:t>
+      </w:r>
+    </w:p>
+    <w:p>
+      <w:r>
+        <w:rPr>
+          <w:rFonts w:ascii="Times New Roman" w:hAnsi="Times New Roman" w:cs="Times New Roman"/>
+          <w:b/>
+          <w:sz w:val="22"/>
+        </w:rPr>
+        <w:t>3.1 Basic probability</w:t>
+      </w:r>
+    </w:p>
+    <w:p>
+      <w:r>
+        <w:rPr>
+          <w:rFonts w:ascii="Times New Roman" w:hAnsi="Times New Roman" w:cs="Times New Roman"/>
+          <w:sz w:val="22"/>
+        </w:rPr>
+        <w:t>Calculate:</w:t>
+      </w:r>
+    </w:p>
+    <w:p>
+      <w:pPr>
+        <w:pStyle w:val="ListParagraph"/>
+        <w:numPr>
+          <w:ilvl w:val="0"/>
+          <w:numId w:val="8"/>
+        </w:numPr>
+      </w:pPr>
+      <w:r>
+        <w:rPr>
+          <w:rFonts w:ascii="Times New Roman" w:hAnsi="Times New Roman" w:cs="Times New Roman"/>
+          <w:sz w:val="22"/>
+        </w:rPr>
+        <w:t>P(Congestion)</w:t>
+      </w:r>
+    </w:p>
+    <w:p>
+      <w:pPr>
+        <w:pStyle w:val="ListParagraph"/>
+        <w:numPr>
+          <w:ilvl w:val="0"/>
+          <w:numId w:val="8"/>
+        </w:numPr>
+      </w:pPr>
+      <w:r>
+        <w:rPr>
+          <w:rFonts w:ascii="Times New Roman" w:hAnsi="Times New Roman" w:cs="Times New Roman"/>
+          <w:sz w:val="22"/>
+        </w:rPr>
+        <w:t>P(Clear Weather)</w:t>
+      </w:r>
+    </w:p>
+    <w:p>
+      <w:pPr>
+        <w:pStyle w:val="ListParagraph"/>
+        <w:numPr>
+          <w:ilvl w:val="0"/>
+          <w:numId w:val="8"/>
+        </w:numPr>
+      </w:pPr>
+      <w:r>
+        <w:rPr>
+          <w:rFonts w:ascii="Times New Roman" w:hAnsi="Times New Roman" w:cs="Times New Roman"/>
+          <w:sz w:val="22"/>
+        </w:rPr>
+        <w:t>P(Congestion AND Clear Weather)</w:t>
+      </w:r>
+    </w:p>
+    <w:p>
+      <w:r>
+        <w:rPr>
+          <w:rFonts w:ascii="Times New Roman" w:hAnsi="Times New Roman" w:cs="Times New Roman"/>
+          <w:sz w:val="22"/>
+        </w:rPr>
+        <w:t xml:space="preserve">Method: All three probabilities are empirical relative frequencies computed over the same 40,575-row deduplicated, one-row-per-hour dataset used throughout Tasks 1.2, 2.1 and 2.2 (so an hour with multiple weather log entries is not double-counted). "Clear Weather" uses the weather_main column’s exact category "Clear" (one of 10 categories in the data: Clouds, Clear, Rain, Drizzle, Mist, Fog, Thunderstorm, Haze, Snow, Squall, Smoke) rather than the free-text </w:t>
+      </w:r>
+      <w:r>
+        <w:rPr>
+          <w:rFonts w:ascii="Times New Roman" w:hAnsi="Times New Roman" w:cs="Times New Roman"/>
+          <w:sz w:val="22"/>
+        </w:rPr>
+        <w:t>weather_description field, since weather_main gives a single unambiguous label per hour.</w:t>
+      </w:r>
+    </w:p>
+    <w:p>
+      <w:r>
+        <w:rPr>
+          <w:rFonts w:ascii="Times New Roman" w:hAnsi="Times New Roman" w:cs="Times New Roman"/>
+          <w:b/>
+          <w:sz w:val="22"/>
+        </w:rPr>
+        <w:t xml:space="preserve">P(Congestion): </w:t>
+      </w:r>
+      <w:r>
+        <w:rPr>
+          <w:rFonts w:ascii="Times New Roman" w:hAnsi="Times New Roman" w:cs="Times New Roman"/>
+          <w:sz w:val="22"/>
+        </w:rPr>
+        <w:t>6,107 of 40,575 hours have traffic_volume &gt; 5,500, so P(Congestion) = 6,107 / 40,575 ≈ 0.1505 (15.05%).</w:t>
+      </w:r>
+    </w:p>
+    <w:p>
+      <w:r>
+        <w:rPr>
+          <w:rFonts w:ascii="Times New Roman" w:hAnsi="Times New Roman" w:cs="Times New Roman"/>
+          <w:b/>
+          <w:sz w:val="22"/>
+        </w:rPr>
+        <w:t xml:space="preserve">P(Clear Weather): </w:t>
+      </w:r>
+      <w:r>
+        <w:rPr>
+          <w:rFonts w:ascii="Times New Roman" w:hAnsi="Times New Roman" w:cs="Times New Roman"/>
+          <w:sz w:val="22"/>
+        </w:rPr>
+        <w:t>13,366 of 40,575 hours are logged with weather_main = "Clear", so P(Clear Weather) = 13,366 / 40,575 ≈ 0.3294 (32.94%).</w:t>
+      </w:r>
+    </w:p>
+    <w:p>
+      <w:r>
+        <w:rPr>
+          <w:rFonts w:ascii="Times New Roman" w:hAnsi="Times New Roman" w:cs="Times New Roman"/>
+          <w:b/>
+          <w:sz w:val="22"/>
+        </w:rPr>
+        <w:t xml:space="preserve">P(Congestion AND Clear Weather): </w:t>
+      </w:r>
+      <w:r>
+        <w:rPr>
+          <w:rFonts w:ascii="Times New Roman" w:hAnsi="Times New Roman" w:cs="Times New Roman"/>
+          <w:sz w:val="22"/>
+        </w:rPr>
+        <w:t>1,762 of 40,575 hours are both congested and clear, so P(Congestion AND Clear Weather) = 1,762 / 40,575 ≈ 0.0434 (4.34%).</w:t>
+      </w:r>
+    </w:p>
+    <w:p/>
+    <w:p>
+      <w:r>
+        <w:rPr>
+          <w:rFonts w:ascii="Times New Roman" w:hAnsi="Times New Roman" w:cs="Times New Roman"/>
+          <w:b/>
+          <w:sz w:val="22"/>
+        </w:rPr>
+        <w:t>3.2 Conditional probability</w:t>
+      </w:r>
+    </w:p>
+    <w:p>
+      <w:r>
+        <w:rPr>
+          <w:rFonts w:ascii="Times New Roman" w:hAnsi="Times New Roman" w:cs="Times New Roman"/>
+          <w:sz w:val="22"/>
+        </w:rPr>
+        <w:t>Calculate:</w:t>
+      </w:r>
+    </w:p>
+    <w:p>
+      <w:pPr>
+        <w:pStyle w:val="ListParagraph"/>
+        <w:numPr>
+          <w:ilvl w:val="0"/>
+          <w:numId w:val="8"/>
+        </w:numPr>
+      </w:pPr>
+      <w:r>
+        <w:rPr>
+          <w:rFonts w:ascii="Times New Roman" w:hAnsi="Times New Roman" w:cs="Times New Roman"/>
+          <w:sz w:val="22"/>
+        </w:rPr>
+        <w:t>P(Clear Weather | Congestion)</w:t>
+      </w:r>
+    </w:p>
+    <w:p>
+      <w:pPr>
+        <w:pStyle w:val="ListParagraph"/>
+        <w:numPr>
+          <w:ilvl w:val="0"/>
+          <w:numId w:val="8"/>
+        </w:numPr>
+      </w:pPr>
+      <w:r>
+        <w:rPr>
+          <w:rFonts w:ascii="Times New Roman" w:hAnsi="Times New Roman" w:cs="Times New Roman"/>
+          <w:sz w:val="22"/>
+        </w:rPr>
+        <w:t>P(High Temperature | Congestion), where high temperature &gt; 292K</w:t>
+      </w:r>
+    </w:p>
+    <w:p>
+      <w:pPr>
+        <w:pStyle w:val="ListParagraph"/>
+        <w:numPr>
+          <w:ilvl w:val="0"/>
+          <w:numId w:val="8"/>
+        </w:numPr>
+      </w:pPr>
+      <w:r>
+        <w:rPr>
+          <w:rFonts w:ascii="Times New Roman" w:hAnsi="Times New Roman" w:cs="Times New Roman"/>
+          <w:sz w:val="22"/>
+        </w:rPr>
+        <w:t>Determine whether weather conditions and congestion can be considered independent using P(A ∩ B) = P(A) × P(B)</w:t>
+      </w:r>
+    </w:p>
+    <w:p>
+      <w:pPr>
+        <w:pStyle w:val="ListParagraph"/>
+        <w:numPr>
+          <w:ilvl w:val="0"/>
+          <w:numId w:val="8"/>
+        </w:numPr>
+      </w:pPr>
+      <w:r>
+        <w:rPr>
+          <w:rFonts w:ascii="Times New Roman" w:hAnsi="Times New Roman" w:cs="Times New Roman"/>
+          <w:sz w:val="22"/>
+        </w:rPr>
+        <w:t>Calculate the odds ratio of congestion in clear versus cloudy weather.</w:t>
+      </w:r>
+    </w:p>
+    <w:p/>
+    <w:p>
+      <w:r>
+        <w:rPr>
+          <w:rFonts w:ascii="Times New Roman" w:hAnsi="Times New Roman" w:cs="Times New Roman"/>
+          <w:sz w:val="22"/>
+        </w:rPr>
+        <w:t>Conclude with a short explanation of what the probability analysis suggests about the relationship between weather and congestion.</w:t>
+      </w:r>
+    </w:p>
+    <w:p>
+      <w:r>
+        <w:rPr>
+          <w:rFonts w:ascii="Times New Roman" w:hAnsi="Times New Roman" w:cs="Times New Roman"/>
+          <w:b/>
+          <w:sz w:val="22"/>
+        </w:rPr>
+        <w:t xml:space="preserve">P(Clear Weather | Congestion): </w:t>
+      </w:r>
+      <w:r>
+        <w:rPr>
+          <w:rFonts w:ascii="Times New Roman" w:hAnsi="Times New Roman" w:cs="Times New Roman"/>
+          <w:sz w:val="22"/>
+        </w:rPr>
+        <w:t>1,762 of the 6,107 congested hours were logged as Clear, so P(Clear Weather | Congestion) = 1,762 / 6,107 ≈ 0.2885 (28.85%).</w:t>
+      </w:r>
+    </w:p>
+    <w:p>
+      <w:r>
+        <w:rPr>
+          <w:rFonts w:ascii="Times New Roman" w:hAnsi="Times New Roman" w:cs="Times New Roman"/>
+          <w:b/>
+          <w:sz w:val="22"/>
+        </w:rPr>
+        <w:t xml:space="preserve">P(High Temperature | Congestion): </w:t>
+      </w:r>
+      <w:r>
+        <w:rPr>
+          <w:rFonts w:ascii="Times New Roman" w:hAnsi="Times New Roman" w:cs="Times New Roman"/>
+          <w:sz w:val="22"/>
+        </w:rPr>
+        <w:t>1,699 of the 6,107 congested hours have temperature above 292K, so P(High Temperature | Congestion) = 1,699 / 6,107 ≈ 0.2782 (27.82%).</w:t>
+      </w:r>
+    </w:p>
+    <w:p>
+      <w:r>
+        <w:rPr>
+          <w:rFonts w:ascii="Times New Roman" w:hAnsi="Times New Roman" w:cs="Times New Roman"/>
+          <w:b/>
+          <w:sz w:val="22"/>
+        </w:rPr>
+        <w:t xml:space="preserve">Independence check: </w:t>
+      </w:r>
+      <w:r>
+        <w:rPr>
+          <w:rFonts w:ascii="Times New Roman" w:hAnsi="Times New Roman" w:cs="Times New Roman"/>
+          <w:sz w:val="22"/>
+        </w:rPr>
+        <w:t>if Congestion and Clear Weather were independent, P(Congestion) x P(Clear Weather) would equal P(Congestion AND Clear Weather). Here P(Congestion) x P(Clear Weather) = 0.1505 x 0.3294 ≈ 0.0496 (4.96%), while the actual joint probability is 0.0434 (4.34%). These two values are not equal, so Congestion and Clear Weather cannot be considered independent.</w:t>
+      </w:r>
+    </w:p>
+    <w:p>
+      <w:r>
+        <w:rPr>
+          <w:rFonts w:ascii="Times New Roman" w:hAnsi="Times New Roman" w:cs="Times New Roman"/>
+          <w:b/>
+          <w:sz w:val="22"/>
+        </w:rPr>
+        <w:lastRenderedPageBreak/>
+        <w:t xml:space="preserve">Odds ratio: </w:t>
+      </w:r>
+      <w:r>
+        <w:rPr>
+          <w:rFonts w:ascii="Times New Roman" w:hAnsi="Times New Roman" w:cs="Times New Roman"/>
+          <w:sz w:val="22"/>
+        </w:rPr>
+        <w:t>among clear hours, 1,762 were congested and 11,604 were not, giving odds of 1,762 / 11,604 ≈ 0.1518. Among cloudy hours, 2,587 were congested and 12,536 were not, giving odds of 2,587 / 12,536 ≈ 0.2064. The odds ratio of congestion in clear weather versus cloudy weather is 0.1518 / 0.2064 ≈ 0.7358.</w:t>
+      </w:r>
+    </w:p>
+    <w:p>
+      <w:pPr>
+        <w:rPr>
+          <w:rFonts w:ascii="Times New Roman" w:hAnsi="Times New Roman" w:cs="Times New Roman"/>
+          <w:sz w:val="22"/>
+        </w:rPr>
+      </w:pPr>
+      <w:r>
+        <w:rPr>
+          <w:rFonts w:ascii="Times New Roman" w:hAnsi="Times New Roman" w:cs="Times New Roman"/>
+          <w:b/>
+          <w:sz w:val="22"/>
+        </w:rPr>
+        <w:t xml:space="preserve">Conclusion: </w:t>
+      </w:r>
+      <w:r>
+        <w:rPr>
+          <w:rFonts w:ascii="Times New Roman" w:hAnsi="Times New Roman" w:cs="Times New Roman"/>
+          <w:sz w:val="22"/>
+        </w:rPr>
+        <w:t>Overall the probability analysis suggests that weather has only a mild relationship with congestion. Congestion is somewhat less likely during clear conditions than the independence assumption would predict, and the odds of congestion in clear weather are about 26 percent lower than in cloudy weather, since the odds ratio is below 1. This points in the same direction as the weak positive correlation found between temperature and traffic volume in Task 2.2, but the effect size is small in both cases. Weather</w:t>
+      </w:r>
+      <w:r>
+        <w:rPr>
+          <w:rFonts w:ascii="Times New Roman" w:hAnsi="Times New Roman" w:cs="Times New Roman"/>
+          <w:sz w:val="22"/>
+        </w:rPr>
+        <w:t xml:space="preserve"> appears to shift the likelihood of congestion only slightly rather than acting as a major driver of it, so factors such as time of day and day of week are still likely to matter more than weather conditions alone.</w:t>
+      </w:r>
     </w:p>
     <w:p>
       <w:pPr>
@@ -5054,27 +5635,26 @@
           <w:szCs w:val="22"/>
           <w:lang w:val="en-PH"/>
         </w:rPr>
-        <w:lastRenderedPageBreak/>
-        <w:t>Task 3: Probability and Congestion Analysis</w:t>
-      </w:r>
-    </w:p>
-    <w:p>
-      <w:pPr>
-        <w:rPr>
-          <w:rFonts w:ascii="Times New Roman" w:hAnsi="Times New Roman" w:cs="Times New Roman"/>
-          <w:sz w:val="22"/>
-          <w:szCs w:val="22"/>
-          <w:lang w:val="en-PH"/>
-        </w:rPr>
-      </w:pPr>
-      <w:r>
-        <w:rPr>
-          <w:rFonts w:ascii="Times New Roman" w:hAnsi="Times New Roman" w:cs="Times New Roman"/>
-          <w:sz w:val="22"/>
-          <w:szCs w:val="22"/>
-          <w:lang w:val="en-PH"/>
-        </w:rPr>
-        <w:t xml:space="preserve">Define </w:t>
+        <w:t>Task 4: Power BI Traffic Intelligence Dashboard</w:t>
+      </w:r>
+    </w:p>
+    <w:p>
+      <w:pPr>
+        <w:rPr>
+          <w:rFonts w:ascii="Times New Roman" w:hAnsi="Times New Roman" w:cs="Times New Roman"/>
+          <w:sz w:val="22"/>
+          <w:szCs w:val="22"/>
+          <w:lang w:val="en-PH"/>
+        </w:rPr>
+      </w:pPr>
+      <w:r>
+        <w:rPr>
+          <w:rFonts w:ascii="Times New Roman" w:hAnsi="Times New Roman" w:cs="Times New Roman"/>
+          <w:sz w:val="22"/>
+          <w:szCs w:val="22"/>
+          <w:lang w:val="en-PH"/>
+        </w:rPr>
+        <w:t xml:space="preserve">Import the traffic CSV file into </w:t>
       </w:r>
       <w:r>
         <w:rPr>
@@ -5085,57 +5665,18 @@
           <w:szCs w:val="22"/>
           <w:lang w:val="en-PH"/>
         </w:rPr>
-        <w:t>congestion</w:t>
-      </w:r>
-      <w:r>
-        <w:rPr>
-          <w:rFonts w:ascii="Times New Roman" w:hAnsi="Times New Roman" w:cs="Times New Roman"/>
-          <w:sz w:val="22"/>
-          <w:szCs w:val="22"/>
-          <w:lang w:val="en-PH"/>
-        </w:rPr>
-        <w:t xml:space="preserve"> as:</w:t>
-      </w:r>
-      <w:r>
-        <w:rPr>
-          <w:rFonts w:ascii="Times New Roman" w:hAnsi="Times New Roman" w:cs="Times New Roman"/>
-          <w:sz w:val="22"/>
-          <w:szCs w:val="22"/>
-          <w:lang w:val="en-PH"/>
-        </w:rPr>
-        <w:t xml:space="preserve"> t</w:t>
-      </w:r>
-      <w:r>
-        <w:rPr>
-          <w:rFonts w:ascii="Times New Roman" w:hAnsi="Times New Roman" w:cs="Times New Roman"/>
-          <w:sz w:val="22"/>
-          <w:szCs w:val="22"/>
-          <w:lang w:val="en-PH"/>
-        </w:rPr>
-        <w:t>raffic volume &gt; 5,500 vehicles.</w:t>
-      </w:r>
-    </w:p>
-    <w:p>
-      <w:pPr>
-        <w:rPr>
-          <w:rFonts w:ascii="Times New Roman" w:hAnsi="Times New Roman" w:cs="Times New Roman"/>
-          <w:sz w:val="22"/>
-          <w:szCs w:val="22"/>
-          <w:lang w:val="en-PH"/>
-        </w:rPr>
-      </w:pPr>
-      <w:r>
-        <w:rPr>
-          <w:rFonts w:ascii="Times New Roman" w:hAnsi="Times New Roman" w:cs="Times New Roman"/>
-          <w:sz w:val="22"/>
-          <w:szCs w:val="22"/>
-          <w:lang w:val="en-PH"/>
-        </w:rPr>
-        <w:t>Calculate:</w:t>
-      </w:r>
-    </w:p>
-    <w:p>
-      <w:pPr>
+        <w:t>Power BI Desktop</w:t>
+      </w:r>
+      <w:r>
+        <w:rPr>
+          <w:rFonts w:ascii="Times New Roman" w:hAnsi="Times New Roman" w:cs="Times New Roman"/>
+          <w:sz w:val="22"/>
+          <w:szCs w:val="22"/>
+          <w:lang w:val="en-PH"/>
+        </w:rPr>
+        <w:t xml:space="preserve"> and use </w:t>
+      </w:r>
+      <w:r>
         <w:rPr>
           <w:rFonts w:ascii="Times New Roman" w:hAnsi="Times New Roman" w:cs="Times New Roman"/>
           <w:b/>
@@ -5144,8 +5685,20 @@
           <w:szCs w:val="22"/>
           <w:lang w:val="en-PH"/>
         </w:rPr>
-      </w:pPr>
-      <w:r>
+        <w:t>Power Query Editor</w:t>
+      </w:r>
+      <w:r>
+        <w:rPr>
+          <w:rFonts w:ascii="Times New Roman" w:hAnsi="Times New Roman" w:cs="Times New Roman"/>
+          <w:sz w:val="22"/>
+          <w:szCs w:val="22"/>
+          <w:lang w:val="en-PH"/>
+        </w:rPr>
+        <w:t xml:space="preserve"> to prepare the data.</w:t>
+      </w:r>
+    </w:p>
+    <w:p>
+      <w:pPr>
         <w:rPr>
           <w:rFonts w:ascii="Times New Roman" w:hAnsi="Times New Roman" w:cs="Times New Roman"/>
           <w:b/>
@@ -5154,7 +5707,36 @@
           <w:szCs w:val="22"/>
           <w:lang w:val="en-PH"/>
         </w:rPr>
-        <w:t>3.1 Basic probability</w:t>
+      </w:pPr>
+      <w:r>
+        <w:rPr>
+          <w:rFonts w:ascii="Times New Roman" w:hAnsi="Times New Roman" w:cs="Times New Roman"/>
+          <w:b/>
+          <w:bCs/>
+          <w:sz w:val="22"/>
+          <w:szCs w:val="22"/>
+          <w:lang w:val="en-PH"/>
+        </w:rPr>
+        <w:t>4.1 Data quality and preparation</w:t>
+      </w:r>
+    </w:p>
+    <w:p>
+      <w:pPr>
+        <w:rPr>
+          <w:rFonts w:ascii="Times New Roman" w:hAnsi="Times New Roman" w:cs="Times New Roman"/>
+          <w:sz w:val="22"/>
+          <w:szCs w:val="22"/>
+          <w:lang w:val="en-PH"/>
+        </w:rPr>
+      </w:pPr>
+      <w:r>
+        <w:rPr>
+          <w:rFonts w:ascii="Times New Roman" w:hAnsi="Times New Roman" w:cs="Times New Roman"/>
+          <w:sz w:val="22"/>
+          <w:szCs w:val="22"/>
+          <w:lang w:val="en-PH"/>
+        </w:rPr>
+        <w:t>Perform the following:</w:t>
       </w:r>
     </w:p>
     <w:p>
@@ -5174,22 +5756,11 @@
       <w:r>
         <w:rPr>
           <w:rFonts w:ascii="Times New Roman" w:hAnsi="Times New Roman" w:cs="Times New Roman"/>
-          <w:b/>
-          <w:bCs/>
-          <w:sz w:val="22"/>
-          <w:szCs w:val="22"/>
-          <w:lang w:val="en-PH"/>
-        </w:rPr>
-        <w:t>P(Congestion)</w:t>
-      </w:r>
-      <w:r>
-        <w:rPr>
-          <w:rFonts w:ascii="Times New Roman" w:hAnsi="Times New Roman" w:cs="Times New Roman"/>
-          <w:sz w:val="22"/>
-          <w:szCs w:val="22"/>
-          <w:lang w:val="en-PH"/>
-        </w:rPr>
-        <w:t xml:space="preserve"> </w:t>
+          <w:sz w:val="22"/>
+          <w:szCs w:val="22"/>
+          <w:lang w:val="en-PH"/>
+        </w:rPr>
+        <w:t xml:space="preserve">Determine the number of rows and columns. </w:t>
       </w:r>
     </w:p>
     <w:p>
@@ -5209,22 +5780,11 @@
       <w:r>
         <w:rPr>
           <w:rFonts w:ascii="Times New Roman" w:hAnsi="Times New Roman" w:cs="Times New Roman"/>
-          <w:b/>
-          <w:bCs/>
-          <w:sz w:val="22"/>
-          <w:szCs w:val="22"/>
-          <w:lang w:val="en-PH"/>
-        </w:rPr>
-        <w:t>P(Clear Weather)</w:t>
-      </w:r>
-      <w:r>
-        <w:rPr>
-          <w:rFonts w:ascii="Times New Roman" w:hAnsi="Times New Roman" w:cs="Times New Roman"/>
-          <w:sz w:val="22"/>
-          <w:szCs w:val="22"/>
-          <w:lang w:val="en-PH"/>
-        </w:rPr>
-        <w:t xml:space="preserve"> </w:t>
+          <w:sz w:val="22"/>
+          <w:szCs w:val="22"/>
+          <w:lang w:val="en-PH"/>
+        </w:rPr>
+        <w:t xml:space="preserve">Identify null/missing values and the columns affected. </w:t>
       </w:r>
     </w:p>
     <w:p>
@@ -5244,710 +5804,426 @@
       <w:r>
         <w:rPr>
           <w:rFonts w:ascii="Times New Roman" w:hAnsi="Times New Roman" w:cs="Times New Roman"/>
+          <w:sz w:val="22"/>
+          <w:szCs w:val="22"/>
+          <w:lang w:val="en-PH"/>
+        </w:rPr>
+        <w:t xml:space="preserve">Check whether the data types are appropriate. </w:t>
+      </w:r>
+    </w:p>
+    <w:p>
+      <w:pPr>
+        <w:pStyle w:val="ListParagraph"/>
+        <w:numPr>
+          <w:ilvl w:val="0"/>
+          <w:numId w:val="9"/>
+        </w:numPr>
+        <w:rPr>
+          <w:rFonts w:ascii="Times New Roman" w:hAnsi="Times New Roman" w:cs="Times New Roman"/>
+          <w:sz w:val="22"/>
+          <w:szCs w:val="22"/>
+          <w:lang w:val="en-PH"/>
+        </w:rPr>
+      </w:pPr>
+      <w:r>
+        <w:rPr>
+          <w:rFonts w:ascii="Times New Roman" w:hAnsi="Times New Roman" w:cs="Times New Roman"/>
+          <w:sz w:val="22"/>
+          <w:szCs w:val="22"/>
+          <w:lang w:val="en-PH"/>
+        </w:rPr>
+        <w:t xml:space="preserve">Extract </w:t>
+      </w:r>
+      <w:r>
+        <w:rPr>
+          <w:rFonts w:ascii="Times New Roman" w:hAnsi="Times New Roman" w:cs="Times New Roman"/>
           <w:b/>
           <w:bCs/>
           <w:sz w:val="22"/>
           <w:szCs w:val="22"/>
           <w:lang w:val="en-PH"/>
         </w:rPr>
-        <w:t>P(Congestion AND Clear Weather)</w:t>
-      </w:r>
-      <w:r>
-        <w:rPr>
-          <w:rFonts w:ascii="Times New Roman" w:hAnsi="Times New Roman" w:cs="Times New Roman"/>
-          <w:sz w:val="22"/>
-          <w:szCs w:val="22"/>
-          <w:lang w:val="en-PH"/>
-        </w:rPr>
-        <w:t xml:space="preserve"> </w:t>
+        <w:t>Hour</w:t>
+      </w:r>
+      <w:r>
+        <w:rPr>
+          <w:rFonts w:ascii="Times New Roman" w:hAnsi="Times New Roman" w:cs="Times New Roman"/>
+          <w:sz w:val="22"/>
+          <w:szCs w:val="22"/>
+          <w:lang w:val="en-PH"/>
+        </w:rPr>
+        <w:t xml:space="preserve"> from </w:t>
+      </w:r>
+      <w:proofErr w:type="spellStart"/>
+      <w:r>
+        <w:rPr>
+          <w:rFonts w:ascii="Times New Roman" w:hAnsi="Times New Roman" w:cs="Times New Roman"/>
+          <w:sz w:val="22"/>
+          <w:szCs w:val="22"/>
+          <w:lang w:val="en-PH"/>
+        </w:rPr>
+        <w:t>DateTime</w:t>
+      </w:r>
+      <w:proofErr w:type="spellEnd"/>
+      <w:r>
+        <w:rPr>
+          <w:rFonts w:ascii="Times New Roman" w:hAnsi="Times New Roman" w:cs="Times New Roman"/>
+          <w:sz w:val="22"/>
+          <w:szCs w:val="22"/>
+          <w:lang w:val="en-PH"/>
+        </w:rPr>
+        <w:t xml:space="preserve">. </w:t>
+      </w:r>
+    </w:p>
+    <w:p>
+      <w:pPr>
+        <w:pStyle w:val="ListParagraph"/>
+        <w:numPr>
+          <w:ilvl w:val="0"/>
+          <w:numId w:val="9"/>
+        </w:numPr>
+        <w:rPr>
+          <w:rFonts w:ascii="Times New Roman" w:hAnsi="Times New Roman" w:cs="Times New Roman"/>
+          <w:sz w:val="22"/>
+          <w:szCs w:val="22"/>
+          <w:lang w:val="en-PH"/>
+        </w:rPr>
+      </w:pPr>
+      <w:r>
+        <w:rPr>
+          <w:rFonts w:ascii="Times New Roman" w:hAnsi="Times New Roman" w:cs="Times New Roman"/>
+          <w:sz w:val="22"/>
+          <w:szCs w:val="22"/>
+          <w:lang w:val="en-PH"/>
+        </w:rPr>
+        <w:t xml:space="preserve">Create </w:t>
+      </w:r>
+      <w:r>
+        <w:rPr>
+          <w:rFonts w:ascii="Times New Roman" w:hAnsi="Times New Roman" w:cs="Times New Roman"/>
+          <w:b/>
+          <w:bCs/>
+          <w:sz w:val="22"/>
+          <w:szCs w:val="22"/>
+          <w:lang w:val="en-PH"/>
+        </w:rPr>
+        <w:t>Temperature in Celsius</w:t>
+      </w:r>
+      <w:r>
+        <w:rPr>
+          <w:rFonts w:ascii="Times New Roman" w:hAnsi="Times New Roman" w:cs="Times New Roman"/>
+          <w:sz w:val="22"/>
+          <w:szCs w:val="22"/>
+          <w:lang w:val="en-PH"/>
+        </w:rPr>
+        <w:t xml:space="preserve">. </w:t>
+      </w:r>
+    </w:p>
+    <w:p>
+      <w:pPr>
+        <w:pStyle w:val="ListParagraph"/>
+        <w:numPr>
+          <w:ilvl w:val="0"/>
+          <w:numId w:val="9"/>
+        </w:numPr>
+        <w:rPr>
+          <w:rFonts w:ascii="Times New Roman" w:hAnsi="Times New Roman" w:cs="Times New Roman"/>
+          <w:sz w:val="22"/>
+          <w:szCs w:val="22"/>
+          <w:lang w:val="en-PH"/>
+        </w:rPr>
+      </w:pPr>
+      <w:r>
+        <w:rPr>
+          <w:rFonts w:ascii="Times New Roman" w:hAnsi="Times New Roman" w:cs="Times New Roman"/>
+          <w:sz w:val="22"/>
+          <w:szCs w:val="22"/>
+          <w:lang w:val="en-PH"/>
+        </w:rPr>
+        <w:t xml:space="preserve">Create a </w:t>
+      </w:r>
+      <w:r>
+        <w:rPr>
+          <w:rFonts w:ascii="Times New Roman" w:hAnsi="Times New Roman" w:cs="Times New Roman"/>
+          <w:b/>
+          <w:bCs/>
+          <w:sz w:val="22"/>
+          <w:szCs w:val="22"/>
+          <w:lang w:val="en-PH"/>
+        </w:rPr>
+        <w:t>Traffic Category</w:t>
+      </w:r>
+      <w:r>
+        <w:rPr>
+          <w:rFonts w:ascii="Times New Roman" w:hAnsi="Times New Roman" w:cs="Times New Roman"/>
+          <w:sz w:val="22"/>
+          <w:szCs w:val="22"/>
+          <w:lang w:val="en-PH"/>
+        </w:rPr>
+        <w:t>:</w:t>
       </w:r>
     </w:p>
     <w:tbl>
       <w:tblPr>
-        <w:tblW w:w="6860" w:type="dxa"/>
+        <w:tblW w:w="3490" w:type="dxa"/>
+        <w:tblCellSpacing w:w="15" w:type="dxa"/>
+        <w:tblBorders>
+          <w:top w:val="single" w:sz="4" w:space="0" w:color="auto"/>
+          <w:left w:val="single" w:sz="4" w:space="0" w:color="auto"/>
+          <w:bottom w:val="single" w:sz="4" w:space="0" w:color="auto"/>
+          <w:right w:val="single" w:sz="4" w:space="0" w:color="auto"/>
+          <w:insideH w:val="single" w:sz="4" w:space="0" w:color="auto"/>
+          <w:insideV w:val="single" w:sz="4" w:space="0" w:color="auto"/>
+        </w:tblBorders>
+        <w:tblCellMar>
+          <w:top w:w="15" w:type="dxa"/>
+          <w:left w:w="15" w:type="dxa"/>
+          <w:bottom w:w="15" w:type="dxa"/>
+          <w:right w:w="15" w:type="dxa"/>
+        </w:tblCellMar>
         <w:tblLook w:val="04A0" w:firstRow="1" w:lastRow="0" w:firstColumn="1" w:lastColumn="0" w:noHBand="0" w:noVBand="1"/>
       </w:tblPr>
       <w:tblGrid>
-        <w:gridCol w:w="5597"/>
-        <w:gridCol w:w="1263"/>
+        <w:gridCol w:w="2131"/>
+        <w:gridCol w:w="1359"/>
       </w:tblGrid>
       <w:tr>
         <w:trPr>
-          <w:trHeight w:val="290"/>
+          <w:trHeight w:val="446"/>
+          <w:tblHeader/>
+          <w:tblCellSpacing w:w="15" w:type="dxa"/>
         </w:trPr>
         <w:tc>
           <w:tcPr>
-            <w:tcW w:w="6860" w:type="dxa"/>
-            <w:gridSpan w:val="2"/>
-            <w:tcBorders>
-              <w:top w:val="single" w:sz="4" w:space="0" w:color="auto"/>
-              <w:left w:val="single" w:sz="4" w:space="0" w:color="auto"/>
-              <w:bottom w:val="single" w:sz="4" w:space="0" w:color="auto"/>
-              <w:right w:val="single" w:sz="4" w:space="0" w:color="auto"/>
-            </w:tcBorders>
-            <w:noWrap/>
-            <w:vAlign w:val="bottom"/>
+            <w:tcW w:w="0" w:type="auto"/>
+            <w:vAlign w:val="center"/>
             <w:hideMark/>
           </w:tcPr>
           <w:p>
             <w:pPr>
-              <w:spacing w:after="0" w:line="240" w:lineRule="auto"/>
-              <w:jc w:val="center"/>
-              <w:rPr>
-                <w:rFonts w:ascii="Aptos Narrow" w:eastAsia="Times New Roman" w:hAnsi="Aptos Narrow" w:cs="Times New Roman"/>
+              <w:rPr>
+                <w:rFonts w:ascii="Times New Roman" w:hAnsi="Times New Roman" w:cs="Times New Roman"/>
                 <w:b/>
                 <w:bCs/>
-                <w:color w:val="000000"/>
-                <w:kern w:val="0"/>
-                <w:sz w:val="22"/>
-                <w:szCs w:val="22"/>
-                <w:lang w:val="en-SG" w:eastAsia="en-SG"/>
-                <w14:ligatures w14:val="none"/>
+                <w:sz w:val="22"/>
+                <w:szCs w:val="22"/>
+                <w:lang w:val="en-PH"/>
               </w:rPr>
             </w:pPr>
             <w:r>
               <w:rPr>
-                <w:rFonts w:ascii="Aptos Narrow" w:eastAsia="Times New Roman" w:hAnsi="Aptos Narrow" w:cs="Times New Roman"/>
+                <w:rFonts w:ascii="Times New Roman" w:hAnsi="Times New Roman" w:cs="Times New Roman"/>
                 <w:b/>
                 <w:bCs/>
-                <w:color w:val="000000"/>
-                <w:kern w:val="0"/>
-                <w:sz w:val="22"/>
-                <w:szCs w:val="22"/>
-                <w:lang w:val="en-SG" w:eastAsia="en-SG"/>
-                <w14:ligatures w14:val="none"/>
-              </w:rPr>
-              <w:t xml:space="preserve">Basic Probability (where, Congestion = Traffic volume &gt; 5,500 vehicles) </w:t>
+                <w:sz w:val="22"/>
+                <w:szCs w:val="22"/>
+                <w:lang w:val="en-PH"/>
+              </w:rPr>
+              <w:t>Traffic Volume</w:t>
+            </w:r>
+          </w:p>
+        </w:tc>
+        <w:tc>
+          <w:tcPr>
+            <w:tcW w:w="0" w:type="auto"/>
+            <w:vAlign w:val="center"/>
+            <w:hideMark/>
+          </w:tcPr>
+          <w:p>
+            <w:pPr>
+              <w:rPr>
+                <w:rFonts w:ascii="Times New Roman" w:hAnsi="Times New Roman" w:cs="Times New Roman"/>
+                <w:b/>
+                <w:bCs/>
+                <w:sz w:val="22"/>
+                <w:szCs w:val="22"/>
+                <w:lang w:val="en-PH"/>
+              </w:rPr>
+            </w:pPr>
+            <w:r>
+              <w:rPr>
+                <w:rFonts w:ascii="Times New Roman" w:hAnsi="Times New Roman" w:cs="Times New Roman"/>
+                <w:b/>
+                <w:bCs/>
+                <w:sz w:val="22"/>
+                <w:szCs w:val="22"/>
+                <w:lang w:val="en-PH"/>
+              </w:rPr>
+              <w:t>Category</w:t>
             </w:r>
           </w:p>
         </w:tc>
       </w:tr>
       <w:tr>
         <w:trPr>
-          <w:trHeight w:val="290"/>
+          <w:trHeight w:val="446"/>
+          <w:tblCellSpacing w:w="15" w:type="dxa"/>
         </w:trPr>
         <w:tc>
           <w:tcPr>
-            <w:tcW w:w="5597" w:type="dxa"/>
-            <w:tcBorders>
-              <w:top w:val="nil"/>
-              <w:left w:val="single" w:sz="4" w:space="0" w:color="auto"/>
-              <w:bottom w:val="single" w:sz="4" w:space="0" w:color="auto"/>
-              <w:right w:val="single" w:sz="4" w:space="0" w:color="auto"/>
-            </w:tcBorders>
-            <w:noWrap/>
-            <w:vAlign w:val="bottom"/>
+            <w:tcW w:w="0" w:type="auto"/>
+            <w:vAlign w:val="center"/>
             <w:hideMark/>
           </w:tcPr>
           <w:p>
             <w:pPr>
-              <w:spacing w:after="0" w:line="240" w:lineRule="auto"/>
-              <w:rPr>
-                <w:rFonts w:ascii="Aptos Narrow" w:eastAsia="Times New Roman" w:hAnsi="Aptos Narrow" w:cs="Times New Roman"/>
-                <w:b/>
-                <w:bCs/>
-                <w:color w:val="000000"/>
-                <w:kern w:val="0"/>
-                <w:sz w:val="22"/>
-                <w:szCs w:val="22"/>
-                <w:lang w:val="en-SG" w:eastAsia="en-SG"/>
-                <w14:ligatures w14:val="none"/>
+              <w:rPr>
+                <w:rFonts w:ascii="Times New Roman" w:hAnsi="Times New Roman" w:cs="Times New Roman"/>
+                <w:sz w:val="22"/>
+                <w:szCs w:val="22"/>
+                <w:lang w:val="en-PH"/>
               </w:rPr>
             </w:pPr>
             <w:r>
               <w:rPr>
-                <w:rFonts w:ascii="Aptos Narrow" w:eastAsia="Times New Roman" w:hAnsi="Aptos Narrow" w:cs="Times New Roman"/>
-                <w:b/>
-                <w:bCs/>
-                <w:color w:val="000000"/>
-                <w:kern w:val="0"/>
-                <w:sz w:val="22"/>
-                <w:szCs w:val="22"/>
-                <w:lang w:val="en-SG" w:eastAsia="en-SG"/>
-                <w14:ligatures w14:val="none"/>
-              </w:rPr>
-              <w:t xml:space="preserve"> N(hourly traffic volume) </w:t>
+                <w:rFonts w:ascii="Times New Roman" w:hAnsi="Times New Roman" w:cs="Times New Roman"/>
+                <w:sz w:val="22"/>
+                <w:szCs w:val="22"/>
+                <w:lang w:val="en-PH"/>
+              </w:rPr>
+              <w:t>&lt; 4,500</w:t>
             </w:r>
           </w:p>
         </w:tc>
         <w:tc>
           <w:tcPr>
-            <w:tcW w:w="1263" w:type="dxa"/>
-            <w:tcBorders>
-              <w:top w:val="nil"/>
-              <w:left w:val="nil"/>
-              <w:bottom w:val="single" w:sz="4" w:space="0" w:color="auto"/>
-              <w:right w:val="single" w:sz="4" w:space="0" w:color="auto"/>
-            </w:tcBorders>
-            <w:noWrap/>
-            <w:vAlign w:val="bottom"/>
+            <w:tcW w:w="0" w:type="auto"/>
+            <w:vAlign w:val="center"/>
             <w:hideMark/>
           </w:tcPr>
           <w:p>
             <w:pPr>
-              <w:spacing w:after="0" w:line="240" w:lineRule="auto"/>
-              <w:jc w:val="right"/>
-              <w:rPr>
-                <w:rFonts w:ascii="Aptos Narrow" w:eastAsia="Times New Roman" w:hAnsi="Aptos Narrow" w:cs="Times New Roman"/>
-                <w:color w:val="000000"/>
-                <w:kern w:val="0"/>
-                <w:sz w:val="22"/>
-                <w:szCs w:val="22"/>
-                <w:lang w:val="en-SG" w:eastAsia="en-SG"/>
-                <w14:ligatures w14:val="none"/>
+              <w:rPr>
+                <w:rFonts w:ascii="Times New Roman" w:hAnsi="Times New Roman" w:cs="Times New Roman"/>
+                <w:sz w:val="22"/>
+                <w:szCs w:val="22"/>
+                <w:lang w:val="en-PH"/>
               </w:rPr>
             </w:pPr>
             <w:r>
               <w:rPr>
-                <w:rFonts w:ascii="Aptos Narrow" w:eastAsia="Times New Roman" w:hAnsi="Aptos Narrow" w:cs="Times New Roman"/>
-                <w:color w:val="000000"/>
-                <w:kern w:val="0"/>
-                <w:sz w:val="22"/>
-                <w:szCs w:val="22"/>
-                <w:lang w:val="en-SG" w:eastAsia="en-SG"/>
-                <w14:ligatures w14:val="none"/>
-              </w:rPr>
-              <w:t>40575</w:t>
+                <w:rFonts w:ascii="Times New Roman" w:hAnsi="Times New Roman" w:cs="Times New Roman"/>
+                <w:sz w:val="22"/>
+                <w:szCs w:val="22"/>
+                <w:lang w:val="en-PH"/>
+              </w:rPr>
+              <w:t>Low</w:t>
             </w:r>
           </w:p>
         </w:tc>
       </w:tr>
       <w:tr>
         <w:trPr>
-          <w:trHeight w:val="290"/>
+          <w:trHeight w:val="431"/>
+          <w:tblCellSpacing w:w="15" w:type="dxa"/>
         </w:trPr>
         <w:tc>
           <w:tcPr>
-            <w:tcW w:w="5597" w:type="dxa"/>
-            <w:tcBorders>
-              <w:top w:val="nil"/>
-              <w:left w:val="single" w:sz="4" w:space="0" w:color="auto"/>
-              <w:bottom w:val="single" w:sz="4" w:space="0" w:color="auto"/>
-              <w:right w:val="single" w:sz="4" w:space="0" w:color="auto"/>
-            </w:tcBorders>
-            <w:noWrap/>
-            <w:vAlign w:val="bottom"/>
+            <w:tcW w:w="0" w:type="auto"/>
+            <w:vAlign w:val="center"/>
             <w:hideMark/>
           </w:tcPr>
           <w:p>
             <w:pPr>
-              <w:spacing w:after="0" w:line="240" w:lineRule="auto"/>
-              <w:rPr>
-                <w:rFonts w:ascii="Aptos Narrow" w:eastAsia="Times New Roman" w:hAnsi="Aptos Narrow" w:cs="Times New Roman"/>
-                <w:b/>
-                <w:bCs/>
-                <w:color w:val="000000"/>
-                <w:kern w:val="0"/>
-                <w:sz w:val="22"/>
-                <w:szCs w:val="22"/>
-                <w:lang w:val="en-SG" w:eastAsia="en-SG"/>
-                <w14:ligatures w14:val="none"/>
+              <w:rPr>
+                <w:rFonts w:ascii="Times New Roman" w:hAnsi="Times New Roman" w:cs="Times New Roman"/>
+                <w:sz w:val="22"/>
+                <w:szCs w:val="22"/>
+                <w:lang w:val="en-PH"/>
               </w:rPr>
             </w:pPr>
             <w:r>
               <w:rPr>
-                <w:rFonts w:ascii="Aptos Narrow" w:eastAsia="Times New Roman" w:hAnsi="Aptos Narrow" w:cs="Times New Roman"/>
-                <w:b/>
-                <w:bCs/>
-                <w:color w:val="000000"/>
-                <w:kern w:val="0"/>
-                <w:sz w:val="22"/>
-                <w:szCs w:val="22"/>
-                <w:lang w:val="en-SG" w:eastAsia="en-SG"/>
-                <w14:ligatures w14:val="none"/>
-              </w:rPr>
-              <w:t xml:space="preserve"> N(Congestion) </w:t>
+                <w:rFonts w:ascii="Times New Roman" w:hAnsi="Times New Roman" w:cs="Times New Roman"/>
+                <w:sz w:val="22"/>
+                <w:szCs w:val="22"/>
+                <w:lang w:val="en-PH"/>
+              </w:rPr>
+              <w:t>4,500–5,500</w:t>
             </w:r>
           </w:p>
         </w:tc>
         <w:tc>
           <w:tcPr>
-            <w:tcW w:w="1263" w:type="dxa"/>
-            <w:tcBorders>
-              <w:top w:val="nil"/>
-              <w:left w:val="nil"/>
-              <w:bottom w:val="single" w:sz="4" w:space="0" w:color="auto"/>
-              <w:right w:val="single" w:sz="4" w:space="0" w:color="auto"/>
-            </w:tcBorders>
-            <w:noWrap/>
-            <w:vAlign w:val="bottom"/>
+            <w:tcW w:w="0" w:type="auto"/>
+            <w:vAlign w:val="center"/>
             <w:hideMark/>
           </w:tcPr>
           <w:p>
             <w:pPr>
-              <w:spacing w:after="0" w:line="240" w:lineRule="auto"/>
-              <w:jc w:val="right"/>
-              <w:rPr>
-                <w:rFonts w:ascii="Aptos Narrow" w:eastAsia="Times New Roman" w:hAnsi="Aptos Narrow" w:cs="Times New Roman"/>
-                <w:color w:val="000000"/>
-                <w:kern w:val="0"/>
-                <w:sz w:val="22"/>
-                <w:szCs w:val="22"/>
-                <w:lang w:val="en-SG" w:eastAsia="en-SG"/>
-                <w14:ligatures w14:val="none"/>
+              <w:rPr>
+                <w:rFonts w:ascii="Times New Roman" w:hAnsi="Times New Roman" w:cs="Times New Roman"/>
+                <w:sz w:val="22"/>
+                <w:szCs w:val="22"/>
+                <w:lang w:val="en-PH"/>
               </w:rPr>
             </w:pPr>
             <w:r>
               <w:rPr>
-                <w:rFonts w:ascii="Aptos Narrow" w:eastAsia="Times New Roman" w:hAnsi="Aptos Narrow" w:cs="Times New Roman"/>
-                <w:color w:val="000000"/>
-                <w:kern w:val="0"/>
-                <w:sz w:val="22"/>
-                <w:szCs w:val="22"/>
-                <w:lang w:val="en-SG" w:eastAsia="en-SG"/>
-                <w14:ligatures w14:val="none"/>
-              </w:rPr>
-              <w:t>6107</w:t>
+                <w:rFonts w:ascii="Times New Roman" w:hAnsi="Times New Roman" w:cs="Times New Roman"/>
+                <w:sz w:val="22"/>
+                <w:szCs w:val="22"/>
+                <w:lang w:val="en-PH"/>
+              </w:rPr>
+              <w:t>Medium</w:t>
             </w:r>
           </w:p>
         </w:tc>
       </w:tr>
       <w:tr>
         <w:trPr>
-          <w:trHeight w:val="290"/>
+          <w:trHeight w:val="446"/>
+          <w:tblCellSpacing w:w="15" w:type="dxa"/>
         </w:trPr>
         <w:tc>
           <w:tcPr>
-            <w:tcW w:w="5597" w:type="dxa"/>
-            <w:tcBorders>
-              <w:top w:val="nil"/>
-              <w:left w:val="single" w:sz="4" w:space="0" w:color="auto"/>
-              <w:bottom w:val="single" w:sz="4" w:space="0" w:color="auto"/>
-              <w:right w:val="single" w:sz="4" w:space="0" w:color="auto"/>
-            </w:tcBorders>
-            <w:noWrap/>
-            <w:vAlign w:val="bottom"/>
+            <w:tcW w:w="0" w:type="auto"/>
+            <w:vAlign w:val="center"/>
             <w:hideMark/>
           </w:tcPr>
           <w:p>
             <w:pPr>
-              <w:spacing w:after="0" w:line="240" w:lineRule="auto"/>
-              <w:rPr>
-                <w:rFonts w:ascii="Aptos Narrow" w:eastAsia="Times New Roman" w:hAnsi="Aptos Narrow" w:cs="Times New Roman"/>
-                <w:b/>
-                <w:bCs/>
-                <w:color w:val="000000"/>
-                <w:kern w:val="0"/>
-                <w:sz w:val="22"/>
-                <w:szCs w:val="22"/>
-                <w:lang w:val="en-SG" w:eastAsia="en-SG"/>
-                <w14:ligatures w14:val="none"/>
+              <w:rPr>
+                <w:rFonts w:ascii="Times New Roman" w:hAnsi="Times New Roman" w:cs="Times New Roman"/>
+                <w:sz w:val="22"/>
+                <w:szCs w:val="22"/>
+                <w:lang w:val="en-PH"/>
               </w:rPr>
             </w:pPr>
             <w:r>
               <w:rPr>
-                <w:rFonts w:ascii="Aptos Narrow" w:eastAsia="Times New Roman" w:hAnsi="Aptos Narrow" w:cs="Times New Roman"/>
-                <w:b/>
-                <w:bCs/>
-                <w:color w:val="000000"/>
-                <w:kern w:val="0"/>
-                <w:sz w:val="22"/>
-                <w:szCs w:val="22"/>
-                <w:lang w:val="en-SG" w:eastAsia="en-SG"/>
-                <w14:ligatures w14:val="none"/>
-              </w:rPr>
-              <w:t xml:space="preserve"> N(Clear Weather) </w:t>
+                <w:rFonts w:ascii="Times New Roman" w:hAnsi="Times New Roman" w:cs="Times New Roman"/>
+                <w:sz w:val="22"/>
+                <w:szCs w:val="22"/>
+                <w:lang w:val="en-PH"/>
+              </w:rPr>
+              <w:t>&gt; 5,500</w:t>
             </w:r>
           </w:p>
         </w:tc>
         <w:tc>
           <w:tcPr>
-            <w:tcW w:w="1263" w:type="dxa"/>
-            <w:tcBorders>
-              <w:top w:val="nil"/>
-              <w:left w:val="nil"/>
-              <w:bottom w:val="single" w:sz="4" w:space="0" w:color="auto"/>
-              <w:right w:val="single" w:sz="4" w:space="0" w:color="auto"/>
-            </w:tcBorders>
-            <w:noWrap/>
-            <w:vAlign w:val="bottom"/>
+            <w:tcW w:w="0" w:type="auto"/>
+            <w:vAlign w:val="center"/>
             <w:hideMark/>
           </w:tcPr>
           <w:p>
             <w:pPr>
-              <w:spacing w:after="0" w:line="240" w:lineRule="auto"/>
-              <w:jc w:val="right"/>
-              <w:rPr>
-                <w:rFonts w:ascii="Aptos Narrow" w:eastAsia="Times New Roman" w:hAnsi="Aptos Narrow" w:cs="Times New Roman"/>
-                <w:color w:val="000000"/>
-                <w:kern w:val="0"/>
-                <w:sz w:val="22"/>
-                <w:szCs w:val="22"/>
-                <w:lang w:val="en-SG" w:eastAsia="en-SG"/>
-                <w14:ligatures w14:val="none"/>
+              <w:rPr>
+                <w:rFonts w:ascii="Times New Roman" w:hAnsi="Times New Roman" w:cs="Times New Roman"/>
+                <w:sz w:val="22"/>
+                <w:szCs w:val="22"/>
+                <w:lang w:val="en-PH"/>
               </w:rPr>
             </w:pPr>
             <w:r>
               <w:rPr>
-                <w:rFonts w:ascii="Aptos Narrow" w:eastAsia="Times New Roman" w:hAnsi="Aptos Narrow" w:cs="Times New Roman"/>
-                <w:color w:val="000000"/>
-                <w:kern w:val="0"/>
-                <w:sz w:val="22"/>
-                <w:szCs w:val="22"/>
-                <w:lang w:val="en-SG" w:eastAsia="en-SG"/>
-                <w14:ligatures w14:val="none"/>
-              </w:rPr>
-              <w:t>13366</w:t>
-            </w:r>
-          </w:p>
-        </w:tc>
-      </w:tr>
-      <w:tr>
-        <w:trPr>
-          <w:trHeight w:val="290"/>
-        </w:trPr>
-        <w:tc>
-          <w:tcPr>
-            <w:tcW w:w="5597" w:type="dxa"/>
-            <w:tcBorders>
-              <w:top w:val="nil"/>
-              <w:left w:val="single" w:sz="4" w:space="0" w:color="auto"/>
-              <w:bottom w:val="single" w:sz="4" w:space="0" w:color="auto"/>
-              <w:right w:val="single" w:sz="4" w:space="0" w:color="auto"/>
-            </w:tcBorders>
-            <w:noWrap/>
-            <w:vAlign w:val="bottom"/>
-            <w:hideMark/>
-          </w:tcPr>
-          <w:p>
-            <w:pPr>
-              <w:spacing w:after="0" w:line="240" w:lineRule="auto"/>
-              <w:rPr>
-                <w:rFonts w:ascii="Aptos Narrow" w:eastAsia="Times New Roman" w:hAnsi="Aptos Narrow" w:cs="Times New Roman"/>
-                <w:b/>
-                <w:bCs/>
-                <w:color w:val="000000"/>
-                <w:kern w:val="0"/>
-                <w:sz w:val="22"/>
-                <w:szCs w:val="22"/>
-                <w:lang w:val="en-SG" w:eastAsia="en-SG"/>
-                <w14:ligatures w14:val="none"/>
-              </w:rPr>
-            </w:pPr>
-            <w:r>
-              <w:rPr>
-                <w:rFonts w:ascii="Aptos Narrow" w:eastAsia="Times New Roman" w:hAnsi="Aptos Narrow" w:cs="Times New Roman"/>
-                <w:b/>
-                <w:bCs/>
-                <w:color w:val="000000"/>
-                <w:kern w:val="0"/>
-                <w:sz w:val="22"/>
-                <w:szCs w:val="22"/>
-                <w:lang w:val="en-SG" w:eastAsia="en-SG"/>
-                <w14:ligatures w14:val="none"/>
-              </w:rPr>
-              <w:t>N(Congestion and Clear Weather)</w:t>
-            </w:r>
-          </w:p>
-        </w:tc>
-        <w:tc>
-          <w:tcPr>
-            <w:tcW w:w="1263" w:type="dxa"/>
-            <w:tcBorders>
-              <w:top w:val="nil"/>
-              <w:left w:val="nil"/>
-              <w:bottom w:val="single" w:sz="4" w:space="0" w:color="auto"/>
-              <w:right w:val="single" w:sz="4" w:space="0" w:color="auto"/>
-            </w:tcBorders>
-            <w:noWrap/>
-            <w:vAlign w:val="bottom"/>
-            <w:hideMark/>
-          </w:tcPr>
-          <w:p>
-            <w:pPr>
-              <w:spacing w:after="0" w:line="240" w:lineRule="auto"/>
-              <w:jc w:val="right"/>
-              <w:rPr>
-                <w:rFonts w:ascii="Aptos Narrow" w:eastAsia="Times New Roman" w:hAnsi="Aptos Narrow" w:cs="Times New Roman"/>
-                <w:color w:val="000000"/>
-                <w:kern w:val="0"/>
-                <w:sz w:val="22"/>
-                <w:szCs w:val="22"/>
-                <w:lang w:val="en-SG" w:eastAsia="en-SG"/>
-                <w14:ligatures w14:val="none"/>
-              </w:rPr>
-            </w:pPr>
-            <w:r>
-              <w:rPr>
-                <w:rFonts w:ascii="Aptos Narrow" w:eastAsia="Times New Roman" w:hAnsi="Aptos Narrow" w:cs="Times New Roman"/>
-                <w:color w:val="000000"/>
-                <w:kern w:val="0"/>
-                <w:sz w:val="22"/>
-                <w:szCs w:val="22"/>
-                <w:lang w:val="en-SG" w:eastAsia="en-SG"/>
-                <w14:ligatures w14:val="none"/>
-              </w:rPr>
-              <w:t>1762</w:t>
-            </w:r>
-          </w:p>
-        </w:tc>
-      </w:tr>
-      <w:tr>
-        <w:trPr>
-          <w:trHeight w:val="290"/>
-        </w:trPr>
-        <w:tc>
-          <w:tcPr>
-            <w:tcW w:w="5597" w:type="dxa"/>
-            <w:tcBorders>
-              <w:top w:val="nil"/>
-              <w:left w:val="single" w:sz="4" w:space="0" w:color="auto"/>
-              <w:bottom w:val="single" w:sz="4" w:space="0" w:color="auto"/>
-              <w:right w:val="single" w:sz="4" w:space="0" w:color="auto"/>
-            </w:tcBorders>
-            <w:noWrap/>
-            <w:vAlign w:val="bottom"/>
-            <w:hideMark/>
-          </w:tcPr>
-          <w:p>
-            <w:pPr>
-              <w:spacing w:after="0" w:line="240" w:lineRule="auto"/>
-              <w:rPr>
-                <w:rFonts w:ascii="Aptos Narrow" w:eastAsia="Times New Roman" w:hAnsi="Aptos Narrow" w:cs="Times New Roman"/>
-                <w:b/>
-                <w:bCs/>
-                <w:color w:val="000000"/>
-                <w:kern w:val="0"/>
-                <w:sz w:val="22"/>
-                <w:szCs w:val="22"/>
-                <w:lang w:val="en-SG" w:eastAsia="en-SG"/>
-                <w14:ligatures w14:val="none"/>
-              </w:rPr>
-            </w:pPr>
-            <w:r>
-              <w:rPr>
-                <w:rFonts w:ascii="Aptos Narrow" w:eastAsia="Times New Roman" w:hAnsi="Aptos Narrow" w:cs="Times New Roman"/>
-                <w:b/>
-                <w:bCs/>
-                <w:color w:val="000000"/>
-                <w:kern w:val="0"/>
-                <w:sz w:val="22"/>
-                <w:szCs w:val="22"/>
-                <w:lang w:val="en-SG" w:eastAsia="en-SG"/>
-                <w14:ligatures w14:val="none"/>
-              </w:rPr>
-              <w:t xml:space="preserve"> P(Congestion) </w:t>
-            </w:r>
-          </w:p>
-        </w:tc>
-        <w:tc>
-          <w:tcPr>
-            <w:tcW w:w="1263" w:type="dxa"/>
-            <w:tcBorders>
-              <w:top w:val="nil"/>
-              <w:left w:val="nil"/>
-              <w:bottom w:val="single" w:sz="4" w:space="0" w:color="auto"/>
-              <w:right w:val="single" w:sz="4" w:space="0" w:color="auto"/>
-            </w:tcBorders>
-            <w:noWrap/>
-            <w:vAlign w:val="bottom"/>
-            <w:hideMark/>
-          </w:tcPr>
-          <w:p>
-            <w:pPr>
-              <w:spacing w:after="0" w:line="240" w:lineRule="auto"/>
-              <w:jc w:val="right"/>
-              <w:rPr>
-                <w:rFonts w:ascii="Aptos Narrow" w:eastAsia="Times New Roman" w:hAnsi="Aptos Narrow" w:cs="Times New Roman"/>
-                <w:color w:val="000000"/>
-                <w:kern w:val="0"/>
-                <w:sz w:val="22"/>
-                <w:szCs w:val="22"/>
-                <w:lang w:val="en-SG" w:eastAsia="en-SG"/>
-                <w14:ligatures w14:val="none"/>
-              </w:rPr>
-            </w:pPr>
-            <w:r>
-              <w:rPr>
-                <w:rFonts w:ascii="Aptos Narrow" w:eastAsia="Times New Roman" w:hAnsi="Aptos Narrow" w:cs="Times New Roman"/>
-                <w:color w:val="000000"/>
-                <w:kern w:val="0"/>
-                <w:sz w:val="22"/>
-                <w:szCs w:val="22"/>
-                <w:lang w:val="en-SG" w:eastAsia="en-SG"/>
-                <w14:ligatures w14:val="none"/>
-              </w:rPr>
-              <w:t>15.05%</w:t>
-            </w:r>
-          </w:p>
-        </w:tc>
-      </w:tr>
-      <w:tr>
-        <w:trPr>
-          <w:trHeight w:val="290"/>
-        </w:trPr>
-        <w:tc>
-          <w:tcPr>
-            <w:tcW w:w="5597" w:type="dxa"/>
-            <w:tcBorders>
-              <w:top w:val="nil"/>
-              <w:left w:val="single" w:sz="4" w:space="0" w:color="auto"/>
-              <w:bottom w:val="single" w:sz="4" w:space="0" w:color="auto"/>
-              <w:right w:val="single" w:sz="4" w:space="0" w:color="auto"/>
-            </w:tcBorders>
-            <w:noWrap/>
-            <w:vAlign w:val="bottom"/>
-            <w:hideMark/>
-          </w:tcPr>
-          <w:p>
-            <w:pPr>
-              <w:spacing w:after="0" w:line="240" w:lineRule="auto"/>
-              <w:rPr>
-                <w:rFonts w:ascii="Aptos Narrow" w:eastAsia="Times New Roman" w:hAnsi="Aptos Narrow" w:cs="Times New Roman"/>
-                <w:b/>
-                <w:bCs/>
-                <w:color w:val="000000"/>
-                <w:kern w:val="0"/>
-                <w:sz w:val="22"/>
-                <w:szCs w:val="22"/>
-                <w:lang w:val="en-SG" w:eastAsia="en-SG"/>
-                <w14:ligatures w14:val="none"/>
-              </w:rPr>
-            </w:pPr>
-            <w:r>
-              <w:rPr>
-                <w:rFonts w:ascii="Aptos Narrow" w:eastAsia="Times New Roman" w:hAnsi="Aptos Narrow" w:cs="Times New Roman"/>
-                <w:b/>
-                <w:bCs/>
-                <w:color w:val="000000"/>
-                <w:kern w:val="0"/>
-                <w:sz w:val="22"/>
-                <w:szCs w:val="22"/>
-                <w:lang w:val="en-SG" w:eastAsia="en-SG"/>
-                <w14:ligatures w14:val="none"/>
-              </w:rPr>
-              <w:t xml:space="preserve"> P(Clear Weather) </w:t>
-            </w:r>
-          </w:p>
-        </w:tc>
-        <w:tc>
-          <w:tcPr>
-            <w:tcW w:w="1263" w:type="dxa"/>
-            <w:tcBorders>
-              <w:top w:val="nil"/>
-              <w:left w:val="nil"/>
-              <w:bottom w:val="single" w:sz="4" w:space="0" w:color="auto"/>
-              <w:right w:val="single" w:sz="4" w:space="0" w:color="auto"/>
-            </w:tcBorders>
-            <w:noWrap/>
-            <w:vAlign w:val="bottom"/>
-            <w:hideMark/>
-          </w:tcPr>
-          <w:p>
-            <w:pPr>
-              <w:spacing w:after="0" w:line="240" w:lineRule="auto"/>
-              <w:jc w:val="right"/>
-              <w:rPr>
-                <w:rFonts w:ascii="Aptos Narrow" w:eastAsia="Times New Roman" w:hAnsi="Aptos Narrow" w:cs="Times New Roman"/>
-                <w:color w:val="000000"/>
-                <w:kern w:val="0"/>
-                <w:sz w:val="22"/>
-                <w:szCs w:val="22"/>
-                <w:lang w:val="en-SG" w:eastAsia="en-SG"/>
-                <w14:ligatures w14:val="none"/>
-              </w:rPr>
-            </w:pPr>
-            <w:r>
-              <w:rPr>
-                <w:rFonts w:ascii="Aptos Narrow" w:eastAsia="Times New Roman" w:hAnsi="Aptos Narrow" w:cs="Times New Roman"/>
-                <w:color w:val="000000"/>
-                <w:kern w:val="0"/>
-                <w:sz w:val="22"/>
-                <w:szCs w:val="22"/>
-                <w:lang w:val="en-SG" w:eastAsia="en-SG"/>
-                <w14:ligatures w14:val="none"/>
-              </w:rPr>
-              <w:t>32.94%</w:t>
-            </w:r>
-          </w:p>
-        </w:tc>
-      </w:tr>
-      <w:tr>
-        <w:trPr>
-          <w:trHeight w:val="290"/>
-        </w:trPr>
-        <w:tc>
-          <w:tcPr>
-            <w:tcW w:w="5597" w:type="dxa"/>
-            <w:tcBorders>
-              <w:top w:val="nil"/>
-              <w:left w:val="single" w:sz="4" w:space="0" w:color="auto"/>
-              <w:bottom w:val="single" w:sz="4" w:space="0" w:color="auto"/>
-              <w:right w:val="single" w:sz="4" w:space="0" w:color="auto"/>
-            </w:tcBorders>
-            <w:noWrap/>
-            <w:vAlign w:val="bottom"/>
-            <w:hideMark/>
-          </w:tcPr>
-          <w:p>
-            <w:pPr>
-              <w:spacing w:after="0" w:line="240" w:lineRule="auto"/>
-              <w:rPr>
-                <w:rFonts w:ascii="Aptos Narrow" w:eastAsia="Times New Roman" w:hAnsi="Aptos Narrow" w:cs="Times New Roman"/>
-                <w:b/>
-                <w:bCs/>
-                <w:color w:val="000000"/>
-                <w:kern w:val="0"/>
-                <w:sz w:val="22"/>
-                <w:szCs w:val="22"/>
-                <w:lang w:val="en-SG" w:eastAsia="en-SG"/>
-                <w14:ligatures w14:val="none"/>
-              </w:rPr>
-            </w:pPr>
-            <w:r>
-              <w:rPr>
-                <w:rFonts w:ascii="Aptos Narrow" w:eastAsia="Times New Roman" w:hAnsi="Aptos Narrow" w:cs="Times New Roman"/>
-                <w:b/>
-                <w:bCs/>
-                <w:color w:val="000000"/>
-                <w:kern w:val="0"/>
-                <w:sz w:val="22"/>
-                <w:szCs w:val="22"/>
-                <w:lang w:val="en-SG" w:eastAsia="en-SG"/>
-                <w14:ligatures w14:val="none"/>
-              </w:rPr>
-              <w:t xml:space="preserve"> P(Congestion And Clear Weather) </w:t>
-            </w:r>
-          </w:p>
-        </w:tc>
-        <w:tc>
-          <w:tcPr>
-            <w:tcW w:w="1263" w:type="dxa"/>
-            <w:tcBorders>
-              <w:top w:val="nil"/>
-              <w:left w:val="nil"/>
-              <w:bottom w:val="single" w:sz="4" w:space="0" w:color="auto"/>
-              <w:right w:val="single" w:sz="4" w:space="0" w:color="auto"/>
-            </w:tcBorders>
-            <w:noWrap/>
-            <w:vAlign w:val="bottom"/>
-            <w:hideMark/>
-          </w:tcPr>
-          <w:p>
-            <w:pPr>
-              <w:spacing w:after="0" w:line="240" w:lineRule="auto"/>
-              <w:jc w:val="right"/>
-              <w:rPr>
-                <w:rFonts w:ascii="Aptos Narrow" w:eastAsia="Times New Roman" w:hAnsi="Aptos Narrow" w:cs="Times New Roman"/>
-                <w:color w:val="000000"/>
-                <w:kern w:val="0"/>
-                <w:sz w:val="22"/>
-                <w:szCs w:val="22"/>
-                <w:lang w:val="en-SG" w:eastAsia="en-SG"/>
-                <w14:ligatures w14:val="none"/>
-              </w:rPr>
-            </w:pPr>
-            <w:r>
-              <w:rPr>
-                <w:rFonts w:ascii="Aptos Narrow" w:eastAsia="Times New Roman" w:hAnsi="Aptos Narrow" w:cs="Times New Roman"/>
-                <w:color w:val="000000"/>
-                <w:kern w:val="0"/>
-                <w:sz w:val="22"/>
-                <w:szCs w:val="22"/>
-                <w:lang w:val="en-SG" w:eastAsia="en-SG"/>
-                <w14:ligatures w14:val="none"/>
-              </w:rPr>
-              <w:t>4.34%</w:t>
+                <w:rFonts w:ascii="Times New Roman" w:hAnsi="Times New Roman" w:cs="Times New Roman"/>
+                <w:sz w:val="22"/>
+                <w:szCs w:val="22"/>
+                <w:lang w:val="en-PH"/>
+              </w:rPr>
+              <w:t>High</w:t>
             </w:r>
           </w:p>
         </w:tc>
@@ -5956,125 +6232,429 @@
     <w:p>
       <w:pPr>
         <w:rPr>
-          <w:rFonts w:ascii="Times New Roman" w:hAnsi="Times New Roman" w:cs="Times New Roman"/>
-          <w:sz w:val="22"/>
-        </w:rPr>
-      </w:pPr>
-    </w:p>
-    <w:p>
-      <w:r>
-        <w:rPr>
-          <w:rFonts w:ascii="Times New Roman" w:hAnsi="Times New Roman" w:cs="Times New Roman"/>
-          <w:b/>
-          <w:bCs/>
-          <w:sz w:val="22"/>
-        </w:rPr>
-        <w:t>Method:</w:t>
-      </w:r>
-      <w:r>
-        <w:rPr>
-          <w:rFonts w:ascii="Times New Roman" w:hAnsi="Times New Roman" w:cs="Times New Roman"/>
-          <w:sz w:val="22"/>
-        </w:rPr>
-        <w:t xml:space="preserve"> All three probabilities are empirical relative frequencies computed over the same 40,575</w:t>
-      </w:r>
-      <w:r>
-        <w:rPr>
-          <w:rFonts w:ascii="Times New Roman" w:hAnsi="Times New Roman" w:cs="Times New Roman"/>
-          <w:sz w:val="22"/>
-        </w:rPr>
-        <w:t xml:space="preserve"> deduplicated rows</w:t>
-      </w:r>
-      <w:r>
-        <w:rPr>
-          <w:rFonts w:ascii="Times New Roman" w:hAnsi="Times New Roman" w:cs="Times New Roman"/>
-          <w:sz w:val="22"/>
-        </w:rPr>
-        <w:t xml:space="preserve">, one-row-per-hour dataset used throughout </w:t>
-      </w:r>
-      <w:r>
-        <w:rPr>
-          <w:rFonts w:ascii="Times New Roman" w:hAnsi="Times New Roman" w:cs="Times New Roman"/>
-          <w:sz w:val="22"/>
-        </w:rPr>
-        <w:t>the previous tasks</w:t>
-      </w:r>
-      <w:r>
-        <w:rPr>
-          <w:rFonts w:ascii="Times New Roman" w:hAnsi="Times New Roman" w:cs="Times New Roman"/>
-          <w:sz w:val="22"/>
-        </w:rPr>
-        <w:t xml:space="preserve"> (so an hour with multiple weather log entries is not double-counted). "Clear Weather" uses the weather_main column’s exact category "Clear" (one of 10 categories in the data: Clouds, Clear, Rain, Drizzle, Mist, Fog, Thunderstorm, Haze, Snow, Squall, Smoke) rather than the free-text weather_description field, since weather_main gives a single unambiguous label per hour.</w:t>
-      </w:r>
-    </w:p>
-    <w:p>
-      <w:r>
-        <w:rPr>
-          <w:rFonts w:ascii="Times New Roman" w:hAnsi="Times New Roman" w:cs="Times New Roman"/>
-          <w:b/>
-          <w:sz w:val="22"/>
-        </w:rPr>
-        <w:t xml:space="preserve">P(Congestion): </w:t>
-      </w:r>
-      <w:r>
-        <w:rPr>
-          <w:rFonts w:ascii="Times New Roman" w:hAnsi="Times New Roman" w:cs="Times New Roman"/>
-          <w:sz w:val="22"/>
-        </w:rPr>
-        <w:t>6,107 of 40,575 hours have traffic_volume &gt; 5,500, so P(Congestion) = 6,107 / 40,575 ≈ 0.1505 (15.05%).</w:t>
-      </w:r>
-    </w:p>
-    <w:p>
-      <w:r>
-        <w:rPr>
-          <w:rFonts w:ascii="Times New Roman" w:hAnsi="Times New Roman" w:cs="Times New Roman"/>
-          <w:b/>
-          <w:sz w:val="22"/>
-        </w:rPr>
-        <w:t xml:space="preserve">P(Clear Weather): </w:t>
-      </w:r>
-      <w:r>
-        <w:rPr>
-          <w:rFonts w:ascii="Times New Roman" w:hAnsi="Times New Roman" w:cs="Times New Roman"/>
-          <w:sz w:val="22"/>
-        </w:rPr>
-        <w:t>13,366 of 40,575 hours are logged with weather_main = "Clear", so P(Clear Weather) = 13,366 / 40,575 ≈ 0.3294 (32.94%).</w:t>
-      </w:r>
-    </w:p>
-    <w:p>
-      <w:r>
-        <w:rPr>
-          <w:rFonts w:ascii="Times New Roman" w:hAnsi="Times New Roman" w:cs="Times New Roman"/>
-          <w:b/>
-          <w:sz w:val="22"/>
-        </w:rPr>
-        <w:t xml:space="preserve">P(Congestion AND Clear Weather): </w:t>
-      </w:r>
-      <w:r>
-        <w:rPr>
-          <w:rFonts w:ascii="Times New Roman" w:hAnsi="Times New Roman" w:cs="Times New Roman"/>
-          <w:sz w:val="22"/>
-        </w:rPr>
-        <w:t>1,762 of 40,575 hours are both congested and clear, so P(Congestion AND Clear Weather) = 1,762 / 40,575 ≈ 0.0434 (4.34%).</w:t>
-      </w:r>
-    </w:p>
-    <w:p>
-      <w:pPr>
-        <w:rPr>
-          <w:rFonts w:ascii="Times New Roman" w:hAnsi="Times New Roman" w:cs="Times New Roman"/>
-          <w:sz w:val="22"/>
-        </w:rPr>
-      </w:pPr>
-    </w:p>
-    <w:p>
-      <w:pPr>
-        <w:rPr>
-          <w:rFonts w:ascii="Times New Roman" w:hAnsi="Times New Roman" w:cs="Times New Roman"/>
-          <w:sz w:val="22"/>
-        </w:rPr>
-      </w:pPr>
-    </w:p>
-    <w:p/>
+          <w:lang w:val="en-SG"/>
+        </w:rPr>
+      </w:pPr>
+    </w:p>
+    <w:p>
+      <w:pPr>
+        <w:rPr>
+          <w:lang w:val="en-SG"/>
+        </w:rPr>
+      </w:pPr>
+      <w:r>
+        <w:rPr>
+          <w:lang w:val="en-SG"/>
+        </w:rPr>
+        <w:t>Steps Followed as below:</w:t>
+      </w:r>
+    </w:p>
+    <w:p>
+      <w:pPr>
+        <w:pStyle w:val="ListParagraph"/>
+        <w:numPr>
+          <w:ilvl w:val="0"/>
+          <w:numId w:val="10"/>
+        </w:numPr>
+        <w:rPr>
+          <w:lang w:val="en-SG"/>
+        </w:rPr>
+      </w:pPr>
+      <w:r>
+        <w:rPr>
+          <w:lang w:val="en-SG"/>
+        </w:rPr>
+        <w:t xml:space="preserve">Row and column count: the imported CSV has 48,204 rows and 9 columns (holiday, temp, rain_1h, snow_1h, </w:t>
+      </w:r>
+      <w:proofErr w:type="spellStart"/>
+      <w:r>
+        <w:rPr>
+          <w:lang w:val="en-SG"/>
+        </w:rPr>
+        <w:t>clouds_all</w:t>
+      </w:r>
+      <w:proofErr w:type="spellEnd"/>
+      <w:r>
+        <w:rPr>
+          <w:lang w:val="en-SG"/>
+        </w:rPr>
+        <w:t xml:space="preserve">, </w:t>
+      </w:r>
+      <w:proofErr w:type="spellStart"/>
+      <w:r>
+        <w:rPr>
+          <w:lang w:val="en-SG"/>
+        </w:rPr>
+        <w:t>weather_main</w:t>
+      </w:r>
+      <w:proofErr w:type="spellEnd"/>
+      <w:r>
+        <w:rPr>
+          <w:lang w:val="en-SG"/>
+        </w:rPr>
+        <w:t xml:space="preserve">, </w:t>
+      </w:r>
+      <w:proofErr w:type="spellStart"/>
+      <w:r>
+        <w:rPr>
+          <w:lang w:val="en-SG"/>
+        </w:rPr>
+        <w:t>weather_description</w:t>
+      </w:r>
+      <w:proofErr w:type="spellEnd"/>
+      <w:r>
+        <w:rPr>
+          <w:lang w:val="en-SG"/>
+        </w:rPr>
+        <w:t xml:space="preserve">, </w:t>
+      </w:r>
+      <w:proofErr w:type="spellStart"/>
+      <w:r>
+        <w:rPr>
+          <w:lang w:val="en-SG"/>
+        </w:rPr>
+        <w:t>date_time</w:t>
+      </w:r>
+      <w:proofErr w:type="spellEnd"/>
+      <w:r>
+        <w:rPr>
+          <w:lang w:val="en-SG"/>
+        </w:rPr>
+        <w:t xml:space="preserve">, </w:t>
+      </w:r>
+      <w:proofErr w:type="spellStart"/>
+      <w:r>
+        <w:rPr>
+          <w:lang w:val="en-SG"/>
+        </w:rPr>
+        <w:t>traffic_volume</w:t>
+      </w:r>
+      <w:proofErr w:type="spellEnd"/>
+      <w:r>
+        <w:rPr>
+          <w:lang w:val="en-SG"/>
+        </w:rPr>
+        <w:t>).</w:t>
+      </w:r>
+    </w:p>
+    <w:p>
+      <w:pPr>
+        <w:pStyle w:val="ListParagraph"/>
+        <w:numPr>
+          <w:ilvl w:val="0"/>
+          <w:numId w:val="10"/>
+        </w:numPr>
+        <w:rPr>
+          <w:lang w:val="en-SG"/>
+        </w:rPr>
+      </w:pPr>
+      <w:r>
+        <w:rPr>
+          <w:lang w:val="en-SG"/>
+        </w:rPr>
+        <w:t xml:space="preserve">Null and missing values: Power Query's Column quality view initially reported 0% Empty for every column, which looks like no missing data at all. </w:t>
+      </w:r>
+      <w:proofErr w:type="gramStart"/>
+      <w:r>
+        <w:rPr>
+          <w:lang w:val="en-SG"/>
+        </w:rPr>
+        <w:t>However</w:t>
+      </w:r>
+      <w:proofErr w:type="gramEnd"/>
+      <w:r>
+        <w:rPr>
+          <w:lang w:val="en-SG"/>
+        </w:rPr>
+        <w:t xml:space="preserve"> holiday stores the literal text None for </w:t>
+      </w:r>
+      <w:proofErr w:type="spellStart"/>
+      <w:r>
+        <w:rPr>
+          <w:lang w:val="en-SG"/>
+        </w:rPr>
+        <w:t>non holiday</w:t>
+      </w:r>
+      <w:proofErr w:type="spellEnd"/>
+      <w:r>
+        <w:rPr>
+          <w:lang w:val="en-SG"/>
+        </w:rPr>
+        <w:t xml:space="preserve"> hours rather than a true blank, in 48,143 of 48,204 rows (99.87%). This is not detected as missing until the text is explicitly </w:t>
+      </w:r>
+      <w:r>
+        <w:rPr>
+          <w:lang w:val="en-SG"/>
+        </w:rPr>
+        <w:lastRenderedPageBreak/>
+        <w:t>replaced. Applying Replace Values (None to blank) on holiday raised its reported Empty percentage to 99%, correctly reflecting that almost every hour has no holiday.</w:t>
+      </w:r>
+    </w:p>
+    <w:p>
+      <w:pPr>
+        <w:pStyle w:val="ListParagraph"/>
+        <w:numPr>
+          <w:ilvl w:val="0"/>
+          <w:numId w:val="10"/>
+        </w:numPr>
+        <w:rPr>
+          <w:lang w:val="en-SG"/>
+        </w:rPr>
+      </w:pPr>
+      <w:r>
+        <w:rPr>
+          <w:lang w:val="en-SG"/>
+        </w:rPr>
+        <w:t xml:space="preserve">Data type check: </w:t>
+      </w:r>
+      <w:proofErr w:type="spellStart"/>
+      <w:r>
+        <w:rPr>
+          <w:lang w:val="en-SG"/>
+        </w:rPr>
+        <w:t>date_time</w:t>
+      </w:r>
+      <w:proofErr w:type="spellEnd"/>
+      <w:r>
+        <w:rPr>
+          <w:lang w:val="en-SG"/>
+        </w:rPr>
+        <w:t xml:space="preserve">, </w:t>
+      </w:r>
+      <w:proofErr w:type="spellStart"/>
+      <w:r>
+        <w:rPr>
+          <w:lang w:val="en-SG"/>
+        </w:rPr>
+        <w:t>clouds_all</w:t>
+      </w:r>
+      <w:proofErr w:type="spellEnd"/>
+      <w:r>
+        <w:rPr>
+          <w:lang w:val="en-SG"/>
+        </w:rPr>
+        <w:t xml:space="preserve"> and </w:t>
+      </w:r>
+      <w:proofErr w:type="spellStart"/>
+      <w:r>
+        <w:rPr>
+          <w:lang w:val="en-SG"/>
+        </w:rPr>
+        <w:t>traffic_volume</w:t>
+      </w:r>
+      <w:proofErr w:type="spellEnd"/>
+      <w:r>
+        <w:rPr>
+          <w:lang w:val="en-SG"/>
+        </w:rPr>
+        <w:t xml:space="preserve"> were auto detected with appropriate types (Date/Time and Whole Number). </w:t>
+      </w:r>
+      <w:proofErr w:type="gramStart"/>
+      <w:r>
+        <w:rPr>
+          <w:lang w:val="en-SG"/>
+        </w:rPr>
+        <w:t>However</w:t>
+      </w:r>
+      <w:proofErr w:type="gramEnd"/>
+      <w:r>
+        <w:rPr>
+          <w:lang w:val="en-SG"/>
+        </w:rPr>
+        <w:t xml:space="preserve"> temp, rain_1h and snow_1h were auto detected as Text rather than a numeric type, which would have prevented correct aggregation and charting. These three were changed to Decimal Number. As a side effect, rain_1h's reported distinct value count dropped from 372 to 30, since several text representations of the same number (such as 0 and 0.0) had been counted as different values before the fix, a further sign the original type was wrong.</w:t>
+      </w:r>
+    </w:p>
+    <w:p>
+      <w:pPr>
+        <w:pStyle w:val="ListParagraph"/>
+        <w:numPr>
+          <w:ilvl w:val="0"/>
+          <w:numId w:val="10"/>
+        </w:numPr>
+        <w:rPr>
+          <w:lang w:val="en-SG"/>
+        </w:rPr>
+      </w:pPr>
+      <w:r>
+        <w:rPr>
+          <w:lang w:val="en-SG"/>
+        </w:rPr>
+        <w:t xml:space="preserve">Hour: extracted from </w:t>
+      </w:r>
+      <w:proofErr w:type="spellStart"/>
+      <w:r>
+        <w:rPr>
+          <w:lang w:val="en-SG"/>
+        </w:rPr>
+        <w:t>date_time</w:t>
+      </w:r>
+      <w:proofErr w:type="spellEnd"/>
+      <w:r>
+        <w:rPr>
+          <w:lang w:val="en-SG"/>
+        </w:rPr>
+        <w:t xml:space="preserve"> using </w:t>
+      </w:r>
+      <w:proofErr w:type="spellStart"/>
+      <w:r>
+        <w:rPr>
+          <w:lang w:val="en-SG"/>
+        </w:rPr>
+        <w:t>Time.Hour</w:t>
+      </w:r>
+      <w:proofErr w:type="spellEnd"/>
+      <w:r>
+        <w:rPr>
+          <w:lang w:val="en-SG"/>
+        </w:rPr>
+        <w:t>([</w:t>
+      </w:r>
+      <w:proofErr w:type="spellStart"/>
+      <w:r>
+        <w:rPr>
+          <w:lang w:val="en-SG"/>
+        </w:rPr>
+        <w:t>date_time</w:t>
+      </w:r>
+      <w:proofErr w:type="spellEnd"/>
+      <w:r>
+        <w:rPr>
+          <w:lang w:val="en-SG"/>
+        </w:rPr>
+        <w:t>]), producing a Whole Number column ranging 0 to 23.</w:t>
+      </w:r>
+    </w:p>
+    <w:p>
+      <w:pPr>
+        <w:pStyle w:val="ListParagraph"/>
+        <w:numPr>
+          <w:ilvl w:val="0"/>
+          <w:numId w:val="10"/>
+        </w:numPr>
+        <w:rPr>
+          <w:lang w:val="en-SG"/>
+        </w:rPr>
+      </w:pPr>
+      <w:r>
+        <w:rPr>
+          <w:lang w:val="en-SG"/>
+        </w:rPr>
+        <w:t xml:space="preserve">Temperature in Celsius: created as a Custom Column named </w:t>
+      </w:r>
+      <w:proofErr w:type="spellStart"/>
+      <w:r>
+        <w:rPr>
+          <w:lang w:val="en-SG"/>
+        </w:rPr>
+        <w:t>Temperature_C</w:t>
+      </w:r>
+      <w:proofErr w:type="spellEnd"/>
+      <w:r>
+        <w:rPr>
+          <w:lang w:val="en-SG"/>
+        </w:rPr>
+        <w:t xml:space="preserve"> using the formula [temp] minus 273.15. Power Query initially left this column as the generic Any type, so it was explicitly changed to Decimal Number.</w:t>
+      </w:r>
+    </w:p>
+    <w:p>
+      <w:pPr>
+        <w:pStyle w:val="ListParagraph"/>
+        <w:numPr>
+          <w:ilvl w:val="0"/>
+          <w:numId w:val="10"/>
+        </w:numPr>
+        <w:rPr>
+          <w:lang w:val="en-SG"/>
+        </w:rPr>
+      </w:pPr>
+      <w:r>
+        <w:rPr>
+          <w:lang w:val="en-SG"/>
+        </w:rPr>
+        <w:t xml:space="preserve">Traffic Category: created as a Custom Column named </w:t>
+      </w:r>
+      <w:proofErr w:type="spellStart"/>
+      <w:r>
+        <w:rPr>
+          <w:lang w:val="en-SG"/>
+        </w:rPr>
+        <w:t>Traffic_Category</w:t>
+      </w:r>
+      <w:proofErr w:type="spellEnd"/>
+      <w:r>
+        <w:rPr>
+          <w:lang w:val="en-SG"/>
+        </w:rPr>
+        <w:t xml:space="preserve"> using nested if </w:t>
+      </w:r>
+      <w:proofErr w:type="gramStart"/>
+      <w:r>
+        <w:rPr>
+          <w:lang w:val="en-SG"/>
+        </w:rPr>
+        <w:t>logic</w:t>
+      </w:r>
+      <w:proofErr w:type="gramEnd"/>
+      <w:r>
+        <w:rPr>
+          <w:lang w:val="en-SG"/>
+        </w:rPr>
+        <w:t xml:space="preserve"> so every row falls into exactly one non overlapping band: Low below 4,500, Medium from 4,500 up to and including 5,500, and High above 5,500, the same threshold used to define Congestion in Task 3. Spot checking against known </w:t>
+      </w:r>
+      <w:proofErr w:type="spellStart"/>
+      <w:r>
+        <w:rPr>
+          <w:lang w:val="en-SG"/>
+        </w:rPr>
+        <w:t>traffic_volume</w:t>
+      </w:r>
+      <w:proofErr w:type="spellEnd"/>
+      <w:r>
+        <w:rPr>
+          <w:lang w:val="en-SG"/>
+        </w:rPr>
+        <w:t xml:space="preserve"> values confirmed correct results, for example 5,545 correctly categorised as High and 4,516 as Medium.</w:t>
+      </w:r>
+    </w:p>
+    <w:p>
+      <w:r>
+        <w:drawing>
+          <wp:inline distT="0" distB="0" distL="0" distR="0" wp14:anchorId="5D3795B8" wp14:editId="23BF505E">
+            <wp:extent cx="5731510" cy="1675765"/>
+            <wp:effectExtent l="0" t="0" r="2540" b="635"/>
+            <wp:docPr id="812200332" name="Picture 1"/>
+            <wp:cNvGraphicFramePr>
+              <a:graphicFrameLocks xmlns:a="http://schemas.openxmlformats.org/drawingml/2006/main" noChangeAspect="1"/>
+            </wp:cNvGraphicFramePr>
+            <a:graphic xmlns:a="http://schemas.openxmlformats.org/drawingml/2006/main">
+              <a:graphicData uri="http://schemas.openxmlformats.org/drawingml/2006/picture">
+                <pic:pic xmlns:pic="http://schemas.openxmlformats.org/drawingml/2006/picture">
+                  <pic:nvPicPr>
+                    <pic:cNvPr id="812200332" name=""/>
+                    <pic:cNvPicPr/>
+                  </pic:nvPicPr>
+                  <pic:blipFill>
+                    <a:blip r:embed="rId8"/>
+                    <a:stretch>
+                      <a:fillRect/>
+                    </a:stretch>
+                  </pic:blipFill>
+                  <pic:spPr>
+                    <a:xfrm>
+                      <a:off x="0" y="0"/>
+                      <a:ext cx="5731510" cy="1675765"/>
+                    </a:xfrm>
+                    <a:prstGeom prst="rect">
+                      <a:avLst/>
+                    </a:prstGeom>
+                  </pic:spPr>
+                </pic:pic>
+              </a:graphicData>
+            </a:graphic>
+          </wp:inline>
+        </w:drawing>
+      </w:r>
+    </w:p>
     <w:sectPr>
       <w:pgSz w:w="11906" w:h="16838"/>
       <w:pgMar w:top="1440" w:right="1440" w:bottom="1440" w:left="1440" w:header="708" w:footer="708" w:gutter="0"/>
@@ -6088,9 +6668,122 @@
 <file path=word/numbering.xml><?xml version="1.0" encoding="utf-8"?>
 <w:numbering xmlns:wpc="http://schemas.microsoft.com/office/word/2010/wordprocessingCanvas" xmlns:cx="http://schemas.microsoft.com/office/drawing/2014/chartex" xmlns:cx1="http://schemas.microsoft.com/office/drawing/2015/9/8/chartex" xmlns:cx2="http://schemas.microsoft.com/office/drawing/2015/10/21/chartex" xmlns:cx3="http://schemas.microsoft.com/office/drawing/2016/5/9/chartex" xmlns:cx4="http://schemas.microsoft.com/office/drawing/2016/5/10/chartex" xmlns:cx5="http://schemas.microsoft.com/office/drawing/2016/5/11/chartex" xmlns:cx6="http://schemas.microsoft.com/office/drawing/2016/5/12/chartex" xmlns:cx7="http://schemas.microsoft.com/office/drawing/2016/5/13/chartex" xmlns:cx8="http://schemas.microsoft.com/office/drawing/2016/5/14/chartex" xmlns:mc="http://schemas.openxmlformats.org/markup-compatibility/2006" xmlns:aink="http://schemas.microsoft.com/office/drawing/2016/ink" xmlns:am3d="http://schemas.microsoft.com/office/drawing/2017/model3d" xmlns:o="urn:schemas-microsoft-com:office:office" xmlns:oel="http://schemas.microsoft.com/office/2019/extlst" xmlns:r="http://schemas.openxmlformats.org/officeDocument/2006/relationships" xmlns:m="http://schemas.openxmlformats.org/officeDocument/2006/math" xmlns:v="urn:schemas-microsoft-com:vml" xmlns:wp14="http://schemas.microsoft.com/office/word/2010/wordprocessingDrawing" xmlns:wp="http://schemas.openxmlformats.org/drawingml/2006/wordprocessingDrawing" xmlns:w10="urn:schemas-microsoft-com:office:word" xmlns:w="http://schemas.openxmlformats.org/wordprocessingml/2006/main" xmlns:w14="http://schemas.microsoft.com/office/word/2010/wordml" xmlns:w15="http://schemas.microsoft.com/office/word/2012/wordml" xmlns:w16cex="http://schemas.microsoft.com/office/word/2018/wordml/cex" xmlns:w16cid="http://schemas.microsoft.com/office/word/2016/wordml/cid" xmlns:w16="http://schemas.microsoft.com/office/word/2018/wordml" xmlns:w16du="http://schemas.microsoft.com/office/word/2023/wordml/word16du" xmlns:w16sdtdh="http://schemas.microsoft.com/office/word/2020/wordml/sdtdatahash" xmlns:w16sdtfl="http://schemas.microsoft.com/office/word/2024/wordml/sdtformatlock" xmlns:w16se="http://schemas.microsoft.com/office/word/2015/wordml/symex" xmlns:wpg="http://schemas.microsoft.com/office/word/2010/wordprocessingGroup" xmlns:wpi="http://schemas.microsoft.com/office/word/2010/wordprocessingInk" xmlns:wne="http://schemas.microsoft.com/office/word/2006/wordml" xmlns:wps="http://schemas.microsoft.com/office/word/2010/wordprocessingShape" mc:Ignorable="w14 w15 w16se w16cid w16 w16cex w16sdtdh w16sdtfl w16du wp14">
   <w:abstractNum w:abstractNumId="0" w15:restartNumberingAfterBreak="0">
-    <w:nsid w:val="08B35A96"/>
+    <w:nsid w:val="108A38F2"/>
     <w:multiLevelType w:val="hybridMultilevel"/>
-    <w:tmpl w:val="C7E4FB6E"/>
+    <w:tmpl w:val="94E46B62"/>
+    <w:lvl w:ilvl="0" w:tplc="48090001">
+      <w:start w:val="1"/>
+      <w:numFmt w:val="bullet"/>
+      <w:lvlText w:val=""/>
+      <w:lvlJc w:val="left"/>
+      <w:pPr>
+        <w:ind w:left="720" w:hanging="360"/>
+      </w:pPr>
+      <w:rPr>
+        <w:rFonts w:ascii="Symbol" w:hAnsi="Symbol" w:hint="default"/>
+      </w:rPr>
+    </w:lvl>
+    <w:lvl w:ilvl="1" w:tplc="48090003" w:tentative="1">
+      <w:start w:val="1"/>
+      <w:numFmt w:val="bullet"/>
+      <w:lvlText w:val="o"/>
+      <w:lvlJc w:val="left"/>
+      <w:pPr>
+        <w:ind w:left="1440" w:hanging="360"/>
+      </w:pPr>
+      <w:rPr>
+        <w:rFonts w:ascii="Courier New" w:hAnsi="Courier New" w:cs="Courier New" w:hint="default"/>
+      </w:rPr>
+    </w:lvl>
+    <w:lvl w:ilvl="2" w:tplc="48090005" w:tentative="1">
+      <w:start w:val="1"/>
+      <w:numFmt w:val="bullet"/>
+      <w:lvlText w:val=""/>
+      <w:lvlJc w:val="left"/>
+      <w:pPr>
+        <w:ind w:left="2160" w:hanging="360"/>
+      </w:pPr>
+      <w:rPr>
+        <w:rFonts w:ascii="Wingdings" w:hAnsi="Wingdings" w:hint="default"/>
+      </w:rPr>
+    </w:lvl>
+    <w:lvl w:ilvl="3" w:tplc="48090001" w:tentative="1">
+      <w:start w:val="1"/>
+      <w:numFmt w:val="bullet"/>
+      <w:lvlText w:val=""/>
+      <w:lvlJc w:val="left"/>
+      <w:pPr>
+        <w:ind w:left="2880" w:hanging="360"/>
+      </w:pPr>
+      <w:rPr>
+        <w:rFonts w:ascii="Symbol" w:hAnsi="Symbol" w:hint="default"/>
+      </w:rPr>
+    </w:lvl>
+    <w:lvl w:ilvl="4" w:tplc="48090003" w:tentative="1">
+      <w:start w:val="1"/>
+      <w:numFmt w:val="bullet"/>
+      <w:lvlText w:val="o"/>
+      <w:lvlJc w:val="left"/>
+      <w:pPr>
+        <w:ind w:left="3600" w:hanging="360"/>
+      </w:pPr>
+      <w:rPr>
+        <w:rFonts w:ascii="Courier New" w:hAnsi="Courier New" w:cs="Courier New" w:hint="default"/>
+      </w:rPr>
+    </w:lvl>
+    <w:lvl w:ilvl="5" w:tplc="48090005" w:tentative="1">
+      <w:start w:val="1"/>
+      <w:numFmt w:val="bullet"/>
+      <w:lvlText w:val=""/>
+      <w:lvlJc w:val="left"/>
+      <w:pPr>
+        <w:ind w:left="4320" w:hanging="360"/>
+      </w:pPr>
+      <w:rPr>
+        <w:rFonts w:ascii="Wingdings" w:hAnsi="Wingdings" w:hint="default"/>
+      </w:rPr>
+    </w:lvl>
+    <w:lvl w:ilvl="6" w:tplc="48090001" w:tentative="1">
+      <w:start w:val="1"/>
+      <w:numFmt w:val="bullet"/>
+      <w:lvlText w:val=""/>
+      <w:lvlJc w:val="left"/>
+      <w:pPr>
+        <w:ind w:left="5040" w:hanging="360"/>
+      </w:pPr>
+      <w:rPr>
+        <w:rFonts w:ascii="Symbol" w:hAnsi="Symbol" w:hint="default"/>
+      </w:rPr>
+    </w:lvl>
+    <w:lvl w:ilvl="7" w:tplc="48090003" w:tentative="1">
+      <w:start w:val="1"/>
+      <w:numFmt w:val="bullet"/>
+      <w:lvlText w:val="o"/>
+      <w:lvlJc w:val="left"/>
+      <w:pPr>
+        <w:ind w:left="5760" w:hanging="360"/>
+      </w:pPr>
+      <w:rPr>
+        <w:rFonts w:ascii="Courier New" w:hAnsi="Courier New" w:cs="Courier New" w:hint="default"/>
+      </w:rPr>
+    </w:lvl>
+    <w:lvl w:ilvl="8" w:tplc="48090005" w:tentative="1">
+      <w:start w:val="1"/>
+      <w:numFmt w:val="bullet"/>
+      <w:lvlText w:val=""/>
+      <w:lvlJc w:val="left"/>
+      <w:pPr>
+        <w:ind w:left="6480" w:hanging="360"/>
+      </w:pPr>
+      <w:rPr>
+        <w:rFonts w:ascii="Wingdings" w:hAnsi="Wingdings" w:hint="default"/>
+      </w:rPr>
+    </w:lvl>
+  </w:abstractNum>
+  <w:abstractNum w:abstractNumId="1" w15:restartNumberingAfterBreak="0">
+    <w:nsid w:val="1A736C6D"/>
+    <w:multiLevelType w:val="hybridMultilevel"/>
+    <w:tmpl w:val="E250AFC2"/>
     <w:lvl w:ilvl="0" w:tplc="34090001">
       <w:start w:val="1"/>
       <w:numFmt w:val="bullet"/>
@@ -6194,119 +6887,6 @@
       <w:lvlJc w:val="left"/>
       <w:pPr>
         <w:ind w:left="6840" w:hanging="360"/>
-      </w:pPr>
-      <w:rPr>
-        <w:rFonts w:ascii="Wingdings" w:hAnsi="Wingdings" w:hint="default"/>
-      </w:rPr>
-    </w:lvl>
-  </w:abstractNum>
-  <w:abstractNum w:abstractNumId="1" w15:restartNumberingAfterBreak="0">
-    <w:nsid w:val="108A38F2"/>
-    <w:multiLevelType w:val="hybridMultilevel"/>
-    <w:tmpl w:val="94E46B62"/>
-    <w:lvl w:ilvl="0" w:tplc="48090001">
-      <w:start w:val="1"/>
-      <w:numFmt w:val="bullet"/>
-      <w:lvlText w:val=""/>
-      <w:lvlJc w:val="left"/>
-      <w:pPr>
-        <w:ind w:left="720" w:hanging="360"/>
-      </w:pPr>
-      <w:rPr>
-        <w:rFonts w:ascii="Symbol" w:hAnsi="Symbol" w:hint="default"/>
-      </w:rPr>
-    </w:lvl>
-    <w:lvl w:ilvl="1" w:tplc="48090003" w:tentative="1">
-      <w:start w:val="1"/>
-      <w:numFmt w:val="bullet"/>
-      <w:lvlText w:val="o"/>
-      <w:lvlJc w:val="left"/>
-      <w:pPr>
-        <w:ind w:left="1440" w:hanging="360"/>
-      </w:pPr>
-      <w:rPr>
-        <w:rFonts w:ascii="Courier New" w:hAnsi="Courier New" w:cs="Courier New" w:hint="default"/>
-      </w:rPr>
-    </w:lvl>
-    <w:lvl w:ilvl="2" w:tplc="48090005" w:tentative="1">
-      <w:start w:val="1"/>
-      <w:numFmt w:val="bullet"/>
-      <w:lvlText w:val=""/>
-      <w:lvlJc w:val="left"/>
-      <w:pPr>
-        <w:ind w:left="2160" w:hanging="360"/>
-      </w:pPr>
-      <w:rPr>
-        <w:rFonts w:ascii="Wingdings" w:hAnsi="Wingdings" w:hint="default"/>
-      </w:rPr>
-    </w:lvl>
-    <w:lvl w:ilvl="3" w:tplc="48090001" w:tentative="1">
-      <w:start w:val="1"/>
-      <w:numFmt w:val="bullet"/>
-      <w:lvlText w:val=""/>
-      <w:lvlJc w:val="left"/>
-      <w:pPr>
-        <w:ind w:left="2880" w:hanging="360"/>
-      </w:pPr>
-      <w:rPr>
-        <w:rFonts w:ascii="Symbol" w:hAnsi="Symbol" w:hint="default"/>
-      </w:rPr>
-    </w:lvl>
-    <w:lvl w:ilvl="4" w:tplc="48090003" w:tentative="1">
-      <w:start w:val="1"/>
-      <w:numFmt w:val="bullet"/>
-      <w:lvlText w:val="o"/>
-      <w:lvlJc w:val="left"/>
-      <w:pPr>
-        <w:ind w:left="3600" w:hanging="360"/>
-      </w:pPr>
-      <w:rPr>
-        <w:rFonts w:ascii="Courier New" w:hAnsi="Courier New" w:cs="Courier New" w:hint="default"/>
-      </w:rPr>
-    </w:lvl>
-    <w:lvl w:ilvl="5" w:tplc="48090005" w:tentative="1">
-      <w:start w:val="1"/>
-      <w:numFmt w:val="bullet"/>
-      <w:lvlText w:val=""/>
-      <w:lvlJc w:val="left"/>
-      <w:pPr>
-        <w:ind w:left="4320" w:hanging="360"/>
-      </w:pPr>
-      <w:rPr>
-        <w:rFonts w:ascii="Wingdings" w:hAnsi="Wingdings" w:hint="default"/>
-      </w:rPr>
-    </w:lvl>
-    <w:lvl w:ilvl="6" w:tplc="48090001" w:tentative="1">
-      <w:start w:val="1"/>
-      <w:numFmt w:val="bullet"/>
-      <w:lvlText w:val=""/>
-      <w:lvlJc w:val="left"/>
-      <w:pPr>
-        <w:ind w:left="5040" w:hanging="360"/>
-      </w:pPr>
-      <w:rPr>
-        <w:rFonts w:ascii="Symbol" w:hAnsi="Symbol" w:hint="default"/>
-      </w:rPr>
-    </w:lvl>
-    <w:lvl w:ilvl="7" w:tplc="48090003" w:tentative="1">
-      <w:start w:val="1"/>
-      <w:numFmt w:val="bullet"/>
-      <w:lvlText w:val="o"/>
-      <w:lvlJc w:val="left"/>
-      <w:pPr>
-        <w:ind w:left="5760" w:hanging="360"/>
-      </w:pPr>
-      <w:rPr>
-        <w:rFonts w:ascii="Courier New" w:hAnsi="Courier New" w:cs="Courier New" w:hint="default"/>
-      </w:rPr>
-    </w:lvl>
-    <w:lvl w:ilvl="8" w:tplc="48090005" w:tentative="1">
-      <w:start w:val="1"/>
-      <w:numFmt w:val="bullet"/>
-      <w:lvlText w:val=""/>
-      <w:lvlJc w:val="left"/>
-      <w:pPr>
-        <w:ind w:left="6480" w:hanging="360"/>
       </w:pPr>
       <w:rPr>
         <w:rFonts w:ascii="Wingdings" w:hAnsi="Wingdings" w:hint="default"/>
@@ -6739,6 +7319,92 @@
     </w:lvl>
   </w:abstractNum>
   <w:abstractNum w:abstractNumId="6" w15:restartNumberingAfterBreak="0">
+    <w:nsid w:val="467D7A2C"/>
+    <w:multiLevelType w:val="hybridMultilevel"/>
+    <w:tmpl w:val="545A5DA2"/>
+    <w:lvl w:ilvl="0" w:tplc="4809000F">
+      <w:start w:val="1"/>
+      <w:numFmt w:val="decimal"/>
+      <w:lvlText w:val="%1."/>
+      <w:lvlJc w:val="left"/>
+      <w:pPr>
+        <w:ind w:left="720" w:hanging="360"/>
+      </w:pPr>
+    </w:lvl>
+    <w:lvl w:ilvl="1" w:tplc="48090019" w:tentative="1">
+      <w:start w:val="1"/>
+      <w:numFmt w:val="lowerLetter"/>
+      <w:lvlText w:val="%2."/>
+      <w:lvlJc w:val="left"/>
+      <w:pPr>
+        <w:ind w:left="1440" w:hanging="360"/>
+      </w:pPr>
+    </w:lvl>
+    <w:lvl w:ilvl="2" w:tplc="4809001B" w:tentative="1">
+      <w:start w:val="1"/>
+      <w:numFmt w:val="lowerRoman"/>
+      <w:lvlText w:val="%3."/>
+      <w:lvlJc w:val="right"/>
+      <w:pPr>
+        <w:ind w:left="2160" w:hanging="180"/>
+      </w:pPr>
+    </w:lvl>
+    <w:lvl w:ilvl="3" w:tplc="4809000F" w:tentative="1">
+      <w:start w:val="1"/>
+      <w:numFmt w:val="decimal"/>
+      <w:lvlText w:val="%4."/>
+      <w:lvlJc w:val="left"/>
+      <w:pPr>
+        <w:ind w:left="2880" w:hanging="360"/>
+      </w:pPr>
+    </w:lvl>
+    <w:lvl w:ilvl="4" w:tplc="48090019" w:tentative="1">
+      <w:start w:val="1"/>
+      <w:numFmt w:val="lowerLetter"/>
+      <w:lvlText w:val="%5."/>
+      <w:lvlJc w:val="left"/>
+      <w:pPr>
+        <w:ind w:left="3600" w:hanging="360"/>
+      </w:pPr>
+    </w:lvl>
+    <w:lvl w:ilvl="5" w:tplc="4809001B" w:tentative="1">
+      <w:start w:val="1"/>
+      <w:numFmt w:val="lowerRoman"/>
+      <w:lvlText w:val="%6."/>
+      <w:lvlJc w:val="right"/>
+      <w:pPr>
+        <w:ind w:left="4320" w:hanging="180"/>
+      </w:pPr>
+    </w:lvl>
+    <w:lvl w:ilvl="6" w:tplc="4809000F" w:tentative="1">
+      <w:start w:val="1"/>
+      <w:numFmt w:val="decimal"/>
+      <w:lvlText w:val="%7."/>
+      <w:lvlJc w:val="left"/>
+      <w:pPr>
+        <w:ind w:left="5040" w:hanging="360"/>
+      </w:pPr>
+    </w:lvl>
+    <w:lvl w:ilvl="7" w:tplc="48090019" w:tentative="1">
+      <w:start w:val="1"/>
+      <w:numFmt w:val="lowerLetter"/>
+      <w:lvlText w:val="%8."/>
+      <w:lvlJc w:val="left"/>
+      <w:pPr>
+        <w:ind w:left="5760" w:hanging="360"/>
+      </w:pPr>
+    </w:lvl>
+    <w:lvl w:ilvl="8" w:tplc="4809001B" w:tentative="1">
+      <w:start w:val="1"/>
+      <w:numFmt w:val="lowerRoman"/>
+      <w:lvlText w:val="%9."/>
+      <w:lvlJc w:val="right"/>
+      <w:pPr>
+        <w:ind w:left="6480" w:hanging="180"/>
+      </w:pPr>
+    </w:lvl>
+  </w:abstractNum>
+  <w:abstractNum w:abstractNumId="7" w15:restartNumberingAfterBreak="0">
     <w:nsid w:val="5CD93BD2"/>
     <w:multiLevelType w:val="multilevel"/>
     <w:tmpl w:val="62BAF922"/>
@@ -6887,7 +7553,7 @@
       </w:rPr>
     </w:lvl>
   </w:abstractNum>
-  <w:abstractNum w:abstractNumId="7" w15:restartNumberingAfterBreak="0">
+  <w:abstractNum w:abstractNumId="8" w15:restartNumberingAfterBreak="0">
     <w:nsid w:val="740F428C"/>
     <w:multiLevelType w:val="hybridMultilevel"/>
     <w:tmpl w:val="81E6BFDE"/>
@@ -7000,7 +7666,7 @@
       </w:rPr>
     </w:lvl>
   </w:abstractNum>
-  <w:abstractNum w:abstractNumId="8" w15:restartNumberingAfterBreak="0">
+  <w:abstractNum w:abstractNumId="9" w15:restartNumberingAfterBreak="0">
     <w:nsid w:val="7EE455F6"/>
     <w:multiLevelType w:val="hybridMultilevel"/>
     <w:tmpl w:val="17600EDA"/>
@@ -7114,16 +7780,16 @@
     </w:lvl>
   </w:abstractNum>
   <w:num w:numId="1" w16cid:durableId="1743143035">
-    <w:abstractNumId w:val="8"/>
+    <w:abstractNumId w:val="9"/>
   </w:num>
   <w:num w:numId="2" w16cid:durableId="1082602018">
-    <w:abstractNumId w:val="7"/>
+    <w:abstractNumId w:val="8"/>
   </w:num>
   <w:num w:numId="3" w16cid:durableId="1385986353">
     <w:abstractNumId w:val="2"/>
   </w:num>
   <w:num w:numId="4" w16cid:durableId="411506492">
-    <w:abstractNumId w:val="6"/>
+    <w:abstractNumId w:val="7"/>
   </w:num>
   <w:num w:numId="5" w16cid:durableId="1222054480">
     <w:abstractNumId w:val="5"/>
@@ -7132,13 +7798,16 @@
     <w:abstractNumId w:val="4"/>
   </w:num>
   <w:num w:numId="7" w16cid:durableId="1779643879">
-    <w:abstractNumId w:val="1"/>
+    <w:abstractNumId w:val="0"/>
   </w:num>
   <w:num w:numId="8" w16cid:durableId="18043436">
     <w:abstractNumId w:val="3"/>
   </w:num>
-  <w:num w:numId="9" w16cid:durableId="826092256">
-    <w:abstractNumId w:val="0"/>
+  <w:num w:numId="9" w16cid:durableId="973214024">
+    <w:abstractNumId w:val="1"/>
+  </w:num>
+  <w:num w:numId="10" w16cid:durableId="1408500824">
+    <w:abstractNumId w:val="6"/>
   </w:num>
 </w:numbering>
 </file>
@@ -7755,7 +8424,6 @@
   <w:style w:type="character" w:default="1" w:styleId="DefaultParagraphFont">
     <w:name w:val="Default Paragraph Font"/>
     <w:uiPriority w:val="1"/>
-    <w:semiHidden/>
     <w:unhideWhenUsed/>
   </w:style>
   <w:style w:type="table" w:default="1" w:styleId="TableNormal">

</xml_diff>

<commit_message>
Add PDF versions of all capstone reports
Adds a PDF alongside each Word report (part1_analysis_notes, part1_insights report, part2_report, part3_bias_fairness_governance_report,
part3_final_capstone_report) so they render inline on GitHub for
easier review, while keeping the .docx as the editable source.
</commit_message>
<xml_diff>
--- a/part1_data_analytics/part1_analysis_notes.docx
+++ b/part1_data_analytics/part1_analysis_notes.docx
@@ -2,6 +2,29 @@
 <file path=word/document.xml><?xml version="1.0" encoding="utf-8"?>
 <w:document xmlns:wpc="http://schemas.microsoft.com/office/word/2010/wordprocessingCanvas" xmlns:cx="http://schemas.microsoft.com/office/drawing/2014/chartex" xmlns:cx1="http://schemas.microsoft.com/office/drawing/2015/9/8/chartex" xmlns:cx2="http://schemas.microsoft.com/office/drawing/2015/10/21/chartex" xmlns:cx3="http://schemas.microsoft.com/office/drawing/2016/5/9/chartex" xmlns:cx4="http://schemas.microsoft.com/office/drawing/2016/5/10/chartex" xmlns:cx5="http://schemas.microsoft.com/office/drawing/2016/5/11/chartex" xmlns:cx6="http://schemas.microsoft.com/office/drawing/2016/5/12/chartex" xmlns:cx7="http://schemas.microsoft.com/office/drawing/2016/5/13/chartex" xmlns:cx8="http://schemas.microsoft.com/office/drawing/2016/5/14/chartex" xmlns:mc="http://schemas.openxmlformats.org/markup-compatibility/2006" xmlns:aink="http://schemas.microsoft.com/office/drawing/2016/ink" xmlns:am3d="http://schemas.microsoft.com/office/drawing/2017/model3d" xmlns:o="urn:schemas-microsoft-com:office:office" xmlns:oel="http://schemas.microsoft.com/office/2019/extlst" xmlns:r="http://schemas.openxmlformats.org/officeDocument/2006/relationships" xmlns:m="http://schemas.openxmlformats.org/officeDocument/2006/math" xmlns:v="urn:schemas-microsoft-com:vml" xmlns:wp14="http://schemas.microsoft.com/office/word/2010/wordprocessingDrawing" xmlns:wp="http://schemas.openxmlformats.org/drawingml/2006/wordprocessingDrawing" xmlns:w10="urn:schemas-microsoft-com:office:word" xmlns:w="http://schemas.openxmlformats.org/wordprocessingml/2006/main" xmlns:w14="http://schemas.microsoft.com/office/word/2010/wordml" xmlns:w15="http://schemas.microsoft.com/office/word/2012/wordml" xmlns:w16cex="http://schemas.microsoft.com/office/word/2018/wordml/cex" xmlns:w16cid="http://schemas.microsoft.com/office/word/2016/wordml/cid" xmlns:w16="http://schemas.microsoft.com/office/word/2018/wordml" xmlns:w16du="http://schemas.microsoft.com/office/word/2023/wordml/word16du" xmlns:w16sdtdh="http://schemas.microsoft.com/office/word/2020/wordml/sdtdatahash" xmlns:w16sdtfl="http://schemas.microsoft.com/office/word/2024/wordml/sdtformatlock" xmlns:w16se="http://schemas.microsoft.com/office/word/2015/wordml/symex" xmlns:wpg="http://schemas.microsoft.com/office/word/2010/wordprocessingGroup" xmlns:wpi="http://schemas.microsoft.com/office/word/2010/wordprocessingInk" xmlns:wne="http://schemas.microsoft.com/office/word/2006/wordml" xmlns:wps="http://schemas.microsoft.com/office/word/2010/wordprocessingShape" mc:Ignorable="w14 w15 w16se w16cid w16 w16cex w16sdtdh w16sdtfl w16du wp14">
   <w:body>
+    <w:p>
+      <w:pPr>
+        <w:rPr>
+          <w:rFonts w:cstheme="minorHAnsi"/>
+          <w:b/>
+          <w:bCs/>
+          <w:sz w:val="22"/>
+          <w:szCs w:val="22"/>
+          <w:lang w:val="en-PH"/>
+        </w:rPr>
+      </w:pPr>
+      <w:r>
+        <w:rPr>
+          <w:rFonts w:cstheme="minorHAnsi"/>
+          <w:b/>
+          <w:bCs/>
+          <w:sz w:val="22"/>
+          <w:szCs w:val="22"/>
+          <w:lang w:val="en-PH"/>
+        </w:rPr>
+        <w:t>Gautam K Das</w:t>
+      </w:r>
+    </w:p>
     <w:p>
       <w:pPr>
         <w:rPr>
@@ -167,119 +190,25 @@
         <w:rPr>
           <w:rFonts w:asciiTheme="minorHAnsi" w:hAnsiTheme="minorHAnsi" w:cstheme="minorHAnsi"/>
         </w:rPr>
-        <w:t xml:space="preserve">Loaded Metro_Interstate_Traffic_Volume.csv into a SQLite table </w:t>
-      </w:r>
-      <w:proofErr w:type="spellStart"/>
-      <w:r>
+        <w:t xml:space="preserve">Loaded Metro_Interstate_Traffic_Volume.csv into a SQLite table traffic_volume (schema in 01_schema.sql) using DB Browser for SQLite's CSV import feature. Verified the load with the following checks, all matching the source CSV</w:t>
+      </w:r>
+    </w:p>
+    <w:p>
+      <w:pPr>
+        <w:pStyle w:val="NormalWeb"/>
         <w:rPr>
           <w:rFonts w:asciiTheme="minorHAnsi" w:hAnsiTheme="minorHAnsi" w:cstheme="minorHAnsi"/>
         </w:rPr>
-        <w:t>traffic_volume</w:t>
-      </w:r>
-      <w:proofErr w:type="spellEnd"/>
+      </w:pPr>
       <w:r>
         <w:rPr>
           <w:rFonts w:asciiTheme="minorHAnsi" w:hAnsiTheme="minorHAnsi" w:cstheme="minorHAnsi"/>
         </w:rPr>
-        <w:t xml:space="preserve"> (schema in 01_schema.sql) using DB Browser for SQLite's CSV import feature. Verified the load with the following checks, all matching the source CSV</w:t>
-      </w:r>
-    </w:p>
-    <w:p>
-      <w:pPr>
-        <w:pStyle w:val="NormalWeb"/>
-        <w:rPr>
-          <w:rFonts w:asciiTheme="minorHAnsi" w:hAnsiTheme="minorHAnsi" w:cstheme="minorHAnsi"/>
-        </w:rPr>
-      </w:pPr>
-      <w:r>
-        <w:rPr>
-          <w:rFonts w:asciiTheme="minorHAnsi" w:hAnsiTheme="minorHAnsi" w:cstheme="minorHAnsi"/>
-        </w:rPr>
-        <w:t xml:space="preserve">Row count: 48,204 (via SELECT </w:t>
-      </w:r>
-      <w:proofErr w:type="gramStart"/>
-      <w:r>
-        <w:rPr>
-          <w:rFonts w:asciiTheme="minorHAnsi" w:hAnsiTheme="minorHAnsi" w:cstheme="minorHAnsi"/>
-        </w:rPr>
-        <w:t>COUNT(</w:t>
-      </w:r>
-      <w:proofErr w:type="gramEnd"/>
-      <w:r>
-        <w:rPr>
-          <w:rFonts w:asciiTheme="minorHAnsi" w:hAnsiTheme="minorHAnsi" w:cstheme="minorHAnsi"/>
-        </w:rPr>
-        <w:t xml:space="preserve">*) FROM </w:t>
-      </w:r>
-      <w:proofErr w:type="spellStart"/>
-      <w:r>
-        <w:rPr>
-          <w:rFonts w:asciiTheme="minorHAnsi" w:hAnsiTheme="minorHAnsi" w:cstheme="minorHAnsi"/>
-        </w:rPr>
-        <w:t>traffic_volume</w:t>
-      </w:r>
-      <w:proofErr w:type="spellEnd"/>
-      <w:r>
-        <w:rPr>
-          <w:rFonts w:asciiTheme="minorHAnsi" w:hAnsiTheme="minorHAnsi" w:cstheme="minorHAnsi"/>
-        </w:rPr>
-        <w:t>;)</w:t>
-      </w:r>
-      <w:r>
-        <w:rPr>
-          <w:rFonts w:asciiTheme="minorHAnsi" w:hAnsiTheme="minorHAnsi" w:cstheme="minorHAnsi"/>
-        </w:rPr>
+        <w:t xml:space="preserve">Row count: 48,204 (via SELECT COUNT(*) FROM traffic_volume;)</w:t>
         <w:br/>
-        <w:t xml:space="preserve">Column count: 9, with correct data types (temp/rain_1h/snow_1h as REAL, </w:t>
-      </w:r>
-      <w:proofErr w:type="spellStart"/>
-      <w:r>
-        <w:rPr>
-          <w:rFonts w:asciiTheme="minorHAnsi" w:hAnsiTheme="minorHAnsi" w:cstheme="minorHAnsi"/>
-        </w:rPr>
-        <w:t>clouds_all</w:t>
-      </w:r>
-      <w:proofErr w:type="spellEnd"/>
-      <w:r>
-        <w:rPr>
-          <w:rFonts w:asciiTheme="minorHAnsi" w:hAnsiTheme="minorHAnsi" w:cstheme="minorHAnsi"/>
-        </w:rPr>
-        <w:t>/</w:t>
-      </w:r>
-      <w:proofErr w:type="spellStart"/>
-      <w:r>
-        <w:rPr>
-          <w:rFonts w:asciiTheme="minorHAnsi" w:hAnsiTheme="minorHAnsi" w:cstheme="minorHAnsi"/>
-        </w:rPr>
-        <w:t>traffic_volume</w:t>
-      </w:r>
-      <w:proofErr w:type="spellEnd"/>
-      <w:r>
-        <w:rPr>
-          <w:rFonts w:asciiTheme="minorHAnsi" w:hAnsiTheme="minorHAnsi" w:cstheme="minorHAnsi"/>
-        </w:rPr>
-        <w:t xml:space="preserve"> as INTEGER)</w:t>
-      </w:r>
-      <w:r>
-        <w:rPr>
-          <w:rFonts w:asciiTheme="minorHAnsi" w:hAnsiTheme="minorHAnsi" w:cstheme="minorHAnsi"/>
-        </w:rPr>
+        <w:t xml:space="preserve">Column count: 9, with correct data types (temp/rain_1h/snow_1h as REAL, clouds_all/traffic_volume as INTEGER)</w:t>
         <w:br/>
-        <w:t xml:space="preserve">Min/max </w:t>
-      </w:r>
-      <w:proofErr w:type="spellStart"/>
-      <w:r>
-        <w:rPr>
-          <w:rFonts w:asciiTheme="minorHAnsi" w:hAnsiTheme="minorHAnsi" w:cstheme="minorHAnsi"/>
-        </w:rPr>
-        <w:t>traffic_volume</w:t>
-      </w:r>
-      <w:proofErr w:type="spellEnd"/>
-      <w:r>
-        <w:rPr>
-          <w:rFonts w:asciiTheme="minorHAnsi" w:hAnsiTheme="minorHAnsi" w:cstheme="minorHAnsi"/>
-        </w:rPr>
-        <w:t>: 0 and 7,280, matching the source data</w:t>
+        <w:t xml:space="preserve">Min/max traffic_volume: 0 and 7,280, matching the source data</w:t>
       </w:r>
     </w:p>
     <w:p>
@@ -352,31 +281,7 @@
           <w:szCs w:val="22"/>
           <w:lang w:val="en-PH"/>
         </w:rPr>
-        <w:t xml:space="preserve">1.2 </w:t>
-      </w:r>
-      <w:proofErr w:type="spellStart"/>
-      <w:r>
-        <w:rPr>
-          <w:rFonts w:cstheme="minorHAnsi"/>
-          <w:b/>
-          <w:bCs/>
-          <w:sz w:val="22"/>
-          <w:szCs w:val="22"/>
-          <w:lang w:val="en-PH"/>
-        </w:rPr>
-        <w:t>Analyse</w:t>
-      </w:r>
-      <w:proofErr w:type="spellEnd"/>
-      <w:r>
-        <w:rPr>
-          <w:rFonts w:cstheme="minorHAnsi"/>
-          <w:b/>
-          <w:bCs/>
-          <w:sz w:val="22"/>
-          <w:szCs w:val="22"/>
-          <w:lang w:val="en-PH"/>
-        </w:rPr>
-        <w:t xml:space="preserve"> annual traffic trends</w:t>
+        <w:t xml:space="preserve">1.2 Analyse annual traffic trends</w:t>
       </w:r>
     </w:p>
     <w:p>
@@ -574,52 +479,17 @@
           <w:rFonts w:asciiTheme="minorHAnsi" w:hAnsiTheme="minorHAnsi" w:cstheme="minorHAnsi"/>
         </w:rPr>
         <w:t>Total traffic volume by year (after removing duplicate-timestamp rows, explained below):</w:t>
-      </w:r>
-      <w:r>
-        <w:rPr>
-          <w:rFonts w:asciiTheme="minorHAnsi" w:hAnsiTheme="minorHAnsi" w:cstheme="minorHAnsi"/>
-        </w:rPr>
         <w:br/>
         <w:t>2012: 6,785,754</w:t>
-      </w:r>
-      <w:r>
-        <w:rPr>
-          <w:rFonts w:asciiTheme="minorHAnsi" w:hAnsiTheme="minorHAnsi" w:cstheme="minorHAnsi"/>
-        </w:rPr>
         <w:br/>
         <w:t>2013: 24,139,878</w:t>
-      </w:r>
-      <w:r>
-        <w:rPr>
-          <w:rFonts w:asciiTheme="minorHAnsi" w:hAnsiTheme="minorHAnsi" w:cstheme="minorHAnsi"/>
-        </w:rPr>
         <w:br/>
         <w:t>2014: 14,718,915</w:t>
-      </w:r>
-      <w:r>
-        <w:rPr>
-          <w:rFonts w:asciiTheme="minorHAnsi" w:hAnsiTheme="minorHAnsi" w:cstheme="minorHAnsi"/>
-        </w:rPr>
         <w:br/>
         <w:t>2015: 11,706,145</w:t>
-      </w:r>
-      <w:r>
-        <w:rPr>
-          <w:rFonts w:asciiTheme="minorHAnsi" w:hAnsiTheme="minorHAnsi" w:cstheme="minorHAnsi"/>
-        </w:rPr>
         <w:br/>
-      </w:r>
-      <w:r>
-        <w:rPr>
-          <w:rFonts w:asciiTheme="minorHAnsi" w:hAnsiTheme="minorHAnsi" w:cstheme="minorHAnsi"/>
-        </w:rPr>
         <w:lastRenderedPageBreak/>
         <w:t>2016: 25,032,183</w:t>
-      </w:r>
-      <w:r>
-        <w:rPr>
-          <w:rFonts w:asciiTheme="minorHAnsi" w:hAnsiTheme="minorHAnsi" w:cstheme="minorHAnsi"/>
-        </w:rPr>
         <w:br/>
         <w:t>2017: 29,420,221</w:t>
       </w:r>
@@ -643,35 +513,7 @@
         <w:rPr>
           <w:rFonts w:asciiTheme="minorHAnsi" w:hAnsiTheme="minorHAnsi" w:cstheme="minorHAnsi"/>
         </w:rPr>
-        <w:t xml:space="preserve"> I found that 5,445 timestamps in this dataset appear 2–3 times each, because the weather feed sometimes logs more than one observation within the same hour. I confirmed </w:t>
-      </w:r>
-      <w:proofErr w:type="spellStart"/>
-      <w:r>
-        <w:rPr>
-          <w:rFonts w:asciiTheme="minorHAnsi" w:hAnsiTheme="minorHAnsi" w:cstheme="minorHAnsi"/>
-        </w:rPr>
-        <w:t>traffic_volume</w:t>
-      </w:r>
-      <w:proofErr w:type="spellEnd"/>
-      <w:r>
-        <w:rPr>
-          <w:rFonts w:asciiTheme="minorHAnsi" w:hAnsiTheme="minorHAnsi" w:cstheme="minorHAnsi"/>
-        </w:rPr>
-        <w:t xml:space="preserve"> is identical across these duplicate rows, so I removed duplicates (keeping one row per unique hour, via the </w:t>
-      </w:r>
-      <w:proofErr w:type="spellStart"/>
-      <w:r>
-        <w:rPr>
-          <w:rFonts w:asciiTheme="minorHAnsi" w:hAnsiTheme="minorHAnsi" w:cstheme="minorHAnsi"/>
-        </w:rPr>
-        <w:t>hourly_traffic</w:t>
-      </w:r>
-      <w:proofErr w:type="spellEnd"/>
-      <w:r>
-        <w:rPr>
-          <w:rFonts w:asciiTheme="minorHAnsi" w:hAnsiTheme="minorHAnsi" w:cstheme="minorHAnsi"/>
-        </w:rPr>
-        <w:t xml:space="preserve"> view in 02_annual_trends.sql) before summing. Without this step, the totals above would be inflated.</w:t>
+        <w:t xml:space="preserve"> I found that 5,445 timestamps in this dataset appear 2–3 times each, because the weather feed sometimes logs more than one observation within the same hour. I confirmed traffic_volume is identical across these duplicate rows, so I removed duplicates (keeping one row per unique hour, via the hourly_traffic view in 02_annual_trends.sql) before summing. Without this step, the totals above would be inflated.</w:t>
       </w:r>
     </w:p>
     <w:p>
@@ -743,40 +585,12 @@
           <w:szCs w:val="22"/>
         </w:rPr>
         <w:t>2013: increase vs. 2012</w:t>
-      </w:r>
-      <w:r>
-        <w:rPr>
-          <w:rFonts w:cstheme="minorHAnsi"/>
-          <w:sz w:val="22"/>
-          <w:szCs w:val="22"/>
-        </w:rPr>
         <w:br/>
         <w:t>2014: decrease vs. 2013</w:t>
-      </w:r>
-      <w:r>
-        <w:rPr>
-          <w:rFonts w:cstheme="minorHAnsi"/>
-          <w:sz w:val="22"/>
-          <w:szCs w:val="22"/>
-        </w:rPr>
         <w:br/>
         <w:t>2015: decrease vs. 2014</w:t>
-      </w:r>
-      <w:r>
-        <w:rPr>
-          <w:rFonts w:cstheme="minorHAnsi"/>
-          <w:sz w:val="22"/>
-          <w:szCs w:val="22"/>
-        </w:rPr>
         <w:br/>
         <w:t>2016: increase vs. 2015</w:t>
-      </w:r>
-      <w:r>
-        <w:rPr>
-          <w:rFonts w:cstheme="minorHAnsi"/>
-          <w:sz w:val="22"/>
-          <w:szCs w:val="22"/>
-        </w:rPr>
         <w:br/>
         <w:t>2017: increase vs. 2016</w:t>
       </w:r>
@@ -923,109 +737,7 @@
           <w:sz w:val="22"/>
           <w:szCs w:val="22"/>
         </w:rPr>
-        <w:t xml:space="preserve">The totals above are heavily shaped by how much data </w:t>
-      </w:r>
-      <w:proofErr w:type="gramStart"/>
-      <w:r>
-        <w:rPr>
-          <w:rFonts w:cstheme="minorHAnsi"/>
-          <w:sz w:val="22"/>
-          <w:szCs w:val="22"/>
-        </w:rPr>
-        <w:t>exists for</w:t>
-      </w:r>
-      <w:proofErr w:type="gramEnd"/>
-      <w:r>
-        <w:rPr>
-          <w:rFonts w:cstheme="minorHAnsi"/>
-          <w:sz w:val="22"/>
-          <w:szCs w:val="22"/>
-        </w:rPr>
-        <w:t xml:space="preserve"> each year, not just real traffic demand. The percentage of the year </w:t>
-      </w:r>
-      <w:proofErr w:type="gramStart"/>
-      <w:r>
-        <w:rPr>
-          <w:rFonts w:cstheme="minorHAnsi"/>
-          <w:sz w:val="22"/>
-          <w:szCs w:val="22"/>
-        </w:rPr>
-        <w:t>actually covered</w:t>
-      </w:r>
-      <w:proofErr w:type="gramEnd"/>
-      <w:r>
-        <w:rPr>
-          <w:rFonts w:cstheme="minorHAnsi"/>
-          <w:sz w:val="22"/>
-          <w:szCs w:val="22"/>
-        </w:rPr>
-        <w:t xml:space="preserve"> by hourly records ranges from 23.9% (2012) to 99.5% (2017). This is why 2013 looks like a 255% jump over 2012</w:t>
-      </w:r>
-      <w:r>
-        <w:rPr>
-          <w:rFonts w:cstheme="minorHAnsi"/>
-          <w:sz w:val="22"/>
-          <w:szCs w:val="22"/>
-        </w:rPr>
-        <w:t xml:space="preserve">, as </w:t>
-      </w:r>
-      <w:r>
-        <w:rPr>
-          <w:rFonts w:cstheme="minorHAnsi"/>
-          <w:sz w:val="22"/>
-          <w:szCs w:val="22"/>
-        </w:rPr>
-        <w:t xml:space="preserve">the year 2012 </w:t>
-      </w:r>
-      <w:r>
-        <w:rPr>
-          <w:rFonts w:cstheme="minorHAnsi"/>
-          <w:sz w:val="22"/>
-          <w:szCs w:val="22"/>
-        </w:rPr>
-        <w:t>only has data from October 2 onward (</w:t>
-      </w:r>
-      <w:r>
-        <w:rPr>
-          <w:rFonts w:cstheme="minorHAnsi"/>
-          <w:sz w:val="22"/>
-          <w:szCs w:val="22"/>
-        </w:rPr>
-        <w:t xml:space="preserve">~ 2 </w:t>
-      </w:r>
-      <w:proofErr w:type="spellStart"/>
-      <w:r>
-        <w:rPr>
-          <w:rFonts w:cstheme="minorHAnsi"/>
-          <w:sz w:val="22"/>
-          <w:szCs w:val="22"/>
-        </w:rPr>
-        <w:t>mths</w:t>
-      </w:r>
-      <w:proofErr w:type="spellEnd"/>
-      <w:r>
-        <w:rPr>
-          <w:rFonts w:cstheme="minorHAnsi"/>
-          <w:sz w:val="22"/>
-          <w:szCs w:val="22"/>
-        </w:rPr>
-        <w:t>)</w:t>
-      </w:r>
-      <w:r>
-        <w:rPr>
-          <w:rFonts w:cstheme="minorHAnsi"/>
-          <w:sz w:val="22"/>
-          <w:szCs w:val="22"/>
-        </w:rPr>
-        <w:t xml:space="preserve">. Thus, </w:t>
-      </w:r>
-      <w:r>
-        <w:rPr>
-          <w:rFonts w:cstheme="minorHAnsi"/>
-          <w:sz w:val="22"/>
-          <w:szCs w:val="22"/>
-        </w:rPr>
-        <w:t>not a genuine traffic surge.</w:t>
+        <w:t xml:space="preserve">The totals above are heavily shaped by how much data exists for each year, not just real traffic demand. The percentage of the year actually covered by hourly records ranges from 23.9% (2012) to 99.5% (2017). This is why 2013 looks like a 255% jump over 2012, as the year 2012 only has data from October 2 onward (~ 2 mths). Thus, not a genuine traffic surge.</w:t>
       </w:r>
     </w:p>
     <w:p>
@@ -1048,71 +760,7 @@
           <w:sz w:val="22"/>
           <w:szCs w:val="22"/>
         </w:rPr>
-        <w:t>A fairer comparison is average traffic volume per recorded hour, since it</w:t>
-      </w:r>
-      <w:r>
-        <w:rPr>
-          <w:rFonts w:cstheme="minorHAnsi"/>
-          <w:sz w:val="22"/>
-          <w:szCs w:val="22"/>
-        </w:rPr>
-        <w:t>s agnostic to</w:t>
-      </w:r>
-      <w:r>
-        <w:rPr>
-          <w:rFonts w:cstheme="minorHAnsi"/>
-          <w:sz w:val="22"/>
-          <w:szCs w:val="22"/>
-        </w:rPr>
-        <w:t xml:space="preserve"> how much data exists for each year. </w:t>
-      </w:r>
-      <w:r>
-        <w:rPr>
-          <w:rFonts w:cstheme="minorHAnsi"/>
-          <w:sz w:val="22"/>
-          <w:szCs w:val="22"/>
-        </w:rPr>
-        <w:t>From that perspective,</w:t>
-      </w:r>
-      <w:r>
-        <w:rPr>
-          <w:rFonts w:cstheme="minorHAnsi"/>
-          <w:sz w:val="22"/>
-          <w:szCs w:val="22"/>
-        </w:rPr>
-        <w:t xml:space="preserve"> 2012–2015 stayed in a narrow band (about 3,227 to 3,310 vehicles/hour). </w:t>
-      </w:r>
-      <w:r>
-        <w:rPr>
-          <w:rFonts w:cstheme="minorHAnsi"/>
-          <w:sz w:val="22"/>
-          <w:szCs w:val="22"/>
-        </w:rPr>
-        <w:t xml:space="preserve">However, </w:t>
-      </w:r>
-      <w:r>
-        <w:rPr>
-          <w:rFonts w:cstheme="minorHAnsi"/>
-          <w:sz w:val="22"/>
-          <w:szCs w:val="22"/>
-        </w:rPr>
-        <w:t xml:space="preserve">2016 </w:t>
-      </w:r>
-      <w:r>
-        <w:rPr>
-          <w:rFonts w:cstheme="minorHAnsi"/>
-          <w:sz w:val="22"/>
-          <w:szCs w:val="22"/>
-        </w:rPr>
-        <w:t>was the</w:t>
-      </w:r>
-      <w:r>
-        <w:rPr>
-          <w:rFonts w:cstheme="minorHAnsi"/>
-          <w:sz w:val="22"/>
-          <w:szCs w:val="22"/>
-        </w:rPr>
-        <w:t xml:space="preserve"> lowest of all six years (3,193.7/hour) despite having good coverage (89.2%). 2017 then reached the highest average of any year (3,376.6/hour, +5.73% over 2016), and since 2017 also has the most complete coverage (99.5%), this looks like a genuine increase in traffic demand rather than a data artifact.</w:t>
+        <w:t xml:space="preserve">A fairer comparison is average traffic volume per recorded hour, since its agnostic to how much data exists for each year. From that perspective, 2012–2015 stayed in a narrow band (about 3,227 to 3,310 vehicles/hour). However, 2016 was the lowest of all six years (3,193.7/hour) despite having good coverage (89.2%). 2017 then reached the highest average of any year (3,376.6/hour, +5.73% over 2016), and since 2017 also has the most complete coverage (99.5%), this looks like a genuine increase in traffic demand rather than a data artifact.</w:t>
       </w:r>
     </w:p>
     <w:p>
@@ -1133,31 +781,7 @@
           <w:szCs w:val="22"/>
           <w:lang w:val="en-PH"/>
         </w:rPr>
-        <w:t xml:space="preserve">1.3 </w:t>
-      </w:r>
-      <w:proofErr w:type="spellStart"/>
-      <w:r>
-        <w:rPr>
-          <w:rFonts w:cstheme="minorHAnsi"/>
-          <w:b/>
-          <w:bCs/>
-          <w:sz w:val="22"/>
-          <w:szCs w:val="22"/>
-          <w:lang w:val="en-PH"/>
-        </w:rPr>
-        <w:t>Analyse</w:t>
-      </w:r>
-      <w:proofErr w:type="spellEnd"/>
-      <w:r>
-        <w:rPr>
-          <w:rFonts w:cstheme="minorHAnsi"/>
-          <w:b/>
-          <w:bCs/>
-          <w:sz w:val="22"/>
-          <w:szCs w:val="22"/>
-          <w:lang w:val="en-PH"/>
-        </w:rPr>
-        <w:t xml:space="preserve"> temperature around holidays</w:t>
+        <w:t xml:space="preserve">1.3 Analyse temperature around holidays</w:t>
       </w:r>
     </w:p>
     <w:p>
@@ -1405,7 +1029,6 @@
                 <w14:ligatures w14:val="none"/>
               </w:rPr>
             </w:pPr>
-            <w:proofErr w:type="spellStart"/>
             <w:r>
               <w:rPr>
                 <w:rFonts w:eastAsia="Times New Roman" w:cstheme="minorHAnsi"/>
@@ -1418,22 +1041,7 @@
                 <w:lang w:val="en-SG" w:eastAsia="en-SG"/>
                 <w14:ligatures w14:val="none"/>
               </w:rPr>
-              <w:t>Avg</w:t>
-            </w:r>
-            <w:proofErr w:type="spellEnd"/>
-            <w:r>
-              <w:rPr>
-                <w:rFonts w:eastAsia="Times New Roman" w:cstheme="minorHAnsi"/>
-                <w:b/>
-                <w:bCs/>
-                <w:color w:val="FFFFFF"/>
-                <w:kern w:val="0"/>
-                <w:sz w:val="22"/>
-                <w:szCs w:val="22"/>
-                <w:lang w:val="en-SG" w:eastAsia="en-SG"/>
-                <w14:ligatures w14:val="none"/>
-              </w:rPr>
-              <w:t xml:space="preserve"> Temp (°C)</w:t>
+              <w:t xml:space="preserve">Avg Temp (°C)</w:t>
             </w:r>
           </w:p>
         </w:tc>
@@ -1467,7 +1075,6 @@
                 <w14:ligatures w14:val="none"/>
               </w:rPr>
             </w:pPr>
-            <w:proofErr w:type="spellStart"/>
             <w:r>
               <w:rPr>
                 <w:rFonts w:eastAsia="Times New Roman" w:cstheme="minorHAnsi"/>
@@ -1480,22 +1087,7 @@
                 <w:lang w:val="en-SG" w:eastAsia="en-SG"/>
                 <w14:ligatures w14:val="none"/>
               </w:rPr>
-              <w:t>Avg</w:t>
-            </w:r>
-            <w:proofErr w:type="spellEnd"/>
-            <w:r>
-              <w:rPr>
-                <w:rFonts w:eastAsia="Times New Roman" w:cstheme="minorHAnsi"/>
-                <w:b/>
-                <w:bCs/>
-                <w:color w:val="FFFFFF"/>
-                <w:kern w:val="0"/>
-                <w:sz w:val="22"/>
-                <w:szCs w:val="22"/>
-                <w:lang w:val="en-SG" w:eastAsia="en-SG"/>
-                <w14:ligatures w14:val="none"/>
-              </w:rPr>
-              <w:t xml:space="preserve"> Temp (K)</w:t>
+              <w:t xml:space="preserve">Avg Temp (K)</w:t>
             </w:r>
           </w:p>
         </w:tc>
@@ -1575,7 +1167,6 @@
                 <w14:ligatures w14:val="none"/>
               </w:rPr>
             </w:pPr>
-            <w:proofErr w:type="spellStart"/>
             <w:r>
               <w:rPr>
                 <w:rFonts w:eastAsia="Times New Roman" w:cstheme="minorHAnsi"/>
@@ -1588,22 +1179,7 @@
                 <w:lang w:val="en-SG" w:eastAsia="en-SG"/>
                 <w14:ligatures w14:val="none"/>
               </w:rPr>
-              <w:t>Avg</w:t>
-            </w:r>
-            <w:proofErr w:type="spellEnd"/>
-            <w:r>
-              <w:rPr>
-                <w:rFonts w:eastAsia="Times New Roman" w:cstheme="minorHAnsi"/>
-                <w:b/>
-                <w:bCs/>
-                <w:color w:val="FFFFFF"/>
-                <w:kern w:val="0"/>
-                <w:sz w:val="22"/>
-                <w:szCs w:val="22"/>
-                <w:lang w:val="en-SG" w:eastAsia="en-SG"/>
-                <w14:ligatures w14:val="none"/>
-              </w:rPr>
-              <w:t xml:space="preserve"> Traffic Volume</w:t>
+              <w:t xml:space="preserve">Avg Traffic Volume</w:t>
             </w:r>
           </w:p>
         </w:tc>
@@ -3086,41 +2662,7 @@
           <w:sz w:val="22"/>
           <w:szCs w:val="22"/>
         </w:rPr>
-        <w:t xml:space="preserve">New Year's Day 2015 could not be included in this comparison as there are zero hourly records for that date due to large gap between 2014-08-08 and 2015-06-11 (~10mths). As a result, I have marked 2015 New </w:t>
-      </w:r>
-      <w:proofErr w:type="gramStart"/>
-      <w:r>
-        <w:rPr>
-          <w:rFonts w:cstheme="minorHAnsi"/>
-          <w:sz w:val="22"/>
-          <w:szCs w:val="22"/>
-        </w:rPr>
-        <w:t>Years day</w:t>
-      </w:r>
-      <w:proofErr w:type="gramEnd"/>
-      <w:r>
-        <w:rPr>
-          <w:rFonts w:cstheme="minorHAnsi"/>
-          <w:sz w:val="22"/>
-          <w:szCs w:val="22"/>
-        </w:rPr>
-        <w:t xml:space="preserve"> as ‘</w:t>
-      </w:r>
-      <w:r>
-        <w:rPr>
-          <w:rFonts w:cstheme="minorHAnsi"/>
-          <w:sz w:val="22"/>
-          <w:szCs w:val="22"/>
-        </w:rPr>
-        <w:t>No data</w:t>
-      </w:r>
-      <w:r>
-        <w:rPr>
-          <w:rFonts w:cstheme="minorHAnsi"/>
-          <w:sz w:val="22"/>
-          <w:szCs w:val="22"/>
-        </w:rPr>
-        <w:t>’.</w:t>
+        <w:t xml:space="preserve">New Year's Day 2015 could not be included in this comparison as there are zero hourly records for that date due to large gap between 2014-08-08 and 2015-06-11 (~10mths). As a result, I have marked 2015 New Years day as ‘No data’.</w:t>
       </w:r>
     </w:p>
     <w:p>
@@ -3229,160 +2771,9 @@
           <w:sz w:val="22"/>
           <w:szCs w:val="22"/>
         </w:rPr>
-        <w:t xml:space="preserve">New Year's Day: 2016 </w:t>
-      </w:r>
-      <w:r>
-        <w:rPr>
-          <w:rFonts w:cstheme="minorHAnsi"/>
-          <w:sz w:val="22"/>
-          <w:szCs w:val="22"/>
-        </w:rPr>
-        <w:t>-</w:t>
-      </w:r>
-      <w:r>
-        <w:rPr>
-          <w:rFonts w:cstheme="minorHAnsi"/>
-          <w:sz w:val="22"/>
-          <w:szCs w:val="22"/>
-        </w:rPr>
-        <w:t xml:space="preserve"> 2017 warmed by </w:t>
-      </w:r>
-      <w:r>
-        <w:rPr>
-          <w:rFonts w:cstheme="minorHAnsi"/>
-          <w:sz w:val="22"/>
-          <w:szCs w:val="22"/>
-        </w:rPr>
-        <w:t>+</w:t>
-      </w:r>
-      <w:r>
-        <w:rPr>
-          <w:rFonts w:cstheme="minorHAnsi"/>
-          <w:sz w:val="22"/>
-          <w:szCs w:val="22"/>
-        </w:rPr>
-        <w:t>3.00</w:t>
-      </w:r>
-      <w:r>
-        <w:rPr>
-          <w:rFonts w:cstheme="minorHAnsi"/>
-          <w:sz w:val="22"/>
-          <w:szCs w:val="22"/>
-        </w:rPr>
-        <w:t xml:space="preserve"> degrees C</w:t>
-      </w:r>
-      <w:r>
-        <w:rPr>
-          <w:rFonts w:cstheme="minorHAnsi"/>
-          <w:sz w:val="22"/>
-          <w:szCs w:val="22"/>
-        </w:rPr>
-        <w:t xml:space="preserve"> (only one year-on-year comparison is possible, since 2015 has no data).</w:t>
-      </w:r>
-      <w:r>
-        <w:rPr>
-          <w:rFonts w:cstheme="minorHAnsi"/>
-          <w:sz w:val="22"/>
-          <w:szCs w:val="22"/>
-        </w:rPr>
+        <w:t xml:space="preserve">New Year's Day: 2016 - 2017 warmed by +3.00 degrees C (only one year-on-year comparison is possible, since 2015 has no data).</w:t>
         <w:br/>
-        <w:t xml:space="preserve">Labor Day: 2015 </w:t>
-      </w:r>
-      <w:r>
-        <w:rPr>
-          <w:rFonts w:cstheme="minorHAnsi"/>
-          <w:sz w:val="22"/>
-          <w:szCs w:val="22"/>
-        </w:rPr>
-        <w:t>-</w:t>
-      </w:r>
-      <w:r>
-        <w:rPr>
-          <w:rFonts w:cstheme="minorHAnsi"/>
-          <w:sz w:val="22"/>
-          <w:szCs w:val="22"/>
-        </w:rPr>
-        <w:t xml:space="preserve"> 2016 was essentially flat (−0.31</w:t>
-      </w:r>
-      <w:r>
-        <w:rPr>
-          <w:rFonts w:cstheme="minorHAnsi"/>
-          <w:sz w:val="22"/>
-          <w:szCs w:val="22"/>
-        </w:rPr>
-        <w:t xml:space="preserve"> degrees C</w:t>
-      </w:r>
-      <w:r>
-        <w:rPr>
-          <w:rFonts w:cstheme="minorHAnsi"/>
-          <w:sz w:val="22"/>
-          <w:szCs w:val="22"/>
-        </w:rPr>
-        <w:t>). 2016</w:t>
-      </w:r>
-      <w:r>
-        <w:rPr>
-          <w:rFonts w:cstheme="minorHAnsi"/>
-          <w:sz w:val="22"/>
-          <w:szCs w:val="22"/>
-        </w:rPr>
-        <w:t xml:space="preserve"> </w:t>
-      </w:r>
-      <w:r>
-        <w:rPr>
-          <w:rFonts w:cstheme="minorHAnsi"/>
-          <w:sz w:val="22"/>
-          <w:szCs w:val="22"/>
-        </w:rPr>
-        <w:t>-</w:t>
-      </w:r>
-      <w:r>
-        <w:rPr>
-          <w:rFonts w:cstheme="minorHAnsi"/>
-          <w:sz w:val="22"/>
-          <w:szCs w:val="22"/>
-        </w:rPr>
-        <w:t xml:space="preserve"> </w:t>
-      </w:r>
-      <w:r>
-        <w:rPr>
-          <w:rFonts w:cstheme="minorHAnsi"/>
-          <w:sz w:val="22"/>
-          <w:szCs w:val="22"/>
-        </w:rPr>
-        <w:t xml:space="preserve">2017 </w:t>
-      </w:r>
-      <w:r>
-        <w:rPr>
-          <w:rFonts w:cstheme="minorHAnsi"/>
-          <w:sz w:val="22"/>
-          <w:szCs w:val="22"/>
-        </w:rPr>
-        <w:t xml:space="preserve">noted a drop of </w:t>
-      </w:r>
-      <w:r>
-        <w:rPr>
-          <w:rFonts w:cstheme="minorHAnsi"/>
-          <w:sz w:val="22"/>
-          <w:szCs w:val="22"/>
-        </w:rPr>
-        <w:t>−3.72</w:t>
-      </w:r>
-      <w:r>
-        <w:rPr>
-          <w:rFonts w:cstheme="minorHAnsi"/>
-          <w:sz w:val="22"/>
-          <w:szCs w:val="22"/>
-        </w:rPr>
-        <w:t xml:space="preserve"> degrees C</w:t>
-      </w:r>
-      <w:r>
-        <w:rPr>
-          <w:rFonts w:cstheme="minorHAnsi"/>
-          <w:sz w:val="22"/>
-          <w:szCs w:val="22"/>
-        </w:rPr>
-        <w:t>, the largest change observed in this analysis.</w:t>
+        <w:t xml:space="preserve">Labor Day: 2015 - 2016 was essentially flat (−0.31 degrees C). 2016 - 2017 noted a drop of −3.72 degrees C, the largest change observed in this analysis.</w:t>
       </w:r>
     </w:p>
     <w:p>
@@ -3403,17 +2794,7 @@
           <w:sz w:val="22"/>
           <w:szCs w:val="22"/>
         </w:rPr>
-        <w:t>“Whether these changes appear relevant to traffic conditions</w:t>
-      </w:r>
-      <w:r>
-        <w:rPr>
-          <w:rFonts w:cstheme="minorHAnsi"/>
-          <w:b/>
-          <w:bCs/>
-          <w:sz w:val="22"/>
-          <w:szCs w:val="22"/>
-        </w:rPr>
-        <w:t>”:</w:t>
+        <w:t>“Whether these changes appear relevant to traffic conditions”:</w:t>
       </w:r>
     </w:p>
     <w:p>
@@ -3436,97 +2817,7 @@
           <w:sz w:val="22"/>
           <w:szCs w:val="22"/>
         </w:rPr>
-        <w:t xml:space="preserve">For New Year's Day, average traffic volume also rose alongside the temperature increase (2016: 1,832.0 to 2017: 2,127.6, +16.1%), which </w:t>
-      </w:r>
-      <w:r>
-        <w:rPr>
-          <w:rFonts w:cstheme="minorHAnsi"/>
-          <w:sz w:val="22"/>
-          <w:szCs w:val="22"/>
-        </w:rPr>
-        <w:t xml:space="preserve">is </w:t>
-      </w:r>
-      <w:r>
-        <w:rPr>
-          <w:rFonts w:cstheme="minorHAnsi"/>
-          <w:sz w:val="22"/>
-          <w:szCs w:val="22"/>
-        </w:rPr>
-        <w:t>directionally consistent with warmer weather coinciding with more traffic.</w:t>
-      </w:r>
-      <w:r>
-        <w:rPr>
-          <w:rFonts w:cstheme="minorHAnsi"/>
-          <w:sz w:val="22"/>
-          <w:szCs w:val="22"/>
-        </w:rPr>
-        <w:t xml:space="preserve"> As</w:t>
-      </w:r>
-      <w:r>
-        <w:rPr>
-          <w:rFonts w:cstheme="minorHAnsi"/>
-          <w:sz w:val="22"/>
-          <w:szCs w:val="22"/>
-        </w:rPr>
-        <w:t xml:space="preserve"> indicated in the previous task 2017 had the highest overall traffic of any year in the given dataset</w:t>
-      </w:r>
-      <w:r>
-        <w:rPr>
-          <w:rFonts w:cstheme="minorHAnsi"/>
-          <w:sz w:val="22"/>
-          <w:szCs w:val="22"/>
-        </w:rPr>
-        <w:t xml:space="preserve"> and </w:t>
-      </w:r>
-      <w:r>
-        <w:rPr>
-          <w:rFonts w:cstheme="minorHAnsi"/>
-          <w:sz w:val="22"/>
-          <w:szCs w:val="22"/>
-        </w:rPr>
-        <w:t xml:space="preserve">the temperature change </w:t>
-      </w:r>
-      <w:r>
-        <w:rPr>
-          <w:rFonts w:cstheme="minorHAnsi"/>
-          <w:sz w:val="22"/>
-          <w:szCs w:val="22"/>
-        </w:rPr>
-        <w:t xml:space="preserve">can be considered as one of the </w:t>
-      </w:r>
-      <w:r>
-        <w:rPr>
-          <w:rFonts w:cstheme="minorHAnsi"/>
-          <w:sz w:val="22"/>
-          <w:szCs w:val="22"/>
-        </w:rPr>
-        <w:t xml:space="preserve">factors rather than the only factor </w:t>
-      </w:r>
-      <w:r>
-        <w:rPr>
-          <w:rFonts w:cstheme="minorHAnsi"/>
-          <w:sz w:val="22"/>
-          <w:szCs w:val="22"/>
-        </w:rPr>
-        <w:t xml:space="preserve">contributing to </w:t>
-      </w:r>
-      <w:proofErr w:type="gramStart"/>
-      <w:r>
-        <w:rPr>
-          <w:rFonts w:cstheme="minorHAnsi"/>
-          <w:sz w:val="22"/>
-          <w:szCs w:val="22"/>
-        </w:rPr>
-        <w:t>a YoY</w:t>
-      </w:r>
-      <w:proofErr w:type="gramEnd"/>
-      <w:r>
-        <w:rPr>
-          <w:rFonts w:cstheme="minorHAnsi"/>
-          <w:sz w:val="22"/>
-          <w:szCs w:val="22"/>
-        </w:rPr>
-        <w:t xml:space="preserve"> growth.</w:t>
+        <w:t xml:space="preserve">For New Year's Day, average traffic volume also rose alongside the temperature increase (2016: 1,832.0 to 2017: 2,127.6, +16.1%), which is directionally consistent with warmer weather coinciding with more traffic. As indicated in the previous task 2017 had the highest overall traffic of any year in the given dataset and the temperature change can be considered as one of the factors rather than the only factor contributing to a YoY growth.</w:t>
       </w:r>
     </w:p>
     <w:p>
@@ -3549,184 +2840,9 @@
           <w:sz w:val="22"/>
           <w:szCs w:val="22"/>
         </w:rPr>
-        <w:t xml:space="preserve">For Labor Day, the relationship </w:t>
-      </w:r>
-      <w:r>
-        <w:rPr>
-          <w:rFonts w:cstheme="minorHAnsi"/>
-          <w:sz w:val="22"/>
-          <w:szCs w:val="22"/>
-        </w:rPr>
-        <w:t>breaks down, as the</w:t>
-      </w:r>
-      <w:r>
-        <w:rPr>
-          <w:rFonts w:cstheme="minorHAnsi"/>
-          <w:sz w:val="22"/>
-          <w:szCs w:val="22"/>
-        </w:rPr>
-        <w:t xml:space="preserve"> average temperature </w:t>
-      </w:r>
-      <w:r>
-        <w:rPr>
-          <w:rFonts w:cstheme="minorHAnsi"/>
-          <w:sz w:val="22"/>
-          <w:szCs w:val="22"/>
-        </w:rPr>
-        <w:t>changed only marginally</w:t>
-      </w:r>
-      <w:r>
-        <w:rPr>
-          <w:rFonts w:cstheme="minorHAnsi"/>
-          <w:sz w:val="22"/>
-          <w:szCs w:val="22"/>
-        </w:rPr>
-        <w:t xml:space="preserve"> </w:t>
-      </w:r>
-      <w:r>
-        <w:rPr>
-          <w:rFonts w:cstheme="minorHAnsi"/>
-          <w:sz w:val="22"/>
-          <w:szCs w:val="22"/>
-        </w:rPr>
-        <w:t>(</w:t>
-      </w:r>
-      <w:r>
-        <w:rPr>
-          <w:rFonts w:cstheme="minorHAnsi"/>
-          <w:sz w:val="22"/>
-          <w:szCs w:val="22"/>
-        </w:rPr>
-        <w:t>a decrease of</w:t>
-      </w:r>
-      <w:r>
-        <w:rPr>
-          <w:rFonts w:cstheme="minorHAnsi"/>
-          <w:sz w:val="22"/>
-          <w:szCs w:val="22"/>
-        </w:rPr>
-        <w:t xml:space="preserve"> -0.31 degrees C)</w:t>
-      </w:r>
-      <w:r>
-        <w:rPr>
-          <w:rFonts w:cstheme="minorHAnsi"/>
-          <w:sz w:val="22"/>
-          <w:szCs w:val="22"/>
-        </w:rPr>
-        <w:t xml:space="preserve"> between 2015 and 2016</w:t>
-      </w:r>
-      <w:r>
-        <w:rPr>
-          <w:rFonts w:cstheme="minorHAnsi"/>
-          <w:sz w:val="22"/>
-          <w:szCs w:val="22"/>
-        </w:rPr>
-        <w:t>. However, traffic fell by 11.5% (2,430.</w:t>
-      </w:r>
-      <w:r>
-        <w:rPr>
-          <w:rFonts w:cstheme="minorHAnsi"/>
-          <w:sz w:val="22"/>
-          <w:szCs w:val="22"/>
-        </w:rPr>
-        <w:t xml:space="preserve">3 – 2,151.5). </w:t>
-      </w:r>
-      <w:r>
-        <w:rPr>
-          <w:rFonts w:cstheme="minorHAnsi"/>
-          <w:sz w:val="22"/>
-          <w:szCs w:val="22"/>
-        </w:rPr>
-        <w:t xml:space="preserve">Thereafter between 2016 and 2017 </w:t>
-      </w:r>
-      <w:r>
-        <w:rPr>
-          <w:rFonts w:cstheme="minorHAnsi"/>
-          <w:sz w:val="22"/>
-          <w:szCs w:val="22"/>
-        </w:rPr>
-        <w:t xml:space="preserve">temperature dropped sharply by ~ - 3.72 degrees C (i.e. </w:t>
-      </w:r>
-      <w:r>
-        <w:rPr>
-          <w:rFonts w:cstheme="minorHAnsi"/>
-          <w:sz w:val="22"/>
-          <w:szCs w:val="22"/>
-        </w:rPr>
-        <w:t>relatively cooler) but traffic registered an increase of 11.3% (</w:t>
-      </w:r>
-      <w:r>
-        <w:rPr>
-          <w:rFonts w:cstheme="minorHAnsi"/>
-          <w:sz w:val="22"/>
-          <w:szCs w:val="22"/>
-        </w:rPr>
-        <w:t>2,151.5 to 2,395.2)</w:t>
-      </w:r>
-      <w:r>
-        <w:rPr>
-          <w:rFonts w:cstheme="minorHAnsi"/>
-          <w:sz w:val="22"/>
-          <w:szCs w:val="22"/>
-        </w:rPr>
-        <w:t xml:space="preserve"> which is contrary to what one might expect if cooler weather </w:t>
-      </w:r>
-      <w:r>
-        <w:rPr>
-          <w:rFonts w:cstheme="minorHAnsi"/>
-          <w:sz w:val="22"/>
-          <w:szCs w:val="22"/>
-        </w:rPr>
-        <w:t xml:space="preserve">suppressed </w:t>
-      </w:r>
-      <w:r>
-        <w:rPr>
-          <w:rFonts w:cstheme="minorHAnsi"/>
-          <w:sz w:val="22"/>
-          <w:szCs w:val="22"/>
-        </w:rPr>
+        <w:t xml:space="preserve">For Labor Day, the relationship breaks down, as the average temperature changed only marginally (a decrease of -0.31 degrees C) between 2015 and 2016. However, traffic fell by 11.5% (2,430.3 – 2,151.5). Thereafter between 2016 and 2017 temperature dropped sharply by ~ - 3.72 degrees C (i.e. relatively cooler) but traffic registered an increase of 11.3% (2,151.5 to 2,395.2) which is contrary to what one might expect if cooler weather suppressed </w:t>
         <w:lastRenderedPageBreak/>
-        <w:t xml:space="preserve">travel. </w:t>
-      </w:r>
-      <w:r>
-        <w:rPr>
-          <w:rFonts w:cstheme="minorHAnsi"/>
-          <w:sz w:val="22"/>
-          <w:szCs w:val="22"/>
-        </w:rPr>
-        <w:t>So,</w:t>
-      </w:r>
-      <w:r>
-        <w:rPr>
-          <w:rFonts w:cstheme="minorHAnsi"/>
-          <w:sz w:val="22"/>
-          <w:szCs w:val="22"/>
-        </w:rPr>
-        <w:t xml:space="preserve"> this </w:t>
-      </w:r>
-      <w:r>
-        <w:rPr>
-          <w:rFonts w:cstheme="minorHAnsi"/>
-          <w:sz w:val="22"/>
-          <w:szCs w:val="22"/>
-        </w:rPr>
-        <w:t>mismatch</w:t>
-      </w:r>
-      <w:r>
-        <w:rPr>
-          <w:rFonts w:cstheme="minorHAnsi"/>
-          <w:sz w:val="22"/>
-          <w:szCs w:val="22"/>
-        </w:rPr>
-        <w:t xml:space="preserve"> </w:t>
-      </w:r>
-      <w:r>
-        <w:rPr>
-          <w:rFonts w:cstheme="minorHAnsi"/>
-          <w:sz w:val="22"/>
-          <w:szCs w:val="22"/>
-        </w:rPr>
-        <w:t>indicates that temperature is not a strong driver of changes in traffic for Labor Day.</w:t>
+        <w:t xml:space="preserve">travel. So, this mismatch indicates that temperature is not a strong driver of changes in traffic for Labor Day.</w:t>
       </w:r>
     </w:p>
     <w:p>
@@ -4614,31 +3730,7 @@
           <w:sz w:val="22"/>
           <w:szCs w:val="22"/>
         </w:rPr>
-        <w:t xml:space="preserve"> </w:t>
-      </w:r>
-      <w:r>
-        <w:rPr>
-          <w:rFonts w:cstheme="minorHAnsi"/>
-          <w:sz w:val="22"/>
-          <w:szCs w:val="22"/>
-        </w:rPr>
-        <w:t xml:space="preserve">The mean (3,290.65) is noticeably lower than the median (3,427.00), a gap of about 136 vehicles. Since the mean </w:t>
-      </w:r>
-      <w:r>
-        <w:rPr>
-          <w:rFonts w:cstheme="minorHAnsi"/>
-          <w:sz w:val="22"/>
-          <w:szCs w:val="22"/>
-        </w:rPr>
-        <w:t>is</w:t>
-      </w:r>
-      <w:r>
-        <w:rPr>
-          <w:rFonts w:cstheme="minorHAnsi"/>
-          <w:sz w:val="22"/>
-          <w:szCs w:val="22"/>
-        </w:rPr>
-        <w:t xml:space="preserve"> below the median, the distribution of traffic volume leans toward lower values. There is a cluster of low traffic hours, mainly overnight and early morning when volume drops close to zero, pulling the average down, while most hours sit at moderate to high volumes clustered nearer the median.</w:t>
+        <w:t xml:space="preserve"> The mean (3,290.65) is noticeably lower than the median (3,427.00), a gap of about 136 vehicles. Since the mean is below the median, the distribution of traffic volume leans toward lower values. There is a cluster of low traffic hours, mainly overnight and early morning when volume drops close to zero, pulling the average down, while most hours sit at moderate to high volumes clustered nearer the median.</w:t>
       </w:r>
     </w:p>
     <w:p>
@@ -4665,95 +3757,7 @@
           <w:sz w:val="22"/>
           <w:szCs w:val="22"/>
         </w:rPr>
-        <w:t xml:space="preserve">The standard deviation (1,984.77) is large relative to the mean, </w:t>
-      </w:r>
-      <w:r>
-        <w:rPr>
-          <w:rFonts w:cstheme="minorHAnsi"/>
-          <w:sz w:val="22"/>
-          <w:szCs w:val="22"/>
-        </w:rPr>
-        <w:t>and looking at the coefficient of variation at ~</w:t>
-      </w:r>
-      <w:r>
-        <w:rPr>
-          <w:rFonts w:cstheme="minorHAnsi"/>
-          <w:sz w:val="22"/>
-          <w:szCs w:val="22"/>
-        </w:rPr>
-        <w:t>60.3</w:t>
-      </w:r>
-      <w:r>
-        <w:rPr>
-          <w:rFonts w:cstheme="minorHAnsi"/>
-          <w:sz w:val="22"/>
-          <w:szCs w:val="22"/>
-        </w:rPr>
-        <w:t xml:space="preserve">% of the mean value (1,984.77 </w:t>
-      </w:r>
-      <w:r>
-        <w:rPr>
-          <w:rFonts w:cstheme="minorHAnsi"/>
-          <w:sz w:val="22"/>
-          <w:szCs w:val="22"/>
-        </w:rPr>
-        <w:t xml:space="preserve">/ </w:t>
-      </w:r>
-      <w:r>
-        <w:rPr>
-          <w:rFonts w:cstheme="minorHAnsi"/>
-          <w:sz w:val="22"/>
-          <w:szCs w:val="22"/>
-        </w:rPr>
-        <w:t xml:space="preserve">3,290.65 is </w:t>
-      </w:r>
-      <w:r>
-        <w:rPr>
-          <w:rFonts w:cstheme="minorHAnsi"/>
-          <w:sz w:val="22"/>
-          <w:szCs w:val="22"/>
-        </w:rPr>
-        <w:t>~</w:t>
-      </w:r>
-      <w:r>
-        <w:rPr>
-          <w:rFonts w:cstheme="minorHAnsi"/>
-          <w:sz w:val="22"/>
-          <w:szCs w:val="22"/>
-        </w:rPr>
-        <w:t xml:space="preserve"> 60.3%</w:t>
-      </w:r>
-      <w:r>
-        <w:rPr>
-          <w:rFonts w:cstheme="minorHAnsi"/>
-          <w:sz w:val="22"/>
-          <w:szCs w:val="22"/>
-        </w:rPr>
-        <w:t>)</w:t>
-      </w:r>
-      <w:r>
-        <w:rPr>
-          <w:rFonts w:cstheme="minorHAnsi"/>
-          <w:sz w:val="22"/>
-          <w:szCs w:val="22"/>
-        </w:rPr>
-        <w:t xml:space="preserve"> indicates substantial </w:t>
-      </w:r>
-      <w:r>
-        <w:rPr>
-          <w:rFonts w:cstheme="minorHAnsi"/>
-          <w:sz w:val="22"/>
-          <w:szCs w:val="22"/>
-        </w:rPr>
-        <w:t>variability i.e. t</w:t>
-      </w:r>
-      <w:r>
-        <w:rPr>
-          <w:rFonts w:cstheme="minorHAnsi"/>
-          <w:sz w:val="22"/>
-          <w:szCs w:val="22"/>
-        </w:rPr>
-        <w:t>raffic volume swings widely rather than staying close to its average. The variance (3,939,323.50) conveys the same spread in squared units, so it is mainly useful as an input to other calculations rather than something to interpret directly on its own.</w:t>
+        <w:t xml:space="preserve">The standard deviation (1,984.77) is large relative to the mean, and looking at the coefficient of variation at ~60.3% of the mean value (1,984.77 / 3,290.65 is ~ 60.3%) indicates substantial variability i.e. traffic volume swings widely rather than staying close to its average. The variance (3,939,323.50) conveys the same spread in squared units, so it is mainly useful as an input to other calculations rather than something to interpret directly on its own.</w:t>
       </w:r>
     </w:p>
     <w:p>
@@ -4772,17 +3776,7 @@
           <w:sz w:val="22"/>
           <w:szCs w:val="22"/>
         </w:rPr>
-        <w:t>Range:</w:t>
-      </w:r>
-      <w:r>
-        <w:rPr>
-          <w:rFonts w:cstheme="minorHAnsi"/>
-          <w:b/>
-          <w:bCs/>
-          <w:sz w:val="22"/>
-          <w:szCs w:val="22"/>
-        </w:rPr>
-        <w:t xml:space="preserve"> </w:t>
+        <w:t xml:space="preserve">Range: </w:t>
       </w:r>
       <w:r>
         <w:rPr>
@@ -4808,73 +3802,7 @@
           <w:sz w:val="22"/>
           <w:szCs w:val="22"/>
         </w:rPr>
-        <w:t xml:space="preserve">Looking at the above statistics as a </w:t>
-      </w:r>
-      <w:r>
-        <w:rPr>
-          <w:rFonts w:cstheme="minorHAnsi"/>
-          <w:sz w:val="22"/>
-          <w:szCs w:val="22"/>
-        </w:rPr>
-        <w:t>cohort</w:t>
-      </w:r>
-      <w:r>
-        <w:rPr>
-          <w:rFonts w:cstheme="minorHAnsi"/>
-          <w:sz w:val="22"/>
-          <w:szCs w:val="22"/>
-        </w:rPr>
-        <w:t xml:space="preserve"> the trend seems consistent</w:t>
-      </w:r>
-      <w:r>
-        <w:rPr>
-          <w:rFonts w:cstheme="minorHAnsi"/>
-          <w:sz w:val="22"/>
-          <w:szCs w:val="22"/>
-        </w:rPr>
-        <w:t>.</w:t>
-      </w:r>
-      <w:r>
-        <w:rPr>
-          <w:rFonts w:cstheme="minorHAnsi"/>
-          <w:sz w:val="22"/>
-          <w:szCs w:val="22"/>
-        </w:rPr>
-        <w:t xml:space="preserve"> Traffic volume is not stable throughout the day. It depends heavily on the time of day, with a wide range between quiet overnight hours and peak commuting hours.</w:t>
-      </w:r>
-      <w:r>
-        <w:rPr>
-          <w:rFonts w:cstheme="minorHAnsi"/>
-          <w:sz w:val="22"/>
-          <w:szCs w:val="22"/>
-        </w:rPr>
-        <w:t xml:space="preserve"> </w:t>
-      </w:r>
-      <w:r>
-        <w:rPr>
-          <w:rFonts w:cstheme="minorHAnsi"/>
-          <w:sz w:val="22"/>
-          <w:szCs w:val="22"/>
-        </w:rPr>
-        <w:t xml:space="preserve">A single average figure hides most of what is </w:t>
-      </w:r>
-      <w:proofErr w:type="gramStart"/>
-      <w:r>
-        <w:rPr>
-          <w:rFonts w:cstheme="minorHAnsi"/>
-          <w:sz w:val="22"/>
-          <w:szCs w:val="22"/>
-        </w:rPr>
-        <w:t>actually happening</w:t>
-      </w:r>
-      <w:proofErr w:type="gramEnd"/>
-      <w:r>
-        <w:rPr>
-          <w:rFonts w:cstheme="minorHAnsi"/>
-          <w:sz w:val="22"/>
-          <w:szCs w:val="22"/>
-        </w:rPr>
-        <w:t>, and any predictive model needs to account for this time driven swing rather than treating traffic volume as roughly constant.</w:t>
+        <w:t xml:space="preserve">Looking at the above statistics as a cohort the trend seems consistent. Traffic volume is not stable throughout the day. It depends heavily on the time of day, with a wide range between quiet overnight hours and peak commuting hours. A single average figure hides most of what is actually happening, and any predictive model needs to account for this time driven swing rather than treating traffic volume as roughly constant.</w:t>
       </w:r>
     </w:p>
     <w:p>
@@ -4978,21 +3906,7 @@
           <w:rFonts w:cstheme="minorHAnsi"/>
           <w:sz w:val="22"/>
         </w:rPr>
-        <w:t>. Because a Pearson correlation is unaffected by a linear rescaling of either variable, this value is identical whether temperature is expressed in Kelvin (</w:t>
-      </w:r>
-      <w:r>
-        <w:rPr>
-          <w:rFonts w:cstheme="minorHAnsi"/>
-          <w:sz w:val="22"/>
-        </w:rPr>
-        <w:t>as available in the file</w:t>
-      </w:r>
-      <w:r>
-        <w:rPr>
-          <w:rFonts w:cstheme="minorHAnsi"/>
-          <w:sz w:val="22"/>
-        </w:rPr>
-        <w:t>) or converted to Celsius.</w:t>
+        <w:t>. Because a Pearson correlation is unaffected by a linear rescaling of either variable, this value is identical whether temperature is expressed in Kelvin (as available in the file) or converted to Celsius.</w:t>
       </w:r>
     </w:p>
     <w:p>
@@ -5014,49 +3928,7 @@
           <w:rFonts w:cstheme="minorHAnsi"/>
           <w:sz w:val="22"/>
         </w:rPr>
-        <w:t xml:space="preserve"> 10 rows record temperature as exactly 0 K (absolute zero), and a further 78 rows record exactly 276.793 K — both look like placeholder/default values rather than real sensor readings (0 K is physically </w:t>
-      </w:r>
-      <w:r>
-        <w:rPr>
-          <w:rFonts w:cstheme="minorHAnsi"/>
-          <w:sz w:val="22"/>
-        </w:rPr>
-        <w:t>impossible</w:t>
-      </w:r>
-      <w:r>
-        <w:rPr>
-          <w:rFonts w:cstheme="minorHAnsi"/>
-          <w:sz w:val="22"/>
-        </w:rPr>
-        <w:t xml:space="preserve"> for Minneapolis–St Paul</w:t>
-      </w:r>
-      <w:r>
-        <w:rPr>
-          <w:rFonts w:cstheme="minorHAnsi"/>
-          <w:sz w:val="22"/>
-        </w:rPr>
-        <w:t xml:space="preserve"> (unless it is created in a lab)</w:t>
-      </w:r>
-      <w:r>
-        <w:rPr>
-          <w:rFonts w:cstheme="minorHAnsi"/>
-          <w:sz w:val="22"/>
-        </w:rPr>
-        <w:t>, and 276.793 K recurs suspiciously often, always on the "extra" row of an hour that already has a duplicate weather entry). Recomputing the coefficient with these 88 rows (0.22% of the data) excluded gives r = 0.1391, which still rounds to 0.14, so this data-quality issue does not change the result</w:t>
-      </w:r>
-      <w:r>
-        <w:rPr>
-          <w:rFonts w:cstheme="minorHAnsi"/>
-          <w:sz w:val="22"/>
-        </w:rPr>
-        <w:t>.</w:t>
-      </w:r>
-      <w:r>
-        <w:rPr>
-          <w:rFonts w:cstheme="minorHAnsi"/>
-          <w:sz w:val="22"/>
-        </w:rPr>
-        <w:t xml:space="preserve"> </w:t>
+        <w:t xml:space="preserve"> 10 rows record temperature as exactly 0 K (absolute zero), and a further 78 rows record exactly 276.793 K — both look like placeholder/default values rather than real sensor readings (0 K is physically impossible for Minneapolis–St Paul (unless it is created in a lab), and 276.793 K recurs suspiciously often, always on the "extra" row of an hour that already has a duplicate weather entry). Recomputing the coefficient with these 88 rows (0.22% of the data) excluded gives r = 0.1391, which still rounds to 0.14, so this data-quality issue does not change the result. </w:t>
       </w:r>
     </w:p>
     <w:p>
@@ -5152,58 +4024,7 @@
           <w:rFonts w:cstheme="minorHAnsi"/>
           <w:sz w:val="22"/>
         </w:rPr>
-        <w:t xml:space="preserve"> By conventional benchmarks for correlation strength (roughly: &lt;0.20 very weak, 0.20–0.39 weak, 0.40–0.59 moderate, 0.60–0.79 strong, ≥0.80 very strong), r = 0.14 falls in the very weak range</w:t>
-      </w:r>
-      <w:r>
-        <w:rPr>
-          <w:rFonts w:cstheme="minorHAnsi"/>
-          <w:sz w:val="22"/>
-        </w:rPr>
-        <w:t xml:space="preserve"> that indicates</w:t>
-      </w:r>
-      <w:r>
-        <w:rPr>
-          <w:rFonts w:cstheme="minorHAnsi"/>
-          <w:sz w:val="22"/>
-        </w:rPr>
-        <w:t xml:space="preserve"> close to no linear relationship at all. Squaring the coefficient gives R</w:t>
-      </w:r>
-      <w:r>
-        <w:rPr>
-          <w:rFonts w:cstheme="minorHAnsi"/>
-          <w:sz w:val="22"/>
-        </w:rPr>
-        <w:t>^2</w:t>
-      </w:r>
-      <w:r>
-        <w:rPr>
-          <w:rFonts w:cstheme="minorHAnsi"/>
-          <w:sz w:val="22"/>
-        </w:rPr>
-        <w:t xml:space="preserve"> ≈ 0.019, meaning temperature alone statistically accounts for under 2% of the hour-to-hour variation in traffic volume. This lines up with the </w:t>
-      </w:r>
-      <w:proofErr w:type="spellStart"/>
-      <w:r>
-        <w:rPr>
-          <w:rFonts w:cstheme="minorHAnsi"/>
-          <w:sz w:val="22"/>
-        </w:rPr>
-        <w:t>sql</w:t>
-      </w:r>
-      <w:proofErr w:type="spellEnd"/>
-      <w:r>
-        <w:rPr>
-          <w:rFonts w:cstheme="minorHAnsi"/>
-          <w:sz w:val="22"/>
-        </w:rPr>
-        <w:t xml:space="preserve"> task</w:t>
-      </w:r>
-      <w:r>
-        <w:rPr>
-          <w:rFonts w:cstheme="minorHAnsi"/>
-          <w:sz w:val="22"/>
-        </w:rPr>
-        <w:t xml:space="preserve"> finding that traffic volume is dominated by time-of-day/commuting patterns rather than a single continuous driver such as temperature.</w:t>
+        <w:t xml:space="preserve"> By conventional benchmarks for correlation strength (roughly: &lt;0.20 very weak, 0.20–0.39 weak, 0.40–0.59 moderate, 0.60–0.79 strong, ≥0.80 very strong), r = 0.14 falls in the very weak range that indicates close to no linear relationship at all. Squaring the coefficient gives R^2 ≈ 0.019, meaning temperature alone statistically accounts for under 2% of the hour-to-hour variation in traffic volume. This lines up with the sql task finding that traffic volume is dominated by time-of-day/commuting patterns rather than a single continuous driver such as temperature.</w:t>
       </w:r>
     </w:p>
     <w:p>
@@ -5243,65 +4064,7 @@
           <w:rFonts w:cstheme="minorHAnsi"/>
           <w:sz w:val="22"/>
         </w:rPr>
-        <w:t xml:space="preserve"> A correlation coefficient only measures how closely two variables move together; it cannot by itself show that one causes the other. Two variables can be correlated because a third, unmeasured variable drives them both (a confounder), because the relationship </w:t>
-      </w:r>
-      <w:proofErr w:type="gramStart"/>
-      <w:r>
-        <w:rPr>
-          <w:rFonts w:cstheme="minorHAnsi"/>
-          <w:sz w:val="22"/>
-        </w:rPr>
-        <w:t>actually runs</w:t>
-      </w:r>
-      <w:proofErr w:type="gramEnd"/>
-      <w:r>
-        <w:rPr>
-          <w:rFonts w:cstheme="minorHAnsi"/>
-          <w:sz w:val="22"/>
-        </w:rPr>
-        <w:t xml:space="preserve"> in the opposite direction, or simply by chance. In this dataset, a plausible confounder is time (hour of day and season): traffic volume follows a strong commuting-driven daily cycle that has nothing to do with the outdoor temperature at that moment, while temperature follows its own daily and seasonal cycle. The two series can drift together somewhat simply because both are shaped by the calendar, without temperature having any direct influence on how many vehicles are on the road</w:t>
-      </w:r>
-      <w:r>
-        <w:rPr>
-          <w:rFonts w:cstheme="minorHAnsi"/>
-          <w:sz w:val="22"/>
-        </w:rPr>
-        <w:t>.</w:t>
-      </w:r>
-      <w:r>
-        <w:rPr>
-          <w:rFonts w:cstheme="minorHAnsi"/>
-          <w:sz w:val="22"/>
-        </w:rPr>
-        <w:t xml:space="preserve"> </w:t>
-      </w:r>
-      <w:r>
-        <w:rPr>
-          <w:rFonts w:cstheme="minorHAnsi"/>
-          <w:sz w:val="22"/>
-        </w:rPr>
-        <w:t>F</w:t>
-      </w:r>
-      <w:r>
-        <w:rPr>
-          <w:rFonts w:cstheme="minorHAnsi"/>
-          <w:sz w:val="22"/>
-        </w:rPr>
-        <w:t>or example, a warm summer rush hour and a cold winter rush hour can both be "high traffic" for scheduling reasons alone. Given how weak this correlation already is (R</w:t>
-      </w:r>
-      <w:r>
-        <w:rPr>
-          <w:rFonts w:cstheme="minorHAnsi"/>
-          <w:sz w:val="22"/>
-        </w:rPr>
-        <w:t>^2</w:t>
-      </w:r>
-      <w:r>
-        <w:rPr>
-          <w:rFonts w:cstheme="minorHAnsi"/>
-          <w:sz w:val="22"/>
-        </w:rPr>
-        <w:t xml:space="preserve"> &lt; 2%), it would be a mistake to conclude from it that warmer weather causes more people to drive; the data only supports saying the two are weakly, positively associated.</w:t>
+        <w:t xml:space="preserve"> A correlation coefficient only measures how closely two variables move together; it cannot by itself show that one causes the other. Two variables can be correlated because a third, unmeasured variable drives them both (a confounder), because the relationship actually runs in the opposite direction, or simply by chance. In this dataset, a plausible confounder is time (hour of day and season): traffic volume follows a strong commuting-driven daily cycle that has nothing to do with the outdoor temperature at that moment, while temperature follows its own daily and seasonal cycle. The two series can drift together somewhat simply because both are shaped by the calendar, without temperature having any direct influence on how many vehicles are on the road. For example, a warm summer rush hour and a cold winter rush hour can both be "high traffic" for scheduling reasons alone. Given how weak this correlation already is (R^2 &lt; 2%), it would be a mistake to conclude from it that warmer weather causes more people to drive; the data only supports saying the two are weakly, positively associated.</w:t>
       </w:r>
     </w:p>
     <w:p>
@@ -5316,23 +4079,7 @@
           <w:sz w:val="22"/>
         </w:rPr>
         <w:lastRenderedPageBreak/>
-        <w:t xml:space="preserve">Overall, temperature has only a marginal linear association with traffic volume in this dataset. It is directionally positive but too weak to treat as a meaningful driver of traffic on its own, reinforcing </w:t>
-      </w:r>
-      <w:proofErr w:type="gramStart"/>
-      <w:r>
-        <w:rPr>
-          <w:rFonts w:cstheme="minorHAnsi"/>
-          <w:sz w:val="22"/>
-        </w:rPr>
-        <w:t>that time-based factors</w:t>
-      </w:r>
-      <w:proofErr w:type="gramEnd"/>
-      <w:r>
-        <w:rPr>
-          <w:rFonts w:cstheme="minorHAnsi"/>
-          <w:sz w:val="22"/>
-        </w:rPr>
-        <w:t xml:space="preserve"> (hour, day of week, holiday status) are far more important explanatory variables than weather.</w:t>
+        <w:t xml:space="preserve">Overall, temperature has only a marginal linear association with traffic volume in this dataset. It is directionally positive but too weak to treat as a meaningful driver of traffic on its own, reinforcing that time-based factors (hour, day of week, holiday status) are far more important explanatory variables than weather.</w:t>
       </w:r>
     </w:p>
     <w:p>
@@ -5370,23 +4117,13 @@
         </w:rPr>
         <w:t xml:space="preserve">Congestion is defined for this task as an hour where </w:t>
       </w:r>
-      <w:proofErr w:type="spellStart"/>
       <w:r>
         <w:rPr>
           <w:rFonts w:cstheme="minorHAnsi"/>
           <w:b/>
           <w:sz w:val="22"/>
         </w:rPr>
-        <w:t>traffic_volume</w:t>
-      </w:r>
-      <w:proofErr w:type="spellEnd"/>
-      <w:r>
-        <w:rPr>
-          <w:rFonts w:cstheme="minorHAnsi"/>
-          <w:b/>
-          <w:sz w:val="22"/>
-        </w:rPr>
-        <w:t xml:space="preserve"> &gt; 5,500 vehicles</w:t>
+        <w:t xml:space="preserve">traffic_volume &gt; 5,500 vehicles</w:t>
       </w:r>
       <w:r>
         <w:rPr>
@@ -5455,21 +4192,12 @@
           <w:rFonts w:cstheme="minorHAnsi"/>
         </w:rPr>
       </w:pPr>
-      <w:proofErr w:type="gramStart"/>
-      <w:r>
-        <w:rPr>
-          <w:rFonts w:cstheme="minorHAnsi"/>
-          <w:sz w:val="22"/>
-        </w:rPr>
-        <w:t>P(</w:t>
-      </w:r>
-      <w:proofErr w:type="gramEnd"/>
-      <w:r>
-        <w:rPr>
-          <w:rFonts w:cstheme="minorHAnsi"/>
-          <w:sz w:val="22"/>
-        </w:rPr>
-        <w:t>Clear Weather)</w:t>
+      <w:r>
+        <w:rPr>
+          <w:rFonts w:cstheme="minorHAnsi"/>
+          <w:sz w:val="22"/>
+        </w:rPr>
+        <w:t>P(Clear Weather)</w:t>
       </w:r>
     </w:p>
     <w:p>
@@ -5483,83 +4211,26 @@
           <w:rFonts w:cstheme="minorHAnsi"/>
         </w:rPr>
       </w:pPr>
-      <w:proofErr w:type="gramStart"/>
-      <w:r>
-        <w:rPr>
-          <w:rFonts w:cstheme="minorHAnsi"/>
-          <w:sz w:val="22"/>
-        </w:rPr>
-        <w:t>P(</w:t>
-      </w:r>
-      <w:proofErr w:type="gramEnd"/>
-      <w:r>
-        <w:rPr>
-          <w:rFonts w:cstheme="minorHAnsi"/>
-          <w:sz w:val="22"/>
-        </w:rPr>
-        <w:t>Congestion AND Clear Weather)</w:t>
-      </w:r>
-    </w:p>
-    <w:p>
-      <w:pPr>
-        <w:rPr>
-          <w:rFonts w:cstheme="minorHAnsi"/>
-        </w:rPr>
-      </w:pPr>
-      <w:r>
-        <w:rPr>
-          <w:rFonts w:cstheme="minorHAnsi"/>
-          <w:sz w:val="22"/>
-        </w:rPr>
-        <w:t xml:space="preserve">Method: All three probabilities are empirical relative frequencies computed over the same 40,575-row deduplicated, one-row-per-hour dataset used throughout Tasks 1.2, 2.1 and 2.2 (so an hour with multiple weather log entries is not double-counted). "Clear Weather" uses the </w:t>
-      </w:r>
-      <w:proofErr w:type="spellStart"/>
-      <w:r>
-        <w:rPr>
-          <w:rFonts w:cstheme="minorHAnsi"/>
-          <w:sz w:val="22"/>
-        </w:rPr>
-        <w:t>weather_main</w:t>
-      </w:r>
-      <w:proofErr w:type="spellEnd"/>
-      <w:r>
-        <w:rPr>
-          <w:rFonts w:cstheme="minorHAnsi"/>
-          <w:sz w:val="22"/>
-        </w:rPr>
-        <w:t xml:space="preserve"> column’s exact category "Clear" (one of 10 categories in the data: Clouds, Clear, Rain, Drizzle, Mist, Fog, Thunderstorm, Haze, Snow, Squall, Smoke) rather than the free-text </w:t>
-      </w:r>
-      <w:proofErr w:type="spellStart"/>
-      <w:r>
-        <w:rPr>
-          <w:rFonts w:cstheme="minorHAnsi"/>
-          <w:sz w:val="22"/>
-        </w:rPr>
-        <w:t>weather_description</w:t>
-      </w:r>
-      <w:proofErr w:type="spellEnd"/>
-      <w:r>
-        <w:rPr>
-          <w:rFonts w:cstheme="minorHAnsi"/>
-          <w:sz w:val="22"/>
-        </w:rPr>
-        <w:t xml:space="preserve"> field, since </w:t>
-      </w:r>
-      <w:proofErr w:type="spellStart"/>
-      <w:r>
-        <w:rPr>
-          <w:rFonts w:cstheme="minorHAnsi"/>
-          <w:sz w:val="22"/>
-        </w:rPr>
-        <w:t>weather_main</w:t>
-      </w:r>
-      <w:proofErr w:type="spellEnd"/>
-      <w:r>
-        <w:rPr>
-          <w:rFonts w:cstheme="minorHAnsi"/>
-          <w:sz w:val="22"/>
-        </w:rPr>
-        <w:t xml:space="preserve"> gives a single unambiguous label per hour.</w:t>
+      <w:r>
+        <w:rPr>
+          <w:rFonts w:cstheme="minorHAnsi"/>
+          <w:sz w:val="22"/>
+        </w:rPr>
+        <w:t>P(Congestion AND Clear Weather)</w:t>
+      </w:r>
+    </w:p>
+    <w:p>
+      <w:pPr>
+        <w:rPr>
+          <w:rFonts w:cstheme="minorHAnsi"/>
+        </w:rPr>
+      </w:pPr>
+      <w:r>
+        <w:rPr>
+          <w:rFonts w:cstheme="minorHAnsi"/>
+          <w:sz w:val="22"/>
+        </w:rPr>
+        <w:t xml:space="preserve">Method: All three probabilities are empirical relative frequencies computed over the same 40,575-row deduplicated, one-row-per-hour dataset used throughout Tasks 1.2, 2.1 and 2.2 (so an hour with multiple weather log entries is not double-counted). "Clear Weather" uses the weather_main column’s exact category "Clear" (one of 10 categories in the data: Clouds, Clear, Rain, Drizzle, Mist, Fog, Thunderstorm, Haze, Snow, Squall, Smoke) rather than the free-text weather_description field, since weather_main gives a single unambiguous label per hour.</w:t>
       </w:r>
     </w:p>
     <w:p>
@@ -5581,135 +4252,51 @@
           <w:rFonts w:cstheme="minorHAnsi"/>
           <w:sz w:val="22"/>
         </w:rPr>
-        <w:t xml:space="preserve">6,107 of 40,575 hours have </w:t>
-      </w:r>
-      <w:proofErr w:type="spellStart"/>
-      <w:r>
-        <w:rPr>
-          <w:rFonts w:cstheme="minorHAnsi"/>
-          <w:sz w:val="22"/>
-        </w:rPr>
-        <w:t>traffic_volume</w:t>
-      </w:r>
-      <w:proofErr w:type="spellEnd"/>
-      <w:r>
-        <w:rPr>
-          <w:rFonts w:cstheme="minorHAnsi"/>
-          <w:sz w:val="22"/>
-        </w:rPr>
-        <w:t xml:space="preserve"> &gt; 5,500, so P(Congestion) = 6,107 / 40,575 ≈ 0.1505 (15.05%).</w:t>
-      </w:r>
-    </w:p>
-    <w:p>
-      <w:pPr>
-        <w:rPr>
-          <w:rFonts w:cstheme="minorHAnsi"/>
-        </w:rPr>
-      </w:pPr>
-      <w:proofErr w:type="gramStart"/>
+        <w:t xml:space="preserve">6,107 of 40,575 hours have traffic_volume &gt; 5,500, so P(Congestion) = 6,107 / 40,575 ≈ 0.1505 (15.05%).</w:t>
+      </w:r>
+    </w:p>
+    <w:p>
+      <w:pPr>
+        <w:rPr>
+          <w:rFonts w:cstheme="minorHAnsi"/>
+        </w:rPr>
+      </w:pPr>
       <w:r>
         <w:rPr>
           <w:rFonts w:cstheme="minorHAnsi"/>
           <w:b/>
           <w:sz w:val="22"/>
         </w:rPr>
-        <w:t>P(</w:t>
-      </w:r>
-      <w:proofErr w:type="gramEnd"/>
+        <w:t xml:space="preserve">P(Clear Weather): </w:t>
+      </w:r>
+      <w:r>
+        <w:rPr>
+          <w:rFonts w:cstheme="minorHAnsi"/>
+          <w:sz w:val="22"/>
+        </w:rPr>
+        <w:t xml:space="preserve">13,366 of 40,575 hours are logged with weather_main = "Clear", so P(Clear Weather) = 13,366 / 40,575 ≈ 0.3294 (32.94%).</w:t>
+      </w:r>
+    </w:p>
+    <w:p>
+      <w:pPr>
+        <w:rPr>
+          <w:rFonts w:cstheme="minorHAnsi"/>
+        </w:rPr>
+      </w:pPr>
       <w:r>
         <w:rPr>
           <w:rFonts w:cstheme="minorHAnsi"/>
           <w:b/>
           <w:sz w:val="22"/>
         </w:rPr>
-        <w:t xml:space="preserve">Clear Weather): </w:t>
-      </w:r>
-      <w:r>
-        <w:rPr>
-          <w:rFonts w:cstheme="minorHAnsi"/>
-          <w:sz w:val="22"/>
-        </w:rPr>
-        <w:t xml:space="preserve">13,366 of 40,575 hours are logged with </w:t>
-      </w:r>
-      <w:proofErr w:type="spellStart"/>
-      <w:r>
-        <w:rPr>
-          <w:rFonts w:cstheme="minorHAnsi"/>
-          <w:sz w:val="22"/>
-        </w:rPr>
-        <w:t>weather_main</w:t>
-      </w:r>
-      <w:proofErr w:type="spellEnd"/>
-      <w:r>
-        <w:rPr>
-          <w:rFonts w:cstheme="minorHAnsi"/>
-          <w:sz w:val="22"/>
-        </w:rPr>
-        <w:t xml:space="preserve"> = "Clear", so </w:t>
-      </w:r>
-      <w:proofErr w:type="gramStart"/>
-      <w:r>
-        <w:rPr>
-          <w:rFonts w:cstheme="minorHAnsi"/>
-          <w:sz w:val="22"/>
-        </w:rPr>
-        <w:t>P(</w:t>
-      </w:r>
-      <w:proofErr w:type="gramEnd"/>
-      <w:r>
-        <w:rPr>
-          <w:rFonts w:cstheme="minorHAnsi"/>
-          <w:sz w:val="22"/>
-        </w:rPr>
-        <w:t>Clear Weather) = 13,366 / 40,575 ≈ 0.3294 (32.94%).</w:t>
-      </w:r>
-    </w:p>
-    <w:p>
-      <w:pPr>
-        <w:rPr>
-          <w:rFonts w:cstheme="minorHAnsi"/>
-        </w:rPr>
-      </w:pPr>
-      <w:proofErr w:type="gramStart"/>
-      <w:r>
-        <w:rPr>
-          <w:rFonts w:cstheme="minorHAnsi"/>
-          <w:b/>
-          <w:sz w:val="22"/>
-        </w:rPr>
-        <w:t>P(</w:t>
-      </w:r>
-      <w:proofErr w:type="gramEnd"/>
-      <w:r>
-        <w:rPr>
-          <w:rFonts w:cstheme="minorHAnsi"/>
-          <w:b/>
-          <w:sz w:val="22"/>
-        </w:rPr>
-        <w:t xml:space="preserve">Congestion AND Clear Weather): </w:t>
-      </w:r>
-      <w:r>
-        <w:rPr>
-          <w:rFonts w:cstheme="minorHAnsi"/>
-          <w:sz w:val="22"/>
-        </w:rPr>
-        <w:t xml:space="preserve">1,762 of 40,575 hours are both congested and clear, so </w:t>
-      </w:r>
-      <w:proofErr w:type="gramStart"/>
-      <w:r>
-        <w:rPr>
-          <w:rFonts w:cstheme="minorHAnsi"/>
-          <w:sz w:val="22"/>
-        </w:rPr>
-        <w:t>P(</w:t>
-      </w:r>
-      <w:proofErr w:type="gramEnd"/>
-      <w:r>
-        <w:rPr>
-          <w:rFonts w:cstheme="minorHAnsi"/>
-          <w:sz w:val="22"/>
-        </w:rPr>
-        <w:t>Congestion AND Clear Weather) = 1,762 / 40,575 ≈ 0.0434 (4.34%).</w:t>
+        <w:t xml:space="preserve">P(Congestion AND Clear Weather): </w:t>
+      </w:r>
+      <w:r>
+        <w:rPr>
+          <w:rFonts w:cstheme="minorHAnsi"/>
+          <w:sz w:val="22"/>
+        </w:rPr>
+        <w:t xml:space="preserve">1,762 of 40,575 hours are both congested and clear, so P(Congestion AND Clear Weather) = 1,762 / 40,575 ≈ 0.0434 (4.34%).</w:t>
       </w:r>
     </w:p>
     <w:p>
@@ -5759,21 +4346,12 @@
           <w:rFonts w:cstheme="minorHAnsi"/>
         </w:rPr>
       </w:pPr>
-      <w:proofErr w:type="gramStart"/>
-      <w:r>
-        <w:rPr>
-          <w:rFonts w:cstheme="minorHAnsi"/>
-          <w:sz w:val="22"/>
-        </w:rPr>
-        <w:t>P(</w:t>
-      </w:r>
-      <w:proofErr w:type="gramEnd"/>
-      <w:r>
-        <w:rPr>
-          <w:rFonts w:cstheme="minorHAnsi"/>
-          <w:sz w:val="22"/>
-        </w:rPr>
-        <w:t>Clear Weather | Congestion)</w:t>
+      <w:r>
+        <w:rPr>
+          <w:rFonts w:cstheme="minorHAnsi"/>
+          <w:sz w:val="22"/>
+        </w:rPr>
+        <w:t>P(Clear Weather | Congestion)</w:t>
       </w:r>
     </w:p>
     <w:p>
@@ -5787,21 +4365,12 @@
           <w:rFonts w:cstheme="minorHAnsi"/>
         </w:rPr>
       </w:pPr>
-      <w:proofErr w:type="gramStart"/>
-      <w:r>
-        <w:rPr>
-          <w:rFonts w:cstheme="minorHAnsi"/>
-          <w:sz w:val="22"/>
-        </w:rPr>
-        <w:t>P(</w:t>
-      </w:r>
-      <w:proofErr w:type="gramEnd"/>
-      <w:r>
-        <w:rPr>
-          <w:rFonts w:cstheme="minorHAnsi"/>
-          <w:sz w:val="22"/>
-        </w:rPr>
-        <w:t>High Temperature | Congestion), where high temperature &gt; 292K</w:t>
+      <w:r>
+        <w:rPr>
+          <w:rFonts w:cstheme="minorHAnsi"/>
+          <w:sz w:val="22"/>
+        </w:rPr>
+        <w:t>P(High Temperature | Congestion), where high temperature &gt; 292K</w:t>
       </w:r>
     </w:p>
     <w:p>
@@ -5820,23 +4389,7 @@
           <w:rFonts w:cstheme="minorHAnsi"/>
           <w:sz w:val="22"/>
         </w:rPr>
-        <w:t xml:space="preserve">Determine whether weather conditions and congestion can be considered independent using </w:t>
-      </w:r>
-      <w:proofErr w:type="gramStart"/>
-      <w:r>
-        <w:rPr>
-          <w:rFonts w:cstheme="minorHAnsi"/>
-          <w:sz w:val="22"/>
-        </w:rPr>
-        <w:t>P(</w:t>
-      </w:r>
-      <w:proofErr w:type="gramEnd"/>
-      <w:r>
-        <w:rPr>
-          <w:rFonts w:cstheme="minorHAnsi"/>
-          <w:sz w:val="22"/>
-        </w:rPr>
-        <w:t>A ∩ B) = P(A) × P(B)</w:t>
+        <w:t xml:space="preserve">Determine whether weather conditions and congestion can be considered independent using P(A ∩ B) = P(A) × P(B)</w:t>
       </w:r>
     </w:p>
     <w:p>
@@ -5885,7 +4438,6 @@
           <w:rFonts w:cstheme="minorHAnsi"/>
         </w:rPr>
       </w:pPr>
-      <w:proofErr w:type="gramStart"/>
       <w:r>
         <w:rPr>
           <w:rFonts w:cstheme="minorHAnsi"/>
@@ -5893,93 +4445,87 @@
           <w:sz w:val="22"/>
         </w:rPr>
         <w:lastRenderedPageBreak/>
-        <w:t>P(</w:t>
-      </w:r>
-      <w:proofErr w:type="gramEnd"/>
+        <w:t xml:space="preserve">P(Clear Weather | Congestion): </w:t>
+      </w:r>
+      <w:r>
+        <w:rPr>
+          <w:rFonts w:cstheme="minorHAnsi"/>
+          <w:sz w:val="22"/>
+        </w:rPr>
+        <w:t xml:space="preserve">1,762 of the 6,107 congested hours were logged as Clear, so P(Clear Weather | Congestion) = 1,762 / 6,107 ≈ 0.2885 (28.85%).</w:t>
+      </w:r>
+    </w:p>
+    <w:p>
+      <w:pPr>
+        <w:rPr>
+          <w:rFonts w:cstheme="minorHAnsi"/>
+        </w:rPr>
+      </w:pPr>
       <w:r>
         <w:rPr>
           <w:rFonts w:cstheme="minorHAnsi"/>
           <w:b/>
           <w:sz w:val="22"/>
         </w:rPr>
-        <w:t xml:space="preserve">Clear Weather | Congestion): </w:t>
-      </w:r>
-      <w:r>
-        <w:rPr>
-          <w:rFonts w:cstheme="minorHAnsi"/>
-          <w:sz w:val="22"/>
-        </w:rPr>
-        <w:t xml:space="preserve">1,762 of the 6,107 congested hours were logged as Clear, so </w:t>
-      </w:r>
-      <w:proofErr w:type="gramStart"/>
-      <w:r>
-        <w:rPr>
-          <w:rFonts w:cstheme="minorHAnsi"/>
-          <w:sz w:val="22"/>
-        </w:rPr>
-        <w:t>P(</w:t>
-      </w:r>
-      <w:proofErr w:type="gramEnd"/>
-      <w:r>
-        <w:rPr>
-          <w:rFonts w:cstheme="minorHAnsi"/>
-          <w:sz w:val="22"/>
-        </w:rPr>
-        <w:t>Clear Weather | Congestion) = 1,762 / 6,107 ≈ 0.2885 (28.85%).</w:t>
-      </w:r>
-    </w:p>
-    <w:p>
-      <w:pPr>
-        <w:rPr>
-          <w:rFonts w:cstheme="minorHAnsi"/>
-        </w:rPr>
-      </w:pPr>
-      <w:proofErr w:type="gramStart"/>
+        <w:t xml:space="preserve">P(High Temperature | Congestion): </w:t>
+      </w:r>
+      <w:r>
+        <w:rPr>
+          <w:rFonts w:cstheme="minorHAnsi"/>
+          <w:sz w:val="22"/>
+        </w:rPr>
+        <w:t xml:space="preserve">1,699 of the 6,107 congested hours have temperature above 292K, so P(High Temperature | Congestion) = 1,699 / 6,107 ≈ 0.2782 (27.82%).</w:t>
+      </w:r>
+    </w:p>
+    <w:p>
+      <w:pPr>
+        <w:rPr>
+          <w:rFonts w:cstheme="minorHAnsi"/>
+        </w:rPr>
+      </w:pPr>
       <w:r>
         <w:rPr>
           <w:rFonts w:cstheme="minorHAnsi"/>
           <w:b/>
           <w:sz w:val="22"/>
         </w:rPr>
-        <w:t>P(</w:t>
-      </w:r>
-      <w:proofErr w:type="gramEnd"/>
+        <w:t xml:space="preserve">Independence check: </w:t>
+      </w:r>
+      <w:r>
+        <w:rPr>
+          <w:rFonts w:cstheme="minorHAnsi"/>
+          <w:sz w:val="22"/>
+        </w:rPr>
+        <w:t xml:space="preserve">if Congestion and Clear Weather were independent, P(Congestion) x P(Clear Weather) would equal P(Congestion AND Clear Weather). Here P(Congestion) x P(Clear Weather) = 0.1505 x 0.3294 ≈ 0.0496 (4.96%), while the actual joint probability is 0.0434 (4.34%). These two values are not equal, so Congestion and Clear Weather cannot be considered independent.</w:t>
+      </w:r>
+    </w:p>
+    <w:p>
+      <w:pPr>
+        <w:rPr>
+          <w:rFonts w:cstheme="minorHAnsi"/>
+        </w:rPr>
+      </w:pPr>
       <w:r>
         <w:rPr>
           <w:rFonts w:cstheme="minorHAnsi"/>
           <w:b/>
           <w:sz w:val="22"/>
         </w:rPr>
-        <w:t xml:space="preserve">High Temperature | Congestion): </w:t>
-      </w:r>
-      <w:r>
-        <w:rPr>
-          <w:rFonts w:cstheme="minorHAnsi"/>
-          <w:sz w:val="22"/>
-        </w:rPr>
-        <w:t xml:space="preserve">1,699 of the 6,107 congested hours have temperature above 292K, so </w:t>
-      </w:r>
-      <w:proofErr w:type="gramStart"/>
-      <w:r>
-        <w:rPr>
-          <w:rFonts w:cstheme="minorHAnsi"/>
-          <w:sz w:val="22"/>
-        </w:rPr>
-        <w:t>P(</w:t>
-      </w:r>
-      <w:proofErr w:type="gramEnd"/>
-      <w:r>
-        <w:rPr>
-          <w:rFonts w:cstheme="minorHAnsi"/>
-          <w:sz w:val="22"/>
-        </w:rPr>
-        <w:t>High Temperature | Congestion) = 1,699 / 6,107 ≈ 0.2782 (27.82%).</w:t>
-      </w:r>
-    </w:p>
-    <w:p>
-      <w:pPr>
-        <w:rPr>
-          <w:rFonts w:cstheme="minorHAnsi"/>
+        <w:t xml:space="preserve">Odds ratio: </w:t>
+      </w:r>
+      <w:r>
+        <w:rPr>
+          <w:rFonts w:cstheme="minorHAnsi"/>
+          <w:sz w:val="22"/>
+        </w:rPr>
+        <w:t>among clear hours, 1,762 were congested and 11,604 were not, giving odds of 1,762 / 11,604 ≈ 0.1518. Among cloudy hours, 2,587 were congested and 12,536 were not, giving odds of 2,587 / 12,536 ≈ 0.2064. The odds ratio of congestion in clear weather versus cloudy weather is 0.1518 / 0.2064 ≈ 0.7358.</w:t>
+      </w:r>
+    </w:p>
+    <w:p>
+      <w:pPr>
+        <w:rPr>
+          <w:rFonts w:cstheme="minorHAnsi"/>
+          <w:sz w:val="22"/>
         </w:rPr>
       </w:pPr>
       <w:r>
@@ -5988,116 +4534,14 @@
           <w:b/>
           <w:sz w:val="22"/>
         </w:rPr>
-        <w:t xml:space="preserve">Independence check: </w:t>
-      </w:r>
-      <w:r>
-        <w:rPr>
-          <w:rFonts w:cstheme="minorHAnsi"/>
-          <w:sz w:val="22"/>
-        </w:rPr>
-        <w:t xml:space="preserve">if Congestion and Clear Weather were independent, P(Congestion) x </w:t>
-      </w:r>
-      <w:proofErr w:type="gramStart"/>
-      <w:r>
-        <w:rPr>
-          <w:rFonts w:cstheme="minorHAnsi"/>
-          <w:sz w:val="22"/>
-        </w:rPr>
-        <w:t>P(</w:t>
-      </w:r>
-      <w:proofErr w:type="gramEnd"/>
-      <w:r>
-        <w:rPr>
-          <w:rFonts w:cstheme="minorHAnsi"/>
-          <w:sz w:val="22"/>
-        </w:rPr>
-        <w:t xml:space="preserve">Clear Weather) would equal </w:t>
-      </w:r>
-      <w:proofErr w:type="gramStart"/>
-      <w:r>
-        <w:rPr>
-          <w:rFonts w:cstheme="minorHAnsi"/>
-          <w:sz w:val="22"/>
-        </w:rPr>
-        <w:t>P(</w:t>
-      </w:r>
-      <w:proofErr w:type="gramEnd"/>
-      <w:r>
-        <w:rPr>
-          <w:rFonts w:cstheme="minorHAnsi"/>
-          <w:sz w:val="22"/>
-        </w:rPr>
-        <w:t xml:space="preserve">Congestion AND Clear Weather). Here P(Congestion) x </w:t>
-      </w:r>
-      <w:proofErr w:type="gramStart"/>
-      <w:r>
-        <w:rPr>
-          <w:rFonts w:cstheme="minorHAnsi"/>
-          <w:sz w:val="22"/>
-        </w:rPr>
-        <w:t>P(</w:t>
-      </w:r>
-      <w:proofErr w:type="gramEnd"/>
-      <w:r>
-        <w:rPr>
-          <w:rFonts w:cstheme="minorHAnsi"/>
-          <w:sz w:val="22"/>
-        </w:rPr>
-        <w:t>Clear Weather) = 0.1505 x 0.3294 ≈ 0.0496 (4.96%), while the actual joint probability is 0.0434 (4.34%). These two values are not equal, so Congestion and Clear Weather cannot be considered independent.</w:t>
-      </w:r>
-    </w:p>
-    <w:p>
-      <w:pPr>
-        <w:rPr>
-          <w:rFonts w:cstheme="minorHAnsi"/>
-        </w:rPr>
-      </w:pPr>
-      <w:r>
-        <w:rPr>
-          <w:rFonts w:cstheme="minorHAnsi"/>
-          <w:b/>
-          <w:sz w:val="22"/>
-        </w:rPr>
-        <w:t xml:space="preserve">Odds ratio: </w:t>
-      </w:r>
-      <w:r>
-        <w:rPr>
-          <w:rFonts w:cstheme="minorHAnsi"/>
-          <w:sz w:val="22"/>
-        </w:rPr>
-        <w:t>among clear hours, 1,762 were congested and 11,604 were not, giving odds of 1,762 / 11,604 ≈ 0.1518. Among cloudy hours, 2,587 were congested and 12,536 were not, giving odds of 2,587 / 12,536 ≈ 0.2064. The odds ratio of congestion in clear weather versus cloudy weather is 0.1518 / 0.2064 ≈ 0.7358.</w:t>
-      </w:r>
-    </w:p>
-    <w:p>
-      <w:pPr>
-        <w:rPr>
-          <w:rFonts w:cstheme="minorHAnsi"/>
-          <w:sz w:val="22"/>
-        </w:rPr>
-      </w:pPr>
-      <w:r>
-        <w:rPr>
-          <w:rFonts w:cstheme="minorHAnsi"/>
-          <w:b/>
-          <w:sz w:val="22"/>
-        </w:rPr>
         <w:t xml:space="preserve">Conclusion: </w:t>
       </w:r>
-      <w:proofErr w:type="gramStart"/>
-      <w:r>
-        <w:rPr>
-          <w:rFonts w:cstheme="minorHAnsi"/>
-          <w:sz w:val="22"/>
-        </w:rPr>
-        <w:t>Overall</w:t>
-      </w:r>
-      <w:proofErr w:type="gramEnd"/>
-      <w:r>
-        <w:rPr>
-          <w:rFonts w:cstheme="minorHAnsi"/>
-          <w:sz w:val="22"/>
-        </w:rPr>
-        <w:t xml:space="preserve"> the probability analysis suggests that weather has only a mild relationship with congestion. Congestion is somewhat less likely during clear conditions than the independence assumption would predict, and the odds of congestion in clear weather are about 26 percent lower than in cloudy weather, since the odds ratio is below 1. This points in the same direction as the weak positive correlation found between temperature and traffic volume in Task 2.2, but the effect size is small in both cases. Weather appears to shift the likelihood of congestion only slightly rather than acting as a major driver of it, so factors such as time of day and day of week are still likely to matter more than weather conditions alone.</w:t>
+      <w:r>
+        <w:rPr>
+          <w:rFonts w:cstheme="minorHAnsi"/>
+          <w:sz w:val="22"/>
+        </w:rPr>
+        <w:t xml:space="preserve">Overall the probability analysis suggests that weather has only a mild relationship with congestion. Congestion is somewhat less likely during clear conditions than the independence assumption would predict, and the odds of congestion in clear weather are about 26 percent lower than in cloudy weather, since the odds ratio is below 1. This points in the same direction as the weak positive correlation found between temperature and traffic volume in Task 2.2, but the effect size is small in both cases. Weather appears to shift the likelihood of congestion only slightly rather than acting as a major driver of it, so factors such as time of day and day of week are still likely to matter more than weather conditions alone.</w:t>
       </w:r>
     </w:p>
     <w:p>
@@ -6345,27 +4789,7 @@
           <w:szCs w:val="22"/>
           <w:lang w:val="en-PH"/>
         </w:rPr>
-        <w:t xml:space="preserve"> from </w:t>
-      </w:r>
-      <w:proofErr w:type="spellStart"/>
-      <w:r>
-        <w:rPr>
-          <w:rFonts w:cstheme="minorHAnsi"/>
-          <w:sz w:val="22"/>
-          <w:szCs w:val="22"/>
-          <w:lang w:val="en-PH"/>
-        </w:rPr>
-        <w:t>DateTime</w:t>
-      </w:r>
-      <w:proofErr w:type="spellEnd"/>
-      <w:r>
-        <w:rPr>
-          <w:rFonts w:cstheme="minorHAnsi"/>
-          <w:sz w:val="22"/>
-          <w:szCs w:val="22"/>
-          <w:lang w:val="en-PH"/>
-        </w:rPr>
-        <w:t xml:space="preserve">. </w:t>
+        <w:t xml:space="preserve"> from DateTime. </w:t>
       </w:r>
     </w:p>
     <w:p>
@@ -6762,87 +5186,7 @@
           <w:rFonts w:cstheme="minorHAnsi"/>
           <w:lang w:val="en-SG"/>
         </w:rPr>
-        <w:t xml:space="preserve">Row and column count: the imported CSV has 48,204 rows and 9 columns (holiday, temp, rain_1h, snow_1h, </w:t>
-      </w:r>
-      <w:proofErr w:type="spellStart"/>
-      <w:r>
-        <w:rPr>
-          <w:rFonts w:cstheme="minorHAnsi"/>
-          <w:lang w:val="en-SG"/>
-        </w:rPr>
-        <w:t>clouds_all</w:t>
-      </w:r>
-      <w:proofErr w:type="spellEnd"/>
-      <w:r>
-        <w:rPr>
-          <w:rFonts w:cstheme="minorHAnsi"/>
-          <w:lang w:val="en-SG"/>
-        </w:rPr>
-        <w:t xml:space="preserve">, </w:t>
-      </w:r>
-      <w:proofErr w:type="spellStart"/>
-      <w:r>
-        <w:rPr>
-          <w:rFonts w:cstheme="minorHAnsi"/>
-          <w:lang w:val="en-SG"/>
-        </w:rPr>
-        <w:t>weather_main</w:t>
-      </w:r>
-      <w:proofErr w:type="spellEnd"/>
-      <w:r>
-        <w:rPr>
-          <w:rFonts w:cstheme="minorHAnsi"/>
-          <w:lang w:val="en-SG"/>
-        </w:rPr>
-        <w:t xml:space="preserve">, </w:t>
-      </w:r>
-      <w:proofErr w:type="spellStart"/>
-      <w:r>
-        <w:rPr>
-          <w:rFonts w:cstheme="minorHAnsi"/>
-          <w:lang w:val="en-SG"/>
-        </w:rPr>
-        <w:t>weather_description</w:t>
-      </w:r>
-      <w:proofErr w:type="spellEnd"/>
-      <w:r>
-        <w:rPr>
-          <w:rFonts w:cstheme="minorHAnsi"/>
-          <w:lang w:val="en-SG"/>
-        </w:rPr>
-        <w:t xml:space="preserve">, </w:t>
-      </w:r>
-      <w:proofErr w:type="spellStart"/>
-      <w:r>
-        <w:rPr>
-          <w:rFonts w:cstheme="minorHAnsi"/>
-          <w:lang w:val="en-SG"/>
-        </w:rPr>
-        <w:t>date_time</w:t>
-      </w:r>
-      <w:proofErr w:type="spellEnd"/>
-      <w:r>
-        <w:rPr>
-          <w:rFonts w:cstheme="minorHAnsi"/>
-          <w:lang w:val="en-SG"/>
-        </w:rPr>
-        <w:t xml:space="preserve">, </w:t>
-      </w:r>
-      <w:proofErr w:type="spellStart"/>
-      <w:r>
-        <w:rPr>
-          <w:rFonts w:cstheme="minorHAnsi"/>
-          <w:lang w:val="en-SG"/>
-        </w:rPr>
-        <w:t>traffic_volume</w:t>
-      </w:r>
-      <w:proofErr w:type="spellEnd"/>
-      <w:r>
-        <w:rPr>
-          <w:rFonts w:cstheme="minorHAnsi"/>
-          <w:lang w:val="en-SG"/>
-        </w:rPr>
-        <w:t>).</w:t>
+        <w:t xml:space="preserve">Row and column count: the imported CSV has 48,204 rows and 9 columns (holiday, temp, rain_1h, snow_1h, clouds_all, weather_main, weather_description, date_time, traffic_volume).</w:t>
       </w:r>
     </w:p>
     <w:p>
@@ -6862,39 +5206,7 @@
           <w:rFonts w:cstheme="minorHAnsi"/>
           <w:lang w:val="en-SG"/>
         </w:rPr>
-        <w:t xml:space="preserve">Null and missing values: Power Query's Column quality view initially reported 0% Empty for every column, which looks like no missing data at all. </w:t>
-      </w:r>
-      <w:proofErr w:type="gramStart"/>
-      <w:r>
-        <w:rPr>
-          <w:rFonts w:cstheme="minorHAnsi"/>
-          <w:lang w:val="en-SG"/>
-        </w:rPr>
-        <w:t>However</w:t>
-      </w:r>
-      <w:proofErr w:type="gramEnd"/>
-      <w:r>
-        <w:rPr>
-          <w:rFonts w:cstheme="minorHAnsi"/>
-          <w:lang w:val="en-SG"/>
-        </w:rPr>
-        <w:t xml:space="preserve"> holiday stores the literal text None for </w:t>
-      </w:r>
-      <w:proofErr w:type="spellStart"/>
-      <w:r>
-        <w:rPr>
-          <w:rFonts w:cstheme="minorHAnsi"/>
-          <w:lang w:val="en-SG"/>
-        </w:rPr>
-        <w:t>non holiday</w:t>
-      </w:r>
-      <w:proofErr w:type="spellEnd"/>
-      <w:r>
-        <w:rPr>
-          <w:rFonts w:cstheme="minorHAnsi"/>
-          <w:lang w:val="en-SG"/>
-        </w:rPr>
-        <w:t xml:space="preserve"> hours rather than a true blank, in 48,143 of 48,204 rows (99.87%). This is not detected as missing until the text is explicitly replaced. Applying Replace Values (None to blank) on holiday raised its reported Empty percentage to 99%, correctly reflecting that almost every hour has no holiday.</w:t>
+        <w:t xml:space="preserve">Null and missing values: Power Query's Column quality view initially reported 0% Empty for every column, which looks like no missing data at all. However holiday stores the literal text None for non holiday hours rather than a true blank, in 48,143 of 48,204 rows (99.87%). This is not detected as missing until the text is explicitly replaced. Applying Replace Values (None to blank) on holiday raised its reported Empty percentage to 99%, correctly reflecting that almost every hour has no holiday.</w:t>
       </w:r>
     </w:p>
     <w:p>
@@ -6914,71 +5226,7 @@
           <w:rFonts w:cstheme="minorHAnsi"/>
           <w:lang w:val="en-SG"/>
         </w:rPr>
-        <w:t xml:space="preserve">Data type check: </w:t>
-      </w:r>
-      <w:proofErr w:type="spellStart"/>
-      <w:r>
-        <w:rPr>
-          <w:rFonts w:cstheme="minorHAnsi"/>
-          <w:lang w:val="en-SG"/>
-        </w:rPr>
-        <w:t>date_time</w:t>
-      </w:r>
-      <w:proofErr w:type="spellEnd"/>
-      <w:r>
-        <w:rPr>
-          <w:rFonts w:cstheme="minorHAnsi"/>
-          <w:lang w:val="en-SG"/>
-        </w:rPr>
-        <w:t xml:space="preserve">, </w:t>
-      </w:r>
-      <w:proofErr w:type="spellStart"/>
-      <w:r>
-        <w:rPr>
-          <w:rFonts w:cstheme="minorHAnsi"/>
-          <w:lang w:val="en-SG"/>
-        </w:rPr>
-        <w:t>clouds_all</w:t>
-      </w:r>
-      <w:proofErr w:type="spellEnd"/>
-      <w:r>
-        <w:rPr>
-          <w:rFonts w:cstheme="minorHAnsi"/>
-          <w:lang w:val="en-SG"/>
-        </w:rPr>
-        <w:t xml:space="preserve"> and </w:t>
-      </w:r>
-      <w:proofErr w:type="spellStart"/>
-      <w:r>
-        <w:rPr>
-          <w:rFonts w:cstheme="minorHAnsi"/>
-          <w:lang w:val="en-SG"/>
-        </w:rPr>
-        <w:t>traffic_volume</w:t>
-      </w:r>
-      <w:proofErr w:type="spellEnd"/>
-      <w:r>
-        <w:rPr>
-          <w:rFonts w:cstheme="minorHAnsi"/>
-          <w:lang w:val="en-SG"/>
-        </w:rPr>
-        <w:t xml:space="preserve"> were auto detected with appropriate types (Date/Time and Whole Number). </w:t>
-      </w:r>
-      <w:proofErr w:type="gramStart"/>
-      <w:r>
-        <w:rPr>
-          <w:rFonts w:cstheme="minorHAnsi"/>
-          <w:lang w:val="en-SG"/>
-        </w:rPr>
-        <w:t>However</w:t>
-      </w:r>
-      <w:proofErr w:type="gramEnd"/>
-      <w:r>
-        <w:rPr>
-          <w:rFonts w:cstheme="minorHAnsi"/>
-          <w:lang w:val="en-SG"/>
-        </w:rPr>
-        <w:t xml:space="preserve"> temp, rain_1h and snow_1h were auto detected as Text rather than a numeric type, which would have prevented correct aggregation and charting. These three were changed to Decimal Number. As a side effect, rain_1h's reported distinct value count dropped from 372 to 30, since several text representations of the same number (such as 0 and 0.0) had been counted as different values before the fix, a further sign the original type was wrong.</w:t>
+        <w:t xml:space="preserve">Data type check: date_time, clouds_all and traffic_volume were auto detected with appropriate types (Date/Time and Whole Number). However temp, rain_1h and snow_1h were auto detected as Text rather than a numeric type, which would have prevented correct aggregation and charting. These three were changed to Decimal Number. As a side effect, rain_1h's reported distinct value count dropped from 372 to 30, since several text representations of the same number (such as 0 and 0.0) had been counted as different values before the fix, a further sign the original type was wrong.</w:t>
       </w:r>
     </w:p>
     <w:p>
@@ -6998,55 +5246,7 @@
           <w:rFonts w:cstheme="minorHAnsi"/>
           <w:lang w:val="en-SG"/>
         </w:rPr>
-        <w:t xml:space="preserve">Hour: extracted from </w:t>
-      </w:r>
-      <w:proofErr w:type="spellStart"/>
-      <w:r>
-        <w:rPr>
-          <w:rFonts w:cstheme="minorHAnsi"/>
-          <w:lang w:val="en-SG"/>
-        </w:rPr>
-        <w:t>date_time</w:t>
-      </w:r>
-      <w:proofErr w:type="spellEnd"/>
-      <w:r>
-        <w:rPr>
-          <w:rFonts w:cstheme="minorHAnsi"/>
-          <w:lang w:val="en-SG"/>
-        </w:rPr>
-        <w:t xml:space="preserve"> using </w:t>
-      </w:r>
-      <w:proofErr w:type="spellStart"/>
-      <w:r>
-        <w:rPr>
-          <w:rFonts w:cstheme="minorHAnsi"/>
-          <w:lang w:val="en-SG"/>
-        </w:rPr>
-        <w:t>Time.Hour</w:t>
-      </w:r>
-      <w:proofErr w:type="spellEnd"/>
-      <w:r>
-        <w:rPr>
-          <w:rFonts w:cstheme="minorHAnsi"/>
-          <w:lang w:val="en-SG"/>
-        </w:rPr>
-        <w:t>([</w:t>
-      </w:r>
-      <w:proofErr w:type="spellStart"/>
-      <w:r>
-        <w:rPr>
-          <w:rFonts w:cstheme="minorHAnsi"/>
-          <w:lang w:val="en-SG"/>
-        </w:rPr>
-        <w:t>date_time</w:t>
-      </w:r>
-      <w:proofErr w:type="spellEnd"/>
-      <w:r>
-        <w:rPr>
-          <w:rFonts w:cstheme="minorHAnsi"/>
-          <w:lang w:val="en-SG"/>
-        </w:rPr>
-        <w:t>]), producing a Whole Number column ranging 0 to 23.</w:t>
+        <w:t xml:space="preserve">Hour: extracted from date_time using Time.Hour([date_time]), producing a Whole Number column ranging 0 to 23.</w:t>
       </w:r>
     </w:p>
     <w:p>
@@ -7066,23 +5266,7 @@
           <w:rFonts w:cstheme="minorHAnsi"/>
           <w:lang w:val="en-SG"/>
         </w:rPr>
-        <w:t xml:space="preserve">Temperature in Celsius: created as a Custom Column named </w:t>
-      </w:r>
-      <w:proofErr w:type="spellStart"/>
-      <w:r>
-        <w:rPr>
-          <w:rFonts w:cstheme="minorHAnsi"/>
-          <w:lang w:val="en-SG"/>
-        </w:rPr>
-        <w:t>Temperature_C</w:t>
-      </w:r>
-      <w:proofErr w:type="spellEnd"/>
-      <w:r>
-        <w:rPr>
-          <w:rFonts w:cstheme="minorHAnsi"/>
-          <w:lang w:val="en-SG"/>
-        </w:rPr>
-        <w:t xml:space="preserve"> using the formula [temp] minus 273.15. Power Query initially left this column as the generic Any type, so it was explicitly changed to Decimal Number.</w:t>
+        <w:t xml:space="preserve">Temperature in Celsius: created as a Custom Column named Temperature_C using the formula [temp] minus 273.15. Power Query initially left this column as the generic Any type, so it was explicitly changed to Decimal Number.</w:t>
       </w:r>
     </w:p>
     <w:p>
@@ -7102,55 +5286,7 @@
           <w:rFonts w:cstheme="minorHAnsi"/>
           <w:lang w:val="en-SG"/>
         </w:rPr>
-        <w:t xml:space="preserve">Traffic Category: created as a Custom Column named </w:t>
-      </w:r>
-      <w:proofErr w:type="spellStart"/>
-      <w:r>
-        <w:rPr>
-          <w:rFonts w:cstheme="minorHAnsi"/>
-          <w:lang w:val="en-SG"/>
-        </w:rPr>
-        <w:t>Traffic_Category</w:t>
-      </w:r>
-      <w:proofErr w:type="spellEnd"/>
-      <w:r>
-        <w:rPr>
-          <w:rFonts w:cstheme="minorHAnsi"/>
-          <w:lang w:val="en-SG"/>
-        </w:rPr>
-        <w:t xml:space="preserve"> using nested if </w:t>
-      </w:r>
-      <w:proofErr w:type="gramStart"/>
-      <w:r>
-        <w:rPr>
-          <w:rFonts w:cstheme="minorHAnsi"/>
-          <w:lang w:val="en-SG"/>
-        </w:rPr>
-        <w:t>logic</w:t>
-      </w:r>
-      <w:proofErr w:type="gramEnd"/>
-      <w:r>
-        <w:rPr>
-          <w:rFonts w:cstheme="minorHAnsi"/>
-          <w:lang w:val="en-SG"/>
-        </w:rPr>
-        <w:t xml:space="preserve"> so every row falls into exactly one non overlapping band: Low below 4,500, Medium from 4,500 up to and including 5,500, and High above 5,500, the same threshold used to define Congestion in Task 3. Spot checking against known </w:t>
-      </w:r>
-      <w:proofErr w:type="spellStart"/>
-      <w:r>
-        <w:rPr>
-          <w:rFonts w:cstheme="minorHAnsi"/>
-          <w:lang w:val="en-SG"/>
-        </w:rPr>
-        <w:t>traffic_volume</w:t>
-      </w:r>
-      <w:proofErr w:type="spellEnd"/>
-      <w:r>
-        <w:rPr>
-          <w:rFonts w:cstheme="minorHAnsi"/>
-          <w:lang w:val="en-SG"/>
-        </w:rPr>
-        <w:t xml:space="preserve"> values confirmed correct results, for example 5,545 correctly categorised as High and 4,516 as Medium.</w:t>
+        <w:t xml:space="preserve">Traffic Category: created as a Custom Column named Traffic_Category using nested if logic so every row falls into exactly one non overlapping band: Low below 4,500, Medium from 4,500 up to and including 5,500, and High above 5,500, the same threshold used to define Congestion in Task 3. Spot checking against known traffic_volume values confirmed correct results, for example 5,545 correctly categorised as High and 4,516 as Medium.</w:t>
       </w:r>
     </w:p>
     <w:p>
@@ -7248,27 +5384,7 @@
           <w:szCs w:val="22"/>
           <w:lang w:val="en-PH"/>
         </w:rPr>
-        <w:t xml:space="preserve">Create </w:t>
-      </w:r>
-      <w:proofErr w:type="spellStart"/>
-      <w:r>
-        <w:rPr>
-          <w:rFonts w:cstheme="minorHAnsi"/>
-          <w:sz w:val="22"/>
-          <w:szCs w:val="22"/>
-          <w:lang w:val="en-PH"/>
-        </w:rPr>
-        <w:t>visualisations</w:t>
-      </w:r>
-      <w:proofErr w:type="spellEnd"/>
-      <w:r>
-        <w:rPr>
-          <w:rFonts w:cstheme="minorHAnsi"/>
-          <w:sz w:val="22"/>
-          <w:szCs w:val="22"/>
-          <w:lang w:val="en-PH"/>
-        </w:rPr>
-        <w:t xml:space="preserve"> showing:</w:t>
+        <w:t xml:space="preserve">Create visualisations showing:</w:t>
       </w:r>
     </w:p>
     <w:p>
@@ -7510,25 +5626,14 @@
           <w:lang w:val="en-PH"/>
         </w:rPr>
       </w:pPr>
-      <w:proofErr w:type="spellStart"/>
-      <w:r>
-        <w:rPr>
-          <w:rFonts w:cstheme="minorHAnsi"/>
-          <w:sz w:val="22"/>
-          <w:szCs w:val="22"/>
-          <w:lang w:val="en-PH"/>
-        </w:rPr>
-        <w:t>Analyse</w:t>
-      </w:r>
-      <w:proofErr w:type="spellEnd"/>
-      <w:r>
-        <w:rPr>
-          <w:rFonts w:cstheme="minorHAnsi"/>
-          <w:sz w:val="22"/>
-          <w:szCs w:val="22"/>
-          <w:lang w:val="en-PH"/>
-        </w:rPr>
-        <w:t xml:space="preserve"> average traffic by weather condition and answer:</w:t>
+      <w:r>
+        <w:rPr>
+          <w:rFonts w:cstheme="minorHAnsi"/>
+          <w:sz w:val="22"/>
+          <w:szCs w:val="22"/>
+          <w:lang w:val="en-PH"/>
+        </w:rPr>
+        <w:t xml:space="preserve">Analyse average traffic by weather condition and answer:</w:t>
       </w:r>
     </w:p>
     <w:p>
@@ -7772,9 +5877,23 @@
           <w:bCs/>
           <w:lang w:val="en-SG"/>
         </w:rPr>
-        <w:t xml:space="preserve">Clouds </w:t>
-      </w:r>
-      <w:proofErr w:type="gramStart"/>
+        <w:t xml:space="preserve">Clouds has the highest average traffic volume (3,616.99)</w:t>
+      </w:r>
+      <w:r>
+        <w:rPr>
+          <w:rFonts w:cstheme="minorHAnsi"/>
+          <w:lang w:val="en-SG"/>
+        </w:rPr>
+        <w:t xml:space="preserve">, closely followed by Haze (3,597.94) and Drizzle (3,159.82). This suggests that overcast or mildly adverse conditions don't meaningfully suppress travel, commuters largely continue their normal patterns under cloudy or hazy skies.</w:t>
+      </w:r>
+    </w:p>
+    <w:p>
+      <w:pPr>
+        <w:rPr>
+          <w:rFonts w:cstheme="minorHAnsi"/>
+          <w:lang w:val="en-SG"/>
+        </w:rPr>
+      </w:pPr>
       <w:r>
         <w:rPr>
           <w:rFonts w:cstheme="minorHAnsi"/>
@@ -7782,101 +5901,29 @@
           <w:bCs/>
           <w:lang w:val="en-SG"/>
         </w:rPr>
-        <w:t>has</w:t>
-      </w:r>
-      <w:proofErr w:type="gramEnd"/>
-      <w:r>
-        <w:rPr>
-          <w:rFonts w:cstheme="minorHAnsi"/>
-          <w:b/>
-          <w:bCs/>
+        <w:t>Squall has the lowest average traffic volume by a wide margin (420.00)</w:t>
+      </w:r>
+      <w:r>
+        <w:rPr>
+          <w:rFonts w:cstheme="minorHAnsi"/>
           <w:lang w:val="en-SG"/>
         </w:rPr>
-        <w:t xml:space="preserve"> the highest average traffic volume (3,616.99)</w:t>
-      </w:r>
-      <w:r>
+        <w:t xml:space="preserve">, far below every other condition, the next-lowest, Smoke, still averages 2,559.67. This sharp drop-off likely reflects two compounding factors: squalls are brief, severe weather events that actively discourage or prevent travel, and they occur rarely in the dataset, meaning this average is based on a much smaller number of hourly records than conditions like Clouds or Clear. As a result, the Squall figure should be interpreted cautiously rather than treated as a robust estimate of typical traffic behavior under that condition, the true underlying pattern is likely "severe weather sharply reduces travel," with the extremity of the number partly an artifact of limited data.</w:t>
+      </w:r>
+    </w:p>
+    <w:p>
+      <w:pPr>
         <w:rPr>
           <w:rFonts w:cstheme="minorHAnsi"/>
           <w:lang w:val="en-SG"/>
         </w:rPr>
-        <w:t xml:space="preserve">, closely followed by Haze (3,597.94) and Drizzle (3,159.82). This suggests that </w:t>
-      </w:r>
-      <w:proofErr w:type="gramStart"/>
+      </w:pPr>
       <w:r>
         <w:rPr>
           <w:rFonts w:cstheme="minorHAnsi"/>
           <w:lang w:val="en-SG"/>
         </w:rPr>
-        <w:t>overcast</w:t>
-      </w:r>
-      <w:proofErr w:type="gramEnd"/>
-      <w:r>
-        <w:rPr>
-          <w:rFonts w:cstheme="minorHAnsi"/>
-          <w:lang w:val="en-SG"/>
-        </w:rPr>
-        <w:t xml:space="preserve"> or mildly adverse conditions don't meaningfully suppress travel, commuters largely continue their normal patterns under cloudy or hazy skies.</w:t>
-      </w:r>
-    </w:p>
-    <w:p>
-      <w:pPr>
-        <w:rPr>
-          <w:rFonts w:cstheme="minorHAnsi"/>
-          <w:lang w:val="en-SG"/>
-        </w:rPr>
-      </w:pPr>
-      <w:r>
-        <w:rPr>
-          <w:rFonts w:cstheme="minorHAnsi"/>
-          <w:b/>
-          <w:bCs/>
-          <w:lang w:val="en-SG"/>
-        </w:rPr>
-        <w:t>Squall has the lowest average traffic volume by a wide margin (420.00)</w:t>
-      </w:r>
-      <w:r>
-        <w:rPr>
-          <w:rFonts w:cstheme="minorHAnsi"/>
-          <w:lang w:val="en-SG"/>
-        </w:rPr>
-        <w:t xml:space="preserve">, far below every other condition, the next-lowest, Smoke, still averages 2,559.67. This sharp drop-off likely reflects two compounding factors: squalls are brief, severe weather events that actively discourage or prevent travel, and they occur rarely in the dataset, meaning this average is based on a much smaller number of hourly records than conditions like Clouds or Clear. As a result, the Squall figure should be interpreted cautiously rather than treated as a robust estimate of typical traffic </w:t>
-      </w:r>
-      <w:proofErr w:type="spellStart"/>
-      <w:r>
-        <w:rPr>
-          <w:rFonts w:cstheme="minorHAnsi"/>
-          <w:lang w:val="en-SG"/>
-        </w:rPr>
-        <w:t>behavior</w:t>
-      </w:r>
-      <w:proofErr w:type="spellEnd"/>
-      <w:r>
-        <w:rPr>
-          <w:rFonts w:cstheme="minorHAnsi"/>
-          <w:lang w:val="en-SG"/>
-        </w:rPr>
-        <w:t xml:space="preserve"> under that condition, the true underlying pattern is likely "severe weather sharply reduces travel," with the extremity of the number partly an artifact of limited data.</w:t>
-      </w:r>
-    </w:p>
-    <w:p>
-      <w:pPr>
-        <w:rPr>
-          <w:rFonts w:cstheme="minorHAnsi"/>
-          <w:lang w:val="en-SG"/>
-        </w:rPr>
-      </w:pPr>
-      <w:r>
-        <w:rPr>
-          <w:rFonts w:cstheme="minorHAnsi"/>
-          <w:lang w:val="en-SG"/>
-        </w:rPr>
         <w:t xml:space="preserve">Overall, common, low-severity weather conditions (Clouds, Haze, Drizzle, Clear, Snow) cluster in a relatively high-traffic band (roughly 3,000-3,620), while rarer or more severe </w:t>
-      </w:r>
-      <w:r>
-        <w:rPr>
-          <w:rFonts w:cstheme="minorHAnsi"/>
-          <w:lang w:val="en-SG"/>
-        </w:rPr>
         <w:lastRenderedPageBreak/>
         <w:t>conditions (Mist, Rain, Thunderstorm, Smoke, Fog, and especially Squall) trend toward lower averages, consistent with reduced travel during more disruptive weather.</w:t>
       </w:r>
@@ -8198,12 +6245,6 @@
           <w:lang w:val="en-SG"/>
         </w:rPr>
         <w:t xml:space="preserve">. This is not a real temperature, it corresponds to temp </w:t>
-      </w:r>
-      <w:r>
-        <w:rPr>
-          <w:rFonts w:cstheme="minorHAnsi"/>
-          <w:lang w:val="en-SG"/>
-        </w:rPr>
         <w:lastRenderedPageBreak/>
         <w:t xml:space="preserve">values of 0 Kelvin in the raw data, which is a sensor or data-logging error rather than an actual weather reading </w:t>
       </w:r>
@@ -8221,21 +6262,7 @@
           <w:rFonts w:cstheme="minorHAnsi"/>
           <w:lang w:val="en-SG"/>
         </w:rPr>
-        <w:t xml:space="preserve"> These erroneous records span a range of traffic volumes (roughly 400 to 5,200), confirming they're a data quality artifact unrelated to genuine temperature effects rather than a real cold-weather pattern. This cluster should be treated as a known data issue in the analysis and, ideally, excluded or corrected in any downstream </w:t>
-      </w:r>
-      <w:r>
-        <w:rPr>
-          <w:rFonts w:cstheme="minorHAnsi"/>
-          <w:lang w:val="en-SG"/>
-        </w:rPr>
-        <w:t>modelling</w:t>
-      </w:r>
-      <w:r>
-        <w:rPr>
-          <w:rFonts w:cstheme="minorHAnsi"/>
-          <w:lang w:val="en-SG"/>
-        </w:rPr>
-        <w:t xml:space="preserve"> to avoid distorting temperature-based conclusions.</w:t>
+        <w:t xml:space="preserve"> These erroneous records span a range of traffic volumes (roughly 400 to 5,200), confirming they're a data quality artifact unrelated to genuine temperature effects rather than a real cold-weather pattern. This cluster should be treated as a known data issue in the analysis and, ideally, excluded or corrected in any downstream modelling to avoid distorting temperature-based conclusions.</w:t>
       </w:r>
     </w:p>
     <w:p>
@@ -8309,27 +6336,7 @@
           <w:szCs w:val="22"/>
           <w:lang w:val="en-PH"/>
         </w:rPr>
-        <w:t xml:space="preserve">Total hours </w:t>
-      </w:r>
-      <w:proofErr w:type="spellStart"/>
-      <w:r>
-        <w:rPr>
-          <w:rFonts w:cstheme="minorHAnsi"/>
-          <w:sz w:val="22"/>
-          <w:szCs w:val="22"/>
-          <w:lang w:val="en-PH"/>
-        </w:rPr>
-        <w:t>analysed</w:t>
-      </w:r>
-      <w:proofErr w:type="spellEnd"/>
-      <w:r>
-        <w:rPr>
-          <w:rFonts w:cstheme="minorHAnsi"/>
-          <w:sz w:val="22"/>
-          <w:szCs w:val="22"/>
-          <w:lang w:val="en-PH"/>
-        </w:rPr>
-        <w:t xml:space="preserve"> </w:t>
+        <w:t xml:space="preserve">Total hours analysed </w:t>
       </w:r>
     </w:p>
     <w:p>

</xml_diff>